<commit_message>
definición IC BB pensamiento ágil y alta de libro.
</commit_message>
<xml_diff>
--- a/Plan_Gestion_Configuracion_G4_ISW_4K1.docx
+++ b/Plan_Gestion_Configuracion_G4_ISW_4K1.docx
@@ -1,6 +1,6 @@
 
 <file path=word/document.xml><?xml version="1.0" encoding="utf-8"?>
-<w:document xmlns:wpc="http://schemas.microsoft.com/office/word/2010/wordprocessingCanvas" xmlns:cx="http://schemas.microsoft.com/office/drawing/2014/chartex" xmlns:mc="http://schemas.openxmlformats.org/markup-compatibility/2006" xmlns:o="urn:schemas-microsoft-com:office:office" xmlns:r="http://schemas.openxmlformats.org/officeDocument/2006/relationships" xmlns:m="http://schemas.openxmlformats.org/officeDocument/2006/math" xmlns:v="urn:schemas-microsoft-com:vml" xmlns:wp14="http://schemas.microsoft.com/office/word/2010/wordprocessingDrawing" xmlns:wp="http://schemas.openxmlformats.org/drawingml/2006/wordprocessingDrawing" xmlns:w10="urn:schemas-microsoft-com:office:word" xmlns:w="http://schemas.openxmlformats.org/wordprocessingml/2006/main" xmlns:w14="http://schemas.microsoft.com/office/word/2010/wordml" xmlns:w15="http://schemas.microsoft.com/office/word/2012/wordml" xmlns:w16se="http://schemas.microsoft.com/office/word/2015/wordml/symex" xmlns:wpg="http://schemas.microsoft.com/office/word/2010/wordprocessingGroup" xmlns:wpi="http://schemas.microsoft.com/office/word/2010/wordprocessingInk" xmlns:wne="http://schemas.microsoft.com/office/word/2006/wordml" xmlns:wps="http://schemas.microsoft.com/office/word/2010/wordprocessingShape" mc:Ignorable="w14 w15 w16se wp14">
+<w:document xmlns:wpc="http://schemas.microsoft.com/office/word/2010/wordprocessingCanvas" xmlns:cx="http://schemas.microsoft.com/office/drawing/2014/chartex" xmlns:cx1="http://schemas.microsoft.com/office/drawing/2015/9/8/chartex" xmlns:cx2="http://schemas.microsoft.com/office/drawing/2015/10/21/chartex" xmlns:cx3="http://schemas.microsoft.com/office/drawing/2016/5/9/chartex" xmlns:cx4="http://schemas.microsoft.com/office/drawing/2016/5/10/chartex" xmlns:cx5="http://schemas.microsoft.com/office/drawing/2016/5/11/chartex" xmlns:cx6="http://schemas.microsoft.com/office/drawing/2016/5/12/chartex" xmlns:cx7="http://schemas.microsoft.com/office/drawing/2016/5/13/chartex" xmlns:cx8="http://schemas.microsoft.com/office/drawing/2016/5/14/chartex" xmlns:mc="http://schemas.openxmlformats.org/markup-compatibility/2006" xmlns:aink="http://schemas.microsoft.com/office/drawing/2016/ink" xmlns:am3d="http://schemas.microsoft.com/office/drawing/2017/model3d" xmlns:o="urn:schemas-microsoft-com:office:office" xmlns:oel="http://schemas.microsoft.com/office/2019/extlst" xmlns:r="http://schemas.openxmlformats.org/officeDocument/2006/relationships" xmlns:m="http://schemas.openxmlformats.org/officeDocument/2006/math" xmlns:v="urn:schemas-microsoft-com:vml" xmlns:wp14="http://schemas.microsoft.com/office/word/2010/wordprocessingDrawing" xmlns:wp="http://schemas.openxmlformats.org/drawingml/2006/wordprocessingDrawing" xmlns:w10="urn:schemas-microsoft-com:office:word" xmlns:w="http://schemas.openxmlformats.org/wordprocessingml/2006/main" xmlns:w14="http://schemas.microsoft.com/office/word/2010/wordml" xmlns:w15="http://schemas.microsoft.com/office/word/2012/wordml" xmlns:w16cex="http://schemas.microsoft.com/office/word/2018/wordml/cex" xmlns:w16cid="http://schemas.microsoft.com/office/word/2016/wordml/cid" xmlns:w16="http://schemas.microsoft.com/office/word/2018/wordml" xmlns:w16du="http://schemas.microsoft.com/office/word/2023/wordml/word16du" xmlns:w16sdtdh="http://schemas.microsoft.com/office/word/2020/wordml/sdtdatahash" xmlns:w16sdtfl="http://schemas.microsoft.com/office/word/2024/wordml/sdtformatlock" xmlns:w16se="http://schemas.microsoft.com/office/word/2015/wordml/symex" xmlns:wpg="http://schemas.microsoft.com/office/word/2010/wordprocessingGroup" xmlns:wpi="http://schemas.microsoft.com/office/word/2010/wordprocessingInk" xmlns:wne="http://schemas.microsoft.com/office/word/2006/wordml" xmlns:wps="http://schemas.microsoft.com/office/word/2010/wordprocessingShape" mc:Ignorable="w14 w15 w16se w16cid w16 w16cex w16sdtdh w16sdtfl w16du wp14">
   <w:body>
     <w:p>
       <w:pPr>
@@ -65,7 +65,7 @@
           <w:szCs w:val="32"/>
         </w:rPr>
         <w:drawing>
-          <wp:inline distT="114300" distB="114300" distL="114300" distR="114300">
+          <wp:inline distT="114300" distB="114300" distL="114300" distR="114300" wp14:anchorId="5CBF077D" wp14:editId="278F39E0">
             <wp:extent cx="3342905" cy="3422228"/>
             <wp:effectExtent l="0" t="0" r="0" b="0"/>
             <wp:docPr id="1" name="image1.png"/>
@@ -125,25 +125,7 @@
           <w:szCs w:val="24"/>
           <w:u w:val="single"/>
         </w:rPr>
-        <w:t xml:space="preserve"> </w:t>
-      </w:r>
-      <w:proofErr w:type="spellStart"/>
-      <w:r>
-        <w:rPr>
-          <w:sz w:val="24"/>
-          <w:szCs w:val="24"/>
-          <w:u w:val="single"/>
-        </w:rPr>
-        <w:t>Grupo</w:t>
-      </w:r>
-      <w:proofErr w:type="spellEnd"/>
-      <w:r>
-        <w:rPr>
-          <w:sz w:val="24"/>
-          <w:szCs w:val="24"/>
-          <w:u w:val="single"/>
-        </w:rPr>
-        <w:t>:</w:t>
+        <w:t xml:space="preserve"> Grupo:</w:t>
       </w:r>
       <w:r>
         <w:rPr>
@@ -245,33 +227,8 @@
           <w:sz w:val="24"/>
           <w:szCs w:val="24"/>
         </w:rPr>
-        <w:t xml:space="preserve">Titular: </w:t>
-      </w:r>
-      <w:proofErr w:type="spellStart"/>
-      <w:r>
-        <w:rPr>
-          <w:sz w:val="24"/>
-          <w:szCs w:val="24"/>
-        </w:rPr>
-        <w:t>Ing</w:t>
-      </w:r>
-      <w:proofErr w:type="spellEnd"/>
-      <w:r>
-        <w:rPr>
-          <w:sz w:val="24"/>
-          <w:szCs w:val="24"/>
-        </w:rPr>
-        <w:t xml:space="preserve">. Judith </w:t>
-      </w:r>
-      <w:proofErr w:type="spellStart"/>
-      <w:r>
-        <w:rPr>
-          <w:sz w:val="24"/>
-          <w:szCs w:val="24"/>
-        </w:rPr>
-        <w:t>Meles</w:t>
-      </w:r>
-      <w:proofErr w:type="spellEnd"/>
+        <w:t>Titular: Ing. Judith Meles</w:t>
+      </w:r>
     </w:p>
     <w:p>
       <w:pPr>
@@ -291,85 +248,44 @@
           <w:color w:val="000000"/>
         </w:rPr>
       </w:pPr>
-      <w:proofErr w:type="spellStart"/>
       <w:r>
         <w:rPr>
           <w:sz w:val="24"/>
           <w:szCs w:val="24"/>
         </w:rPr>
-        <w:t>Jefa</w:t>
-      </w:r>
-      <w:proofErr w:type="spellEnd"/>
+        <w:t xml:space="preserve">Jefa de </w:t>
+      </w:r>
+      <w:proofErr w:type="spellStart"/>
       <w:r>
         <w:rPr>
           <w:sz w:val="24"/>
           <w:szCs w:val="24"/>
         </w:rPr>
-        <w:t xml:space="preserve"> de </w:t>
-      </w:r>
-      <w:proofErr w:type="spellStart"/>
+        <w:t>Trabajos</w:t>
+      </w:r>
+      <w:proofErr w:type="spellEnd"/>
       <w:r>
         <w:rPr>
           <w:sz w:val="24"/>
           <w:szCs w:val="24"/>
         </w:rPr>
-        <w:t>Trabajos</w:t>
-      </w:r>
-      <w:proofErr w:type="spellEnd"/>
+        <w:t xml:space="preserve"> </w:t>
+      </w:r>
+      <w:proofErr w:type="spellStart"/>
       <w:r>
         <w:rPr>
           <w:sz w:val="24"/>
           <w:szCs w:val="24"/>
         </w:rPr>
-        <w:t xml:space="preserve"> </w:t>
-      </w:r>
-      <w:proofErr w:type="spellStart"/>
+        <w:t>Prácticos</w:t>
+      </w:r>
+      <w:proofErr w:type="spellEnd"/>
       <w:r>
         <w:rPr>
           <w:sz w:val="24"/>
           <w:szCs w:val="24"/>
         </w:rPr>
-        <w:t>Prácticos</w:t>
-      </w:r>
-      <w:proofErr w:type="spellEnd"/>
-      <w:r>
-        <w:rPr>
-          <w:sz w:val="24"/>
-          <w:szCs w:val="24"/>
-        </w:rPr>
-        <w:t xml:space="preserve">: </w:t>
-      </w:r>
-      <w:proofErr w:type="spellStart"/>
-      <w:r>
-        <w:rPr>
-          <w:sz w:val="24"/>
-          <w:szCs w:val="24"/>
-        </w:rPr>
-        <w:t>Ing</w:t>
-      </w:r>
-      <w:proofErr w:type="spellEnd"/>
-      <w:r>
-        <w:rPr>
-          <w:sz w:val="24"/>
-          <w:szCs w:val="24"/>
-        </w:rPr>
-        <w:t xml:space="preserve">. </w:t>
-      </w:r>
-      <w:proofErr w:type="spellStart"/>
-      <w:r>
-        <w:rPr>
-          <w:sz w:val="24"/>
-          <w:szCs w:val="24"/>
-        </w:rPr>
-        <w:t>Mickaela</w:t>
-      </w:r>
-      <w:proofErr w:type="spellEnd"/>
-      <w:r>
-        <w:rPr>
-          <w:sz w:val="24"/>
-          <w:szCs w:val="24"/>
-        </w:rPr>
-        <w:t xml:space="preserve"> Crespo</w:t>
+        <w:t>: Ing. Mickaela Crespo</w:t>
       </w:r>
     </w:p>
     <w:p>
@@ -404,33 +320,8 @@
           <w:sz w:val="24"/>
           <w:szCs w:val="24"/>
         </w:rPr>
-        <w:t xml:space="preserve"> </w:t>
-      </w:r>
-      <w:proofErr w:type="spellStart"/>
-      <w:r>
-        <w:rPr>
-          <w:sz w:val="24"/>
-          <w:szCs w:val="24"/>
-        </w:rPr>
-        <w:t>Alumno</w:t>
-      </w:r>
-      <w:proofErr w:type="spellEnd"/>
-      <w:r>
-        <w:rPr>
-          <w:sz w:val="24"/>
-          <w:szCs w:val="24"/>
-        </w:rPr>
-        <w:t xml:space="preserve">: Salvador </w:t>
-      </w:r>
-      <w:proofErr w:type="spellStart"/>
-      <w:r>
-        <w:rPr>
-          <w:sz w:val="24"/>
-          <w:szCs w:val="24"/>
-        </w:rPr>
-        <w:t>Barbera</w:t>
-      </w:r>
-      <w:proofErr w:type="spellEnd"/>
+        <w:t xml:space="preserve"> Alumno: Salvador Barbera</w:t>
+      </w:r>
     </w:p>
     <w:p>
       <w:pPr>
@@ -445,34 +336,14 @@
           <w:szCs w:val="24"/>
         </w:rPr>
       </w:pPr>
-      <w:proofErr w:type="spellStart"/>
       <w:r>
         <w:rPr>
           <w:color w:val="1D2125"/>
           <w:sz w:val="24"/>
           <w:szCs w:val="24"/>
         </w:rPr>
-        <w:t>Ing</w:t>
-      </w:r>
-      <w:proofErr w:type="spellEnd"/>
-      <w:r>
-        <w:rPr>
-          <w:color w:val="1D2125"/>
-          <w:sz w:val="24"/>
-          <w:szCs w:val="24"/>
-        </w:rPr>
-        <w:t xml:space="preserve">. Valeria </w:t>
-      </w:r>
-      <w:proofErr w:type="spellStart"/>
-      <w:r>
-        <w:rPr>
-          <w:color w:val="1D2125"/>
-          <w:sz w:val="24"/>
-          <w:szCs w:val="24"/>
-        </w:rPr>
-        <w:t>Abdala</w:t>
-      </w:r>
-      <w:proofErr w:type="spellEnd"/>
+        <w:t>Ing. Valeria Abdala</w:t>
+      </w:r>
     </w:p>
     <w:p>
       <w:pPr>
@@ -542,37 +413,12 @@
         </w:rPr>
       </w:pPr>
       <w:hyperlink r:id="rId7">
-        <w:proofErr w:type="spellStart"/>
         <w:r>
           <w:rPr>
             <w:sz w:val="24"/>
             <w:szCs w:val="24"/>
           </w:rPr>
-          <w:t>Cufre</w:t>
-        </w:r>
-        <w:proofErr w:type="spellEnd"/>
-        <w:r>
-          <w:rPr>
-            <w:sz w:val="24"/>
-            <w:szCs w:val="24"/>
-          </w:rPr>
-          <w:t xml:space="preserve">, </w:t>
-        </w:r>
-        <w:proofErr w:type="spellStart"/>
-        <w:r>
-          <w:rPr>
-            <w:sz w:val="24"/>
-            <w:szCs w:val="24"/>
-          </w:rPr>
-          <w:t>Ángel</w:t>
-        </w:r>
-        <w:proofErr w:type="spellEnd"/>
-        <w:r>
-          <w:rPr>
-            <w:sz w:val="24"/>
-            <w:szCs w:val="24"/>
-          </w:rPr>
-          <w:t xml:space="preserve"> Hugo - 94490</w:t>
+          <w:t>Cufre, Ángel Hugo - 94490</w:t>
         </w:r>
       </w:hyperlink>
     </w:p>
@@ -602,69 +448,28 @@
             <w:sz w:val="24"/>
             <w:szCs w:val="24"/>
           </w:rPr>
-          <w:t xml:space="preserve">, </w:t>
+          <w:t>, Tomás - 94763</w:t>
         </w:r>
-        <w:proofErr w:type="spellStart"/>
+      </w:hyperlink>
+    </w:p>
+    <w:p>
+      <w:pPr>
+        <w:numPr>
+          <w:ilvl w:val="0"/>
+          <w:numId w:val="1"/>
+        </w:numPr>
+        <w:shd w:val="clear" w:color="auto" w:fill="FFFFFF"/>
+        <w:rPr>
+          <w:color w:val="000000"/>
+        </w:rPr>
+      </w:pPr>
+      <w:hyperlink r:id="rId9">
         <w:r>
           <w:rPr>
             <w:sz w:val="24"/>
             <w:szCs w:val="24"/>
           </w:rPr>
-          <w:t>Tomás</w:t>
-        </w:r>
-        <w:proofErr w:type="spellEnd"/>
-        <w:r>
-          <w:rPr>
-            <w:sz w:val="24"/>
-            <w:szCs w:val="24"/>
-          </w:rPr>
-          <w:t xml:space="preserve"> - 94763</w:t>
-        </w:r>
-      </w:hyperlink>
-    </w:p>
-    <w:p>
-      <w:pPr>
-        <w:numPr>
-          <w:ilvl w:val="0"/>
-          <w:numId w:val="1"/>
-        </w:numPr>
-        <w:shd w:val="clear" w:color="auto" w:fill="FFFFFF"/>
-        <w:rPr>
-          <w:color w:val="000000"/>
-        </w:rPr>
-      </w:pPr>
-      <w:hyperlink r:id="rId9">
-        <w:proofErr w:type="spellStart"/>
-        <w:r>
-          <w:rPr>
-            <w:sz w:val="24"/>
-            <w:szCs w:val="24"/>
-          </w:rPr>
-          <w:t>Espósito</w:t>
-        </w:r>
-        <w:proofErr w:type="spellEnd"/>
-        <w:r>
-          <w:rPr>
-            <w:sz w:val="24"/>
-            <w:szCs w:val="24"/>
-          </w:rPr>
-          <w:t xml:space="preserve">, </w:t>
-        </w:r>
-        <w:proofErr w:type="spellStart"/>
-        <w:r>
-          <w:rPr>
-            <w:sz w:val="24"/>
-            <w:szCs w:val="24"/>
-          </w:rPr>
-          <w:t>Nicolás</w:t>
-        </w:r>
-        <w:proofErr w:type="spellEnd"/>
-        <w:r>
-          <w:rPr>
-            <w:sz w:val="24"/>
-            <w:szCs w:val="24"/>
-          </w:rPr>
-          <w:t xml:space="preserve"> - 90203</w:t>
+          <w:t>Espósito, Nicolás - 90203</w:t>
         </w:r>
       </w:hyperlink>
     </w:p>
@@ -706,39 +511,7 @@
             <w:sz w:val="24"/>
             <w:szCs w:val="24"/>
           </w:rPr>
-          <w:t xml:space="preserve">Luna, </w:t>
-        </w:r>
-        <w:proofErr w:type="spellStart"/>
-        <w:r>
-          <w:rPr>
-            <w:sz w:val="24"/>
-            <w:szCs w:val="24"/>
-          </w:rPr>
-          <w:t>Ángel</w:t>
-        </w:r>
-        <w:proofErr w:type="spellEnd"/>
-        <w:r>
-          <w:rPr>
-            <w:sz w:val="24"/>
-            <w:szCs w:val="24"/>
-          </w:rPr>
-          <w:t xml:space="preserve"> </w:t>
-        </w:r>
-        <w:proofErr w:type="spellStart"/>
-        <w:r>
-          <w:rPr>
-            <w:sz w:val="24"/>
-            <w:szCs w:val="24"/>
-          </w:rPr>
-          <w:t>Nahuel</w:t>
-        </w:r>
-        <w:proofErr w:type="spellEnd"/>
-        <w:r>
-          <w:rPr>
-            <w:sz w:val="24"/>
-            <w:szCs w:val="24"/>
-          </w:rPr>
-          <w:t xml:space="preserve"> - 89627</w:t>
+          <w:t>Luna, Ángel Nahuel - 89627</w:t>
         </w:r>
       </w:hyperlink>
     </w:p>
@@ -759,69 +532,28 @@
             <w:sz w:val="24"/>
             <w:szCs w:val="24"/>
           </w:rPr>
-          <w:t xml:space="preserve">Longo </w:t>
+          <w:t>Longo Prudencio, Máximo - 97101</w:t>
         </w:r>
-        <w:proofErr w:type="spellStart"/>
+      </w:hyperlink>
+    </w:p>
+    <w:p>
+      <w:pPr>
+        <w:numPr>
+          <w:ilvl w:val="0"/>
+          <w:numId w:val="1"/>
+        </w:numPr>
+        <w:shd w:val="clear" w:color="auto" w:fill="FFFFFF"/>
+        <w:rPr>
+          <w:color w:val="000000"/>
+        </w:rPr>
+      </w:pPr>
+      <w:hyperlink r:id="rId13">
         <w:r>
           <w:rPr>
             <w:sz w:val="24"/>
             <w:szCs w:val="24"/>
           </w:rPr>
-          <w:t>Prudencio</w:t>
-        </w:r>
-        <w:proofErr w:type="spellEnd"/>
-        <w:r>
-          <w:rPr>
-            <w:sz w:val="24"/>
-            <w:szCs w:val="24"/>
-          </w:rPr>
-          <w:t xml:space="preserve">, </w:t>
-        </w:r>
-        <w:proofErr w:type="spellStart"/>
-        <w:r>
-          <w:rPr>
-            <w:sz w:val="24"/>
-            <w:szCs w:val="24"/>
-          </w:rPr>
-          <w:t>Máximo</w:t>
-        </w:r>
-        <w:proofErr w:type="spellEnd"/>
-        <w:r>
-          <w:rPr>
-            <w:sz w:val="24"/>
-            <w:szCs w:val="24"/>
-          </w:rPr>
-          <w:t xml:space="preserve"> - 97101</w:t>
-        </w:r>
-      </w:hyperlink>
-    </w:p>
-    <w:p>
-      <w:pPr>
-        <w:numPr>
-          <w:ilvl w:val="0"/>
-          <w:numId w:val="1"/>
-        </w:numPr>
-        <w:shd w:val="clear" w:color="auto" w:fill="FFFFFF"/>
-        <w:rPr>
-          <w:color w:val="000000"/>
-        </w:rPr>
-      </w:pPr>
-      <w:hyperlink r:id="rId13">
-        <w:proofErr w:type="spellStart"/>
-        <w:r>
-          <w:rPr>
-            <w:sz w:val="24"/>
-            <w:szCs w:val="24"/>
-          </w:rPr>
-          <w:t>Patolsky</w:t>
-        </w:r>
-        <w:proofErr w:type="spellEnd"/>
-        <w:r>
-          <w:rPr>
-            <w:sz w:val="24"/>
-            <w:szCs w:val="24"/>
-          </w:rPr>
-          <w:t>, Daniel - 92847</w:t>
+          <w:t>Patolsky, Daniel - 92847</w:t>
         </w:r>
       </w:hyperlink>
     </w:p>
@@ -851,23 +583,7 @@
             <w:sz w:val="24"/>
             <w:szCs w:val="24"/>
           </w:rPr>
-          <w:t xml:space="preserve">, </w:t>
-        </w:r>
-        <w:proofErr w:type="spellStart"/>
-        <w:r>
-          <w:rPr>
-            <w:sz w:val="24"/>
-            <w:szCs w:val="24"/>
-          </w:rPr>
-          <w:t>Máximo</w:t>
-        </w:r>
-        <w:proofErr w:type="spellEnd"/>
-        <w:r>
-          <w:rPr>
-            <w:sz w:val="24"/>
-            <w:szCs w:val="24"/>
-          </w:rPr>
-          <w:t xml:space="preserve"> - 98175</w:t>
+          <w:t>, Máximo - 98175</w:t>
         </w:r>
       </w:hyperlink>
     </w:p>
@@ -884,37 +600,12 @@
         </w:rPr>
       </w:pPr>
       <w:hyperlink r:id="rId15">
-        <w:proofErr w:type="spellStart"/>
         <w:r>
           <w:rPr>
             <w:sz w:val="24"/>
             <w:szCs w:val="24"/>
           </w:rPr>
-          <w:t>Uliana</w:t>
-        </w:r>
-        <w:proofErr w:type="spellEnd"/>
-        <w:r>
-          <w:rPr>
-            <w:sz w:val="24"/>
-            <w:szCs w:val="24"/>
-          </w:rPr>
-          <w:t xml:space="preserve">, </w:t>
-        </w:r>
-        <w:proofErr w:type="spellStart"/>
-        <w:r>
-          <w:rPr>
-            <w:sz w:val="24"/>
-            <w:szCs w:val="24"/>
-          </w:rPr>
-          <w:t>Agustín</w:t>
-        </w:r>
-        <w:proofErr w:type="spellEnd"/>
-        <w:r>
-          <w:rPr>
-            <w:sz w:val="24"/>
-            <w:szCs w:val="24"/>
-          </w:rPr>
-          <w:t xml:space="preserve"> - 97828</w:t>
+          <w:t>Uliana, Agustín - 97828</w:t>
         </w:r>
       </w:hyperlink>
     </w:p>
@@ -960,10 +651,7 @@
         <w:t xml:space="preserve"> https://github.com/Nahuellunacab/ISW_4K1_G4</w:t>
       </w:r>
     </w:p>
-    <w:p>
-      <w:bookmarkStart w:id="0" w:name="_GoBack"/>
-      <w:bookmarkEnd w:id="0"/>
-    </w:p>
+    <w:p/>
     <w:p>
       <w:pPr>
         <w:jc w:val="center"/>
@@ -1036,7 +724,6 @@
         <w:tc>
           <w:tcPr>
             <w:tcW w:w="2250" w:type="dxa"/>
-            <w:shd w:val="clear" w:color="auto" w:fill="auto"/>
             <w:tcMar>
               <w:top w:w="100" w:type="dxa"/>
               <w:left w:w="100" w:type="dxa"/>
@@ -1093,7 +780,53 @@
         <w:tc>
           <w:tcPr>
             <w:tcW w:w="4935" w:type="dxa"/>
-            <w:shd w:val="clear" w:color="auto" w:fill="auto"/>
+            <w:tcMar>
+              <w:top w:w="100" w:type="dxa"/>
+              <w:left w:w="100" w:type="dxa"/>
+              <w:bottom w:w="100" w:type="dxa"/>
+              <w:right w:w="100" w:type="dxa"/>
+            </w:tcMar>
+          </w:tcPr>
+          <w:p>
+            <w:pPr>
+              <w:widowControl w:val="0"/>
+              <w:pBdr>
+                <w:top w:val="nil"/>
+                <w:left w:val="nil"/>
+                <w:bottom w:val="nil"/>
+                <w:right w:val="nil"/>
+                <w:between w:val="nil"/>
+              </w:pBdr>
+              <w:spacing w:line="240" w:lineRule="auto"/>
+              <w:jc w:val="center"/>
+            </w:pPr>
+            <w:r>
+              <w:t xml:space="preserve">Reglas de </w:t>
+            </w:r>
+            <w:proofErr w:type="spellStart"/>
+            <w:r>
+              <w:t>nombrado</w:t>
+            </w:r>
+            <w:proofErr w:type="spellEnd"/>
+          </w:p>
+          <w:p>
+            <w:pPr>
+              <w:widowControl w:val="0"/>
+              <w:pBdr>
+                <w:top w:val="nil"/>
+                <w:left w:val="nil"/>
+                <w:bottom w:val="nil"/>
+                <w:right w:val="nil"/>
+                <w:between w:val="nil"/>
+              </w:pBdr>
+              <w:spacing w:line="240" w:lineRule="auto"/>
+              <w:jc w:val="center"/>
+            </w:pPr>
+          </w:p>
+        </w:tc>
+        <w:tc>
+          <w:tcPr>
+            <w:tcW w:w="3990" w:type="dxa"/>
             <w:tcMar>
               <w:top w:w="100" w:type="dxa"/>
               <w:left w:w="100" w:type="dxa"/>
@@ -1116,18 +849,26 @@
             </w:pPr>
             <w:proofErr w:type="spellStart"/>
             <w:r>
-              <w:t>Reglas</w:t>
-            </w:r>
-            <w:proofErr w:type="spellEnd"/>
-            <w:r>
-              <w:t xml:space="preserve"> de </w:t>
-            </w:r>
-            <w:proofErr w:type="spellStart"/>
-            <w:r>
-              <w:t>nombrado</w:t>
+              <w:t>Ubicación</w:t>
             </w:r>
             <w:proofErr w:type="spellEnd"/>
           </w:p>
+        </w:tc>
+      </w:tr>
+      <w:tr>
+        <w:trPr>
+          <w:trHeight w:val="480"/>
+        </w:trPr>
+        <w:tc>
+          <w:tcPr>
+            <w:tcW w:w="2250" w:type="dxa"/>
+            <w:tcMar>
+              <w:top w:w="100" w:type="dxa"/>
+              <w:left w:w="100" w:type="dxa"/>
+              <w:bottom w:w="100" w:type="dxa"/>
+              <w:right w:w="100" w:type="dxa"/>
+            </w:tcMar>
+          </w:tcPr>
           <w:p>
             <w:pPr>
               <w:widowControl w:val="0"/>
@@ -1139,14 +880,25 @@
                 <w:between w:val="nil"/>
               </w:pBdr>
               <w:spacing w:line="240" w:lineRule="auto"/>
-              <w:jc w:val="center"/>
             </w:pPr>
+            <w:proofErr w:type="spellStart"/>
+            <w:r>
+              <w:t>Trabajos</w:t>
+            </w:r>
+            <w:proofErr w:type="spellEnd"/>
+            <w:r>
+              <w:t xml:space="preserve"> </w:t>
+            </w:r>
+            <w:proofErr w:type="spellStart"/>
+            <w:r>
+              <w:t>Prácticos</w:t>
+            </w:r>
+            <w:proofErr w:type="spellEnd"/>
           </w:p>
         </w:tc>
         <w:tc>
           <w:tcPr>
-            <w:tcW w:w="3990" w:type="dxa"/>
-            <w:shd w:val="clear" w:color="auto" w:fill="auto"/>
+            <w:tcW w:w="4935" w:type="dxa"/>
             <w:tcMar>
               <w:top w:w="100" w:type="dxa"/>
               <w:left w:w="100" w:type="dxa"/>
@@ -1167,80 +919,6 @@
               <w:spacing w:line="240" w:lineRule="auto"/>
               <w:jc w:val="center"/>
             </w:pPr>
-            <w:proofErr w:type="spellStart"/>
-            <w:r>
-              <w:t>Ubicación</w:t>
-            </w:r>
-            <w:proofErr w:type="spellEnd"/>
-          </w:p>
-        </w:tc>
-      </w:tr>
-      <w:tr>
-        <w:trPr>
-          <w:trHeight w:val="480"/>
-        </w:trPr>
-        <w:tc>
-          <w:tcPr>
-            <w:tcW w:w="2250" w:type="dxa"/>
-            <w:shd w:val="clear" w:color="auto" w:fill="auto"/>
-            <w:tcMar>
-              <w:top w:w="100" w:type="dxa"/>
-              <w:left w:w="100" w:type="dxa"/>
-              <w:bottom w:w="100" w:type="dxa"/>
-              <w:right w:w="100" w:type="dxa"/>
-            </w:tcMar>
-          </w:tcPr>
-          <w:p>
-            <w:pPr>
-              <w:widowControl w:val="0"/>
-              <w:pBdr>
-                <w:top w:val="nil"/>
-                <w:left w:val="nil"/>
-                <w:bottom w:val="nil"/>
-                <w:right w:val="nil"/>
-                <w:between w:val="nil"/>
-              </w:pBdr>
-              <w:spacing w:line="240" w:lineRule="auto"/>
-            </w:pPr>
-            <w:proofErr w:type="spellStart"/>
-            <w:r>
-              <w:t>Trabajos</w:t>
-            </w:r>
-            <w:proofErr w:type="spellEnd"/>
-            <w:r>
-              <w:t xml:space="preserve"> </w:t>
-            </w:r>
-            <w:proofErr w:type="spellStart"/>
-            <w:r>
-              <w:t>Prácticos</w:t>
-            </w:r>
-            <w:proofErr w:type="spellEnd"/>
-          </w:p>
-        </w:tc>
-        <w:tc>
-          <w:tcPr>
-            <w:tcW w:w="4935" w:type="dxa"/>
-            <w:shd w:val="clear" w:color="auto" w:fill="auto"/>
-            <w:tcMar>
-              <w:top w:w="100" w:type="dxa"/>
-              <w:left w:w="100" w:type="dxa"/>
-              <w:bottom w:w="100" w:type="dxa"/>
-              <w:right w:w="100" w:type="dxa"/>
-            </w:tcMar>
-          </w:tcPr>
-          <w:p>
-            <w:pPr>
-              <w:widowControl w:val="0"/>
-              <w:pBdr>
-                <w:top w:val="nil"/>
-                <w:left w:val="nil"/>
-                <w:bottom w:val="nil"/>
-                <w:right w:val="nil"/>
-                <w:between w:val="nil"/>
-              </w:pBdr>
-              <w:spacing w:line="240" w:lineRule="auto"/>
-              <w:jc w:val="center"/>
-            </w:pPr>
             <w:r>
               <w:t>TP#_&lt;</w:t>
             </w:r>
@@ -1257,7 +935,6 @@
         <w:tc>
           <w:tcPr>
             <w:tcW w:w="3990" w:type="dxa"/>
-            <w:shd w:val="clear" w:color="auto" w:fill="auto"/>
             <w:tcMar>
               <w:top w:w="100" w:type="dxa"/>
               <w:left w:w="100" w:type="dxa"/>
@@ -1306,7 +983,6 @@
         <w:tc>
           <w:tcPr>
             <w:tcW w:w="2250" w:type="dxa"/>
-            <w:shd w:val="clear" w:color="auto" w:fill="auto"/>
             <w:tcMar>
               <w:top w:w="100" w:type="dxa"/>
               <w:left w:w="100" w:type="dxa"/>
@@ -1345,7 +1021,6 @@
         <w:tc>
           <w:tcPr>
             <w:tcW w:w="4935" w:type="dxa"/>
-            <w:shd w:val="clear" w:color="auto" w:fill="auto"/>
             <w:tcMar>
               <w:top w:w="100" w:type="dxa"/>
               <w:left w:w="100" w:type="dxa"/>
@@ -1382,7 +1057,6 @@
         <w:tc>
           <w:tcPr>
             <w:tcW w:w="3990" w:type="dxa"/>
-            <w:shd w:val="clear" w:color="auto" w:fill="auto"/>
             <w:tcMar>
               <w:top w:w="100" w:type="dxa"/>
               <w:left w:w="100" w:type="dxa"/>
@@ -1455,7 +1129,6 @@
         <w:tc>
           <w:tcPr>
             <w:tcW w:w="2250" w:type="dxa"/>
-            <w:shd w:val="clear" w:color="auto" w:fill="auto"/>
             <w:tcMar>
               <w:top w:w="100" w:type="dxa"/>
               <w:left w:w="100" w:type="dxa"/>
@@ -1486,7 +1159,6 @@
         <w:tc>
           <w:tcPr>
             <w:tcW w:w="4935" w:type="dxa"/>
-            <w:shd w:val="clear" w:color="auto" w:fill="auto"/>
             <w:tcMar>
               <w:top w:w="100" w:type="dxa"/>
               <w:left w:w="100" w:type="dxa"/>
@@ -1539,7 +1211,6 @@
         <w:tc>
           <w:tcPr>
             <w:tcW w:w="3990" w:type="dxa"/>
-            <w:shd w:val="clear" w:color="auto" w:fill="auto"/>
             <w:tcMar>
               <w:top w:w="100" w:type="dxa"/>
               <w:left w:w="100" w:type="dxa"/>
@@ -1596,7 +1267,6 @@
         <w:tc>
           <w:tcPr>
             <w:tcW w:w="2250" w:type="dxa"/>
-            <w:shd w:val="clear" w:color="auto" w:fill="auto"/>
             <w:tcMar>
               <w:top w:w="100" w:type="dxa"/>
               <w:left w:w="100" w:type="dxa"/>
@@ -1629,7 +1299,6 @@
         <w:tc>
           <w:tcPr>
             <w:tcW w:w="4935" w:type="dxa"/>
-            <w:shd w:val="clear" w:color="auto" w:fill="auto"/>
             <w:tcMar>
               <w:top w:w="100" w:type="dxa"/>
               <w:left w:w="100" w:type="dxa"/>
@@ -1666,7 +1335,6 @@
         <w:tc>
           <w:tcPr>
             <w:tcW w:w="3990" w:type="dxa"/>
-            <w:shd w:val="clear" w:color="auto" w:fill="auto"/>
             <w:tcMar>
               <w:top w:w="100" w:type="dxa"/>
               <w:left w:w="100" w:type="dxa"/>
@@ -1698,6 +1366,108 @@
           </w:p>
         </w:tc>
       </w:tr>
+      <w:tr>
+        <w:trPr>
+          <w:trHeight w:val="610"/>
+        </w:trPr>
+        <w:tc>
+          <w:tcPr>
+            <w:tcW w:w="2250" w:type="dxa"/>
+            <w:tcMar>
+              <w:top w:w="100" w:type="dxa"/>
+              <w:left w:w="100" w:type="dxa"/>
+              <w:bottom w:w="100" w:type="dxa"/>
+              <w:right w:w="100" w:type="dxa"/>
+            </w:tcMar>
+          </w:tcPr>
+          <w:p>
+            <w:pPr>
+              <w:widowControl w:val="0"/>
+              <w:pBdr>
+                <w:top w:val="nil"/>
+                <w:left w:val="nil"/>
+                <w:bottom w:val="nil"/>
+                <w:right w:val="nil"/>
+                <w:between w:val="nil"/>
+              </w:pBdr>
+              <w:spacing w:line="240" w:lineRule="auto"/>
+            </w:pPr>
+            <w:proofErr w:type="spellStart"/>
+            <w:r>
+              <w:t>Bibliografia</w:t>
+            </w:r>
+            <w:proofErr w:type="spellEnd"/>
+            <w:r>
+              <w:t xml:space="preserve"> Pensamiento </w:t>
+            </w:r>
+            <w:proofErr w:type="spellStart"/>
+            <w:r>
+              <w:t>Ágil</w:t>
+            </w:r>
+            <w:proofErr w:type="spellEnd"/>
+          </w:p>
+        </w:tc>
+        <w:tc>
+          <w:tcPr>
+            <w:tcW w:w="4935" w:type="dxa"/>
+            <w:tcMar>
+              <w:top w:w="100" w:type="dxa"/>
+              <w:left w:w="100" w:type="dxa"/>
+              <w:bottom w:w="100" w:type="dxa"/>
+              <w:right w:w="100" w:type="dxa"/>
+            </w:tcMar>
+          </w:tcPr>
+          <w:p>
+            <w:pPr>
+              <w:widowControl w:val="0"/>
+              <w:pBdr>
+                <w:top w:val="nil"/>
+                <w:left w:val="nil"/>
+                <w:bottom w:val="nil"/>
+                <w:right w:val="nil"/>
+                <w:between w:val="nil"/>
+              </w:pBdr>
+              <w:spacing w:line="240" w:lineRule="auto"/>
+              <w:jc w:val="center"/>
+            </w:pPr>
+            <w:r>
+              <w:t>PA_&lt;</w:t>
+            </w:r>
+            <w:proofErr w:type="spellStart"/>
+            <w:r>
+              <w:t>NombreLibro</w:t>
+            </w:r>
+            <w:proofErr w:type="spellEnd"/>
+            <w:r>
+              <w:t>&gt;.pdf</w:t>
+            </w:r>
+          </w:p>
+        </w:tc>
+        <w:tc>
+          <w:tcPr>
+            <w:tcW w:w="3990" w:type="dxa"/>
+            <w:tcMar>
+              <w:top w:w="100" w:type="dxa"/>
+              <w:left w:w="100" w:type="dxa"/>
+              <w:bottom w:w="100" w:type="dxa"/>
+              <w:right w:w="100" w:type="dxa"/>
+            </w:tcMar>
+          </w:tcPr>
+          <w:p>
+            <w:pPr>
+              <w:widowControl w:val="0"/>
+              <w:pBdr>
+                <w:top w:val="nil"/>
+                <w:left w:val="nil"/>
+                <w:bottom w:val="nil"/>
+                <w:right w:val="nil"/>
+                <w:between w:val="nil"/>
+              </w:pBdr>
+              <w:spacing w:line="240" w:lineRule="auto"/>
+            </w:pPr>
+          </w:p>
+        </w:tc>
+      </w:tr>
     </w:tbl>
     <w:p/>
     <w:p>
@@ -1958,7 +1728,7 @@
           <w:noProof/>
         </w:rPr>
         <w:drawing>
-          <wp:inline distT="114300" distB="114300" distL="114300" distR="114300">
+          <wp:inline distT="114300" distB="114300" distL="114300" distR="114300" wp14:anchorId="3CAC1CB1" wp14:editId="31D595BB">
             <wp:extent cx="5731200" cy="6438900"/>
             <wp:effectExtent l="0" t="0" r="0" b="0"/>
             <wp:docPr id="2" name="image2.png"/>
@@ -2033,27 +1803,7 @@
           <w:szCs w:val="30"/>
           <w:u w:val="single"/>
         </w:rPr>
-        <w:t xml:space="preserve"> de </w:t>
-      </w:r>
-      <w:proofErr w:type="spellStart"/>
-      <w:r>
-        <w:rPr>
-          <w:b/>
-          <w:sz w:val="30"/>
-          <w:szCs w:val="30"/>
-          <w:u w:val="single"/>
-        </w:rPr>
-        <w:t>Línea</w:t>
-      </w:r>
-      <w:proofErr w:type="spellEnd"/>
-      <w:r>
-        <w:rPr>
-          <w:b/>
-          <w:sz w:val="30"/>
-          <w:szCs w:val="30"/>
-          <w:u w:val="single"/>
-        </w:rPr>
-        <w:t xml:space="preserve"> Base</w:t>
+        <w:t xml:space="preserve"> de Línea Base</w:t>
       </w:r>
     </w:p>
     <w:p/>
@@ -2158,15 +1908,7 @@
       </w:r>
       <w:proofErr w:type="spellEnd"/>
       <w:r>
-        <w:t xml:space="preserve">. </w:t>
-      </w:r>
-      <w:proofErr w:type="spellStart"/>
-      <w:r>
-        <w:t>Esto</w:t>
-      </w:r>
-      <w:proofErr w:type="spellEnd"/>
-      <w:r>
-        <w:t xml:space="preserve"> </w:t>
+        <w:t xml:space="preserve">. Esto </w:t>
       </w:r>
       <w:proofErr w:type="spellStart"/>
       <w:r>
@@ -2291,7 +2033,7 @@
 </file>
 
 <file path=word/numbering.xml><?xml version="1.0" encoding="utf-8"?>
-<w:numbering xmlns:wpc="http://schemas.microsoft.com/office/word/2010/wordprocessingCanvas" xmlns:cx="http://schemas.microsoft.com/office/drawing/2014/chartex" xmlns:mc="http://schemas.openxmlformats.org/markup-compatibility/2006" xmlns:o="urn:schemas-microsoft-com:office:office" xmlns:r="http://schemas.openxmlformats.org/officeDocument/2006/relationships" xmlns:m="http://schemas.openxmlformats.org/officeDocument/2006/math" xmlns:v="urn:schemas-microsoft-com:vml" xmlns:wp14="http://schemas.microsoft.com/office/word/2010/wordprocessingDrawing" xmlns:wp="http://schemas.openxmlformats.org/drawingml/2006/wordprocessingDrawing" xmlns:w10="urn:schemas-microsoft-com:office:word" xmlns:w="http://schemas.openxmlformats.org/wordprocessingml/2006/main" xmlns:w14="http://schemas.microsoft.com/office/word/2010/wordml" xmlns:w15="http://schemas.microsoft.com/office/word/2012/wordml" xmlns:w16se="http://schemas.microsoft.com/office/word/2015/wordml/symex" xmlns:wpg="http://schemas.microsoft.com/office/word/2010/wordprocessingGroup" xmlns:wpi="http://schemas.microsoft.com/office/word/2010/wordprocessingInk" xmlns:wne="http://schemas.microsoft.com/office/word/2006/wordml" xmlns:wps="http://schemas.microsoft.com/office/word/2010/wordprocessingShape" mc:Ignorable="w14 w15 w16se wp14">
+<w:numbering xmlns:wpc="http://schemas.microsoft.com/office/word/2010/wordprocessingCanvas" xmlns:cx="http://schemas.microsoft.com/office/drawing/2014/chartex" xmlns:cx1="http://schemas.microsoft.com/office/drawing/2015/9/8/chartex" xmlns:cx2="http://schemas.microsoft.com/office/drawing/2015/10/21/chartex" xmlns:cx3="http://schemas.microsoft.com/office/drawing/2016/5/9/chartex" xmlns:cx4="http://schemas.microsoft.com/office/drawing/2016/5/10/chartex" xmlns:cx5="http://schemas.microsoft.com/office/drawing/2016/5/11/chartex" xmlns:cx6="http://schemas.microsoft.com/office/drawing/2016/5/12/chartex" xmlns:cx7="http://schemas.microsoft.com/office/drawing/2016/5/13/chartex" xmlns:cx8="http://schemas.microsoft.com/office/drawing/2016/5/14/chartex" xmlns:mc="http://schemas.openxmlformats.org/markup-compatibility/2006" xmlns:aink="http://schemas.microsoft.com/office/drawing/2016/ink" xmlns:am3d="http://schemas.microsoft.com/office/drawing/2017/model3d" xmlns:o="urn:schemas-microsoft-com:office:office" xmlns:oel="http://schemas.microsoft.com/office/2019/extlst" xmlns:r="http://schemas.openxmlformats.org/officeDocument/2006/relationships" xmlns:m="http://schemas.openxmlformats.org/officeDocument/2006/math" xmlns:v="urn:schemas-microsoft-com:vml" xmlns:wp14="http://schemas.microsoft.com/office/word/2010/wordprocessingDrawing" xmlns:wp="http://schemas.openxmlformats.org/drawingml/2006/wordprocessingDrawing" xmlns:w10="urn:schemas-microsoft-com:office:word" xmlns:w="http://schemas.openxmlformats.org/wordprocessingml/2006/main" xmlns:w14="http://schemas.microsoft.com/office/word/2010/wordml" xmlns:w15="http://schemas.microsoft.com/office/word/2012/wordml" xmlns:w16cex="http://schemas.microsoft.com/office/word/2018/wordml/cex" xmlns:w16cid="http://schemas.microsoft.com/office/word/2016/wordml/cid" xmlns:w16="http://schemas.microsoft.com/office/word/2018/wordml" xmlns:w16du="http://schemas.microsoft.com/office/word/2023/wordml/word16du" xmlns:w16sdtdh="http://schemas.microsoft.com/office/word/2020/wordml/sdtdatahash" xmlns:w16sdtfl="http://schemas.microsoft.com/office/word/2024/wordml/sdtformatlock" xmlns:w16se="http://schemas.microsoft.com/office/word/2015/wordml/symex" xmlns:wpg="http://schemas.microsoft.com/office/word/2010/wordprocessingGroup" xmlns:wpi="http://schemas.microsoft.com/office/word/2010/wordprocessingInk" xmlns:wne="http://schemas.microsoft.com/office/word/2006/wordml" xmlns:wps="http://schemas.microsoft.com/office/word/2010/wordprocessingShape" mc:Ignorable="w14 w15 w16se w16cid w16 w16cex w16sdtdh w16sdtfl w16du wp14">
   <w:abstractNum w:abstractNumId="0" w15:restartNumberingAfterBreak="0">
     <w:nsid w:val="2ED02198"/>
     <w:multiLevelType w:val="multilevel"/>
@@ -2522,17 +2264,17 @@
       </w:rPr>
     </w:lvl>
   </w:abstractNum>
-  <w:num w:numId="1">
+  <w:num w:numId="1" w16cid:durableId="1963148650">
     <w:abstractNumId w:val="1"/>
   </w:num>
-  <w:num w:numId="2">
+  <w:num w:numId="2" w16cid:durableId="907616776">
     <w:abstractNumId w:val="0"/>
   </w:num>
 </w:numbering>
 </file>
 
 <file path=word/styles.xml><?xml version="1.0" encoding="utf-8"?>
-<w:styles xmlns:mc="http://schemas.openxmlformats.org/markup-compatibility/2006" xmlns:r="http://schemas.openxmlformats.org/officeDocument/2006/relationships" xmlns:w="http://schemas.openxmlformats.org/wordprocessingml/2006/main" xmlns:w14="http://schemas.microsoft.com/office/word/2010/wordml" xmlns:w15="http://schemas.microsoft.com/office/word/2012/wordml" xmlns:w16se="http://schemas.microsoft.com/office/word/2015/wordml/symex" mc:Ignorable="w14 w15 w16se">
+<w:styles xmlns:mc="http://schemas.openxmlformats.org/markup-compatibility/2006" xmlns:r="http://schemas.openxmlformats.org/officeDocument/2006/relationships" xmlns:w="http://schemas.openxmlformats.org/wordprocessingml/2006/main" xmlns:w14="http://schemas.microsoft.com/office/word/2010/wordml" xmlns:w15="http://schemas.microsoft.com/office/word/2012/wordml" xmlns:w16cex="http://schemas.microsoft.com/office/word/2018/wordml/cex" xmlns:w16cid="http://schemas.microsoft.com/office/word/2016/wordml/cid" xmlns:w16="http://schemas.microsoft.com/office/word/2018/wordml" xmlns:w16du="http://schemas.microsoft.com/office/word/2023/wordml/word16du" xmlns:w16sdtdh="http://schemas.microsoft.com/office/word/2020/wordml/sdtdatahash" xmlns:w16sdtfl="http://schemas.microsoft.com/office/word/2024/wordml/sdtformatlock" xmlns:w16se="http://schemas.microsoft.com/office/word/2015/wordml/symex" mc:Ignorable="w14 w15 w16se w16cid w16 w16cex w16sdtdh w16sdtfl w16du">
   <w:docDefaults>
     <w:rPrDefault>
       <w:rPr>
@@ -2548,7 +2290,7 @@
       </w:pPr>
     </w:pPrDefault>
   </w:docDefaults>
-  <w:latentStyles w:defLockedState="0" w:defUIPriority="99" w:defSemiHidden="0" w:defUnhideWhenUsed="0" w:defQFormat="0" w:count="371">
+  <w:latentStyles w:defLockedState="0" w:defUIPriority="99" w:defSemiHidden="0" w:defUnhideWhenUsed="0" w:defQFormat="0" w:count="376">
     <w:lsdException w:name="Normal" w:uiPriority="0" w:qFormat="1"/>
     <w:lsdException w:name="heading 1" w:uiPriority="9" w:qFormat="1"/>
     <w:lsdException w:name="heading 2" w:semiHidden="1" w:uiPriority="9" w:unhideWhenUsed="1" w:qFormat="1"/>
@@ -2920,6 +2662,11 @@
     <w:lsdException w:name="List Table 5 Dark Accent 6" w:uiPriority="50"/>
     <w:lsdException w:name="List Table 6 Colorful Accent 6" w:uiPriority="51"/>
     <w:lsdException w:name="List Table 7 Colorful Accent 6" w:uiPriority="52"/>
+    <w:lsdException w:name="Mention" w:semiHidden="1" w:unhideWhenUsed="1"/>
+    <w:lsdException w:name="Smart Hyperlink" w:semiHidden="1" w:unhideWhenUsed="1"/>
+    <w:lsdException w:name="Hashtag" w:semiHidden="1" w:unhideWhenUsed="1"/>
+    <w:lsdException w:name="Unresolved Mention" w:semiHidden="1" w:unhideWhenUsed="1"/>
+    <w:lsdException w:name="Smart Link" w:semiHidden="1" w:unhideWhenUsed="1"/>
   </w:latentStyles>
   <w:style w:type="paragraph" w:default="1" w:styleId="Normal">
     <w:name w:val="Normal"/>

</xml_diff>

<commit_message>
Actualización IC en Docx de PC
</commit_message>
<xml_diff>
--- a/Plan_Gestion_Configuracion_G4_ISW_4K1.docx
+++ b/Plan_Gestion_Configuracion_G4_ISW_4K1.docx
@@ -1465,6 +1465,26 @@
               </w:pBdr>
               <w:spacing w:line="240" w:lineRule="auto"/>
             </w:pPr>
+            <w:hyperlink r:id="rId20" w:history="1">
+              <w:r>
+                <w:rPr>
+                  <w:rStyle w:val="Hipervnculo"/>
+                </w:rPr>
+                <w:t>Bibliografia</w:t>
+              </w:r>
+              <w:r>
+                <w:rPr>
+                  <w:rStyle w:val="Hipervnculo"/>
+                </w:rPr>
+                <w:t>/</w:t>
+              </w:r>
+              <w:r>
+                <w:rPr>
+                  <w:rStyle w:val="Hipervnculo"/>
+                </w:rPr>
+                <w:t>Bibliografia_De_La_Catedra/MaterialBibliografico/Pensamiento_Ágil</w:t>
+              </w:r>
+            </w:hyperlink>
           </w:p>
         </w:tc>
       </w:tr>
@@ -1741,7 +1761,7 @@
                     <pic:cNvPicPr preferRelativeResize="0"/>
                   </pic:nvPicPr>
                   <pic:blipFill>
-                    <a:blip r:embed="rId20"/>
+                    <a:blip r:embed="rId21"/>
                     <a:srcRect/>
                     <a:stretch>
                       <a:fillRect/>
@@ -2842,6 +2862,41 @@
       </w:tblCellMar>
     </w:tblPr>
   </w:style>
+  <w:style w:type="character" w:styleId="Hipervnculo">
+    <w:name w:val="Hyperlink"/>
+    <w:basedOn w:val="Fuentedeprrafopredeter"/>
+    <w:uiPriority w:val="99"/>
+    <w:unhideWhenUsed/>
+    <w:rsid w:val="0017035C"/>
+    <w:rPr>
+      <w:color w:val="0000FF" w:themeColor="hyperlink"/>
+      <w:u w:val="single"/>
+    </w:rPr>
+  </w:style>
+  <w:style w:type="character" w:styleId="Mencinsinresolver">
+    <w:name w:val="Unresolved Mention"/>
+    <w:basedOn w:val="Fuentedeprrafopredeter"/>
+    <w:uiPriority w:val="99"/>
+    <w:semiHidden/>
+    <w:unhideWhenUsed/>
+    <w:rsid w:val="0017035C"/>
+    <w:rPr>
+      <w:color w:val="605E5C"/>
+      <w:shd w:val="clear" w:color="auto" w:fill="E1DFDD"/>
+    </w:rPr>
+  </w:style>
+  <w:style w:type="character" w:styleId="Hipervnculovisitado">
+    <w:name w:val="FollowedHyperlink"/>
+    <w:basedOn w:val="Fuentedeprrafopredeter"/>
+    <w:uiPriority w:val="99"/>
+    <w:semiHidden/>
+    <w:unhideWhenUsed/>
+    <w:rsid w:val="0017035C"/>
+    <w:rPr>
+      <w:color w:val="800080" w:themeColor="followedHyperlink"/>
+      <w:u w:val="single"/>
+    </w:rPr>
+  </w:style>
 </w:styles>
 </file>
 

</xml_diff>

<commit_message>
actualicé la estructura y el criterio de la linea base en el doc, y la nomenclatura de la minuta
</commit_message>
<xml_diff>
--- a/Plan_Gestion_Configuracion_G4_ISW_4K1.docx
+++ b/Plan_Gestion_Configuracion_G4_ISW_4K1.docx
@@ -1,6 +1,6 @@
 
 <file path=word/document.xml><?xml version="1.0" encoding="utf-8"?>
-<w:document xmlns:wpc="http://schemas.microsoft.com/office/word/2010/wordprocessingCanvas" xmlns:cx="http://schemas.microsoft.com/office/drawing/2014/chartex" xmlns:cx1="http://schemas.microsoft.com/office/drawing/2015/9/8/chartex" xmlns:cx2="http://schemas.microsoft.com/office/drawing/2015/10/21/chartex" xmlns:cx3="http://schemas.microsoft.com/office/drawing/2016/5/9/chartex" xmlns:cx4="http://schemas.microsoft.com/office/drawing/2016/5/10/chartex" xmlns:cx5="http://schemas.microsoft.com/office/drawing/2016/5/11/chartex" xmlns:cx6="http://schemas.microsoft.com/office/drawing/2016/5/12/chartex" xmlns:cx7="http://schemas.microsoft.com/office/drawing/2016/5/13/chartex" xmlns:cx8="http://schemas.microsoft.com/office/drawing/2016/5/14/chartex" xmlns:mc="http://schemas.openxmlformats.org/markup-compatibility/2006" xmlns:aink="http://schemas.microsoft.com/office/drawing/2016/ink" xmlns:am3d="http://schemas.microsoft.com/office/drawing/2017/model3d" xmlns:o="urn:schemas-microsoft-com:office:office" xmlns:oel="http://schemas.microsoft.com/office/2019/extlst" xmlns:r="http://schemas.openxmlformats.org/officeDocument/2006/relationships" xmlns:m="http://schemas.openxmlformats.org/officeDocument/2006/math" xmlns:v="urn:schemas-microsoft-com:vml" xmlns:wp14="http://schemas.microsoft.com/office/word/2010/wordprocessingDrawing" xmlns:wp="http://schemas.openxmlformats.org/drawingml/2006/wordprocessingDrawing" xmlns:w10="urn:schemas-microsoft-com:office:word" xmlns:w="http://schemas.openxmlformats.org/wordprocessingml/2006/main" xmlns:w14="http://schemas.microsoft.com/office/word/2010/wordml" xmlns:w15="http://schemas.microsoft.com/office/word/2012/wordml" xmlns:w16cex="http://schemas.microsoft.com/office/word/2018/wordml/cex" xmlns:w16cid="http://schemas.microsoft.com/office/word/2016/wordml/cid" xmlns:w16="http://schemas.microsoft.com/office/word/2018/wordml" xmlns:w16du="http://schemas.microsoft.com/office/word/2023/wordml/word16du" xmlns:w16sdtdh="http://schemas.microsoft.com/office/word/2020/wordml/sdtdatahash" xmlns:w16sdtfl="http://schemas.microsoft.com/office/word/2024/wordml/sdtformatlock" xmlns:w16se="http://schemas.microsoft.com/office/word/2015/wordml/symex" xmlns:wpg="http://schemas.microsoft.com/office/word/2010/wordprocessingGroup" xmlns:wpi="http://schemas.microsoft.com/office/word/2010/wordprocessingInk" xmlns:wne="http://schemas.microsoft.com/office/word/2006/wordml" xmlns:wps="http://schemas.microsoft.com/office/word/2010/wordprocessingShape" mc:Ignorable="w14 w15 w16se w16cid w16 w16cex w16sdtdh w16sdtfl w16du wp14">
+<w:document xmlns:wpc="http://schemas.microsoft.com/office/word/2010/wordprocessingCanvas" xmlns:cx="http://schemas.microsoft.com/office/drawing/2014/chartex" xmlns:cx1="http://schemas.microsoft.com/office/drawing/2015/9/8/chartex" xmlns:cx2="http://schemas.microsoft.com/office/drawing/2015/10/21/chartex" xmlns:cx3="http://schemas.microsoft.com/office/drawing/2016/5/9/chartex" xmlns:cx4="http://schemas.microsoft.com/office/drawing/2016/5/10/chartex" xmlns:cx5="http://schemas.microsoft.com/office/drawing/2016/5/11/chartex" xmlns:cx6="http://schemas.microsoft.com/office/drawing/2016/5/12/chartex" xmlns:cx7="http://schemas.microsoft.com/office/drawing/2016/5/13/chartex" xmlns:cx8="http://schemas.microsoft.com/office/drawing/2016/5/14/chartex" xmlns:mc="http://schemas.openxmlformats.org/markup-compatibility/2006" xmlns:aink="http://schemas.microsoft.com/office/drawing/2016/ink" xmlns:am3d="http://schemas.microsoft.com/office/drawing/2017/model3d" xmlns:o="urn:schemas-microsoft-com:office:office" xmlns:oel="http://schemas.microsoft.com/office/2019/extlst" xmlns:r="http://schemas.openxmlformats.org/officeDocument/2006/relationships" xmlns:m="http://schemas.openxmlformats.org/officeDocument/2006/math" xmlns:v="urn:schemas-microsoft-com:vml" xmlns:wp14="http://schemas.microsoft.com/office/word/2010/wordprocessingDrawing" xmlns:wp="http://schemas.openxmlformats.org/drawingml/2006/wordprocessingDrawing" xmlns:w10="urn:schemas-microsoft-com:office:word" xmlns:w="http://schemas.openxmlformats.org/wordprocessingml/2006/main" xmlns:w14="http://schemas.microsoft.com/office/word/2010/wordml" xmlns:w15="http://schemas.microsoft.com/office/word/2012/wordml" xmlns:w16cex="http://schemas.microsoft.com/office/word/2018/wordml/cex" xmlns:w16cid="http://schemas.microsoft.com/office/word/2016/wordml/cid" xmlns:w16="http://schemas.microsoft.com/office/word/2018/wordml" xmlns:w16du="http://schemas.microsoft.com/office/word/2023/wordml/word16du" xmlns:w16sdtdh="http://schemas.microsoft.com/office/word/2020/wordml/sdtdatahash" xmlns:w16sdtfl="http://schemas.microsoft.com/office/word/2024/wordml/sdtformatlock" xmlns:w16se="http://schemas.microsoft.com/office/word/2015/wordml/symex" xmlns:wpg="http://schemas.microsoft.com/office/word/2010/wordprocessingGroup" xmlns:wpi="http://schemas.microsoft.com/office/word/2010/wordprocessingInk" xmlns:wne="http://schemas.microsoft.com/office/word/2006/wordml" xmlns:wps="http://schemas.microsoft.com/office/word/2010/wordprocessingShape" xmlns:a="http://schemas.openxmlformats.org/drawingml/2006/main" xmlns:pic="http://schemas.openxmlformats.org/drawingml/2006/picture" xmlns:a14="http://schemas.microsoft.com/office/drawing/2010/main" mc:Ignorable="w14 w15 w16se w16cid w16 w16cex w16sdtdh w16sdtfl w16du wp14">
   <w:body>
     <w:p>
       <w:pPr>
@@ -702,12 +702,12 @@
         <w:tblW w:w="11175" w:type="dxa"/>
         <w:tblInd w:w="-1020" w:type="dxa"/>
         <w:tblBorders>
-          <w:top w:val="single" w:sz="8" w:space="0" w:color="000000"/>
-          <w:left w:val="single" w:sz="8" w:space="0" w:color="000000"/>
-          <w:bottom w:val="single" w:sz="8" w:space="0" w:color="000000"/>
-          <w:right w:val="single" w:sz="8" w:space="0" w:color="000000"/>
-          <w:insideH w:val="single" w:sz="8" w:space="0" w:color="000000"/>
-          <w:insideV w:val="single" w:sz="8" w:space="0" w:color="000000"/>
+          <w:top w:val="single" w:color="000000" w:sz="8" w:space="0"/>
+          <w:left w:val="single" w:color="000000" w:sz="8" w:space="0"/>
+          <w:bottom w:val="single" w:color="000000" w:sz="8" w:space="0"/>
+          <w:right w:val="single" w:color="000000" w:sz="8" w:space="0"/>
+          <w:insideH w:val="single" w:color="000000" w:sz="8" w:space="0"/>
+          <w:insideV w:val="single" w:color="000000" w:sz="8" w:space="0"/>
         </w:tblBorders>
         <w:tblLayout w:type="fixed"/>
         <w:tblLook w:val="0600" w:firstRow="0" w:lastRow="0" w:firstColumn="0" w:lastColumn="0" w:noHBand="1" w:noVBand="1"/>
@@ -1465,7 +1465,7 @@
               </w:pBdr>
               <w:spacing w:line="240" w:lineRule="auto"/>
             </w:pPr>
-            <w:hyperlink r:id="rId20" w:history="1">
+            <w:hyperlink w:history="1" r:id="rId20">
               <w:r>
                 <w:rPr>
                   <w:rStyle w:val="Hipervnculo"/>
@@ -1678,7 +1678,7 @@
           <w:u w:val="single"/>
         </w:rPr>
         <w:sectPr>
-          <w:pgSz w:w="11909" w:h="16834"/>
+          <w:pgSz w:w="11909" w:h="16834" w:orient="portrait"/>
           <w:pgMar w:top="1440" w:right="1440" w:bottom="1440" w:left="1440" w:header="720" w:footer="720" w:gutter="0"/>
           <w:pgNumType w:start="1"/>
           <w:cols w:space="720"/>
@@ -1744,38 +1744,41 @@
         <w:jc w:val="center"/>
       </w:pPr>
       <w:r>
-        <w:rPr>
-          <w:noProof/>
-        </w:rPr>
         <w:drawing>
-          <wp:inline distT="114300" distB="114300" distL="114300" distR="114300" wp14:anchorId="3CAC1CB1" wp14:editId="31D595BB">
-            <wp:extent cx="5731200" cy="6438900"/>
+          <wp:inline wp14:editId="17DABFA1" wp14:anchorId="7C56C7F8">
+            <wp:extent cx="4733925" cy="6171559"/>
             <wp:effectExtent l="0" t="0" r="0" b="0"/>
-            <wp:docPr id="2" name="image2.png"/>
-            <wp:cNvGraphicFramePr/>
-            <a:graphic xmlns:a="http://schemas.openxmlformats.org/drawingml/2006/main">
-              <a:graphicData uri="http://schemas.openxmlformats.org/drawingml/2006/picture">
+            <wp:docPr id="1518750164" name="drawing"/>
+            <wp:cNvGraphicFramePr>
+              <a:graphicFrameLocks noChangeAspect="1"/>
+            </wp:cNvGraphicFramePr>
+            <a:graphic>
+              <a:graphicData xmlns:a="http://schemas.openxmlformats.org/drawingml/2006/main" uri="http://schemas.openxmlformats.org/drawingml/2006/picture">
                 <pic:pic xmlns:pic="http://schemas.openxmlformats.org/drawingml/2006/picture">
                   <pic:nvPicPr>
-                    <pic:cNvPr id="0" name="image2.png"/>
-                    <pic:cNvPicPr preferRelativeResize="0"/>
+                    <pic:cNvPr id="1518750164" name=""/>
+                    <pic:cNvPicPr/>
                   </pic:nvPicPr>
                   <pic:blipFill>
-                    <a:blip r:embed="rId21"/>
-                    <a:srcRect/>
+                    <a:blip xmlns:r="http://schemas.openxmlformats.org/officeDocument/2006/relationships" r:embed="rId186820000">
+                      <a:extLst>
+                        <a:ext uri="{28A0092B-C50C-407E-A947-70E740481C1C}">
+                          <a14:useLocalDpi xmlns:a14="http://schemas.microsoft.com/office/drawing/2010/main"/>
+                        </a:ext>
+                      </a:extLst>
+                    </a:blip>
                     <a:stretch>
                       <a:fillRect/>
                     </a:stretch>
                   </pic:blipFill>
                   <pic:spPr>
-                    <a:xfrm>
+                    <a:xfrm rot="0">
                       <a:off x="0" y="0"/>
-                      <a:ext cx="5731200" cy="6438900"/>
+                      <a:ext cx="4733925" cy="6171559"/>
                     </a:xfrm>
                     <a:prstGeom prst="rect">
                       <a:avLst/>
                     </a:prstGeom>
-                    <a:ln/>
                   </pic:spPr>
                 </pic:pic>
               </a:graphicData>
@@ -1788,7 +1791,7 @@
       <w:pPr>
         <w:jc w:val="center"/>
         <w:sectPr>
-          <w:pgSz w:w="11909" w:h="16834"/>
+          <w:pgSz w:w="11909" w:h="16834" w:orient="portrait"/>
           <w:pgMar w:top="1440" w:right="1440" w:bottom="1440" w:left="1440" w:header="720" w:footer="720" w:gutter="0"/>
           <w:cols w:space="720"/>
         </w:sectPr>
@@ -1826,197 +1829,64 @@
         <w:t xml:space="preserve"> de Línea Base</w:t>
       </w:r>
     </w:p>
-    <w:p/>
+    <w:p w14:noSpellErr="1">
+      <w:pPr>
+        <w:pStyle w:val="Normal"/>
+      </w:pPr>
+    </w:p>
     <w:p>
       <w:pPr>
         <w:jc w:val="both"/>
       </w:pPr>
       <w:r>
-        <w:t xml:space="preserve">La </w:t>
-      </w:r>
-      <w:proofErr w:type="spellStart"/>
-      <w:r>
-        <w:t>línea</w:t>
-      </w:r>
-      <w:proofErr w:type="spellEnd"/>
-      <w:r>
-        <w:t xml:space="preserve"> base del </w:t>
-      </w:r>
-      <w:proofErr w:type="spellStart"/>
-      <w:r>
-        <w:t>repositorio</w:t>
-      </w:r>
-      <w:proofErr w:type="spellEnd"/>
-      <w:r>
+        <w:rPr>
+          <w:lang w:val="es-ES"/>
+        </w:rPr>
+        <w:t xml:space="preserve">La línea base será establecida en el momento posterior a una devolución positiva tanto verbal o escrita por parte de los docentes en los trabajos prácticos. </w:t>
+      </w:r>
+      <w:r>
+        <w:rPr>
+          <w:lang w:val="es-ES"/>
+        </w:rPr>
+        <w:t xml:space="preserve">El contenido de </w:t>
+      </w:r>
+      <w:r>
+        <w:rPr>
+          <w:lang w:val="es-ES"/>
+        </w:rPr>
+        <w:t>la misma</w:t>
+      </w:r>
+      <w:r>
+        <w:rPr>
+          <w:lang w:val="es-ES"/>
+        </w:rPr>
+        <w:t xml:space="preserve"> tendrá</w:t>
+      </w:r>
+      <w:r>
+        <w:rPr>
+          <w:lang w:val="es-ES"/>
+        </w:rPr>
+        <w:t xml:space="preserve"> los ítems de configuración pertenecientes a cada trabajo practico.</w:t>
+      </w:r>
+    </w:p>
+    <w:p>
+      <w:pPr>
+        <w:pStyle w:val="Normal"/>
+        <w:jc w:val="both"/>
+      </w:pPr>
+      <w:r>
+        <w:rPr/>
         <w:t xml:space="preserve"> </w:t>
       </w:r>
-      <w:proofErr w:type="spellStart"/>
-      <w:r>
-        <w:t>será</w:t>
-      </w:r>
-      <w:proofErr w:type="spellEnd"/>
-      <w:r>
-        <w:t xml:space="preserve"> </w:t>
-      </w:r>
-      <w:proofErr w:type="spellStart"/>
-      <w:r>
-        <w:t>establecida</w:t>
-      </w:r>
-      <w:proofErr w:type="spellEnd"/>
-      <w:r>
-        <w:t xml:space="preserve"> </w:t>
-      </w:r>
-      <w:proofErr w:type="spellStart"/>
-      <w:r>
-        <w:t>únicamente</w:t>
-      </w:r>
-      <w:proofErr w:type="spellEnd"/>
-      <w:r>
-        <w:t xml:space="preserve"> </w:t>
-      </w:r>
-      <w:proofErr w:type="spellStart"/>
-      <w:r>
-        <w:t>cuando</w:t>
-      </w:r>
-      <w:proofErr w:type="spellEnd"/>
-      <w:r>
-        <w:t xml:space="preserve"> </w:t>
-      </w:r>
-      <w:proofErr w:type="spellStart"/>
-      <w:r>
-        <w:t>exista</w:t>
-      </w:r>
-      <w:proofErr w:type="spellEnd"/>
-      <w:r>
-        <w:t xml:space="preserve"> un </w:t>
-      </w:r>
-      <w:proofErr w:type="spellStart"/>
-      <w:r>
-        <w:t>consenso</w:t>
-      </w:r>
-      <w:proofErr w:type="spellEnd"/>
-      <w:r>
-        <w:t xml:space="preserve"> entre </w:t>
-      </w:r>
-      <w:proofErr w:type="spellStart"/>
-      <w:r>
-        <w:t>todos</w:t>
-      </w:r>
-      <w:proofErr w:type="spellEnd"/>
-      <w:r>
-        <w:t xml:space="preserve"> </w:t>
-      </w:r>
-      <w:proofErr w:type="spellStart"/>
-      <w:r>
-        <w:t>los</w:t>
-      </w:r>
-      <w:proofErr w:type="spellEnd"/>
-      <w:r>
-        <w:t xml:space="preserve"> </w:t>
-      </w:r>
-      <w:proofErr w:type="spellStart"/>
-      <w:r>
-        <w:t>miembros</w:t>
-      </w:r>
-      <w:proofErr w:type="spellEnd"/>
-      <w:r>
-        <w:t xml:space="preserve"> del </w:t>
-      </w:r>
-      <w:proofErr w:type="spellStart"/>
-      <w:r>
-        <w:t>equipo</w:t>
-      </w:r>
-      <w:proofErr w:type="spellEnd"/>
-      <w:r>
-        <w:t xml:space="preserve">. Esto </w:t>
-      </w:r>
-      <w:proofErr w:type="spellStart"/>
-      <w:r>
-        <w:t>implica</w:t>
-      </w:r>
-      <w:proofErr w:type="spellEnd"/>
-      <w:r>
-        <w:t xml:space="preserve"> que </w:t>
-      </w:r>
-      <w:proofErr w:type="spellStart"/>
-      <w:r>
-        <w:t>los</w:t>
-      </w:r>
-      <w:proofErr w:type="spellEnd"/>
-      <w:r>
-        <w:t xml:space="preserve"> 10 </w:t>
-      </w:r>
-      <w:proofErr w:type="spellStart"/>
-      <w:r>
-        <w:t>integrantes</w:t>
-      </w:r>
-      <w:proofErr w:type="spellEnd"/>
-      <w:r>
-        <w:t xml:space="preserve"> </w:t>
-      </w:r>
-      <w:proofErr w:type="spellStart"/>
-      <w:r>
-        <w:t>deberán</w:t>
-      </w:r>
-      <w:proofErr w:type="spellEnd"/>
-      <w:r>
-        <w:t xml:space="preserve"> </w:t>
-      </w:r>
-      <w:proofErr w:type="spellStart"/>
-      <w:r>
-        <w:t>revisar</w:t>
-      </w:r>
-      <w:proofErr w:type="spellEnd"/>
-      <w:r>
-        <w:t xml:space="preserve"> y </w:t>
-      </w:r>
-      <w:proofErr w:type="spellStart"/>
-      <w:r>
-        <w:t>aprobar</w:t>
-      </w:r>
-      <w:proofErr w:type="spellEnd"/>
-      <w:r>
-        <w:t xml:space="preserve"> </w:t>
-      </w:r>
-      <w:proofErr w:type="spellStart"/>
-      <w:r>
-        <w:t>los</w:t>
-      </w:r>
-      <w:proofErr w:type="spellEnd"/>
-      <w:r>
-        <w:t xml:space="preserve"> </w:t>
-      </w:r>
-      <w:proofErr w:type="spellStart"/>
-      <w:r>
-        <w:t>cambios</w:t>
-      </w:r>
-      <w:proofErr w:type="spellEnd"/>
-      <w:r>
-        <w:t xml:space="preserve"> </w:t>
-      </w:r>
-      <w:proofErr w:type="spellStart"/>
-      <w:r>
-        <w:t>propuestos</w:t>
-      </w:r>
-      <w:proofErr w:type="spellEnd"/>
-      <w:r>
-        <w:t xml:space="preserve"> antes de </w:t>
-      </w:r>
-      <w:proofErr w:type="spellStart"/>
-      <w:r>
-        <w:t>su</w:t>
-      </w:r>
-      <w:proofErr w:type="spellEnd"/>
-      <w:r>
-        <w:t xml:space="preserve"> </w:t>
-      </w:r>
-      <w:proofErr w:type="spellStart"/>
-      <w:r>
-        <w:t>consolidación</w:t>
-      </w:r>
-      <w:proofErr w:type="spellEnd"/>
-      <w:r>
-        <w:t>.</w:t>
+    </w:p>
+    <w:p>
+      <w:pPr>
+        <w:pStyle w:val="Normal"/>
+        <w:jc w:val="both"/>
+      </w:pPr>
+      <w:r>
+        <w:rPr/>
+        <w:t>La línea base del repositorio será modificada únicamente cuando exista un consenso entre todos los miembros del equipo. Esto implica que los 10 integrantes deberán revisar y aprobar los cambios propuestos antes de su consolidación.</w:t>
       </w:r>
     </w:p>
     <w:p>
@@ -2044,7 +1914,7 @@
       </w:pPr>
     </w:p>
     <w:sectPr>
-      <w:pgSz w:w="11909" w:h="16834"/>
+      <w:pgSz w:w="11909" w:h="16834" w:orient="portrait"/>
       <w:pgMar w:top="1440" w:right="1440" w:bottom="1440" w:left="1440" w:header="720" w:footer="720" w:gutter="0"/>
       <w:cols w:space="720"/>
     </w:sectPr>
@@ -2180,7 +2050,7 @@
         <w:ind w:left="720" w:hanging="360"/>
       </w:pPr>
       <w:rPr>
-        <w:rFonts w:ascii="Arial" w:eastAsia="Arial" w:hAnsi="Arial" w:cs="Arial"/>
+        <w:rFonts w:ascii="Arial" w:hAnsi="Arial" w:eastAsia="Arial" w:cs="Arial"/>
         <w:color w:val="1F2328"/>
         <w:sz w:val="24"/>
         <w:szCs w:val="24"/>
@@ -2298,7 +2168,7 @@
   <w:docDefaults>
     <w:rPrDefault>
       <w:rPr>
-        <w:rFonts w:ascii="Arial" w:eastAsia="Arial" w:hAnsi="Arial" w:cs="Arial"/>
+        <w:rFonts w:ascii="Arial" w:hAnsi="Arial" w:eastAsia="Arial" w:cs="Arial"/>
         <w:sz w:val="22"/>
         <w:szCs w:val="22"/>
         <w:lang w:val="en-US" w:eastAsia="en-US" w:bidi="ar-SA"/>
@@ -2313,14 +2183,14 @@
   <w:latentStyles w:defLockedState="0" w:defUIPriority="99" w:defSemiHidden="0" w:defUnhideWhenUsed="0" w:defQFormat="0" w:count="376">
     <w:lsdException w:name="Normal" w:uiPriority="0" w:qFormat="1"/>
     <w:lsdException w:name="heading 1" w:uiPriority="9" w:qFormat="1"/>
-    <w:lsdException w:name="heading 2" w:semiHidden="1" w:uiPriority="9" w:unhideWhenUsed="1" w:qFormat="1"/>
-    <w:lsdException w:name="heading 3" w:semiHidden="1" w:uiPriority="9" w:unhideWhenUsed="1" w:qFormat="1"/>
-    <w:lsdException w:name="heading 4" w:semiHidden="1" w:uiPriority="9" w:unhideWhenUsed="1" w:qFormat="1"/>
-    <w:lsdException w:name="heading 5" w:semiHidden="1" w:uiPriority="9" w:unhideWhenUsed="1" w:qFormat="1"/>
-    <w:lsdException w:name="heading 6" w:semiHidden="1" w:uiPriority="9" w:unhideWhenUsed="1" w:qFormat="1"/>
-    <w:lsdException w:name="heading 7" w:semiHidden="1" w:uiPriority="9" w:unhideWhenUsed="1" w:qFormat="1"/>
-    <w:lsdException w:name="heading 8" w:semiHidden="1" w:uiPriority="9" w:unhideWhenUsed="1" w:qFormat="1"/>
-    <w:lsdException w:name="heading 9" w:semiHidden="1" w:uiPriority="9" w:unhideWhenUsed="1" w:qFormat="1"/>
+    <w:lsdException w:name="heading 2" w:uiPriority="9" w:semiHidden="1" w:unhideWhenUsed="1" w:qFormat="1"/>
+    <w:lsdException w:name="heading 3" w:uiPriority="9" w:semiHidden="1" w:unhideWhenUsed="1" w:qFormat="1"/>
+    <w:lsdException w:name="heading 4" w:uiPriority="9" w:semiHidden="1" w:unhideWhenUsed="1" w:qFormat="1"/>
+    <w:lsdException w:name="heading 5" w:uiPriority="9" w:semiHidden="1" w:unhideWhenUsed="1" w:qFormat="1"/>
+    <w:lsdException w:name="heading 6" w:uiPriority="9" w:semiHidden="1" w:unhideWhenUsed="1" w:qFormat="1"/>
+    <w:lsdException w:name="heading 7" w:uiPriority="9" w:semiHidden="1" w:unhideWhenUsed="1" w:qFormat="1"/>
+    <w:lsdException w:name="heading 8" w:uiPriority="9" w:semiHidden="1" w:unhideWhenUsed="1" w:qFormat="1"/>
+    <w:lsdException w:name="heading 9" w:uiPriority="9" w:semiHidden="1" w:unhideWhenUsed="1" w:qFormat="1"/>
     <w:lsdException w:name="index 1" w:semiHidden="1" w:unhideWhenUsed="1"/>
     <w:lsdException w:name="index 2" w:semiHidden="1" w:unhideWhenUsed="1"/>
     <w:lsdException w:name="index 3" w:semiHidden="1" w:unhideWhenUsed="1"/>
@@ -2330,22 +2200,22 @@
     <w:lsdException w:name="index 7" w:semiHidden="1" w:unhideWhenUsed="1"/>
     <w:lsdException w:name="index 8" w:semiHidden="1" w:unhideWhenUsed="1"/>
     <w:lsdException w:name="index 9" w:semiHidden="1" w:unhideWhenUsed="1"/>
-    <w:lsdException w:name="toc 1" w:semiHidden="1" w:uiPriority="39" w:unhideWhenUsed="1"/>
-    <w:lsdException w:name="toc 2" w:semiHidden="1" w:uiPriority="39" w:unhideWhenUsed="1"/>
-    <w:lsdException w:name="toc 3" w:semiHidden="1" w:uiPriority="39" w:unhideWhenUsed="1"/>
-    <w:lsdException w:name="toc 4" w:semiHidden="1" w:uiPriority="39" w:unhideWhenUsed="1"/>
-    <w:lsdException w:name="toc 5" w:semiHidden="1" w:uiPriority="39" w:unhideWhenUsed="1"/>
-    <w:lsdException w:name="toc 6" w:semiHidden="1" w:uiPriority="39" w:unhideWhenUsed="1"/>
-    <w:lsdException w:name="toc 7" w:semiHidden="1" w:uiPriority="39" w:unhideWhenUsed="1"/>
-    <w:lsdException w:name="toc 8" w:semiHidden="1" w:uiPriority="39" w:unhideWhenUsed="1"/>
-    <w:lsdException w:name="toc 9" w:semiHidden="1" w:uiPriority="39" w:unhideWhenUsed="1"/>
+    <w:lsdException w:name="toc 1" w:uiPriority="39" w:semiHidden="1" w:unhideWhenUsed="1"/>
+    <w:lsdException w:name="toc 2" w:uiPriority="39" w:semiHidden="1" w:unhideWhenUsed="1"/>
+    <w:lsdException w:name="toc 3" w:uiPriority="39" w:semiHidden="1" w:unhideWhenUsed="1"/>
+    <w:lsdException w:name="toc 4" w:uiPriority="39" w:semiHidden="1" w:unhideWhenUsed="1"/>
+    <w:lsdException w:name="toc 5" w:uiPriority="39" w:semiHidden="1" w:unhideWhenUsed="1"/>
+    <w:lsdException w:name="toc 6" w:uiPriority="39" w:semiHidden="1" w:unhideWhenUsed="1"/>
+    <w:lsdException w:name="toc 7" w:uiPriority="39" w:semiHidden="1" w:unhideWhenUsed="1"/>
+    <w:lsdException w:name="toc 8" w:uiPriority="39" w:semiHidden="1" w:unhideWhenUsed="1"/>
+    <w:lsdException w:name="toc 9" w:uiPriority="39" w:semiHidden="1" w:unhideWhenUsed="1"/>
     <w:lsdException w:name="Normal Indent" w:semiHidden="1" w:unhideWhenUsed="1"/>
     <w:lsdException w:name="footnote text" w:semiHidden="1" w:unhideWhenUsed="1"/>
     <w:lsdException w:name="annotation text" w:semiHidden="1" w:unhideWhenUsed="1"/>
     <w:lsdException w:name="header" w:semiHidden="1" w:unhideWhenUsed="1"/>
     <w:lsdException w:name="footer" w:semiHidden="1" w:unhideWhenUsed="1"/>
     <w:lsdException w:name="index heading" w:semiHidden="1" w:unhideWhenUsed="1"/>
-    <w:lsdException w:name="caption" w:semiHidden="1" w:uiPriority="35" w:unhideWhenUsed="1" w:qFormat="1"/>
+    <w:lsdException w:name="caption" w:uiPriority="35" w:semiHidden="1" w:unhideWhenUsed="1" w:qFormat="1"/>
     <w:lsdException w:name="table of figures" w:semiHidden="1" w:unhideWhenUsed="1"/>
     <w:lsdException w:name="envelope address" w:semiHidden="1" w:unhideWhenUsed="1"/>
     <w:lsdException w:name="envelope return" w:semiHidden="1" w:unhideWhenUsed="1"/>
@@ -2376,7 +2246,7 @@
     <w:lsdException w:name="Title" w:uiPriority="10" w:qFormat="1"/>
     <w:lsdException w:name="Closing" w:semiHidden="1" w:unhideWhenUsed="1"/>
     <w:lsdException w:name="Signature" w:semiHidden="1" w:unhideWhenUsed="1"/>
-    <w:lsdException w:name="Default Paragraph Font" w:semiHidden="1" w:uiPriority="1" w:unhideWhenUsed="1"/>
+    <w:lsdException w:name="Default Paragraph Font" w:uiPriority="1" w:semiHidden="1" w:unhideWhenUsed="1"/>
     <w:lsdException w:name="Body Text" w:semiHidden="1" w:unhideWhenUsed="1"/>
     <w:lsdException w:name="Body Text Indent" w:semiHidden="1" w:unhideWhenUsed="1"/>
     <w:lsdException w:name="List Continue" w:semiHidden="1" w:unhideWhenUsed="1"/>
@@ -2576,8 +2446,8 @@
     <w:lsdException w:name="Subtle Reference" w:uiPriority="31" w:qFormat="1"/>
     <w:lsdException w:name="Intense Reference" w:uiPriority="32" w:qFormat="1"/>
     <w:lsdException w:name="Book Title" w:uiPriority="33" w:qFormat="1"/>
-    <w:lsdException w:name="Bibliography" w:semiHidden="1" w:uiPriority="37" w:unhideWhenUsed="1"/>
-    <w:lsdException w:name="TOC Heading" w:semiHidden="1" w:uiPriority="39" w:unhideWhenUsed="1" w:qFormat="1"/>
+    <w:lsdException w:name="Bibliography" w:uiPriority="37" w:semiHidden="1" w:unhideWhenUsed="1"/>
+    <w:lsdException w:name="TOC Heading" w:uiPriority="39" w:semiHidden="1" w:unhideWhenUsed="1" w:qFormat="1"/>
     <w:lsdException w:name="Plain Table 1" w:uiPriority="41"/>
     <w:lsdException w:name="Plain Table 2" w:uiPriority="42"/>
     <w:lsdException w:name="Plain Table 3" w:uiPriority="43"/>
@@ -2688,7 +2558,7 @@
     <w:lsdException w:name="Unresolved Mention" w:semiHidden="1" w:unhideWhenUsed="1"/>
     <w:lsdException w:name="Smart Link" w:semiHidden="1" w:unhideWhenUsed="1"/>
   </w:latentStyles>
-  <w:style w:type="paragraph" w:default="1" w:styleId="Normal">
+  <w:style w:type="paragraph" w:styleId="Normal" w:default="1">
     <w:name w:val="Normal"/>
   </w:style>
   <w:style w:type="paragraph" w:styleId="Ttulo1">
@@ -2782,13 +2652,13 @@
       <w:color w:val="666666"/>
     </w:rPr>
   </w:style>
-  <w:style w:type="character" w:default="1" w:styleId="Fuentedeprrafopredeter">
+  <w:style w:type="character" w:styleId="Fuentedeprrafopredeter" w:default="1">
     <w:name w:val="Default Paragraph Font"/>
     <w:uiPriority w:val="1"/>
     <w:semiHidden/>
     <w:unhideWhenUsed/>
   </w:style>
-  <w:style w:type="table" w:default="1" w:styleId="Tablanormal">
+  <w:style w:type="table" w:styleId="Tablanormal" w:default="1">
     <w:name w:val="Normal Table"/>
     <w:uiPriority w:val="99"/>
     <w:semiHidden/>
@@ -2803,13 +2673,13 @@
       </w:tblCellMar>
     </w:tblPr>
   </w:style>
-  <w:style w:type="numbering" w:default="1" w:styleId="Sinlista">
+  <w:style w:type="numbering" w:styleId="Sinlista" w:default="1">
     <w:name w:val="No List"/>
     <w:uiPriority w:val="99"/>
     <w:semiHidden/>
     <w:unhideWhenUsed/>
   </w:style>
-  <w:style w:type="table" w:customStyle="1" w:styleId="TableNormal">
+  <w:style w:type="table" w:styleId="TableNormal" w:customStyle="1">
     <w:name w:val="TableNormal"/>
     <w:tblPr>
       <w:tblCellMar>
@@ -2849,7 +2719,7 @@
       <w:szCs w:val="30"/>
     </w:rPr>
   </w:style>
-  <w:style w:type="table" w:customStyle="1" w:styleId="a">
+  <w:style w:type="table" w:styleId="a" w:customStyle="1">
     <w:basedOn w:val="TableNormal"/>
     <w:tblPr>
       <w:tblStyleRowBandSize w:val="1"/>

</xml_diff>

<commit_message>
Actualizacion del Plan de Gestion
</commit_message>
<xml_diff>
--- a/Plan_Gestion_Configuracion_G4_ISW_4K1.docx
+++ b/Plan_Gestion_Configuracion_G4_ISW_4K1.docx
@@ -1,6 +1,6 @@
 
 <file path=word/document.xml><?xml version="1.0" encoding="utf-8"?>
-<w:document xmlns:wpc="http://schemas.microsoft.com/office/word/2010/wordprocessingCanvas" xmlns:cx="http://schemas.microsoft.com/office/drawing/2014/chartex" xmlns:cx1="http://schemas.microsoft.com/office/drawing/2015/9/8/chartex" xmlns:cx2="http://schemas.microsoft.com/office/drawing/2015/10/21/chartex" xmlns:cx3="http://schemas.microsoft.com/office/drawing/2016/5/9/chartex" xmlns:cx4="http://schemas.microsoft.com/office/drawing/2016/5/10/chartex" xmlns:cx5="http://schemas.microsoft.com/office/drawing/2016/5/11/chartex" xmlns:cx6="http://schemas.microsoft.com/office/drawing/2016/5/12/chartex" xmlns:cx7="http://schemas.microsoft.com/office/drawing/2016/5/13/chartex" xmlns:cx8="http://schemas.microsoft.com/office/drawing/2016/5/14/chartex" xmlns:mc="http://schemas.openxmlformats.org/markup-compatibility/2006" xmlns:aink="http://schemas.microsoft.com/office/drawing/2016/ink" xmlns:am3d="http://schemas.microsoft.com/office/drawing/2017/model3d" xmlns:o="urn:schemas-microsoft-com:office:office" xmlns:oel="http://schemas.microsoft.com/office/2019/extlst" xmlns:r="http://schemas.openxmlformats.org/officeDocument/2006/relationships" xmlns:m="http://schemas.openxmlformats.org/officeDocument/2006/math" xmlns:v="urn:schemas-microsoft-com:vml" xmlns:wp14="http://schemas.microsoft.com/office/word/2010/wordprocessingDrawing" xmlns:wp="http://schemas.openxmlformats.org/drawingml/2006/wordprocessingDrawing" xmlns:w10="urn:schemas-microsoft-com:office:word" xmlns:w="http://schemas.openxmlformats.org/wordprocessingml/2006/main" xmlns:w14="http://schemas.microsoft.com/office/word/2010/wordml" xmlns:w15="http://schemas.microsoft.com/office/word/2012/wordml" xmlns:w16cex="http://schemas.microsoft.com/office/word/2018/wordml/cex" xmlns:w16cid="http://schemas.microsoft.com/office/word/2016/wordml/cid" xmlns:w16="http://schemas.microsoft.com/office/word/2018/wordml" xmlns:w16du="http://schemas.microsoft.com/office/word/2023/wordml/word16du" xmlns:w16sdtdh="http://schemas.microsoft.com/office/word/2020/wordml/sdtdatahash" xmlns:w16sdtfl="http://schemas.microsoft.com/office/word/2024/wordml/sdtformatlock" xmlns:w16se="http://schemas.microsoft.com/office/word/2015/wordml/symex" xmlns:wpg="http://schemas.microsoft.com/office/word/2010/wordprocessingGroup" xmlns:wpi="http://schemas.microsoft.com/office/word/2010/wordprocessingInk" xmlns:wne="http://schemas.microsoft.com/office/word/2006/wordml" xmlns:wps="http://schemas.microsoft.com/office/word/2010/wordprocessingShape" xmlns:a="http://schemas.openxmlformats.org/drawingml/2006/main" xmlns:pic="http://schemas.openxmlformats.org/drawingml/2006/picture" xmlns:a14="http://schemas.microsoft.com/office/drawing/2010/main" mc:Ignorable="w14 w15 w16se w16cid w16 w16cex w16sdtdh w16sdtfl w16du wp14">
+<w:document xmlns:wpc="http://schemas.microsoft.com/office/word/2010/wordprocessingCanvas" xmlns:cx="http://schemas.microsoft.com/office/drawing/2014/chartex" xmlns:cx1="http://schemas.microsoft.com/office/drawing/2015/9/8/chartex" xmlns:cx2="http://schemas.microsoft.com/office/drawing/2015/10/21/chartex" xmlns:cx3="http://schemas.microsoft.com/office/drawing/2016/5/9/chartex" xmlns:cx4="http://schemas.microsoft.com/office/drawing/2016/5/10/chartex" xmlns:cx5="http://schemas.microsoft.com/office/drawing/2016/5/11/chartex" xmlns:cx6="http://schemas.microsoft.com/office/drawing/2016/5/12/chartex" xmlns:cx7="http://schemas.microsoft.com/office/drawing/2016/5/13/chartex" xmlns:cx8="http://schemas.microsoft.com/office/drawing/2016/5/14/chartex" xmlns:mc="http://schemas.openxmlformats.org/markup-compatibility/2006" xmlns:aink="http://schemas.microsoft.com/office/drawing/2016/ink" xmlns:am3d="http://schemas.microsoft.com/office/drawing/2017/model3d" xmlns:o="urn:schemas-microsoft-com:office:office" xmlns:oel="http://schemas.microsoft.com/office/2019/extlst" xmlns:r="http://schemas.openxmlformats.org/officeDocument/2006/relationships" xmlns:m="http://schemas.openxmlformats.org/officeDocument/2006/math" xmlns:v="urn:schemas-microsoft-com:vml" xmlns:wp14="http://schemas.microsoft.com/office/word/2010/wordprocessingDrawing" xmlns:wp="http://schemas.openxmlformats.org/drawingml/2006/wordprocessingDrawing" xmlns:w10="urn:schemas-microsoft-com:office:word" xmlns:w="http://schemas.openxmlformats.org/wordprocessingml/2006/main" xmlns:w14="http://schemas.microsoft.com/office/word/2010/wordml" xmlns:w15="http://schemas.microsoft.com/office/word/2012/wordml" xmlns:w16cex="http://schemas.microsoft.com/office/word/2018/wordml/cex" xmlns:w16cid="http://schemas.microsoft.com/office/word/2016/wordml/cid" xmlns:w16="http://schemas.microsoft.com/office/word/2018/wordml" xmlns:w16du="http://schemas.microsoft.com/office/word/2023/wordml/word16du" xmlns:w16sdtdh="http://schemas.microsoft.com/office/word/2020/wordml/sdtdatahash" xmlns:w16sdtfl="http://schemas.microsoft.com/office/word/2024/wordml/sdtformatlock" xmlns:w16se="http://schemas.microsoft.com/office/word/2015/wordml/symex" xmlns:wpg="http://schemas.microsoft.com/office/word/2010/wordprocessingGroup" xmlns:wpi="http://schemas.microsoft.com/office/word/2010/wordprocessingInk" xmlns:wne="http://schemas.microsoft.com/office/word/2006/wordml" xmlns:wps="http://schemas.microsoft.com/office/word/2010/wordprocessingShape" mc:Ignorable="w14 w15 w16se w16cid w16 w16cex w16sdtdh w16sdtfl w16du wp14">
   <w:body>
     <w:p>
       <w:pPr>
@@ -9,43 +9,17 @@
           <w:b/>
           <w:sz w:val="34"/>
           <w:szCs w:val="34"/>
-        </w:rPr>
-      </w:pPr>
-      <w:proofErr w:type="spellStart"/>
+          <w:lang w:val="es-AR"/>
+        </w:rPr>
+      </w:pPr>
       <w:r>
         <w:rPr>
           <w:b/>
           <w:sz w:val="34"/>
           <w:szCs w:val="34"/>
-        </w:rPr>
-        <w:t>Gestión</w:t>
-      </w:r>
-      <w:proofErr w:type="spellEnd"/>
-      <w:r>
-        <w:rPr>
-          <w:b/>
-          <w:sz w:val="34"/>
-          <w:szCs w:val="34"/>
-        </w:rPr>
-        <w:t xml:space="preserve"> de la </w:t>
-      </w:r>
-      <w:proofErr w:type="spellStart"/>
-      <w:r>
-        <w:rPr>
-          <w:b/>
-          <w:sz w:val="34"/>
-          <w:szCs w:val="34"/>
-        </w:rPr>
-        <w:t>configuración</w:t>
-      </w:r>
-      <w:proofErr w:type="spellEnd"/>
-      <w:r>
-        <w:rPr>
-          <w:b/>
-          <w:sz w:val="34"/>
-          <w:szCs w:val="34"/>
-        </w:rPr>
-        <w:t xml:space="preserve"> del Software</w:t>
+          <w:lang w:val="es-AR"/>
+        </w:rPr>
+        <w:t>Gestión de la configuración del Software</w:t>
       </w:r>
     </w:p>
     <w:p>
@@ -107,6 +81,7 @@
         <w:rPr>
           <w:sz w:val="24"/>
           <w:szCs w:val="24"/>
+          <w:lang w:val="es-AR"/>
         </w:rPr>
       </w:pPr>
       <w:proofErr w:type="spellStart"/>
@@ -115,6 +90,7 @@
           <w:sz w:val="24"/>
           <w:szCs w:val="24"/>
           <w:u w:val="single"/>
+          <w:lang w:val="es-AR"/>
         </w:rPr>
         <w:t>Nro</w:t>
       </w:r>
@@ -124,6 +100,7 @@
           <w:sz w:val="24"/>
           <w:szCs w:val="24"/>
           <w:u w:val="single"/>
+          <w:lang w:val="es-AR"/>
         </w:rPr>
         <w:t xml:space="preserve"> Grupo:</w:t>
       </w:r>
@@ -131,6 +108,7 @@
         <w:rPr>
           <w:sz w:val="24"/>
           <w:szCs w:val="24"/>
+          <w:lang w:val="es-AR"/>
         </w:rPr>
         <w:t xml:space="preserve"> 4</w:t>
       </w:r>
@@ -140,67 +118,53 @@
         <w:rPr>
           <w:sz w:val="24"/>
           <w:szCs w:val="24"/>
-        </w:rPr>
-      </w:pPr>
-      <w:proofErr w:type="spellStart"/>
+          <w:lang w:val="es-AR"/>
+        </w:rPr>
+      </w:pPr>
       <w:r>
         <w:rPr>
           <w:sz w:val="24"/>
           <w:szCs w:val="24"/>
           <w:u w:val="single"/>
-        </w:rPr>
-        <w:t>Curso</w:t>
-      </w:r>
-      <w:proofErr w:type="spellEnd"/>
+          <w:lang w:val="es-AR"/>
+        </w:rPr>
+        <w:t>Curso:</w:t>
+      </w:r>
       <w:r>
         <w:rPr>
           <w:sz w:val="24"/>
           <w:szCs w:val="24"/>
-          <w:u w:val="single"/>
-        </w:rPr>
-        <w:t>:</w:t>
-      </w:r>
-      <w:r>
+          <w:lang w:val="es-AR"/>
+        </w:rPr>
+        <w:t xml:space="preserve"> 4K1</w:t>
+      </w:r>
+    </w:p>
+    <w:p>
+      <w:pPr>
         <w:rPr>
           <w:sz w:val="24"/>
           <w:szCs w:val="24"/>
-        </w:rPr>
-        <w:t xml:space="preserve"> 4K1</w:t>
-      </w:r>
+          <w:lang w:val="es-AR"/>
+        </w:rPr>
+      </w:pPr>
     </w:p>
     <w:p>
       <w:pPr>
         <w:rPr>
           <w:sz w:val="24"/>
           <w:szCs w:val="24"/>
-        </w:rPr>
-      </w:pPr>
-    </w:p>
-    <w:p>
-      <w:pPr>
+          <w:u w:val="single"/>
+          <w:lang w:val="es-AR"/>
+        </w:rPr>
+      </w:pPr>
+      <w:r>
         <w:rPr>
           <w:sz w:val="24"/>
           <w:szCs w:val="24"/>
           <w:u w:val="single"/>
-        </w:rPr>
-      </w:pPr>
-      <w:proofErr w:type="spellStart"/>
-      <w:r>
-        <w:rPr>
-          <w:sz w:val="24"/>
-          <w:szCs w:val="24"/>
-          <w:u w:val="single"/>
-        </w:rPr>
-        <w:t>Docentes</w:t>
-      </w:r>
-      <w:proofErr w:type="spellEnd"/>
-      <w:r>
-        <w:rPr>
-          <w:sz w:val="24"/>
-          <w:szCs w:val="24"/>
-          <w:u w:val="single"/>
-        </w:rPr>
-        <w:t>:</w:t>
+          <w:lang w:val="es-AR"/>
+        </w:rPr>
+        <w:t>Docentes:</w:t>
       </w:r>
     </w:p>
     <w:p>
@@ -252,40 +216,16 @@
         <w:rPr>
           <w:sz w:val="24"/>
           <w:szCs w:val="24"/>
-        </w:rPr>
-        <w:t xml:space="preserve">Jefa de </w:t>
-      </w:r>
-      <w:proofErr w:type="spellStart"/>
+          <w:lang w:val="es-AR"/>
+        </w:rPr>
+        <w:t xml:space="preserve">Jefa de Trabajos Prácticos: Ing. </w:t>
+      </w:r>
       <w:r>
         <w:rPr>
           <w:sz w:val="24"/>
           <w:szCs w:val="24"/>
         </w:rPr>
-        <w:t>Trabajos</w:t>
-      </w:r>
-      <w:proofErr w:type="spellEnd"/>
-      <w:r>
-        <w:rPr>
-          <w:sz w:val="24"/>
-          <w:szCs w:val="24"/>
-        </w:rPr>
-        <w:t xml:space="preserve"> </w:t>
-      </w:r>
-      <w:proofErr w:type="spellStart"/>
-      <w:r>
-        <w:rPr>
-          <w:sz w:val="24"/>
-          <w:szCs w:val="24"/>
-        </w:rPr>
-        <w:t>Prácticos</w:t>
-      </w:r>
-      <w:proofErr w:type="spellEnd"/>
-      <w:r>
-        <w:rPr>
-          <w:sz w:val="24"/>
-          <w:szCs w:val="24"/>
-        </w:rPr>
-        <w:t>: Ing. Mickaela Crespo</w:t>
+        <w:t>Mickaela Crespo</w:t>
       </w:r>
     </w:p>
     <w:p>
@@ -320,7 +260,23 @@
           <w:sz w:val="24"/>
           <w:szCs w:val="24"/>
         </w:rPr>
-        <w:t xml:space="preserve"> Alumno: Salvador Barbera</w:t>
+        <w:t xml:space="preserve"> </w:t>
+      </w:r>
+      <w:proofErr w:type="spellStart"/>
+      <w:r>
+        <w:rPr>
+          <w:sz w:val="24"/>
+          <w:szCs w:val="24"/>
+        </w:rPr>
+        <w:t>Alumno</w:t>
+      </w:r>
+      <w:proofErr w:type="spellEnd"/>
+      <w:r>
+        <w:rPr>
+          <w:sz w:val="24"/>
+          <w:szCs w:val="24"/>
+        </w:rPr>
+        <w:t>: Salvador Barbera</w:t>
       </w:r>
     </w:p>
     <w:p>
@@ -615,43 +571,45 @@
         <w:rPr>
           <w:sz w:val="24"/>
           <w:szCs w:val="24"/>
-        </w:rPr>
-      </w:pPr>
+          <w:lang w:val="es-AR"/>
+        </w:rPr>
+      </w:pPr>
+      <w:proofErr w:type="gramStart"/>
       <w:r>
         <w:rPr>
           <w:sz w:val="24"/>
           <w:szCs w:val="24"/>
           <w:u w:val="single"/>
-        </w:rPr>
-        <w:t xml:space="preserve">Link del </w:t>
-      </w:r>
-      <w:proofErr w:type="spellStart"/>
+          <w:lang w:val="es-AR"/>
+        </w:rPr>
+        <w:t>Link</w:t>
+      </w:r>
+      <w:proofErr w:type="gramEnd"/>
       <w:r>
         <w:rPr>
           <w:sz w:val="24"/>
           <w:szCs w:val="24"/>
           <w:u w:val="single"/>
-        </w:rPr>
-        <w:t>Repositorio</w:t>
-      </w:r>
-      <w:proofErr w:type="spellEnd"/>
+          <w:lang w:val="es-AR"/>
+        </w:rPr>
+        <w:t xml:space="preserve"> del Repositorio:</w:t>
+      </w:r>
       <w:r>
         <w:rPr>
           <w:sz w:val="24"/>
           <w:szCs w:val="24"/>
-          <w:u w:val="single"/>
-        </w:rPr>
-        <w:t>:</w:t>
-      </w:r>
-      <w:r>
-        <w:rPr>
-          <w:sz w:val="24"/>
-          <w:szCs w:val="24"/>
+          <w:lang w:val="es-AR"/>
         </w:rPr>
         <w:t xml:space="preserve"> https://github.com/Nahuellunacab/ISW_4K1_G4</w:t>
       </w:r>
     </w:p>
-    <w:p/>
+    <w:p>
+      <w:pPr>
+        <w:rPr>
+          <w:lang w:val="es-AR"/>
+        </w:rPr>
+      </w:pPr>
+    </w:p>
     <w:p>
       <w:pPr>
         <w:jc w:val="center"/>
@@ -702,12 +660,12 @@
         <w:tblW w:w="11175" w:type="dxa"/>
         <w:tblInd w:w="-1020" w:type="dxa"/>
         <w:tblBorders>
-          <w:top w:val="single" w:color="000000" w:sz="8" w:space="0"/>
-          <w:left w:val="single" w:color="000000" w:sz="8" w:space="0"/>
-          <w:bottom w:val="single" w:color="000000" w:sz="8" w:space="0"/>
-          <w:right w:val="single" w:color="000000" w:sz="8" w:space="0"/>
-          <w:insideH w:val="single" w:color="000000" w:sz="8" w:space="0"/>
-          <w:insideV w:val="single" w:color="000000" w:sz="8" w:space="0"/>
+          <w:top w:val="single" w:sz="8" w:space="0" w:color="000000"/>
+          <w:left w:val="single" w:sz="8" w:space="0" w:color="000000"/>
+          <w:bottom w:val="single" w:sz="8" w:space="0" w:color="000000"/>
+          <w:right w:val="single" w:sz="8" w:space="0" w:color="000000"/>
+          <w:insideH w:val="single" w:sz="8" w:space="0" w:color="000000"/>
+          <w:insideV w:val="single" w:sz="8" w:space="0" w:color="000000"/>
         </w:tblBorders>
         <w:tblLayout w:type="fixed"/>
         <w:tblLook w:val="0600" w:firstRow="0" w:lastRow="0" w:firstColumn="0" w:lastColumn="0" w:noHBand="1" w:noVBand="1"/>
@@ -1075,6 +1033,9 @@
                 <w:between w:val="nil"/>
               </w:pBdr>
               <w:spacing w:line="240" w:lineRule="auto"/>
+              <w:rPr>
+                <w:lang w:val="es-AR"/>
+              </w:rPr>
             </w:pPr>
             <w:hyperlink r:id="rId17">
               <w:proofErr w:type="spellStart"/>
@@ -1082,6 +1043,7 @@
                 <w:rPr>
                   <w:color w:val="1155CC"/>
                   <w:u w:val="single"/>
+                  <w:lang w:val="es-AR"/>
                 </w:rPr>
                 <w:t>Bibliografia</w:t>
               </w:r>
@@ -1090,6 +1052,7 @@
                 <w:rPr>
                   <w:color w:val="1155CC"/>
                   <w:u w:val="single"/>
+                  <w:lang w:val="es-AR"/>
                 </w:rPr>
                 <w:t>/</w:t>
               </w:r>
@@ -1098,6 +1061,7 @@
                 <w:rPr>
                   <w:color w:val="1155CC"/>
                   <w:u w:val="single"/>
+                  <w:lang w:val="es-AR"/>
                 </w:rPr>
                 <w:t>Bibliografia_De_La_Catedra</w:t>
               </w:r>
@@ -1106,6 +1070,7 @@
                 <w:rPr>
                   <w:color w:val="1155CC"/>
                   <w:u w:val="single"/>
+                  <w:lang w:val="es-AR"/>
                 </w:rPr>
                 <w:t>/</w:t>
               </w:r>
@@ -1114,6 +1079,7 @@
                 <w:rPr>
                   <w:color w:val="1155CC"/>
                   <w:u w:val="single"/>
+                  <w:lang w:val="es-AR"/>
                 </w:rPr>
                 <w:t>Diaspositivas</w:t>
               </w:r>
@@ -1195,10 +1161,12 @@
               <w:t>NombreDeTema</w:t>
             </w:r>
             <w:proofErr w:type="spellEnd"/>
+            <w:proofErr w:type="gramStart"/>
             <w:r>
               <w:t>&gt;.&lt;</w:t>
             </w:r>
             <w:proofErr w:type="spellStart"/>
+            <w:proofErr w:type="gramEnd"/>
             <w:r>
               <w:t>Extensión</w:t>
             </w:r>
@@ -1353,12 +1321,16 @@
                 <w:between w:val="nil"/>
               </w:pBdr>
               <w:spacing w:line="240" w:lineRule="auto"/>
+              <w:rPr>
+                <w:lang w:val="es-AR"/>
+              </w:rPr>
             </w:pPr>
             <w:hyperlink r:id="rId19">
               <w:r>
                 <w:rPr>
                   <w:color w:val="1155CC"/>
                   <w:u w:val="single"/>
+                  <w:lang w:val="es-AR"/>
                 </w:rPr>
                 <w:t>Bibliografia/Bibliografia_De_La_Catedra/MaterialBibliografico/SCM</w:t>
               </w:r>
@@ -1465,37 +1437,194 @@
               </w:pBdr>
               <w:spacing w:line="240" w:lineRule="auto"/>
             </w:pPr>
-            <w:hyperlink w:history="1" r:id="rId20">
+            <w:hyperlink r:id="rId20" w:history="1">
               <w:r>
                 <w:rPr>
                   <w:rStyle w:val="Hipervnculo"/>
+                  <w:lang w:val="es-AR"/>
                 </w:rPr>
-                <w:t>Bibliografia</w:t>
-              </w:r>
-              <w:r>
-                <w:rPr>
-                  <w:rStyle w:val="Hipervnculo"/>
-                </w:rPr>
-                <w:t>/</w:t>
-              </w:r>
-              <w:r>
-                <w:rPr>
-                  <w:rStyle w:val="Hipervnculo"/>
-                </w:rPr>
-                <w:t>Bibliografia_De_La_Catedra/MaterialBibliografico/Pensamiento_Ágil</w:t>
+                <w:t>Bibliografia/Bibliografia_De_La_Catedra/MaterialBibliografico/Pensamiento_Ágil</w:t>
               </w:r>
             </w:hyperlink>
+          </w:p>
+          <w:p>
+            <w:pPr>
+              <w:widowControl w:val="0"/>
+              <w:pBdr>
+                <w:top w:val="nil"/>
+                <w:left w:val="nil"/>
+                <w:bottom w:val="nil"/>
+                <w:right w:val="nil"/>
+                <w:between w:val="nil"/>
+              </w:pBdr>
+              <w:spacing w:line="240" w:lineRule="auto"/>
+              <w:rPr>
+                <w:lang w:val="es-AR"/>
+              </w:rPr>
+            </w:pPr>
+          </w:p>
+        </w:tc>
+      </w:tr>
+      <w:tr>
+        <w:trPr>
+          <w:trHeight w:val="610"/>
+        </w:trPr>
+        <w:tc>
+          <w:tcPr>
+            <w:tcW w:w="2250" w:type="dxa"/>
+            <w:tcMar>
+              <w:top w:w="100" w:type="dxa"/>
+              <w:left w:w="100" w:type="dxa"/>
+              <w:bottom w:w="100" w:type="dxa"/>
+              <w:right w:w="100" w:type="dxa"/>
+            </w:tcMar>
+          </w:tcPr>
+          <w:p>
+            <w:pPr>
+              <w:widowControl w:val="0"/>
+              <w:pBdr>
+                <w:top w:val="nil"/>
+                <w:left w:val="nil"/>
+                <w:bottom w:val="nil"/>
+                <w:right w:val="nil"/>
+                <w:between w:val="nil"/>
+              </w:pBdr>
+              <w:spacing w:line="240" w:lineRule="auto"/>
+            </w:pPr>
+            <w:proofErr w:type="spellStart"/>
+            <w:r>
+              <w:t>Consignas</w:t>
+            </w:r>
+            <w:proofErr w:type="spellEnd"/>
+            <w:r>
+              <w:t xml:space="preserve"> del </w:t>
+            </w:r>
+            <w:r>
+              <w:br/>
+            </w:r>
+            <w:proofErr w:type="spellStart"/>
+            <w:r>
+              <w:t>Trabajo</w:t>
+            </w:r>
+            <w:proofErr w:type="spellEnd"/>
+            <w:r>
+              <w:t xml:space="preserve"> </w:t>
+            </w:r>
+            <w:proofErr w:type="spellStart"/>
+            <w:r>
+              <w:t>Practico</w:t>
+            </w:r>
+            <w:proofErr w:type="spellEnd"/>
+          </w:p>
+        </w:tc>
+        <w:tc>
+          <w:tcPr>
+            <w:tcW w:w="4935" w:type="dxa"/>
+            <w:tcMar>
+              <w:top w:w="100" w:type="dxa"/>
+              <w:left w:w="100" w:type="dxa"/>
+              <w:bottom w:w="100" w:type="dxa"/>
+              <w:right w:w="100" w:type="dxa"/>
+            </w:tcMar>
+          </w:tcPr>
+          <w:p>
+            <w:pPr>
+              <w:widowControl w:val="0"/>
+              <w:pBdr>
+                <w:top w:val="nil"/>
+                <w:left w:val="nil"/>
+                <w:bottom w:val="nil"/>
+                <w:right w:val="nil"/>
+                <w:between w:val="nil"/>
+              </w:pBdr>
+              <w:spacing w:line="240" w:lineRule="auto"/>
+              <w:jc w:val="center"/>
+            </w:pPr>
+            <w:r>
+              <w:t>ISW_TP#_&lt;</w:t>
+            </w:r>
+            <w:proofErr w:type="spellStart"/>
+            <w:r>
+              <w:t>NombreTrabajoPractico</w:t>
+            </w:r>
+            <w:proofErr w:type="spellEnd"/>
+            <w:proofErr w:type="gramStart"/>
+            <w:r>
+              <w:t>&gt;.&lt;</w:t>
+            </w:r>
+            <w:proofErr w:type="gramEnd"/>
+            <w:r>
+              <w:t>Extension&gt;</w:t>
+            </w:r>
+          </w:p>
+        </w:tc>
+        <w:tc>
+          <w:tcPr>
+            <w:tcW w:w="3990" w:type="dxa"/>
+            <w:tcMar>
+              <w:top w:w="100" w:type="dxa"/>
+              <w:left w:w="100" w:type="dxa"/>
+              <w:bottom w:w="100" w:type="dxa"/>
+              <w:right w:w="100" w:type="dxa"/>
+            </w:tcMar>
+          </w:tcPr>
+          <w:p>
+            <w:pPr>
+              <w:widowControl w:val="0"/>
+              <w:pBdr>
+                <w:top w:val="nil"/>
+                <w:left w:val="nil"/>
+                <w:bottom w:val="nil"/>
+                <w:right w:val="nil"/>
+                <w:between w:val="nil"/>
+              </w:pBdr>
+              <w:spacing w:line="240" w:lineRule="auto"/>
+              <w:rPr>
+                <w:lang w:val="es-AR"/>
+              </w:rPr>
+            </w:pPr>
+            <w:r>
+              <w:rPr>
+                <w:lang w:val="es-AR"/>
+              </w:rPr>
+              <w:t>ISW_4K1_G4\Entregas\Trabajos_Prácticos\TP</w:t>
+            </w:r>
+            <w:r>
+              <w:rPr>
+                <w:lang w:val="es-AR"/>
+              </w:rPr>
+              <w:t>#</w:t>
+            </w:r>
+            <w:r>
+              <w:rPr>
+                <w:lang w:val="es-AR"/>
+              </w:rPr>
+              <w:t>_</w:t>
+            </w:r>
+            <w:r>
+              <w:rPr>
+                <w:lang w:val="es-AR"/>
+              </w:rPr>
+              <w:t>&lt;NombreTrabajoPractico&gt;</w:t>
+            </w:r>
           </w:p>
         </w:tc>
       </w:tr>
     </w:tbl>
-    <w:p/>
+    <w:p>
+      <w:pPr>
+        <w:rPr>
+          <w:lang w:val="es-AR"/>
+        </w:rPr>
+      </w:pPr>
+    </w:p>
     <w:p>
       <w:pPr>
         <w:rPr>
           <w:b/>
           <w:sz w:val="26"/>
           <w:szCs w:val="26"/>
+          <w:lang w:val="es-AR"/>
         </w:rPr>
       </w:pPr>
     </w:p>
@@ -1505,6 +1634,7 @@
           <w:b/>
           <w:sz w:val="26"/>
           <w:szCs w:val="26"/>
+          <w:lang w:val="es-AR"/>
         </w:rPr>
       </w:pPr>
     </w:p>
@@ -1514,6 +1644,7 @@
           <w:b/>
           <w:sz w:val="26"/>
           <w:szCs w:val="26"/>
+          <w:lang w:val="es-AR"/>
         </w:rPr>
       </w:pPr>
     </w:p>
@@ -1525,6 +1656,7 @@
           <w:sz w:val="30"/>
           <w:szCs w:val="30"/>
           <w:u w:val="single"/>
+          <w:lang w:val="es-AR"/>
         </w:rPr>
       </w:pPr>
     </w:p>
@@ -1536,6 +1668,7 @@
           <w:sz w:val="30"/>
           <w:szCs w:val="30"/>
           <w:u w:val="single"/>
+          <w:lang w:val="es-AR"/>
         </w:rPr>
       </w:pPr>
     </w:p>
@@ -1547,6 +1680,7 @@
           <w:sz w:val="30"/>
           <w:szCs w:val="30"/>
           <w:u w:val="single"/>
+          <w:lang w:val="es-AR"/>
         </w:rPr>
       </w:pPr>
     </w:p>
@@ -1555,6 +1689,7 @@
         <w:rPr>
           <w:sz w:val="30"/>
           <w:szCs w:val="30"/>
+          <w:lang w:val="es-AR"/>
         </w:rPr>
       </w:pPr>
     </w:p>
@@ -1566,6 +1701,7 @@
           <w:sz w:val="30"/>
           <w:szCs w:val="30"/>
           <w:u w:val="single"/>
+          <w:lang w:val="es-AR"/>
         </w:rPr>
       </w:pPr>
     </w:p>
@@ -1577,6 +1713,7 @@
           <w:sz w:val="30"/>
           <w:szCs w:val="30"/>
           <w:u w:val="single"/>
+          <w:lang w:val="es-AR"/>
         </w:rPr>
       </w:pPr>
     </w:p>
@@ -1588,6 +1725,7 @@
           <w:sz w:val="30"/>
           <w:szCs w:val="30"/>
           <w:u w:val="single"/>
+          <w:lang w:val="es-AR"/>
         </w:rPr>
       </w:pPr>
     </w:p>
@@ -1599,6 +1737,7 @@
           <w:sz w:val="30"/>
           <w:szCs w:val="30"/>
           <w:u w:val="single"/>
+          <w:lang w:val="es-AR"/>
         </w:rPr>
       </w:pPr>
     </w:p>
@@ -1610,6 +1749,7 @@
           <w:sz w:val="30"/>
           <w:szCs w:val="30"/>
           <w:u w:val="single"/>
+          <w:lang w:val="es-AR"/>
         </w:rPr>
       </w:pPr>
     </w:p>
@@ -1621,6 +1761,7 @@
           <w:sz w:val="30"/>
           <w:szCs w:val="30"/>
           <w:u w:val="single"/>
+          <w:lang w:val="es-AR"/>
         </w:rPr>
       </w:pPr>
     </w:p>
@@ -1632,6 +1773,7 @@
           <w:sz w:val="30"/>
           <w:szCs w:val="30"/>
           <w:u w:val="single"/>
+          <w:lang w:val="es-AR"/>
         </w:rPr>
       </w:pPr>
     </w:p>
@@ -1643,6 +1785,7 @@
           <w:sz w:val="30"/>
           <w:szCs w:val="30"/>
           <w:u w:val="single"/>
+          <w:lang w:val="es-AR"/>
         </w:rPr>
       </w:pPr>
     </w:p>
@@ -1654,6 +1797,7 @@
           <w:sz w:val="30"/>
           <w:szCs w:val="30"/>
           <w:u w:val="single"/>
+          <w:lang w:val="es-AR"/>
         </w:rPr>
       </w:pPr>
     </w:p>
@@ -1665,6 +1809,7 @@
           <w:sz w:val="30"/>
           <w:szCs w:val="30"/>
           <w:u w:val="single"/>
+          <w:lang w:val="es-AR"/>
         </w:rPr>
       </w:pPr>
     </w:p>
@@ -1676,9 +1821,10 @@
           <w:sz w:val="30"/>
           <w:szCs w:val="30"/>
           <w:u w:val="single"/>
+          <w:lang w:val="es-AR"/>
         </w:rPr>
         <w:sectPr>
-          <w:pgSz w:w="11909" w:h="16834" w:orient="portrait"/>
+          <w:pgSz w:w="11909" w:h="16834"/>
           <w:pgMar w:top="1440" w:right="1440" w:bottom="1440" w:left="1440" w:header="720" w:footer="720" w:gutter="0"/>
           <w:pgNumType w:start="1"/>
           <w:cols w:space="720"/>
@@ -1744,23 +1890,26 @@
         <w:jc w:val="center"/>
       </w:pPr>
       <w:r>
+        <w:rPr>
+          <w:noProof/>
+        </w:rPr>
         <w:drawing>
-          <wp:inline wp14:editId="17DABFA1" wp14:anchorId="7C56C7F8">
+          <wp:inline distT="0" distB="0" distL="0" distR="0" wp14:anchorId="7C56C7F8" wp14:editId="17DABFA1">
             <wp:extent cx="4733925" cy="6171559"/>
             <wp:effectExtent l="0" t="0" r="0" b="0"/>
             <wp:docPr id="1518750164" name="drawing"/>
             <wp:cNvGraphicFramePr>
-              <a:graphicFrameLocks noChangeAspect="1"/>
+              <a:graphicFrameLocks xmlns:a="http://schemas.openxmlformats.org/drawingml/2006/main" noChangeAspect="1"/>
             </wp:cNvGraphicFramePr>
-            <a:graphic>
-              <a:graphicData xmlns:a="http://schemas.openxmlformats.org/drawingml/2006/main" uri="http://schemas.openxmlformats.org/drawingml/2006/picture">
+            <a:graphic xmlns:a="http://schemas.openxmlformats.org/drawingml/2006/main">
+              <a:graphicData uri="http://schemas.openxmlformats.org/drawingml/2006/picture">
                 <pic:pic xmlns:pic="http://schemas.openxmlformats.org/drawingml/2006/picture">
                   <pic:nvPicPr>
                     <pic:cNvPr id="1518750164" name=""/>
                     <pic:cNvPicPr/>
                   </pic:nvPicPr>
                   <pic:blipFill>
-                    <a:blip xmlns:r="http://schemas.openxmlformats.org/officeDocument/2006/relationships" r:embed="rId186820000">
+                    <a:blip r:embed="rId21">
                       <a:extLst>
                         <a:ext uri="{28A0092B-C50C-407E-A947-70E740481C1C}">
                           <a14:useLocalDpi xmlns:a14="http://schemas.microsoft.com/office/drawing/2010/main"/>
@@ -1772,7 +1921,7 @@
                     </a:stretch>
                   </pic:blipFill>
                   <pic:spPr>
-                    <a:xfrm rot="0">
+                    <a:xfrm>
                       <a:off x="0" y="0"/>
                       <a:ext cx="4733925" cy="6171559"/>
                     </a:xfrm>
@@ -1791,7 +1940,7 @@
       <w:pPr>
         <w:jc w:val="center"/>
         <w:sectPr>
-          <w:pgSz w:w="11909" w:h="16834" w:orient="portrait"/>
+          <w:pgSz w:w="11909" w:h="16834"/>
           <w:pgMar w:top="1440" w:right="1440" w:bottom="1440" w:left="1440" w:header="720" w:footer="720" w:gutter="0"/>
           <w:cols w:space="720"/>
         </w:sectPr>
@@ -1805,38 +1954,34 @@
           <w:sz w:val="30"/>
           <w:szCs w:val="30"/>
           <w:u w:val="single"/>
-        </w:rPr>
-      </w:pPr>
-      <w:proofErr w:type="spellStart"/>
+          <w:lang w:val="es-AR"/>
+        </w:rPr>
+      </w:pPr>
       <w:r>
         <w:rPr>
           <w:b/>
           <w:sz w:val="30"/>
           <w:szCs w:val="30"/>
           <w:u w:val="single"/>
+          <w:lang w:val="es-AR"/>
         </w:rPr>
         <w:lastRenderedPageBreak/>
-        <w:t>Criterios</w:t>
-      </w:r>
-      <w:proofErr w:type="spellEnd"/>
-      <w:r>
-        <w:rPr>
-          <w:b/>
-          <w:sz w:val="30"/>
-          <w:szCs w:val="30"/>
-          <w:u w:val="single"/>
-        </w:rPr>
-        <w:t xml:space="preserve"> de Línea Base</w:t>
-      </w:r>
-    </w:p>
-    <w:p w14:noSpellErr="1">
-      <w:pPr>
-        <w:pStyle w:val="Normal"/>
+        <w:t>Criterios de Línea Base</w:t>
+      </w:r>
+    </w:p>
+    <w:p>
+      <w:pPr>
+        <w:rPr>
+          <w:lang w:val="es-AR"/>
+        </w:rPr>
       </w:pPr>
     </w:p>
     <w:p>
       <w:pPr>
         <w:jc w:val="both"/>
+        <w:rPr>
+          <w:lang w:val="es-AR"/>
+        </w:rPr>
       </w:pPr>
       <w:r>
         <w:rPr>
@@ -1850,12 +1995,14 @@
         </w:rPr>
         <w:t xml:space="preserve">El contenido de </w:t>
       </w:r>
+      <w:proofErr w:type="gramStart"/>
       <w:r>
         <w:rPr>
           <w:lang w:val="es-ES"/>
         </w:rPr>
         <w:t>la misma</w:t>
       </w:r>
+      <w:proofErr w:type="gramEnd"/>
       <w:r>
         <w:rPr>
           <w:lang w:val="es-ES"/>
@@ -1871,21 +2018,29 @@
     </w:p>
     <w:p>
       <w:pPr>
-        <w:pStyle w:val="Normal"/>
         <w:jc w:val="both"/>
-      </w:pPr>
-      <w:r>
-        <w:rPr/>
+        <w:rPr>
+          <w:lang w:val="es-AR"/>
+        </w:rPr>
+      </w:pPr>
+      <w:r>
+        <w:rPr>
+          <w:lang w:val="es-AR"/>
+        </w:rPr>
         <w:t xml:space="preserve"> </w:t>
       </w:r>
     </w:p>
     <w:p>
       <w:pPr>
-        <w:pStyle w:val="Normal"/>
         <w:jc w:val="both"/>
-      </w:pPr>
-      <w:r>
-        <w:rPr/>
+        <w:rPr>
+          <w:lang w:val="es-AR"/>
+        </w:rPr>
+      </w:pPr>
+      <w:r>
+        <w:rPr>
+          <w:lang w:val="es-AR"/>
+        </w:rPr>
         <w:t>La línea base del repositorio será modificada únicamente cuando exista un consenso entre todos los miembros del equipo. Esto implica que los 10 integrantes deberán revisar y aprobar los cambios propuestos antes de su consolidación.</w:t>
       </w:r>
     </w:p>
@@ -1894,6 +2049,7 @@
         <w:jc w:val="center"/>
         <w:rPr>
           <w:u w:val="single"/>
+          <w:lang w:val="es-AR"/>
         </w:rPr>
       </w:pPr>
     </w:p>
@@ -1902,6 +2058,7 @@
         <w:jc w:val="center"/>
         <w:rPr>
           <w:u w:val="single"/>
+          <w:lang w:val="es-AR"/>
         </w:rPr>
       </w:pPr>
     </w:p>
@@ -1910,11 +2067,12 @@
         <w:jc w:val="center"/>
         <w:rPr>
           <w:u w:val="single"/>
+          <w:lang w:val="es-AR"/>
         </w:rPr>
       </w:pPr>
     </w:p>
     <w:sectPr>
-      <w:pgSz w:w="11909" w:h="16834" w:orient="portrait"/>
+      <w:pgSz w:w="11909" w:h="16834"/>
       <w:pgMar w:top="1440" w:right="1440" w:bottom="1440" w:left="1440" w:header="720" w:footer="720" w:gutter="0"/>
       <w:cols w:space="720"/>
     </w:sectPr>
@@ -2050,7 +2208,7 @@
         <w:ind w:left="720" w:hanging="360"/>
       </w:pPr>
       <w:rPr>
-        <w:rFonts w:ascii="Arial" w:hAnsi="Arial" w:eastAsia="Arial" w:cs="Arial"/>
+        <w:rFonts w:ascii="Arial" w:eastAsia="Arial" w:hAnsi="Arial" w:cs="Arial"/>
         <w:color w:val="1F2328"/>
         <w:sz w:val="24"/>
         <w:szCs w:val="24"/>
@@ -2168,7 +2326,7 @@
   <w:docDefaults>
     <w:rPrDefault>
       <w:rPr>
-        <w:rFonts w:ascii="Arial" w:hAnsi="Arial" w:eastAsia="Arial" w:cs="Arial"/>
+        <w:rFonts w:ascii="Arial" w:eastAsia="Arial" w:hAnsi="Arial" w:cs="Arial"/>
         <w:sz w:val="22"/>
         <w:szCs w:val="22"/>
         <w:lang w:val="en-US" w:eastAsia="en-US" w:bidi="ar-SA"/>
@@ -2183,14 +2341,14 @@
   <w:latentStyles w:defLockedState="0" w:defUIPriority="99" w:defSemiHidden="0" w:defUnhideWhenUsed="0" w:defQFormat="0" w:count="376">
     <w:lsdException w:name="Normal" w:uiPriority="0" w:qFormat="1"/>
     <w:lsdException w:name="heading 1" w:uiPriority="9" w:qFormat="1"/>
-    <w:lsdException w:name="heading 2" w:uiPriority="9" w:semiHidden="1" w:unhideWhenUsed="1" w:qFormat="1"/>
-    <w:lsdException w:name="heading 3" w:uiPriority="9" w:semiHidden="1" w:unhideWhenUsed="1" w:qFormat="1"/>
-    <w:lsdException w:name="heading 4" w:uiPriority="9" w:semiHidden="1" w:unhideWhenUsed="1" w:qFormat="1"/>
-    <w:lsdException w:name="heading 5" w:uiPriority="9" w:semiHidden="1" w:unhideWhenUsed="1" w:qFormat="1"/>
-    <w:lsdException w:name="heading 6" w:uiPriority="9" w:semiHidden="1" w:unhideWhenUsed="1" w:qFormat="1"/>
-    <w:lsdException w:name="heading 7" w:uiPriority="9" w:semiHidden="1" w:unhideWhenUsed="1" w:qFormat="1"/>
-    <w:lsdException w:name="heading 8" w:uiPriority="9" w:semiHidden="1" w:unhideWhenUsed="1" w:qFormat="1"/>
-    <w:lsdException w:name="heading 9" w:uiPriority="9" w:semiHidden="1" w:unhideWhenUsed="1" w:qFormat="1"/>
+    <w:lsdException w:name="heading 2" w:semiHidden="1" w:uiPriority="9" w:unhideWhenUsed="1" w:qFormat="1"/>
+    <w:lsdException w:name="heading 3" w:semiHidden="1" w:uiPriority="9" w:unhideWhenUsed="1" w:qFormat="1"/>
+    <w:lsdException w:name="heading 4" w:semiHidden="1" w:uiPriority="9" w:unhideWhenUsed="1" w:qFormat="1"/>
+    <w:lsdException w:name="heading 5" w:semiHidden="1" w:uiPriority="9" w:unhideWhenUsed="1" w:qFormat="1"/>
+    <w:lsdException w:name="heading 6" w:semiHidden="1" w:uiPriority="9" w:unhideWhenUsed="1" w:qFormat="1"/>
+    <w:lsdException w:name="heading 7" w:semiHidden="1" w:uiPriority="9" w:unhideWhenUsed="1" w:qFormat="1"/>
+    <w:lsdException w:name="heading 8" w:semiHidden="1" w:uiPriority="9" w:unhideWhenUsed="1" w:qFormat="1"/>
+    <w:lsdException w:name="heading 9" w:semiHidden="1" w:uiPriority="9" w:unhideWhenUsed="1" w:qFormat="1"/>
     <w:lsdException w:name="index 1" w:semiHidden="1" w:unhideWhenUsed="1"/>
     <w:lsdException w:name="index 2" w:semiHidden="1" w:unhideWhenUsed="1"/>
     <w:lsdException w:name="index 3" w:semiHidden="1" w:unhideWhenUsed="1"/>
@@ -2200,22 +2358,22 @@
     <w:lsdException w:name="index 7" w:semiHidden="1" w:unhideWhenUsed="1"/>
     <w:lsdException w:name="index 8" w:semiHidden="1" w:unhideWhenUsed="1"/>
     <w:lsdException w:name="index 9" w:semiHidden="1" w:unhideWhenUsed="1"/>
-    <w:lsdException w:name="toc 1" w:uiPriority="39" w:semiHidden="1" w:unhideWhenUsed="1"/>
-    <w:lsdException w:name="toc 2" w:uiPriority="39" w:semiHidden="1" w:unhideWhenUsed="1"/>
-    <w:lsdException w:name="toc 3" w:uiPriority="39" w:semiHidden="1" w:unhideWhenUsed="1"/>
-    <w:lsdException w:name="toc 4" w:uiPriority="39" w:semiHidden="1" w:unhideWhenUsed="1"/>
-    <w:lsdException w:name="toc 5" w:uiPriority="39" w:semiHidden="1" w:unhideWhenUsed="1"/>
-    <w:lsdException w:name="toc 6" w:uiPriority="39" w:semiHidden="1" w:unhideWhenUsed="1"/>
-    <w:lsdException w:name="toc 7" w:uiPriority="39" w:semiHidden="1" w:unhideWhenUsed="1"/>
-    <w:lsdException w:name="toc 8" w:uiPriority="39" w:semiHidden="1" w:unhideWhenUsed="1"/>
-    <w:lsdException w:name="toc 9" w:uiPriority="39" w:semiHidden="1" w:unhideWhenUsed="1"/>
+    <w:lsdException w:name="toc 1" w:semiHidden="1" w:uiPriority="39" w:unhideWhenUsed="1"/>
+    <w:lsdException w:name="toc 2" w:semiHidden="1" w:uiPriority="39" w:unhideWhenUsed="1"/>
+    <w:lsdException w:name="toc 3" w:semiHidden="1" w:uiPriority="39" w:unhideWhenUsed="1"/>
+    <w:lsdException w:name="toc 4" w:semiHidden="1" w:uiPriority="39" w:unhideWhenUsed="1"/>
+    <w:lsdException w:name="toc 5" w:semiHidden="1" w:uiPriority="39" w:unhideWhenUsed="1"/>
+    <w:lsdException w:name="toc 6" w:semiHidden="1" w:uiPriority="39" w:unhideWhenUsed="1"/>
+    <w:lsdException w:name="toc 7" w:semiHidden="1" w:uiPriority="39" w:unhideWhenUsed="1"/>
+    <w:lsdException w:name="toc 8" w:semiHidden="1" w:uiPriority="39" w:unhideWhenUsed="1"/>
+    <w:lsdException w:name="toc 9" w:semiHidden="1" w:uiPriority="39" w:unhideWhenUsed="1"/>
     <w:lsdException w:name="Normal Indent" w:semiHidden="1" w:unhideWhenUsed="1"/>
     <w:lsdException w:name="footnote text" w:semiHidden="1" w:unhideWhenUsed="1"/>
     <w:lsdException w:name="annotation text" w:semiHidden="1" w:unhideWhenUsed="1"/>
     <w:lsdException w:name="header" w:semiHidden="1" w:unhideWhenUsed="1"/>
     <w:lsdException w:name="footer" w:semiHidden="1" w:unhideWhenUsed="1"/>
     <w:lsdException w:name="index heading" w:semiHidden="1" w:unhideWhenUsed="1"/>
-    <w:lsdException w:name="caption" w:uiPriority="35" w:semiHidden="1" w:unhideWhenUsed="1" w:qFormat="1"/>
+    <w:lsdException w:name="caption" w:semiHidden="1" w:uiPriority="35" w:unhideWhenUsed="1" w:qFormat="1"/>
     <w:lsdException w:name="table of figures" w:semiHidden="1" w:unhideWhenUsed="1"/>
     <w:lsdException w:name="envelope address" w:semiHidden="1" w:unhideWhenUsed="1"/>
     <w:lsdException w:name="envelope return" w:semiHidden="1" w:unhideWhenUsed="1"/>
@@ -2246,7 +2404,7 @@
     <w:lsdException w:name="Title" w:uiPriority="10" w:qFormat="1"/>
     <w:lsdException w:name="Closing" w:semiHidden="1" w:unhideWhenUsed="1"/>
     <w:lsdException w:name="Signature" w:semiHidden="1" w:unhideWhenUsed="1"/>
-    <w:lsdException w:name="Default Paragraph Font" w:uiPriority="1" w:semiHidden="1" w:unhideWhenUsed="1"/>
+    <w:lsdException w:name="Default Paragraph Font" w:semiHidden="1" w:uiPriority="1" w:unhideWhenUsed="1"/>
     <w:lsdException w:name="Body Text" w:semiHidden="1" w:unhideWhenUsed="1"/>
     <w:lsdException w:name="Body Text Indent" w:semiHidden="1" w:unhideWhenUsed="1"/>
     <w:lsdException w:name="List Continue" w:semiHidden="1" w:unhideWhenUsed="1"/>
@@ -2446,8 +2604,8 @@
     <w:lsdException w:name="Subtle Reference" w:uiPriority="31" w:qFormat="1"/>
     <w:lsdException w:name="Intense Reference" w:uiPriority="32" w:qFormat="1"/>
     <w:lsdException w:name="Book Title" w:uiPriority="33" w:qFormat="1"/>
-    <w:lsdException w:name="Bibliography" w:uiPriority="37" w:semiHidden="1" w:unhideWhenUsed="1"/>
-    <w:lsdException w:name="TOC Heading" w:uiPriority="39" w:semiHidden="1" w:unhideWhenUsed="1" w:qFormat="1"/>
+    <w:lsdException w:name="Bibliography" w:semiHidden="1" w:uiPriority="37" w:unhideWhenUsed="1"/>
+    <w:lsdException w:name="TOC Heading" w:semiHidden="1" w:uiPriority="39" w:unhideWhenUsed="1" w:qFormat="1"/>
     <w:lsdException w:name="Plain Table 1" w:uiPriority="41"/>
     <w:lsdException w:name="Plain Table 2" w:uiPriority="42"/>
     <w:lsdException w:name="Plain Table 3" w:uiPriority="43"/>
@@ -2558,7 +2716,7 @@
     <w:lsdException w:name="Unresolved Mention" w:semiHidden="1" w:unhideWhenUsed="1"/>
     <w:lsdException w:name="Smart Link" w:semiHidden="1" w:unhideWhenUsed="1"/>
   </w:latentStyles>
-  <w:style w:type="paragraph" w:styleId="Normal" w:default="1">
+  <w:style w:type="paragraph" w:default="1" w:styleId="Normal">
     <w:name w:val="Normal"/>
   </w:style>
   <w:style w:type="paragraph" w:styleId="Ttulo1">
@@ -2652,13 +2810,13 @@
       <w:color w:val="666666"/>
     </w:rPr>
   </w:style>
-  <w:style w:type="character" w:styleId="Fuentedeprrafopredeter" w:default="1">
+  <w:style w:type="character" w:default="1" w:styleId="Fuentedeprrafopredeter">
     <w:name w:val="Default Paragraph Font"/>
     <w:uiPriority w:val="1"/>
     <w:semiHidden/>
     <w:unhideWhenUsed/>
   </w:style>
-  <w:style w:type="table" w:styleId="Tablanormal" w:default="1">
+  <w:style w:type="table" w:default="1" w:styleId="Tablanormal">
     <w:name w:val="Normal Table"/>
     <w:uiPriority w:val="99"/>
     <w:semiHidden/>
@@ -2673,13 +2831,13 @@
       </w:tblCellMar>
     </w:tblPr>
   </w:style>
-  <w:style w:type="numbering" w:styleId="Sinlista" w:default="1">
+  <w:style w:type="numbering" w:default="1" w:styleId="Sinlista">
     <w:name w:val="No List"/>
     <w:uiPriority w:val="99"/>
     <w:semiHidden/>
     <w:unhideWhenUsed/>
   </w:style>
-  <w:style w:type="table" w:styleId="TableNormal" w:customStyle="1">
+  <w:style w:type="table" w:customStyle="1" w:styleId="TableNormal">
     <w:name w:val="TableNormal"/>
     <w:tblPr>
       <w:tblCellMar>
@@ -2719,7 +2877,7 @@
       <w:szCs w:val="30"/>
     </w:rPr>
   </w:style>
-  <w:style w:type="table" w:styleId="a" w:customStyle="1">
+  <w:style w:type="table" w:customStyle="1" w:styleId="a">
     <w:basedOn w:val="TableNormal"/>
     <w:tblPr>
       <w:tblStyleRowBandSize w:val="1"/>

</xml_diff>

<commit_message>
Glosario agregado al plan de gestion de la configuracion
</commit_message>
<xml_diff>
--- a/Plan_Gestion_Configuracion_G4_ISW_4K1.docx
+++ b/Plan_Gestion_Configuracion_G4_ISW_4K1.docx
@@ -23,12 +23,12 @@
           <wp:inline distB="0" distT="0" distL="0" distR="0">
             <wp:extent cx="1247035" cy="1465004"/>
             <wp:effectExtent b="0" l="0" r="0" t="0"/>
-            <wp:docPr id="1" name="image2.png"/>
+            <wp:docPr id="1" name="image1.png"/>
             <a:graphic>
               <a:graphicData uri="http://schemas.openxmlformats.org/drawingml/2006/picture">
                 <pic:pic>
                   <pic:nvPicPr>
-                    <pic:cNvPr id="0" name="image2.png"/>
+                    <pic:cNvPr id="0" name="image1.png"/>
                     <pic:cNvPicPr preferRelativeResize="0"/>
                   </pic:nvPicPr>
                   <pic:blipFill>
@@ -171,31 +171,21 @@
           <w:sz w:val="20"/>
           <w:szCs w:val="20"/>
         </w:rPr>
-      </w:pPr>
-      <w:r>
-        <w:rPr>
-          <w:b w:val="1"/>
-          <w:sz w:val="24"/>
-          <w:szCs w:val="24"/>
-          <w:rtl w:val="0"/>
-        </w:rPr>
-        <w:t xml:space="preserve">Nro. de grupo: 4</w:t>
-      </w:r>
-      <w:r>
-        <w:rPr>
-          <w:rtl w:val="0"/>
-        </w:rPr>
-      </w:r>
-    </w:p>
-    <w:p>
-      <w:pPr>
-        <w:rPr/>
         <w:sectPr>
           <w:pgSz w:h="16834" w:w="11909" w:orient="portrait"/>
           <w:pgMar w:bottom="720" w:top="720" w:left="720" w:right="720" w:header="720" w:footer="720"/>
           <w:pgNumType w:start="1"/>
         </w:sectPr>
       </w:pPr>
+      <w:r>
+        <w:rPr>
+          <w:b w:val="1"/>
+          <w:sz w:val="24"/>
+          <w:szCs w:val="24"/>
+          <w:rtl w:val="0"/>
+        </w:rPr>
+        <w:t xml:space="preserve">Nro. de grupo: 4</w:t>
+      </w:r>
       <w:r>
         <w:rPr>
           <w:rtl w:val="0"/>
@@ -1382,14 +1372,12 @@
               <w:spacing w:line="240" w:lineRule="auto"/>
               <w:jc w:val="center"/>
               <w:rPr>
-                <w:rFonts w:ascii="Consolas" w:cs="Consolas" w:eastAsia="Consolas" w:hAnsi="Consolas"/>
                 <w:sz w:val="20"/>
                 <w:szCs w:val="20"/>
               </w:rPr>
             </w:pPr>
             <w:r>
               <w:rPr>
-                <w:rFonts w:ascii="Consolas" w:cs="Consolas" w:eastAsia="Consolas" w:hAnsi="Consolas"/>
                 <w:sz w:val="20"/>
                 <w:szCs w:val="20"/>
                 <w:rtl w:val="0"/>
@@ -1506,14 +1494,12 @@
               <w:spacing w:line="240" w:lineRule="auto"/>
               <w:jc w:val="center"/>
               <w:rPr>
-                <w:rFonts w:ascii="Consolas" w:cs="Consolas" w:eastAsia="Consolas" w:hAnsi="Consolas"/>
                 <w:sz w:val="20"/>
                 <w:szCs w:val="20"/>
               </w:rPr>
             </w:pPr>
             <w:r>
               <w:rPr>
-                <w:rFonts w:ascii="Consolas" w:cs="Consolas" w:eastAsia="Consolas" w:hAnsi="Consolas"/>
                 <w:sz w:val="20"/>
                 <w:szCs w:val="20"/>
                 <w:rtl w:val="0"/>
@@ -1630,14 +1616,12 @@
               <w:spacing w:line="240" w:lineRule="auto"/>
               <w:jc w:val="center"/>
               <w:rPr>
-                <w:rFonts w:ascii="Consolas" w:cs="Consolas" w:eastAsia="Consolas" w:hAnsi="Consolas"/>
                 <w:sz w:val="20"/>
                 <w:szCs w:val="20"/>
               </w:rPr>
             </w:pPr>
             <w:r>
               <w:rPr>
-                <w:rFonts w:ascii="Consolas" w:cs="Consolas" w:eastAsia="Consolas" w:hAnsi="Consolas"/>
                 <w:sz w:val="20"/>
                 <w:szCs w:val="20"/>
                 <w:rtl w:val="0"/>
@@ -1754,14 +1738,12 @@
               <w:spacing w:line="240" w:lineRule="auto"/>
               <w:jc w:val="center"/>
               <w:rPr>
-                <w:rFonts w:ascii="Consolas" w:cs="Consolas" w:eastAsia="Consolas" w:hAnsi="Consolas"/>
                 <w:sz w:val="20"/>
                 <w:szCs w:val="20"/>
               </w:rPr>
             </w:pPr>
             <w:r>
               <w:rPr>
-                <w:rFonts w:ascii="Consolas" w:cs="Consolas" w:eastAsia="Consolas" w:hAnsi="Consolas"/>
                 <w:sz w:val="20"/>
                 <w:szCs w:val="20"/>
                 <w:rtl w:val="0"/>
@@ -1878,14 +1860,12 @@
               <w:spacing w:line="240" w:lineRule="auto"/>
               <w:jc w:val="center"/>
               <w:rPr>
-                <w:rFonts w:ascii="Consolas" w:cs="Consolas" w:eastAsia="Consolas" w:hAnsi="Consolas"/>
                 <w:sz w:val="20"/>
                 <w:szCs w:val="20"/>
               </w:rPr>
             </w:pPr>
             <w:r>
               <w:rPr>
-                <w:rFonts w:ascii="Consolas" w:cs="Consolas" w:eastAsia="Consolas" w:hAnsi="Consolas"/>
                 <w:sz w:val="20"/>
                 <w:szCs w:val="20"/>
                 <w:rtl w:val="0"/>
@@ -2002,14 +1982,12 @@
               <w:spacing w:line="240" w:lineRule="auto"/>
               <w:jc w:val="center"/>
               <w:rPr>
-                <w:rFonts w:ascii="Consolas" w:cs="Consolas" w:eastAsia="Consolas" w:hAnsi="Consolas"/>
                 <w:sz w:val="20"/>
                 <w:szCs w:val="20"/>
               </w:rPr>
             </w:pPr>
             <w:r>
               <w:rPr>
-                <w:rFonts w:ascii="Consolas" w:cs="Consolas" w:eastAsia="Consolas" w:hAnsi="Consolas"/>
                 <w:sz w:val="20"/>
                 <w:szCs w:val="20"/>
                 <w:rtl w:val="0"/>
@@ -2141,12 +2119,12 @@
           <wp:inline distB="0" distT="0" distL="0" distR="0">
             <wp:extent cx="4733925" cy="6171559"/>
             <wp:effectExtent b="0" l="0" r="0" t="0"/>
-            <wp:docPr id="2" name="image1.png"/>
+            <wp:docPr id="2" name="image2.png"/>
             <a:graphic>
               <a:graphicData uri="http://schemas.openxmlformats.org/drawingml/2006/picture">
                 <pic:pic>
                   <pic:nvPicPr>
-                    <pic:cNvPr id="0" name="image1.png"/>
+                    <pic:cNvPr id="0" name="image2.png"/>
                     <pic:cNvPicPr preferRelativeResize="0"/>
                   </pic:nvPicPr>
                   <pic:blipFill>
@@ -2170,6 +2148,1020 @@
           </wp:inline>
         </w:drawing>
       </w:r>
+      <w:r>
+        <w:rPr>
+          <w:rtl w:val="0"/>
+        </w:rPr>
+      </w:r>
+    </w:p>
+    <w:p>
+      <w:pPr>
+        <w:jc w:val="center"/>
+        <w:rPr>
+          <w:b w:val="1"/>
+          <w:sz w:val="30"/>
+          <w:szCs w:val="30"/>
+          <w:u w:val="single"/>
+        </w:rPr>
+      </w:pPr>
+      <w:r>
+        <w:rPr>
+          <w:b w:val="1"/>
+          <w:sz w:val="30"/>
+          <w:szCs w:val="30"/>
+          <w:u w:val="single"/>
+          <w:rtl w:val="0"/>
+        </w:rPr>
+        <w:t xml:space="preserve">Glosario</w:t>
+      </w:r>
+    </w:p>
+    <w:p>
+      <w:pPr>
+        <w:jc w:val="left"/>
+        <w:rPr>
+          <w:u w:val="single"/>
+        </w:rPr>
+      </w:pPr>
+      <w:r>
+        <w:rPr>
+          <w:rtl w:val="0"/>
+        </w:rPr>
+      </w:r>
+    </w:p>
+    <w:p>
+      <w:pPr>
+        <w:jc w:val="center"/>
+        <w:rPr>
+          <w:b w:val="1"/>
+          <w:sz w:val="30"/>
+          <w:szCs w:val="30"/>
+          <w:u w:val="single"/>
+        </w:rPr>
+      </w:pPr>
+      <w:r>
+        <w:rPr>
+          <w:rtl w:val="0"/>
+        </w:rPr>
+      </w:r>
+    </w:p>
+    <w:p>
+      <w:pPr>
+        <w:jc w:val="center"/>
+        <w:rPr>
+          <w:b w:val="1"/>
+          <w:sz w:val="30"/>
+          <w:szCs w:val="30"/>
+          <w:u w:val="single"/>
+        </w:rPr>
+      </w:pPr>
+      <w:r>
+        <w:rPr>
+          <w:rtl w:val="0"/>
+        </w:rPr>
+      </w:r>
+    </w:p>
+    <w:tbl>
+      <w:tblPr>
+        <w:tblStyle w:val="Table3"/>
+        <w:tblW w:w="9029.0" w:type="dxa"/>
+        <w:jc w:val="center"/>
+        <w:tblBorders>
+          <w:top w:color="000000" w:space="0" w:sz="8" w:val="single"/>
+          <w:left w:color="000000" w:space="0" w:sz="8" w:val="single"/>
+          <w:bottom w:color="000000" w:space="0" w:sz="8" w:val="single"/>
+          <w:right w:color="000000" w:space="0" w:sz="8" w:val="single"/>
+          <w:insideH w:color="000000" w:space="0" w:sz="8" w:val="single"/>
+          <w:insideV w:color="000000" w:space="0" w:sz="8" w:val="single"/>
+        </w:tblBorders>
+        <w:tblLayout w:type="fixed"/>
+        <w:tblLook w:val="0600"/>
+      </w:tblPr>
+      <w:tblGrid>
+        <w:gridCol w:w="4514.5"/>
+        <w:gridCol w:w="4514.5"/>
+        <w:tblGridChange w:id="0">
+          <w:tblGrid>
+            <w:gridCol w:w="4514.5"/>
+            <w:gridCol w:w="4514.5"/>
+          </w:tblGrid>
+        </w:tblGridChange>
+      </w:tblGrid>
+      <w:tr>
+        <w:trPr>
+          <w:cantSplit w:val="0"/>
+          <w:tblHeader w:val="0"/>
+        </w:trPr>
+        <w:tc>
+          <w:tcPr>
+            <w:shd w:fill="auto" w:val="clear"/>
+            <w:tcMar>
+              <w:top w:w="100.0" w:type="dxa"/>
+              <w:left w:w="100.0" w:type="dxa"/>
+              <w:bottom w:w="100.0" w:type="dxa"/>
+              <w:right w:w="100.0" w:type="dxa"/>
+            </w:tcMar>
+            <w:vAlign w:val="top"/>
+          </w:tcPr>
+          <w:p>
+            <w:pPr>
+              <w:keepNext w:val="0"/>
+              <w:keepLines w:val="0"/>
+              <w:pageBreakBefore w:val="0"/>
+              <w:widowControl w:val="0"/>
+              <w:pBdr>
+                <w:top w:space="0" w:sz="0" w:val="nil"/>
+                <w:left w:space="0" w:sz="0" w:val="nil"/>
+                <w:bottom w:space="0" w:sz="0" w:val="nil"/>
+                <w:right w:space="0" w:sz="0" w:val="nil"/>
+                <w:between w:space="0" w:sz="0" w:val="nil"/>
+              </w:pBdr>
+              <w:shd w:fill="auto" w:val="clear"/>
+              <w:spacing w:after="0" w:before="0" w:line="240" w:lineRule="auto"/>
+              <w:ind w:left="0" w:right="0" w:firstLine="0"/>
+              <w:jc w:val="center"/>
+              <w:rPr>
+                <w:b w:val="1"/>
+                <w:sz w:val="30"/>
+                <w:szCs w:val="30"/>
+              </w:rPr>
+            </w:pPr>
+            <w:r>
+              <w:rPr>
+                <w:b w:val="1"/>
+                <w:sz w:val="30"/>
+                <w:szCs w:val="30"/>
+                <w:rtl w:val="0"/>
+              </w:rPr>
+              <w:t xml:space="preserve">Sigla</w:t>
+            </w:r>
+          </w:p>
+        </w:tc>
+        <w:tc>
+          <w:tcPr>
+            <w:shd w:fill="auto" w:val="clear"/>
+            <w:tcMar>
+              <w:top w:w="100.0" w:type="dxa"/>
+              <w:left w:w="100.0" w:type="dxa"/>
+              <w:bottom w:w="100.0" w:type="dxa"/>
+              <w:right w:w="100.0" w:type="dxa"/>
+            </w:tcMar>
+            <w:vAlign w:val="top"/>
+          </w:tcPr>
+          <w:p>
+            <w:pPr>
+              <w:keepNext w:val="0"/>
+              <w:keepLines w:val="0"/>
+              <w:pageBreakBefore w:val="0"/>
+              <w:widowControl w:val="0"/>
+              <w:pBdr>
+                <w:top w:space="0" w:sz="0" w:val="nil"/>
+                <w:left w:space="0" w:sz="0" w:val="nil"/>
+                <w:bottom w:space="0" w:sz="0" w:val="nil"/>
+                <w:right w:space="0" w:sz="0" w:val="nil"/>
+                <w:between w:space="0" w:sz="0" w:val="nil"/>
+              </w:pBdr>
+              <w:shd w:fill="auto" w:val="clear"/>
+              <w:spacing w:after="0" w:before="0" w:line="240" w:lineRule="auto"/>
+              <w:ind w:left="0" w:right="0" w:firstLine="0"/>
+              <w:jc w:val="center"/>
+              <w:rPr>
+                <w:b w:val="1"/>
+                <w:sz w:val="30"/>
+                <w:szCs w:val="30"/>
+              </w:rPr>
+            </w:pPr>
+            <w:r>
+              <w:rPr>
+                <w:b w:val="1"/>
+                <w:sz w:val="30"/>
+                <w:szCs w:val="30"/>
+                <w:rtl w:val="0"/>
+              </w:rPr>
+              <w:t xml:space="preserve">Significado</w:t>
+            </w:r>
+          </w:p>
+        </w:tc>
+      </w:tr>
+      <w:tr>
+        <w:trPr>
+          <w:cantSplit w:val="0"/>
+          <w:tblHeader w:val="0"/>
+        </w:trPr>
+        <w:tc>
+          <w:tcPr>
+            <w:shd w:fill="auto" w:val="clear"/>
+            <w:tcMar>
+              <w:top w:w="100.0" w:type="dxa"/>
+              <w:left w:w="100.0" w:type="dxa"/>
+              <w:bottom w:w="100.0" w:type="dxa"/>
+              <w:right w:w="100.0" w:type="dxa"/>
+            </w:tcMar>
+            <w:vAlign w:val="top"/>
+          </w:tcPr>
+          <w:p>
+            <w:pPr>
+              <w:widowControl w:val="0"/>
+              <w:spacing w:line="240" w:lineRule="auto"/>
+              <w:jc w:val="center"/>
+              <w:rPr>
+                <w:sz w:val="24"/>
+                <w:szCs w:val="24"/>
+                <w:u w:val="single"/>
+              </w:rPr>
+            </w:pPr>
+            <w:r>
+              <w:rPr>
+                <w:sz w:val="24"/>
+                <w:szCs w:val="24"/>
+                <w:rtl w:val="0"/>
+              </w:rPr>
+              <w:t xml:space="preserve">&lt;NombreTrabajoPractico&gt;</w:t>
+            </w:r>
+            <w:r>
+              <w:rPr>
+                <w:rtl w:val="0"/>
+              </w:rPr>
+            </w:r>
+          </w:p>
+        </w:tc>
+        <w:tc>
+          <w:tcPr>
+            <w:shd w:fill="auto" w:val="clear"/>
+            <w:tcMar>
+              <w:top w:w="100.0" w:type="dxa"/>
+              <w:left w:w="100.0" w:type="dxa"/>
+              <w:bottom w:w="100.0" w:type="dxa"/>
+              <w:right w:w="100.0" w:type="dxa"/>
+            </w:tcMar>
+            <w:vAlign w:val="top"/>
+          </w:tcPr>
+          <w:p>
+            <w:pPr>
+              <w:keepNext w:val="0"/>
+              <w:keepLines w:val="0"/>
+              <w:pageBreakBefore w:val="0"/>
+              <w:widowControl w:val="0"/>
+              <w:pBdr>
+                <w:top w:space="0" w:sz="0" w:val="nil"/>
+                <w:left w:space="0" w:sz="0" w:val="nil"/>
+                <w:bottom w:space="0" w:sz="0" w:val="nil"/>
+                <w:right w:space="0" w:sz="0" w:val="nil"/>
+                <w:between w:space="0" w:sz="0" w:val="nil"/>
+              </w:pBdr>
+              <w:shd w:fill="auto" w:val="clear"/>
+              <w:spacing w:after="0" w:before="0" w:line="240" w:lineRule="auto"/>
+              <w:ind w:left="0" w:right="0" w:firstLine="0"/>
+              <w:jc w:val="center"/>
+              <w:rPr>
+                <w:sz w:val="24"/>
+                <w:szCs w:val="24"/>
+              </w:rPr>
+            </w:pPr>
+            <w:r>
+              <w:rPr>
+                <w:sz w:val="24"/>
+                <w:szCs w:val="24"/>
+                <w:rtl w:val="0"/>
+              </w:rPr>
+              <w:t xml:space="preserve">Nombre que permite identificar cada trabajo práctico de forma unívoca.</w:t>
+            </w:r>
+          </w:p>
+        </w:tc>
+      </w:tr>
+      <w:tr>
+        <w:trPr>
+          <w:cantSplit w:val="0"/>
+          <w:tblHeader w:val="0"/>
+        </w:trPr>
+        <w:tc>
+          <w:tcPr>
+            <w:shd w:fill="auto" w:val="clear"/>
+            <w:tcMar>
+              <w:top w:w="100.0" w:type="dxa"/>
+              <w:left w:w="100.0" w:type="dxa"/>
+              <w:bottom w:w="100.0" w:type="dxa"/>
+              <w:right w:w="100.0" w:type="dxa"/>
+            </w:tcMar>
+            <w:vAlign w:val="top"/>
+          </w:tcPr>
+          <w:p>
+            <w:pPr>
+              <w:widowControl w:val="0"/>
+              <w:spacing w:line="240" w:lineRule="auto"/>
+              <w:jc w:val="center"/>
+              <w:rPr>
+                <w:sz w:val="24"/>
+                <w:szCs w:val="24"/>
+                <w:u w:val="single"/>
+              </w:rPr>
+            </w:pPr>
+            <w:r>
+              <w:rPr>
+                <w:rtl w:val="0"/>
+              </w:rPr>
+              <w:t xml:space="preserve">TP#</w:t>
+            </w:r>
+            <w:r>
+              <w:rPr>
+                <w:rtl w:val="0"/>
+              </w:rPr>
+            </w:r>
+          </w:p>
+        </w:tc>
+        <w:tc>
+          <w:tcPr>
+            <w:shd w:fill="auto" w:val="clear"/>
+            <w:tcMar>
+              <w:top w:w="100.0" w:type="dxa"/>
+              <w:left w:w="100.0" w:type="dxa"/>
+              <w:bottom w:w="100.0" w:type="dxa"/>
+              <w:right w:w="100.0" w:type="dxa"/>
+            </w:tcMar>
+            <w:vAlign w:val="top"/>
+          </w:tcPr>
+          <w:p>
+            <w:pPr>
+              <w:keepNext w:val="0"/>
+              <w:keepLines w:val="0"/>
+              <w:pageBreakBefore w:val="0"/>
+              <w:widowControl w:val="0"/>
+              <w:pBdr>
+                <w:top w:space="0" w:sz="0" w:val="nil"/>
+                <w:left w:space="0" w:sz="0" w:val="nil"/>
+                <w:bottom w:space="0" w:sz="0" w:val="nil"/>
+                <w:right w:space="0" w:sz="0" w:val="nil"/>
+                <w:between w:space="0" w:sz="0" w:val="nil"/>
+              </w:pBdr>
+              <w:shd w:fill="auto" w:val="clear"/>
+              <w:spacing w:after="0" w:before="0" w:line="240" w:lineRule="auto"/>
+              <w:ind w:left="0" w:right="0" w:firstLine="0"/>
+              <w:jc w:val="center"/>
+              <w:rPr>
+                <w:sz w:val="24"/>
+                <w:szCs w:val="24"/>
+              </w:rPr>
+            </w:pPr>
+            <w:r>
+              <w:rPr>
+                <w:sz w:val="24"/>
+                <w:szCs w:val="24"/>
+                <w:rtl w:val="0"/>
+              </w:rPr>
+              <w:t xml:space="preserve">Número de trabajo práctico.</w:t>
+            </w:r>
+          </w:p>
+        </w:tc>
+      </w:tr>
+      <w:tr>
+        <w:trPr>
+          <w:cantSplit w:val="0"/>
+          <w:tblHeader w:val="0"/>
+        </w:trPr>
+        <w:tc>
+          <w:tcPr>
+            <w:shd w:fill="auto" w:val="clear"/>
+            <w:tcMar>
+              <w:top w:w="100.0" w:type="dxa"/>
+              <w:left w:w="100.0" w:type="dxa"/>
+              <w:bottom w:w="100.0" w:type="dxa"/>
+              <w:right w:w="100.0" w:type="dxa"/>
+            </w:tcMar>
+            <w:vAlign w:val="top"/>
+          </w:tcPr>
+          <w:p>
+            <w:pPr>
+              <w:widowControl w:val="0"/>
+              <w:spacing w:line="240" w:lineRule="auto"/>
+              <w:jc w:val="center"/>
+              <w:rPr>
+                <w:sz w:val="24"/>
+                <w:szCs w:val="24"/>
+                <w:u w:val="single"/>
+              </w:rPr>
+            </w:pPr>
+            <w:r>
+              <w:rPr>
+                <w:rtl w:val="0"/>
+              </w:rPr>
+              <w:t xml:space="preserve">&lt;NombrePresentación&gt;</w:t>
+            </w:r>
+            <w:r>
+              <w:rPr>
+                <w:rtl w:val="0"/>
+              </w:rPr>
+            </w:r>
+          </w:p>
+        </w:tc>
+        <w:tc>
+          <w:tcPr>
+            <w:shd w:fill="auto" w:val="clear"/>
+            <w:tcMar>
+              <w:top w:w="100.0" w:type="dxa"/>
+              <w:left w:w="100.0" w:type="dxa"/>
+              <w:bottom w:w="100.0" w:type="dxa"/>
+              <w:right w:w="100.0" w:type="dxa"/>
+            </w:tcMar>
+            <w:vAlign w:val="top"/>
+          </w:tcPr>
+          <w:p>
+            <w:pPr>
+              <w:keepNext w:val="0"/>
+              <w:keepLines w:val="0"/>
+              <w:pageBreakBefore w:val="0"/>
+              <w:widowControl w:val="0"/>
+              <w:pBdr>
+                <w:top w:space="0" w:sz="0" w:val="nil"/>
+                <w:left w:space="0" w:sz="0" w:val="nil"/>
+                <w:bottom w:space="0" w:sz="0" w:val="nil"/>
+                <w:right w:space="0" w:sz="0" w:val="nil"/>
+                <w:between w:space="0" w:sz="0" w:val="nil"/>
+              </w:pBdr>
+              <w:shd w:fill="auto" w:val="clear"/>
+              <w:spacing w:after="0" w:before="0" w:line="240" w:lineRule="auto"/>
+              <w:ind w:left="0" w:right="0" w:firstLine="0"/>
+              <w:jc w:val="center"/>
+              <w:rPr>
+                <w:sz w:val="24"/>
+                <w:szCs w:val="24"/>
+              </w:rPr>
+            </w:pPr>
+            <w:r>
+              <w:rPr>
+                <w:sz w:val="24"/>
+                <w:szCs w:val="24"/>
+                <w:rtl w:val="0"/>
+              </w:rPr>
+              <w:t xml:space="preserve">Nombre que permite identificar unívocamente las presentaciones de clase.</w:t>
+            </w:r>
+          </w:p>
+        </w:tc>
+      </w:tr>
+      <w:tr>
+        <w:trPr>
+          <w:cantSplit w:val="0"/>
+          <w:tblHeader w:val="0"/>
+        </w:trPr>
+        <w:tc>
+          <w:tcPr>
+            <w:shd w:fill="auto" w:val="clear"/>
+            <w:tcMar>
+              <w:top w:w="100.0" w:type="dxa"/>
+              <w:left w:w="100.0" w:type="dxa"/>
+              <w:bottom w:w="100.0" w:type="dxa"/>
+              <w:right w:w="100.0" w:type="dxa"/>
+            </w:tcMar>
+            <w:vAlign w:val="top"/>
+          </w:tcPr>
+          <w:p>
+            <w:pPr>
+              <w:keepNext w:val="0"/>
+              <w:keepLines w:val="0"/>
+              <w:pageBreakBefore w:val="0"/>
+              <w:widowControl w:val="0"/>
+              <w:pBdr>
+                <w:top w:space="0" w:sz="0" w:val="nil"/>
+                <w:left w:space="0" w:sz="0" w:val="nil"/>
+                <w:bottom w:space="0" w:sz="0" w:val="nil"/>
+                <w:right w:space="0" w:sz="0" w:val="nil"/>
+                <w:between w:space="0" w:sz="0" w:val="nil"/>
+              </w:pBdr>
+              <w:shd w:fill="auto" w:val="clear"/>
+              <w:spacing w:after="0" w:before="0" w:line="240" w:lineRule="auto"/>
+              <w:ind w:left="0" w:right="0" w:firstLine="0"/>
+              <w:jc w:val="center"/>
+              <w:rPr>
+                <w:sz w:val="24"/>
+                <w:szCs w:val="24"/>
+              </w:rPr>
+            </w:pPr>
+            <w:r>
+              <w:rPr>
+                <w:sz w:val="24"/>
+                <w:szCs w:val="24"/>
+                <w:rtl w:val="0"/>
+              </w:rPr>
+              <w:t xml:space="preserve">&lt;Fecha&gt;</w:t>
+            </w:r>
+          </w:p>
+        </w:tc>
+        <w:tc>
+          <w:tcPr>
+            <w:shd w:fill="auto" w:val="clear"/>
+            <w:tcMar>
+              <w:top w:w="100.0" w:type="dxa"/>
+              <w:left w:w="100.0" w:type="dxa"/>
+              <w:bottom w:w="100.0" w:type="dxa"/>
+              <w:right w:w="100.0" w:type="dxa"/>
+            </w:tcMar>
+            <w:vAlign w:val="top"/>
+          </w:tcPr>
+          <w:p>
+            <w:pPr>
+              <w:keepNext w:val="0"/>
+              <w:keepLines w:val="0"/>
+              <w:pageBreakBefore w:val="0"/>
+              <w:widowControl w:val="0"/>
+              <w:pBdr>
+                <w:top w:space="0" w:sz="0" w:val="nil"/>
+                <w:left w:space="0" w:sz="0" w:val="nil"/>
+                <w:bottom w:space="0" w:sz="0" w:val="nil"/>
+                <w:right w:space="0" w:sz="0" w:val="nil"/>
+                <w:between w:space="0" w:sz="0" w:val="nil"/>
+              </w:pBdr>
+              <w:shd w:fill="auto" w:val="clear"/>
+              <w:spacing w:after="0" w:before="0" w:line="240" w:lineRule="auto"/>
+              <w:ind w:left="0" w:right="0" w:firstLine="0"/>
+              <w:jc w:val="center"/>
+              <w:rPr>
+                <w:sz w:val="24"/>
+                <w:szCs w:val="24"/>
+              </w:rPr>
+            </w:pPr>
+            <w:r>
+              <w:rPr>
+                <w:sz w:val="24"/>
+                <w:szCs w:val="24"/>
+                <w:rtl w:val="0"/>
+              </w:rPr>
+              <w:t xml:space="preserve">Fecha correspondiente al dia que se tomó la minuta.</w:t>
+            </w:r>
+          </w:p>
+        </w:tc>
+      </w:tr>
+      <w:tr>
+        <w:trPr>
+          <w:cantSplit w:val="0"/>
+          <w:tblHeader w:val="0"/>
+        </w:trPr>
+        <w:tc>
+          <w:tcPr>
+            <w:shd w:fill="auto" w:val="clear"/>
+            <w:tcMar>
+              <w:top w:w="100.0" w:type="dxa"/>
+              <w:left w:w="100.0" w:type="dxa"/>
+              <w:bottom w:w="100.0" w:type="dxa"/>
+              <w:right w:w="100.0" w:type="dxa"/>
+            </w:tcMar>
+            <w:vAlign w:val="top"/>
+          </w:tcPr>
+          <w:p>
+            <w:pPr>
+              <w:widowControl w:val="0"/>
+              <w:spacing w:line="240" w:lineRule="auto"/>
+              <w:jc w:val="center"/>
+              <w:rPr>
+                <w:sz w:val="24"/>
+                <w:szCs w:val="24"/>
+                <w:u w:val="single"/>
+              </w:rPr>
+            </w:pPr>
+            <w:r>
+              <w:rPr>
+                <w:rtl w:val="0"/>
+              </w:rPr>
+              <w:t xml:space="preserve">&lt;NombreDeTema&gt;</w:t>
+            </w:r>
+            <w:r>
+              <w:rPr>
+                <w:rtl w:val="0"/>
+              </w:rPr>
+            </w:r>
+          </w:p>
+        </w:tc>
+        <w:tc>
+          <w:tcPr>
+            <w:shd w:fill="auto" w:val="clear"/>
+            <w:tcMar>
+              <w:top w:w="100.0" w:type="dxa"/>
+              <w:left w:w="100.0" w:type="dxa"/>
+              <w:bottom w:w="100.0" w:type="dxa"/>
+              <w:right w:w="100.0" w:type="dxa"/>
+            </w:tcMar>
+            <w:vAlign w:val="top"/>
+          </w:tcPr>
+          <w:p>
+            <w:pPr>
+              <w:keepNext w:val="0"/>
+              <w:keepLines w:val="0"/>
+              <w:pageBreakBefore w:val="0"/>
+              <w:widowControl w:val="0"/>
+              <w:pBdr>
+                <w:top w:space="0" w:sz="0" w:val="nil"/>
+                <w:left w:space="0" w:sz="0" w:val="nil"/>
+                <w:bottom w:space="0" w:sz="0" w:val="nil"/>
+                <w:right w:space="0" w:sz="0" w:val="nil"/>
+                <w:between w:space="0" w:sz="0" w:val="nil"/>
+              </w:pBdr>
+              <w:shd w:fill="auto" w:val="clear"/>
+              <w:spacing w:after="0" w:before="0" w:line="240" w:lineRule="auto"/>
+              <w:ind w:left="0" w:right="0" w:firstLine="0"/>
+              <w:jc w:val="center"/>
+              <w:rPr>
+                <w:sz w:val="24"/>
+                <w:szCs w:val="24"/>
+              </w:rPr>
+            </w:pPr>
+            <w:r>
+              <w:rPr>
+                <w:sz w:val="24"/>
+                <w:szCs w:val="24"/>
+                <w:rtl w:val="0"/>
+              </w:rPr>
+              <w:t xml:space="preserve">Nombre del tema correspondiente a la minuta.</w:t>
+            </w:r>
+          </w:p>
+        </w:tc>
+      </w:tr>
+      <w:tr>
+        <w:trPr>
+          <w:cantSplit w:val="0"/>
+          <w:tblHeader w:val="0"/>
+        </w:trPr>
+        <w:tc>
+          <w:tcPr>
+            <w:shd w:fill="auto" w:val="clear"/>
+            <w:tcMar>
+              <w:top w:w="100.0" w:type="dxa"/>
+              <w:left w:w="100.0" w:type="dxa"/>
+              <w:bottom w:w="100.0" w:type="dxa"/>
+              <w:right w:w="100.0" w:type="dxa"/>
+            </w:tcMar>
+            <w:vAlign w:val="top"/>
+          </w:tcPr>
+          <w:p>
+            <w:pPr>
+              <w:widowControl w:val="0"/>
+              <w:spacing w:line="240" w:lineRule="auto"/>
+              <w:jc w:val="center"/>
+              <w:rPr/>
+            </w:pPr>
+            <w:r>
+              <w:rPr>
+                <w:rtl w:val="0"/>
+              </w:rPr>
+              <w:t xml:space="preserve">&lt;Apellido&gt;</w:t>
+            </w:r>
+          </w:p>
+        </w:tc>
+        <w:tc>
+          <w:tcPr>
+            <w:shd w:fill="auto" w:val="clear"/>
+            <w:tcMar>
+              <w:top w:w="100.0" w:type="dxa"/>
+              <w:left w:w="100.0" w:type="dxa"/>
+              <w:bottom w:w="100.0" w:type="dxa"/>
+              <w:right w:w="100.0" w:type="dxa"/>
+            </w:tcMar>
+            <w:vAlign w:val="top"/>
+          </w:tcPr>
+          <w:p>
+            <w:pPr>
+              <w:keepNext w:val="0"/>
+              <w:keepLines w:val="0"/>
+              <w:pageBreakBefore w:val="0"/>
+              <w:widowControl w:val="0"/>
+              <w:pBdr>
+                <w:top w:space="0" w:sz="0" w:val="nil"/>
+                <w:left w:space="0" w:sz="0" w:val="nil"/>
+                <w:bottom w:space="0" w:sz="0" w:val="nil"/>
+                <w:right w:space="0" w:sz="0" w:val="nil"/>
+                <w:between w:space="0" w:sz="0" w:val="nil"/>
+              </w:pBdr>
+              <w:shd w:fill="auto" w:val="clear"/>
+              <w:spacing w:after="0" w:before="0" w:line="240" w:lineRule="auto"/>
+              <w:ind w:left="0" w:right="0" w:firstLine="0"/>
+              <w:jc w:val="center"/>
+              <w:rPr>
+                <w:sz w:val="24"/>
+                <w:szCs w:val="24"/>
+              </w:rPr>
+            </w:pPr>
+            <w:r>
+              <w:rPr>
+                <w:sz w:val="24"/>
+                <w:szCs w:val="24"/>
+                <w:rtl w:val="0"/>
+              </w:rPr>
+              <w:t xml:space="preserve">Apellido del autor que identifica unívocamente una minuta.</w:t>
+            </w:r>
+          </w:p>
+        </w:tc>
+      </w:tr>
+      <w:tr>
+        <w:trPr>
+          <w:cantSplit w:val="0"/>
+          <w:tblHeader w:val="0"/>
+        </w:trPr>
+        <w:tc>
+          <w:tcPr>
+            <w:shd w:fill="auto" w:val="clear"/>
+            <w:tcMar>
+              <w:top w:w="100.0" w:type="dxa"/>
+              <w:left w:w="100.0" w:type="dxa"/>
+              <w:bottom w:w="100.0" w:type="dxa"/>
+              <w:right w:w="100.0" w:type="dxa"/>
+            </w:tcMar>
+            <w:vAlign w:val="top"/>
+          </w:tcPr>
+          <w:p>
+            <w:pPr>
+              <w:widowControl w:val="0"/>
+              <w:spacing w:line="240" w:lineRule="auto"/>
+              <w:jc w:val="center"/>
+              <w:rPr/>
+            </w:pPr>
+            <w:r>
+              <w:rPr>
+                <w:rtl w:val="0"/>
+              </w:rPr>
+              <w:t xml:space="preserve">&lt;Extensión&gt;</w:t>
+            </w:r>
+          </w:p>
+        </w:tc>
+        <w:tc>
+          <w:tcPr>
+            <w:shd w:fill="auto" w:val="clear"/>
+            <w:tcMar>
+              <w:top w:w="100.0" w:type="dxa"/>
+              <w:left w:w="100.0" w:type="dxa"/>
+              <w:bottom w:w="100.0" w:type="dxa"/>
+              <w:right w:w="100.0" w:type="dxa"/>
+            </w:tcMar>
+            <w:vAlign w:val="top"/>
+          </w:tcPr>
+          <w:p>
+            <w:pPr>
+              <w:widowControl w:val="0"/>
+              <w:spacing w:line="240" w:lineRule="auto"/>
+              <w:jc w:val="center"/>
+              <w:rPr>
+                <w:sz w:val="24"/>
+                <w:szCs w:val="24"/>
+              </w:rPr>
+            </w:pPr>
+            <w:r>
+              <w:rPr>
+                <w:rtl w:val="0"/>
+              </w:rPr>
+              <w:t xml:space="preserve">Determina la extensión del archivo identificado como ítem de configuración. Ejemplo: .docx, .txt, etc</w:t>
+            </w:r>
+            <w:r>
+              <w:rPr>
+                <w:rtl w:val="0"/>
+              </w:rPr>
+            </w:r>
+          </w:p>
+        </w:tc>
+      </w:tr>
+      <w:tr>
+        <w:trPr>
+          <w:cantSplit w:val="0"/>
+          <w:tblHeader w:val="0"/>
+        </w:trPr>
+        <w:tc>
+          <w:tcPr>
+            <w:shd w:fill="auto" w:val="clear"/>
+            <w:tcMar>
+              <w:top w:w="100.0" w:type="dxa"/>
+              <w:left w:w="100.0" w:type="dxa"/>
+              <w:bottom w:w="100.0" w:type="dxa"/>
+              <w:right w:w="100.0" w:type="dxa"/>
+            </w:tcMar>
+            <w:vAlign w:val="top"/>
+          </w:tcPr>
+          <w:p>
+            <w:pPr>
+              <w:widowControl w:val="0"/>
+              <w:spacing w:line="240" w:lineRule="auto"/>
+              <w:jc w:val="center"/>
+              <w:rPr/>
+            </w:pPr>
+            <w:r>
+              <w:rPr>
+                <w:rtl w:val="0"/>
+              </w:rPr>
+              <w:t xml:space="preserve">SCM</w:t>
+            </w:r>
+          </w:p>
+        </w:tc>
+        <w:tc>
+          <w:tcPr>
+            <w:shd w:fill="auto" w:val="clear"/>
+            <w:tcMar>
+              <w:top w:w="100.0" w:type="dxa"/>
+              <w:left w:w="100.0" w:type="dxa"/>
+              <w:bottom w:w="100.0" w:type="dxa"/>
+              <w:right w:w="100.0" w:type="dxa"/>
+            </w:tcMar>
+            <w:vAlign w:val="top"/>
+          </w:tcPr>
+          <w:p>
+            <w:pPr>
+              <w:widowControl w:val="0"/>
+              <w:spacing w:line="240" w:lineRule="auto"/>
+              <w:jc w:val="center"/>
+              <w:rPr/>
+            </w:pPr>
+            <w:r>
+              <w:rPr>
+                <w:rtl w:val="0"/>
+              </w:rPr>
+              <w:t xml:space="preserve">Software Configuration Management</w:t>
+            </w:r>
+          </w:p>
+        </w:tc>
+      </w:tr>
+      <w:tr>
+        <w:trPr>
+          <w:cantSplit w:val="0"/>
+          <w:tblHeader w:val="0"/>
+        </w:trPr>
+        <w:tc>
+          <w:tcPr>
+            <w:shd w:fill="auto" w:val="clear"/>
+            <w:tcMar>
+              <w:top w:w="100.0" w:type="dxa"/>
+              <w:left w:w="100.0" w:type="dxa"/>
+              <w:bottom w:w="100.0" w:type="dxa"/>
+              <w:right w:w="100.0" w:type="dxa"/>
+            </w:tcMar>
+            <w:vAlign w:val="top"/>
+          </w:tcPr>
+          <w:p>
+            <w:pPr>
+              <w:widowControl w:val="0"/>
+              <w:spacing w:line="240" w:lineRule="auto"/>
+              <w:jc w:val="center"/>
+              <w:rPr/>
+            </w:pPr>
+            <w:r>
+              <w:rPr>
+                <w:rtl w:val="0"/>
+              </w:rPr>
+              <w:t xml:space="preserve">PA</w:t>
+            </w:r>
+          </w:p>
+        </w:tc>
+        <w:tc>
+          <w:tcPr>
+            <w:shd w:fill="auto" w:val="clear"/>
+            <w:tcMar>
+              <w:top w:w="100.0" w:type="dxa"/>
+              <w:left w:w="100.0" w:type="dxa"/>
+              <w:bottom w:w="100.0" w:type="dxa"/>
+              <w:right w:w="100.0" w:type="dxa"/>
+            </w:tcMar>
+            <w:vAlign w:val="top"/>
+          </w:tcPr>
+          <w:p>
+            <w:pPr>
+              <w:widowControl w:val="0"/>
+              <w:spacing w:line="240" w:lineRule="auto"/>
+              <w:jc w:val="center"/>
+              <w:rPr/>
+            </w:pPr>
+            <w:r>
+              <w:rPr>
+                <w:rtl w:val="0"/>
+              </w:rPr>
+              <w:t xml:space="preserve">Pensamiento Ágil</w:t>
+            </w:r>
+          </w:p>
+        </w:tc>
+      </w:tr>
+      <w:tr>
+        <w:trPr>
+          <w:cantSplit w:val="0"/>
+          <w:tblHeader w:val="0"/>
+        </w:trPr>
+        <w:tc>
+          <w:tcPr>
+            <w:shd w:fill="auto" w:val="clear"/>
+            <w:tcMar>
+              <w:top w:w="100.0" w:type="dxa"/>
+              <w:left w:w="100.0" w:type="dxa"/>
+              <w:bottom w:w="100.0" w:type="dxa"/>
+              <w:right w:w="100.0" w:type="dxa"/>
+            </w:tcMar>
+            <w:vAlign w:val="top"/>
+          </w:tcPr>
+          <w:p>
+            <w:pPr>
+              <w:widowControl w:val="0"/>
+              <w:spacing w:line="240" w:lineRule="auto"/>
+              <w:jc w:val="center"/>
+              <w:rPr/>
+            </w:pPr>
+            <w:r>
+              <w:rPr>
+                <w:rtl w:val="0"/>
+              </w:rPr>
+              <w:t xml:space="preserve">&lt;NombreLibro&gt; </w:t>
+            </w:r>
+          </w:p>
+        </w:tc>
+        <w:tc>
+          <w:tcPr>
+            <w:shd w:fill="auto" w:val="clear"/>
+            <w:tcMar>
+              <w:top w:w="100.0" w:type="dxa"/>
+              <w:left w:w="100.0" w:type="dxa"/>
+              <w:bottom w:w="100.0" w:type="dxa"/>
+              <w:right w:w="100.0" w:type="dxa"/>
+            </w:tcMar>
+            <w:vAlign w:val="top"/>
+          </w:tcPr>
+          <w:p>
+            <w:pPr>
+              <w:widowControl w:val="0"/>
+              <w:spacing w:line="240" w:lineRule="auto"/>
+              <w:jc w:val="center"/>
+              <w:rPr/>
+            </w:pPr>
+            <w:r>
+              <w:rPr>
+                <w:rtl w:val="0"/>
+              </w:rPr>
+              <w:t xml:space="preserve">Nombre que permite identificar unívocamente a los libros de la catedra.</w:t>
+            </w:r>
+          </w:p>
+        </w:tc>
+      </w:tr>
+    </w:tbl>
+    <w:p>
+      <w:pPr>
+        <w:jc w:val="center"/>
+        <w:rPr>
+          <w:b w:val="1"/>
+          <w:sz w:val="30"/>
+          <w:szCs w:val="30"/>
+          <w:u w:val="single"/>
+        </w:rPr>
+      </w:pPr>
+      <w:r>
+        <w:rPr>
+          <w:rtl w:val="0"/>
+        </w:rPr>
+      </w:r>
+    </w:p>
+    <w:p>
+      <w:pPr>
+        <w:jc w:val="center"/>
+        <w:rPr>
+          <w:b w:val="1"/>
+          <w:sz w:val="30"/>
+          <w:szCs w:val="30"/>
+          <w:u w:val="single"/>
+        </w:rPr>
+      </w:pPr>
+      <w:r>
+        <w:rPr>
+          <w:rtl w:val="0"/>
+        </w:rPr>
+      </w:r>
+    </w:p>
+    <w:p>
+      <w:pPr>
+        <w:jc w:val="center"/>
+        <w:rPr>
+          <w:b w:val="1"/>
+          <w:sz w:val="30"/>
+          <w:szCs w:val="30"/>
+          <w:u w:val="single"/>
+        </w:rPr>
+      </w:pPr>
+      <w:r>
+        <w:rPr>
+          <w:rtl w:val="0"/>
+        </w:rPr>
+      </w:r>
+    </w:p>
+    <w:p>
+      <w:pPr>
+        <w:jc w:val="center"/>
+        <w:rPr>
+          <w:b w:val="1"/>
+          <w:sz w:val="30"/>
+          <w:szCs w:val="30"/>
+          <w:u w:val="single"/>
+        </w:rPr>
+      </w:pPr>
+      <w:r>
+        <w:rPr>
+          <w:rtl w:val="0"/>
+        </w:rPr>
+      </w:r>
+    </w:p>
+    <w:p>
+      <w:pPr>
+        <w:jc w:val="center"/>
+        <w:rPr>
+          <w:b w:val="1"/>
+          <w:sz w:val="30"/>
+          <w:szCs w:val="30"/>
+          <w:u w:val="single"/>
+        </w:rPr>
+      </w:pPr>
       <w:r>
         <w:rPr>
           <w:rtl w:val="0"/>
@@ -2431,6 +3423,13 @@
     </w:tblPr>
   </w:style>
   <w:style w:type="table" w:styleId="Table2">
+    <w:basedOn w:val="TableNormal"/>
+    <w:tblPr>
+      <w:tblStyleRowBandSize w:val="1"/>
+      <w:tblStyleColBandSize w:val="1"/>
+    </w:tblPr>
+  </w:style>
+  <w:style w:type="table" w:styleId="Table3">
     <w:basedOn w:val="TableNormal"/>
     <w:tblPr>
       <w:tblStyleRowBandSize w:val="1"/>

</xml_diff>

<commit_message>
Agregando actualizaciones en glosario
</commit_message>
<xml_diff>
--- a/Plan_Gestion_Configuracion_G4_ISW_4K1.docx
+++ b/Plan_Gestion_Configuracion_G4_ISW_4K1.docx
@@ -278,12 +278,6 @@
           <w:szCs w:val="24"/>
         </w:rPr>
         <w:tab/>
-      </w:r>
-      <w:r>
-        <w:rPr>
-          <w:sz w:val="24"/>
-          <w:szCs w:val="24"/>
-        </w:rPr>
         <w:t xml:space="preserve">Ing. </w:t>
       </w:r>
       <w:proofErr w:type="spellStart"/>
@@ -1889,18 +1883,7 @@
                 <w:szCs w:val="20"/>
                 <w:u w:val="single"/>
               </w:rPr>
-              <w:t>Resum</w:t>
-            </w:r>
-            <w:bookmarkStart w:id="0" w:name="_GoBack"/>
-            <w:bookmarkEnd w:id="0"/>
-            <w:r>
-              <w:rPr>
-                <w:color w:val="1155CC"/>
-                <w:sz w:val="20"/>
-                <w:szCs w:val="20"/>
-                <w:u w:val="single"/>
-              </w:rPr>
-              <w:t>enes</w:t>
+              <w:t>Resumenes</w:t>
             </w:r>
             <w:proofErr w:type="spellEnd"/>
           </w:p>
@@ -2203,16 +2186,7 @@
                   <w:szCs w:val="20"/>
                   <w:u w:val="single"/>
                 </w:rPr>
-                <w:t>Bibliografia/Bibliografia_De_La_Catedra/Material_</w:t>
-              </w:r>
-              <w:r>
-                <w:rPr>
-                  <w:color w:val="1155CC"/>
-                  <w:sz w:val="20"/>
-                  <w:szCs w:val="20"/>
-                  <w:u w:val="single"/>
-                </w:rPr>
-                <w:t>Bibliografico/SCM</w:t>
+                <w:t>Bibliografia/Bibliografia_De_La_Catedra/Material_Bibliografico/SCM</w:t>
               </w:r>
             </w:hyperlink>
           </w:p>
@@ -2349,16 +2323,7 @@
                   <w:szCs w:val="20"/>
                   <w:u w:val="single"/>
                 </w:rPr>
-                <w:t>Bibliografia/Bibliografia_De_La_Catedra/Material_</w:t>
-              </w:r>
-              <w:r>
-                <w:rPr>
-                  <w:color w:val="0000FF"/>
-                  <w:sz w:val="20"/>
-                  <w:szCs w:val="20"/>
-                  <w:u w:val="single"/>
-                </w:rPr>
-                <w:t>Bibliografico/Pensamiento_Ágil</w:t>
+                <w:t>Bibliografia/Bibliografia_De_La_Catedra/Material_Bibliografico/Pensamiento_Ágil</w:t>
               </w:r>
             </w:hyperlink>
           </w:p>
@@ -2393,10 +2358,7 @@
               <w:jc w:val="center"/>
             </w:pPr>
             <w:r>
-              <w:t>Consignas del Trabajo</w:t>
-            </w:r>
-            <w:r>
-              <w:t xml:space="preserve"> Práctico</w:t>
+              <w:t>Consignas del Trabajo Práctico</w:t>
             </w:r>
           </w:p>
         </w:tc>
@@ -2547,16 +2509,7 @@
           <w:u w:val="single"/>
         </w:rPr>
         <w:lastRenderedPageBreak/>
-        <w:t>Estruct</w:t>
-      </w:r>
-      <w:r>
-        <w:rPr>
-          <w:b/>
-          <w:sz w:val="30"/>
-          <w:szCs w:val="30"/>
-          <w:u w:val="single"/>
-        </w:rPr>
-        <w:t>ura del repositorio</w:t>
+        <w:t>Estructura del repositorio</w:t>
       </w:r>
     </w:p>
     <w:p>
@@ -2580,26 +2533,23 @@
         </w:sectPr>
       </w:pPr>
       <w:r>
-        <w:rPr>
-          <w:noProof/>
-          <w:lang w:val="en-US"/>
-        </w:rPr>
         <w:drawing>
-          <wp:inline distT="0" distB="0" distL="0" distR="0">
-            <wp:extent cx="4733925" cy="6171559"/>
+          <wp:inline distT="0" distB="0" distL="0" distR="0" wp14:anchorId="3C3F85FB" wp14:editId="6800A125">
+            <wp:extent cx="3753374" cy="6554115"/>
             <wp:effectExtent l="0" t="0" r="0" b="0"/>
-            <wp:docPr id="2" name="image2.png"/>
-            <wp:cNvGraphicFramePr/>
+            <wp:docPr id="3" name="Imagen 3"/>
+            <wp:cNvGraphicFramePr>
+              <a:graphicFrameLocks xmlns:a="http://schemas.openxmlformats.org/drawingml/2006/main" noChangeAspect="1"/>
+            </wp:cNvGraphicFramePr>
             <a:graphic xmlns:a="http://schemas.openxmlformats.org/drawingml/2006/main">
               <a:graphicData uri="http://schemas.openxmlformats.org/drawingml/2006/picture">
                 <pic:pic xmlns:pic="http://schemas.openxmlformats.org/drawingml/2006/picture">
                   <pic:nvPicPr>
-                    <pic:cNvPr id="0" name="image2.png"/>
-                    <pic:cNvPicPr preferRelativeResize="0"/>
+                    <pic:cNvPr id="1" name=""/>
+                    <pic:cNvPicPr/>
                   </pic:nvPicPr>
                   <pic:blipFill>
                     <a:blip r:embed="rId25"/>
-                    <a:srcRect/>
                     <a:stretch>
                       <a:fillRect/>
                     </a:stretch>
@@ -2607,12 +2557,11 @@
                   <pic:spPr>
                     <a:xfrm>
                       <a:off x="0" y="0"/>
-                      <a:ext cx="4733925" cy="6171559"/>
+                      <a:ext cx="3753374" cy="6554115"/>
                     </a:xfrm>
                     <a:prstGeom prst="rect">
                       <a:avLst/>
                     </a:prstGeom>
-                    <a:ln/>
                   </pic:spPr>
                 </pic:pic>
               </a:graphicData>
@@ -2641,24 +2590,6 @@
         <w:lastRenderedPageBreak/>
         <w:t>Glosario</w:t>
       </w:r>
-    </w:p>
-    <w:p>
-      <w:pPr>
-        <w:rPr>
-          <w:u w:val="single"/>
-        </w:rPr>
-      </w:pPr>
-    </w:p>
-    <w:p>
-      <w:pPr>
-        <w:jc w:val="center"/>
-        <w:rPr>
-          <w:b/>
-          <w:sz w:val="30"/>
-          <w:szCs w:val="30"/>
-          <w:u w:val="single"/>
-        </w:rPr>
-      </w:pPr>
     </w:p>
     <w:p>
       <w:pPr>
@@ -2796,32 +2727,18 @@
               <w:spacing w:line="240" w:lineRule="auto"/>
               <w:jc w:val="center"/>
               <w:rPr>
-                <w:sz w:val="24"/>
-                <w:szCs w:val="24"/>
                 <w:u w:val="single"/>
               </w:rPr>
             </w:pPr>
             <w:r>
-              <w:rPr>
-                <w:sz w:val="24"/>
-                <w:szCs w:val="24"/>
-              </w:rPr>
               <w:t>&lt;</w:t>
             </w:r>
             <w:proofErr w:type="spellStart"/>
             <w:r>
-              <w:rPr>
-                <w:sz w:val="24"/>
-                <w:szCs w:val="24"/>
-              </w:rPr>
               <w:t>NombreTrabajoPractico</w:t>
             </w:r>
             <w:proofErr w:type="spellEnd"/>
             <w:r>
-              <w:rPr>
-                <w:sz w:val="24"/>
-                <w:szCs w:val="24"/>
-              </w:rPr>
               <w:t>&gt;</w:t>
             </w:r>
           </w:p>
@@ -2849,16 +2766,8 @@
               </w:pBdr>
               <w:spacing w:line="240" w:lineRule="auto"/>
               <w:jc w:val="center"/>
-              <w:rPr>
-                <w:sz w:val="24"/>
-                <w:szCs w:val="24"/>
-              </w:rPr>
-            </w:pPr>
-            <w:r>
-              <w:rPr>
-                <w:sz w:val="24"/>
-                <w:szCs w:val="24"/>
-              </w:rPr>
+            </w:pPr>
+            <w:r>
               <w:t>Nombre que permite identificar cada trabajo práctico de forma unívoca.</w:t>
             </w:r>
           </w:p>
@@ -2885,8 +2794,6 @@
               <w:spacing w:line="240" w:lineRule="auto"/>
               <w:jc w:val="center"/>
               <w:rPr>
-                <w:sz w:val="24"/>
-                <w:szCs w:val="24"/>
                 <w:u w:val="single"/>
               </w:rPr>
             </w:pPr>
@@ -2918,16 +2825,8 @@
               </w:pBdr>
               <w:spacing w:line="240" w:lineRule="auto"/>
               <w:jc w:val="center"/>
-              <w:rPr>
-                <w:sz w:val="24"/>
-                <w:szCs w:val="24"/>
-              </w:rPr>
-            </w:pPr>
-            <w:r>
-              <w:rPr>
-                <w:sz w:val="24"/>
-                <w:szCs w:val="24"/>
-              </w:rPr>
+            </w:pPr>
+            <w:r>
               <w:t>Número de trabajo práctico.</w:t>
             </w:r>
           </w:p>
@@ -2954,8 +2853,6 @@
               <w:spacing w:line="240" w:lineRule="auto"/>
               <w:jc w:val="center"/>
               <w:rPr>
-                <w:sz w:val="24"/>
-                <w:szCs w:val="24"/>
                 <w:u w:val="single"/>
               </w:rPr>
             </w:pPr>
@@ -2995,16 +2892,8 @@
               </w:pBdr>
               <w:spacing w:line="240" w:lineRule="auto"/>
               <w:jc w:val="center"/>
-              <w:rPr>
-                <w:sz w:val="24"/>
-                <w:szCs w:val="24"/>
-              </w:rPr>
-            </w:pPr>
-            <w:r>
-              <w:rPr>
-                <w:sz w:val="24"/>
-                <w:szCs w:val="24"/>
-              </w:rPr>
+            </w:pPr>
+            <w:r>
               <w:t>Nombre que permite identificar unívocamente las presentaciones de clase.</w:t>
             </w:r>
           </w:p>
@@ -3037,16 +2926,8 @@
               </w:pBdr>
               <w:spacing w:line="240" w:lineRule="auto"/>
               <w:jc w:val="center"/>
-              <w:rPr>
-                <w:sz w:val="24"/>
-                <w:szCs w:val="24"/>
-              </w:rPr>
-            </w:pPr>
-            <w:r>
-              <w:rPr>
-                <w:sz w:val="24"/>
-                <w:szCs w:val="24"/>
-              </w:rPr>
+            </w:pPr>
+            <w:r>
               <w:t>&lt;Fecha&gt;</w:t>
             </w:r>
           </w:p>
@@ -3074,32 +2955,16 @@
               </w:pBdr>
               <w:spacing w:line="240" w:lineRule="auto"/>
               <w:jc w:val="center"/>
-              <w:rPr>
-                <w:sz w:val="24"/>
-                <w:szCs w:val="24"/>
-              </w:rPr>
-            </w:pPr>
-            <w:r>
-              <w:rPr>
-                <w:sz w:val="24"/>
-                <w:szCs w:val="24"/>
-              </w:rPr>
+            </w:pPr>
+            <w:r>
               <w:t xml:space="preserve">Fecha correspondiente al </w:t>
             </w:r>
             <w:proofErr w:type="spellStart"/>
             <w:r>
-              <w:rPr>
-                <w:sz w:val="24"/>
-                <w:szCs w:val="24"/>
-              </w:rPr>
               <w:t>dia</w:t>
             </w:r>
             <w:proofErr w:type="spellEnd"/>
             <w:r>
-              <w:rPr>
-                <w:sz w:val="24"/>
-                <w:szCs w:val="24"/>
-              </w:rPr>
               <w:t xml:space="preserve"> que se tomó la minuta.</w:t>
             </w:r>
           </w:p>
@@ -3126,8 +2991,6 @@
               <w:spacing w:line="240" w:lineRule="auto"/>
               <w:jc w:val="center"/>
               <w:rPr>
-                <w:sz w:val="24"/>
-                <w:szCs w:val="24"/>
                 <w:u w:val="single"/>
               </w:rPr>
             </w:pPr>
@@ -3167,17 +3030,15 @@
               </w:pBdr>
               <w:spacing w:line="240" w:lineRule="auto"/>
               <w:jc w:val="center"/>
-              <w:rPr>
-                <w:sz w:val="24"/>
-                <w:szCs w:val="24"/>
-              </w:rPr>
-            </w:pPr>
-            <w:r>
-              <w:rPr>
-                <w:sz w:val="24"/>
-                <w:szCs w:val="24"/>
-              </w:rPr>
-              <w:t>Nombre del tema correspondiente a la minuta.</w:t>
+            </w:pPr>
+            <w:r>
+              <w:t>Nombre del tema correspondiente a la minuta</w:t>
+            </w:r>
+            <w:r>
+              <w:t xml:space="preserve"> / Resumen / Ejercicio Práctico</w:t>
+            </w:r>
+            <w:r>
+              <w:t>.</w:t>
             </w:r>
           </w:p>
         </w:tc>
@@ -3231,17 +3092,15 @@
               </w:pBdr>
               <w:spacing w:line="240" w:lineRule="auto"/>
               <w:jc w:val="center"/>
-              <w:rPr>
-                <w:sz w:val="24"/>
-                <w:szCs w:val="24"/>
-              </w:rPr>
-            </w:pPr>
-            <w:r>
-              <w:rPr>
-                <w:sz w:val="24"/>
-                <w:szCs w:val="24"/>
-              </w:rPr>
-              <w:t>Apellido del autor que identifica unívocamente una minuta.</w:t>
+            </w:pPr>
+            <w:r>
+              <w:t>Apellido del autor que identifica unívocamente una minuta</w:t>
+            </w:r>
+            <w:r>
+              <w:t xml:space="preserve">  / Resumen / Ejercicio Práctico</w:t>
+            </w:r>
+            <w:r>
+              <w:t>.</w:t>
             </w:r>
           </w:p>
         </w:tc>
@@ -3268,7 +3127,7 @@
               <w:jc w:val="center"/>
             </w:pPr>
             <w:r>
-              <w:t>&lt;Extensión&gt;</w:t>
+              <w:t>&lt;Apellidos&gt;</w:t>
             </w:r>
           </w:p>
         </w:tc>
@@ -3286,37 +3145,19 @@
           <w:p>
             <w:pPr>
               <w:widowControl w:val="0"/>
-              <w:spacing w:line="240" w:lineRule="auto"/>
-              <w:jc w:val="center"/>
-              <w:rPr>
-                <w:sz w:val="24"/>
-                <w:szCs w:val="24"/>
-              </w:rPr>
-            </w:pPr>
-            <w:r>
-              <w:t>Determina la extensión del archivo identificado como ítem de configuración. Ejemplo: .</w:t>
-            </w:r>
-            <w:proofErr w:type="spellStart"/>
-            <w:r>
-              <w:t>docx</w:t>
-            </w:r>
-            <w:proofErr w:type="spellEnd"/>
-            <w:r>
-              <w:t>, .</w:t>
-            </w:r>
-            <w:proofErr w:type="spellStart"/>
-            <w:r>
-              <w:t>txt</w:t>
-            </w:r>
-            <w:proofErr w:type="spellEnd"/>
-            <w:r>
-              <w:t xml:space="preserve">, </w:t>
-            </w:r>
-            <w:proofErr w:type="spellStart"/>
-            <w:r>
-              <w:t>etc</w:t>
-            </w:r>
-            <w:proofErr w:type="spellEnd"/>
+              <w:pBdr>
+                <w:top w:val="nil"/>
+                <w:left w:val="nil"/>
+                <w:bottom w:val="nil"/>
+                <w:right w:val="nil"/>
+                <w:between w:val="nil"/>
+              </w:pBdr>
+              <w:spacing w:line="240" w:lineRule="auto"/>
+              <w:jc w:val="center"/>
+            </w:pPr>
+            <w:r>
+              <w:t>Apellido o apellidos de aquellos autores que participaron en la realización del Ejercicio Práctico</w:t>
+            </w:r>
           </w:p>
         </w:tc>
       </w:tr>
@@ -3342,7 +3183,7 @@
               <w:jc w:val="center"/>
             </w:pPr>
             <w:r>
-              <w:t>SCM</w:t>
+              <w:t>&lt;Extensión&gt;</w:t>
             </w:r>
           </w:p>
         </w:tc>
@@ -3364,16 +3205,29 @@
               <w:jc w:val="center"/>
             </w:pPr>
             <w:r>
-              <w:t xml:space="preserve">Software </w:t>
+              <w:t>Determina la extensión del archivo identificado como ítem de configuración. Ejemplo: .</w:t>
             </w:r>
             <w:proofErr w:type="spellStart"/>
             <w:r>
-              <w:t>Configuration</w:t>
+              <w:t>docx</w:t>
             </w:r>
             <w:proofErr w:type="spellEnd"/>
             <w:r>
-              <w:t xml:space="preserve"> Management</w:t>
-            </w:r>
+              <w:t>, .</w:t>
+            </w:r>
+            <w:proofErr w:type="spellStart"/>
+            <w:r>
+              <w:t>txt</w:t>
+            </w:r>
+            <w:proofErr w:type="spellEnd"/>
+            <w:r>
+              <w:t xml:space="preserve">, </w:t>
+            </w:r>
+            <w:proofErr w:type="spellStart"/>
+            <w:r>
+              <w:t>etc</w:t>
+            </w:r>
+            <w:proofErr w:type="spellEnd"/>
           </w:p>
         </w:tc>
       </w:tr>
@@ -3399,7 +3253,7 @@
               <w:jc w:val="center"/>
             </w:pPr>
             <w:r>
-              <w:t>PA</w:t>
+              <w:t>SCM</w:t>
             </w:r>
           </w:p>
         </w:tc>
@@ -3421,7 +3275,15 @@
               <w:jc w:val="center"/>
             </w:pPr>
             <w:r>
-              <w:t>Pensamiento Ágil</w:t>
+              <w:t xml:space="preserve">Software </w:t>
+            </w:r>
+            <w:proofErr w:type="spellStart"/>
+            <w:r>
+              <w:t>Configuration</w:t>
+            </w:r>
+            <w:proofErr w:type="spellEnd"/>
+            <w:r>
+              <w:t xml:space="preserve"> Management</w:t>
             </w:r>
           </w:p>
         </w:tc>
@@ -3448,6 +3310,55 @@
               <w:jc w:val="center"/>
             </w:pPr>
             <w:r>
+              <w:t>PA</w:t>
+            </w:r>
+          </w:p>
+        </w:tc>
+        <w:tc>
+          <w:tcPr>
+            <w:tcW w:w="4514" w:type="dxa"/>
+            <w:shd w:val="clear" w:color="auto" w:fill="auto"/>
+            <w:tcMar>
+              <w:top w:w="100" w:type="dxa"/>
+              <w:left w:w="100" w:type="dxa"/>
+              <w:bottom w:w="100" w:type="dxa"/>
+              <w:right w:w="100" w:type="dxa"/>
+            </w:tcMar>
+          </w:tcPr>
+          <w:p>
+            <w:pPr>
+              <w:widowControl w:val="0"/>
+              <w:spacing w:line="240" w:lineRule="auto"/>
+              <w:jc w:val="center"/>
+            </w:pPr>
+            <w:r>
+              <w:t>Pensamiento Ágil</w:t>
+            </w:r>
+          </w:p>
+        </w:tc>
+      </w:tr>
+      <w:tr>
+        <w:trPr>
+          <w:jc w:val="center"/>
+        </w:trPr>
+        <w:tc>
+          <w:tcPr>
+            <w:tcW w:w="4514" w:type="dxa"/>
+            <w:shd w:val="clear" w:color="auto" w:fill="auto"/>
+            <w:tcMar>
+              <w:top w:w="100" w:type="dxa"/>
+              <w:left w:w="100" w:type="dxa"/>
+              <w:bottom w:w="100" w:type="dxa"/>
+              <w:right w:w="100" w:type="dxa"/>
+            </w:tcMar>
+          </w:tcPr>
+          <w:p>
+            <w:pPr>
+              <w:widowControl w:val="0"/>
+              <w:spacing w:line="240" w:lineRule="auto"/>
+              <w:jc w:val="center"/>
+            </w:pPr>
+            <w:r>
               <w:t>&lt;</w:t>
             </w:r>
             <w:proofErr w:type="spellStart"/>
@@ -3541,7 +3452,6 @@
     </w:p>
     <w:p>
       <w:pPr>
-        <w:jc w:val="center"/>
         <w:rPr>
           <w:b/>
           <w:sz w:val="30"/>
@@ -3556,6 +3466,27 @@
           <w:szCs w:val="30"/>
           <w:u w:val="single"/>
         </w:rPr>
+        <w:br w:type="page"/>
+      </w:r>
+    </w:p>
+    <w:p>
+      <w:pPr>
+        <w:jc w:val="center"/>
+        <w:rPr>
+          <w:b/>
+          <w:sz w:val="30"/>
+          <w:szCs w:val="30"/>
+          <w:u w:val="single"/>
+        </w:rPr>
+      </w:pPr>
+      <w:r>
+        <w:rPr>
+          <w:b/>
+          <w:sz w:val="30"/>
+          <w:szCs w:val="30"/>
+          <w:u w:val="single"/>
+        </w:rPr>
+        <w:lastRenderedPageBreak/>
         <w:t>Criterios de Línea Base</w:t>
       </w:r>
     </w:p>
@@ -3573,10 +3504,7 @@
       </w:r>
       <w:proofErr w:type="spellEnd"/>
       <w:r>
-        <w:t xml:space="preserve"> positiva tanto verbal o escrita por parte de los docentes en los trabajos práctic</w:t>
-      </w:r>
-      <w:r>
-        <w:t>os. El contenido de la misma tendrá los ítems de configuración pertenecientes a cada trabajo practico.</w:t>
+        <w:t xml:space="preserve"> positiva tanto verbal o escrita por parte de los docentes en los trabajos prácticos. El contenido de la misma tendrá los ítems de configuración pertenecientes a cada trabajo practico.</w:t>
       </w:r>
     </w:p>
     <w:p>
@@ -3586,17 +3514,15 @@
       <w:r>
         <w:t xml:space="preserve"> </w:t>
       </w:r>
+      <w:bookmarkStart w:id="0" w:name="_GoBack"/>
+      <w:bookmarkEnd w:id="0"/>
     </w:p>
     <w:p>
       <w:pPr>
         <w:jc w:val="both"/>
       </w:pPr>
       <w:r>
-        <w:lastRenderedPageBreak/>
-        <w:t>La línea base del repositorio será modificada únicamente cuando exista un consenso entre todos los miembros del equipo. Esto implica que los 10 integra</w:t>
-      </w:r>
-      <w:r>
-        <w:t>ntes deberán revisar y aprobar los cambios propuestos antes de su consolidación.</w:t>
+        <w:t>La línea base del repositorio será modificada únicamente cuando exista un consenso entre todos los miembros del equipo. Esto implica que los 10 integrantes deberán revisar y aprobar los cambios propuestos antes de su consolidación.</w:t>
       </w:r>
     </w:p>
     <w:p>

</xml_diff>

<commit_message>
Nueva carpeta y cambios menores OWO
</commit_message>
<xml_diff>
--- a/Plan_Gestion_Configuracion_G4_ISW_4K1.docx
+++ b/Plan_Gestion_Configuracion_G4_ISW_4K1.docx
@@ -1,9 +1,10 @@
 
 <file path=word/document.xml><?xml version="1.0" encoding="utf-8"?>
-<w:document xmlns:wpc="http://schemas.microsoft.com/office/word/2010/wordprocessingCanvas" xmlns:cx="http://schemas.microsoft.com/office/drawing/2014/chartex" xmlns:mc="http://schemas.openxmlformats.org/markup-compatibility/2006" xmlns:o="urn:schemas-microsoft-com:office:office" xmlns:r="http://schemas.openxmlformats.org/officeDocument/2006/relationships" xmlns:m="http://schemas.openxmlformats.org/officeDocument/2006/math" xmlns:v="urn:schemas-microsoft-com:vml" xmlns:wp14="http://schemas.microsoft.com/office/word/2010/wordprocessingDrawing" xmlns:wp="http://schemas.openxmlformats.org/drawingml/2006/wordprocessingDrawing" xmlns:w10="urn:schemas-microsoft-com:office:word" xmlns:w="http://schemas.openxmlformats.org/wordprocessingml/2006/main" xmlns:w14="http://schemas.microsoft.com/office/word/2010/wordml" xmlns:w15="http://schemas.microsoft.com/office/word/2012/wordml" xmlns:w16se="http://schemas.microsoft.com/office/word/2015/wordml/symex" xmlns:wpg="http://schemas.microsoft.com/office/word/2010/wordprocessingGroup" xmlns:wpi="http://schemas.microsoft.com/office/word/2010/wordprocessingInk" xmlns:wne="http://schemas.microsoft.com/office/word/2006/wordml" xmlns:wps="http://schemas.microsoft.com/office/word/2010/wordprocessingShape" mc:Ignorable="w14 w15 w16se wp14">
+<w:document xmlns:wpc="http://schemas.microsoft.com/office/word/2010/wordprocessingCanvas" xmlns:cx="http://schemas.microsoft.com/office/drawing/2014/chartex" xmlns:cx1="http://schemas.microsoft.com/office/drawing/2015/9/8/chartex" xmlns:cx2="http://schemas.microsoft.com/office/drawing/2015/10/21/chartex" xmlns:cx3="http://schemas.microsoft.com/office/drawing/2016/5/9/chartex" xmlns:cx4="http://schemas.microsoft.com/office/drawing/2016/5/10/chartex" xmlns:cx5="http://schemas.microsoft.com/office/drawing/2016/5/11/chartex" xmlns:cx6="http://schemas.microsoft.com/office/drawing/2016/5/12/chartex" xmlns:cx7="http://schemas.microsoft.com/office/drawing/2016/5/13/chartex" xmlns:cx8="http://schemas.microsoft.com/office/drawing/2016/5/14/chartex" xmlns:mc="http://schemas.openxmlformats.org/markup-compatibility/2006" xmlns:aink="http://schemas.microsoft.com/office/drawing/2016/ink" xmlns:am3d="http://schemas.microsoft.com/office/drawing/2017/model3d" xmlns:o="urn:schemas-microsoft-com:office:office" xmlns:oel="http://schemas.microsoft.com/office/2019/extlst" xmlns:r="http://schemas.openxmlformats.org/officeDocument/2006/relationships" xmlns:m="http://schemas.openxmlformats.org/officeDocument/2006/math" xmlns:v="urn:schemas-microsoft-com:vml" xmlns:wp14="http://schemas.microsoft.com/office/word/2010/wordprocessingDrawing" xmlns:wp="http://schemas.openxmlformats.org/drawingml/2006/wordprocessingDrawing" xmlns:w10="urn:schemas-microsoft-com:office:word" xmlns:w="http://schemas.openxmlformats.org/wordprocessingml/2006/main" xmlns:w14="http://schemas.microsoft.com/office/word/2010/wordml" xmlns:w15="http://schemas.microsoft.com/office/word/2012/wordml" xmlns:w16cex="http://schemas.microsoft.com/office/word/2018/wordml/cex" xmlns:w16cid="http://schemas.microsoft.com/office/word/2016/wordml/cid" xmlns:w16="http://schemas.microsoft.com/office/word/2018/wordml" xmlns:w16du="http://schemas.microsoft.com/office/word/2023/wordml/word16du" xmlns:w16sdtdh="http://schemas.microsoft.com/office/word/2020/wordml/sdtdatahash" xmlns:w16sdtfl="http://schemas.microsoft.com/office/word/2024/wordml/sdtformatlock" xmlns:w16se="http://schemas.microsoft.com/office/word/2015/wordml/symex" xmlns:wpg="http://schemas.microsoft.com/office/word/2010/wordprocessingGroup" xmlns:wpi="http://schemas.microsoft.com/office/word/2010/wordprocessingInk" xmlns:wne="http://schemas.microsoft.com/office/word/2006/wordml" xmlns:wps="http://schemas.microsoft.com/office/word/2010/wordprocessingShape" mc:Ignorable="w14 w15 w16se w16cid w16 w16cex w16sdtdh w16sdtfl w16du wp14">
   <w:body>
     <w:p>
       <w:pPr>
+        <w:spacing w:line="480" w:lineRule="auto"/>
         <w:jc w:val="center"/>
         <w:rPr>
           <w:rFonts w:ascii="Quattrocento Sans" w:eastAsia="Quattrocento Sans" w:hAnsi="Quattrocento Sans" w:cs="Quattrocento Sans"/>
@@ -22,7 +23,7 @@
           <w:lang w:val="en-US"/>
         </w:rPr>
         <w:drawing>
-          <wp:inline distT="0" distB="0" distL="0" distR="0">
+          <wp:inline distT="0" distB="0" distL="0" distR="0" wp14:anchorId="20B59B7A" wp14:editId="721A51E9">
             <wp:extent cx="1247035" cy="1465004"/>
             <wp:effectExtent l="0" t="0" r="0" b="0"/>
             <wp:docPr id="1" name="image1.png"/>
@@ -201,7 +202,6 @@
           <w:sz w:val="24"/>
           <w:szCs w:val="24"/>
         </w:rPr>
-        <w:lastRenderedPageBreak/>
         <w:t>Docentes</w:t>
       </w:r>
     </w:p>
@@ -221,6 +221,7 @@
         <w:spacing w:before="60"/>
         <w:rPr>
           <w:color w:val="000000"/>
+          <w:lang w:val="en-US"/>
         </w:rPr>
       </w:pPr>
       <w:r>
@@ -236,17 +237,16 @@
           <w:szCs w:val="24"/>
         </w:rPr>
         <w:tab/>
-        <w:t xml:space="preserve">Ing. Judith </w:t>
+        <w:t xml:space="preserve">Ing. </w:t>
       </w:r>
-      <w:proofErr w:type="spellStart"/>
       <w:r>
         <w:rPr>
           <w:sz w:val="24"/>
           <w:szCs w:val="24"/>
-        </w:rPr>
-        <w:t>Meles</w:t>
+          <w:lang w:val="en-US"/>
+        </w:rPr>
+        <w:t>Judith Meles</w:t>
       </w:r>
-      <w:proofErr w:type="spellEnd"/>
     </w:p>
     <w:p>
       <w:pPr>
@@ -263,12 +263,14 @@
         </w:tabs>
         <w:rPr>
           <w:color w:val="000000"/>
+          <w:lang w:val="en-US"/>
         </w:rPr>
       </w:pPr>
       <w:r>
         <w:rPr>
           <w:sz w:val="24"/>
           <w:szCs w:val="24"/>
+          <w:lang w:val="en-US"/>
         </w:rPr>
         <w:t xml:space="preserve">JTP </w:t>
       </w:r>
@@ -276,25 +278,10 @@
         <w:rPr>
           <w:sz w:val="24"/>
           <w:szCs w:val="24"/>
+          <w:lang w:val="en-US"/>
         </w:rPr>
         <w:tab/>
-        <w:t xml:space="preserve">Ing. </w:t>
-      </w:r>
-      <w:proofErr w:type="spellStart"/>
-      <w:r>
-        <w:rPr>
-          <w:sz w:val="24"/>
-          <w:szCs w:val="24"/>
-        </w:rPr>
-        <w:t>Mickaela</w:t>
-      </w:r>
-      <w:proofErr w:type="spellEnd"/>
-      <w:r>
-        <w:rPr>
-          <w:sz w:val="24"/>
-          <w:szCs w:val="24"/>
-        </w:rPr>
-        <w:t xml:space="preserve"> Crespo</w:t>
+        <w:t>Ing. Mickaela Crespo</w:t>
       </w:r>
     </w:p>
     <w:p>
@@ -321,8 +308,8 @@
           <w:b/>
           <w:sz w:val="24"/>
           <w:szCs w:val="24"/>
-        </w:rPr>
-        <w:lastRenderedPageBreak/>
+          <w:lang w:val="en-US"/>
+        </w:rPr>
         <w:tab/>
       </w:r>
       <w:r>
@@ -330,6 +317,7 @@
           <w:b/>
           <w:sz w:val="24"/>
           <w:szCs w:val="24"/>
+          <w:lang w:val="en-US"/>
         </w:rPr>
         <w:tab/>
       </w:r>
@@ -338,8 +326,16 @@
           <w:b/>
           <w:sz w:val="24"/>
           <w:szCs w:val="24"/>
+          <w:lang w:val="en-US"/>
         </w:rPr>
         <w:tab/>
+      </w:r>
+      <w:r>
+        <w:rPr>
+          <w:b/>
+          <w:sz w:val="24"/>
+          <w:szCs w:val="24"/>
+        </w:rPr>
         <w:t>Ayudantes</w:t>
       </w:r>
     </w:p>
@@ -362,17 +358,8 @@
           <w:sz w:val="24"/>
           <w:szCs w:val="24"/>
         </w:rPr>
-        <w:t xml:space="preserve">Salvador Barbera – Marcos </w:t>
+        <w:t>Salvador Barbera</w:t>
       </w:r>
-      <w:proofErr w:type="spellStart"/>
-      <w:r>
-        <w:rPr>
-          <w:sz w:val="24"/>
-          <w:szCs w:val="24"/>
-        </w:rPr>
-        <w:t>Pomenich</w:t>
-      </w:r>
-      <w:proofErr w:type="spellEnd"/>
     </w:p>
     <w:p>
       <w:pPr>
@@ -565,21 +552,12 @@
               </w:rPr>
             </w:pPr>
             <w:hyperlink r:id="rId6">
-              <w:proofErr w:type="spellStart"/>
               <w:r>
                 <w:rPr>
                   <w:sz w:val="24"/>
                   <w:szCs w:val="24"/>
                 </w:rPr>
-                <w:t>Cufré</w:t>
-              </w:r>
-              <w:proofErr w:type="spellEnd"/>
-              <w:r>
-                <w:rPr>
-                  <w:sz w:val="24"/>
-                  <w:szCs w:val="24"/>
-                </w:rPr>
-                <w:t>, Ángel Hugo</w:t>
+                <w:t>Cufré, Ángel Hugo</w:t>
               </w:r>
             </w:hyperlink>
           </w:p>
@@ -623,7 +601,6 @@
               </w:rPr>
             </w:pPr>
             <w:hyperlink r:id="rId7">
-              <w:proofErr w:type="spellStart"/>
               <w:r>
                 <w:t>C</w:t>
               </w:r>
@@ -634,15 +611,7 @@
                   <w:sz w:val="24"/>
                   <w:szCs w:val="24"/>
                 </w:rPr>
-                <w:t>arrió</w:t>
-              </w:r>
-              <w:proofErr w:type="spellEnd"/>
-              <w:r>
-                <w:rPr>
-                  <w:sz w:val="24"/>
-                  <w:szCs w:val="24"/>
-                </w:rPr>
-                <w:t xml:space="preserve">, Tomás </w:t>
+                <w:t xml:space="preserve">arrió, Tomás </w:t>
               </w:r>
             </w:hyperlink>
           </w:p>
@@ -1749,11 +1718,9 @@
               <w:spacing w:line="240" w:lineRule="auto"/>
               <w:jc w:val="center"/>
             </w:pPr>
-            <w:proofErr w:type="spellStart"/>
-            <w:r>
-              <w:t>Resumenes</w:t>
-            </w:r>
-            <w:proofErr w:type="spellEnd"/>
+            <w:r>
+              <w:t>Resúmenes</w:t>
+            </w:r>
           </w:p>
         </w:tc>
         <w:tc>
@@ -2358,7 +2325,11 @@
               <w:jc w:val="center"/>
             </w:pPr>
             <w:r>
-              <w:t>Consignas del Trabajo Práctico</w:t>
+              <w:t>Bibliografía</w:t>
+            </w:r>
+            <w:r>
+              <w:br/>
+              <w:t>Gestión de Productos</w:t>
             </w:r>
           </w:p>
         </w:tc>
@@ -2395,7 +2366,7 @@
                 <w:sz w:val="20"/>
                 <w:szCs w:val="20"/>
               </w:rPr>
-              <w:t>ISW_TP#_&lt;</w:t>
+              <w:t>GP_&lt;</w:t>
             </w:r>
             <w:proofErr w:type="spellStart"/>
             <w:r>
@@ -2403,7 +2374,7 @@
                 <w:sz w:val="20"/>
                 <w:szCs w:val="20"/>
               </w:rPr>
-              <w:t>NombreTrabajoPractico</w:t>
+              <w:t>NombreLibro</w:t>
             </w:r>
             <w:proofErr w:type="spellEnd"/>
             <w:r>
@@ -2411,7 +2382,7 @@
                 <w:sz w:val="20"/>
                 <w:szCs w:val="20"/>
               </w:rPr>
-              <w:t>&gt;.&lt;</w:t>
+              <w:t>&gt;.</w:t>
             </w:r>
             <w:proofErr w:type="spellStart"/>
             <w:r>
@@ -2419,16 +2390,9 @@
                 <w:sz w:val="20"/>
                 <w:szCs w:val="20"/>
               </w:rPr>
-              <w:t>Extension</w:t>
+              <w:t>pdf</w:t>
             </w:r>
             <w:proofErr w:type="spellEnd"/>
-            <w:r>
-              <w:rPr>
-                <w:sz w:val="20"/>
-                <w:szCs w:val="20"/>
-              </w:rPr>
-              <w:t>&gt;</w:t>
-            </w:r>
           </w:p>
         </w:tc>
         <w:tc>
@@ -2454,12 +2418,159 @@
               </w:pBdr>
               <w:spacing w:line="240" w:lineRule="auto"/>
               <w:jc w:val="center"/>
-              <w:rPr>
-                <w:sz w:val="20"/>
-                <w:szCs w:val="20"/>
-              </w:rPr>
-            </w:pPr>
-            <w:hyperlink r:id="rId24">
+            </w:pPr>
+            <w:hyperlink r:id="rId24" w:history="1">
+              <w:r>
+                <w:rPr>
+                  <w:rStyle w:val="Hipervnculo"/>
+                  <w:sz w:val="20"/>
+                  <w:szCs w:val="20"/>
+                </w:rPr>
+                <w:t>Bibliografia/Bibliografia_De_La_Catedra/Material_Bibliografico/</w:t>
+              </w:r>
+              <w:r>
+                <w:rPr>
+                  <w:rStyle w:val="Hipervnculo"/>
+                  <w:sz w:val="20"/>
+                  <w:szCs w:val="20"/>
+                </w:rPr>
+                <w:t>Gestion_Producto</w:t>
+              </w:r>
+            </w:hyperlink>
+          </w:p>
+        </w:tc>
+      </w:tr>
+      <w:tr>
+        <w:trPr>
+          <w:trHeight w:val="610"/>
+        </w:trPr>
+        <w:tc>
+          <w:tcPr>
+            <w:tcW w:w="1560" w:type="dxa"/>
+            <w:tcMar>
+              <w:top w:w="100" w:type="dxa"/>
+              <w:left w:w="100" w:type="dxa"/>
+              <w:bottom w:w="100" w:type="dxa"/>
+              <w:right w:w="100" w:type="dxa"/>
+            </w:tcMar>
+            <w:vAlign w:val="center"/>
+          </w:tcPr>
+          <w:p>
+            <w:pPr>
+              <w:widowControl w:val="0"/>
+              <w:pBdr>
+                <w:top w:val="nil"/>
+                <w:left w:val="nil"/>
+                <w:bottom w:val="nil"/>
+                <w:right w:val="nil"/>
+                <w:between w:val="nil"/>
+              </w:pBdr>
+              <w:spacing w:line="240" w:lineRule="auto"/>
+              <w:jc w:val="center"/>
+            </w:pPr>
+            <w:r>
+              <w:t>Consignas del Trabajo Práctico</w:t>
+            </w:r>
+          </w:p>
+        </w:tc>
+        <w:tc>
+          <w:tcPr>
+            <w:tcW w:w="3237" w:type="dxa"/>
+            <w:tcMar>
+              <w:top w:w="100" w:type="dxa"/>
+              <w:left w:w="100" w:type="dxa"/>
+              <w:bottom w:w="100" w:type="dxa"/>
+              <w:right w:w="100" w:type="dxa"/>
+            </w:tcMar>
+            <w:vAlign w:val="center"/>
+          </w:tcPr>
+          <w:p>
+            <w:pPr>
+              <w:widowControl w:val="0"/>
+              <w:pBdr>
+                <w:top w:val="nil"/>
+                <w:left w:val="nil"/>
+                <w:bottom w:val="nil"/>
+                <w:right w:val="nil"/>
+                <w:between w:val="nil"/>
+              </w:pBdr>
+              <w:spacing w:line="240" w:lineRule="auto"/>
+              <w:jc w:val="center"/>
+              <w:rPr>
+                <w:sz w:val="20"/>
+                <w:szCs w:val="20"/>
+              </w:rPr>
+            </w:pPr>
+            <w:r>
+              <w:rPr>
+                <w:sz w:val="20"/>
+                <w:szCs w:val="20"/>
+              </w:rPr>
+              <w:t>ISW_TP#_&lt;</w:t>
+            </w:r>
+            <w:proofErr w:type="spellStart"/>
+            <w:r>
+              <w:rPr>
+                <w:sz w:val="20"/>
+                <w:szCs w:val="20"/>
+              </w:rPr>
+              <w:t>NombreTrabajoPractico</w:t>
+            </w:r>
+            <w:proofErr w:type="spellEnd"/>
+            <w:r>
+              <w:rPr>
+                <w:sz w:val="20"/>
+                <w:szCs w:val="20"/>
+              </w:rPr>
+              <w:t>&gt;.&lt;</w:t>
+            </w:r>
+            <w:proofErr w:type="spellStart"/>
+            <w:r>
+              <w:rPr>
+                <w:sz w:val="20"/>
+                <w:szCs w:val="20"/>
+              </w:rPr>
+              <w:t>Extension</w:t>
+            </w:r>
+            <w:proofErr w:type="spellEnd"/>
+            <w:r>
+              <w:rPr>
+                <w:sz w:val="20"/>
+                <w:szCs w:val="20"/>
+              </w:rPr>
+              <w:t>&gt;</w:t>
+            </w:r>
+          </w:p>
+        </w:tc>
+        <w:tc>
+          <w:tcPr>
+            <w:tcW w:w="5662" w:type="dxa"/>
+            <w:tcMar>
+              <w:top w:w="100" w:type="dxa"/>
+              <w:left w:w="100" w:type="dxa"/>
+              <w:bottom w:w="100" w:type="dxa"/>
+              <w:right w:w="100" w:type="dxa"/>
+            </w:tcMar>
+            <w:vAlign w:val="center"/>
+          </w:tcPr>
+          <w:p>
+            <w:pPr>
+              <w:widowControl w:val="0"/>
+              <w:pBdr>
+                <w:top w:val="nil"/>
+                <w:left w:val="nil"/>
+                <w:bottom w:val="nil"/>
+                <w:right w:val="nil"/>
+                <w:between w:val="nil"/>
+              </w:pBdr>
+              <w:spacing w:line="240" w:lineRule="auto"/>
+              <w:jc w:val="center"/>
+              <w:rPr>
+                <w:sz w:val="20"/>
+                <w:szCs w:val="20"/>
+              </w:rPr>
+            </w:pPr>
+            <w:hyperlink r:id="rId25">
               <w:r>
                 <w:rPr>
                   <w:color w:val="0000FF"/>
@@ -2533,11 +2644,14 @@
         </w:sectPr>
       </w:pPr>
       <w:r>
+        <w:rPr>
+          <w:noProof/>
+        </w:rPr>
         <w:drawing>
-          <wp:inline distT="0" distB="0" distL="0" distR="0" wp14:anchorId="3C3F85FB" wp14:editId="6800A125">
-            <wp:extent cx="3753374" cy="6554115"/>
-            <wp:effectExtent l="0" t="0" r="0" b="0"/>
-            <wp:docPr id="3" name="Imagen 3"/>
+          <wp:inline distT="0" distB="0" distL="0" distR="0" wp14:anchorId="7EE0C77B" wp14:editId="3F06E46F">
+            <wp:extent cx="2886075" cy="5029200"/>
+            <wp:effectExtent l="0" t="0" r="9525" b="0"/>
+            <wp:docPr id="1746192628" name="Imagen 1" descr="Texto&#10;&#10;El contenido generado por IA puede ser incorrecto."/>
             <wp:cNvGraphicFramePr>
               <a:graphicFrameLocks xmlns:a="http://schemas.openxmlformats.org/drawingml/2006/main" noChangeAspect="1"/>
             </wp:cNvGraphicFramePr>
@@ -2545,11 +2659,11 @@
               <a:graphicData uri="http://schemas.openxmlformats.org/drawingml/2006/picture">
                 <pic:pic xmlns:pic="http://schemas.openxmlformats.org/drawingml/2006/picture">
                   <pic:nvPicPr>
-                    <pic:cNvPr id="1" name=""/>
+                    <pic:cNvPr id="1746192628" name="Imagen 1" descr="Texto&#10;&#10;El contenido generado por IA puede ser incorrecto."/>
                     <pic:cNvPicPr/>
                   </pic:nvPicPr>
                   <pic:blipFill>
-                    <a:blip r:embed="rId25"/>
+                    <a:blip r:embed="rId26"/>
                     <a:stretch>
                       <a:fillRect/>
                     </a:stretch>
@@ -2557,7 +2671,7 @@
                   <pic:spPr>
                     <a:xfrm>
                       <a:off x="0" y="0"/>
-                      <a:ext cx="3753374" cy="6554115"/>
+                      <a:ext cx="2886075" cy="5029200"/>
                     </a:xfrm>
                     <a:prstGeom prst="rect">
                       <a:avLst/>
@@ -2630,7 +2744,6 @@
         <w:tc>
           <w:tcPr>
             <w:tcW w:w="4514" w:type="dxa"/>
-            <w:shd w:val="clear" w:color="auto" w:fill="auto"/>
             <w:tcMar>
               <w:top w:w="100" w:type="dxa"/>
               <w:left w:w="100" w:type="dxa"/>
@@ -2668,8 +2781,7 @@
         </w:tc>
         <w:tc>
           <w:tcPr>
-            <w:tcW w:w="4514" w:type="dxa"/>
-            <w:shd w:val="clear" w:color="auto" w:fill="auto"/>
+            <w:tcW w:w="4515" w:type="dxa"/>
             <w:tcMar>
               <w:top w:w="100" w:type="dxa"/>
               <w:left w:w="100" w:type="dxa"/>
@@ -2713,40 +2825,57 @@
         <w:tc>
           <w:tcPr>
             <w:tcW w:w="4514" w:type="dxa"/>
-            <w:shd w:val="clear" w:color="auto" w:fill="auto"/>
-            <w:tcMar>
-              <w:top w:w="100" w:type="dxa"/>
-              <w:left w:w="100" w:type="dxa"/>
-              <w:bottom w:w="100" w:type="dxa"/>
-              <w:right w:w="100" w:type="dxa"/>
-            </w:tcMar>
-          </w:tcPr>
-          <w:p>
-            <w:pPr>
-              <w:widowControl w:val="0"/>
-              <w:spacing w:line="240" w:lineRule="auto"/>
-              <w:jc w:val="center"/>
-              <w:rPr>
+            <w:tcMar>
+              <w:top w:w="100" w:type="dxa"/>
+              <w:left w:w="100" w:type="dxa"/>
+              <w:bottom w:w="100" w:type="dxa"/>
+              <w:right w:w="100" w:type="dxa"/>
+            </w:tcMar>
+            <w:vAlign w:val="center"/>
+          </w:tcPr>
+          <w:p>
+            <w:pPr>
+              <w:widowControl w:val="0"/>
+              <w:spacing w:line="240" w:lineRule="auto"/>
+              <w:jc w:val="center"/>
+              <w:rPr>
+                <w:rFonts w:ascii="Consolas" w:hAnsi="Consolas"/>
+                <w:b/>
+                <w:bCs/>
                 <w:u w:val="single"/>
               </w:rPr>
             </w:pPr>
             <w:r>
+              <w:rPr>
+                <w:rFonts w:ascii="Consolas" w:hAnsi="Consolas"/>
+                <w:b/>
+                <w:bCs/>
+              </w:rPr>
               <w:t>&lt;</w:t>
             </w:r>
             <w:proofErr w:type="spellStart"/>
             <w:r>
+              <w:rPr>
+                <w:rFonts w:ascii="Consolas" w:hAnsi="Consolas"/>
+                <w:b/>
+                <w:bCs/>
+              </w:rPr>
               <w:t>NombreTrabajoPractico</w:t>
             </w:r>
             <w:proofErr w:type="spellEnd"/>
             <w:r>
+              <w:rPr>
+                <w:rFonts w:ascii="Consolas" w:hAnsi="Consolas"/>
+                <w:b/>
+                <w:bCs/>
+              </w:rPr>
               <w:t>&gt;</w:t>
             </w:r>
           </w:p>
         </w:tc>
         <w:tc>
           <w:tcPr>
-            <w:tcW w:w="4514" w:type="dxa"/>
-            <w:shd w:val="clear" w:color="auto" w:fill="auto"/>
+            <w:tcW w:w="4515" w:type="dxa"/>
             <w:tcMar>
               <w:top w:w="100" w:type="dxa"/>
               <w:left w:w="100" w:type="dxa"/>
@@ -2780,32 +2909,39 @@
         <w:tc>
           <w:tcPr>
             <w:tcW w:w="4514" w:type="dxa"/>
-            <w:shd w:val="clear" w:color="auto" w:fill="auto"/>
-            <w:tcMar>
-              <w:top w:w="100" w:type="dxa"/>
-              <w:left w:w="100" w:type="dxa"/>
-              <w:bottom w:w="100" w:type="dxa"/>
-              <w:right w:w="100" w:type="dxa"/>
-            </w:tcMar>
-          </w:tcPr>
-          <w:p>
-            <w:pPr>
-              <w:widowControl w:val="0"/>
-              <w:spacing w:line="240" w:lineRule="auto"/>
-              <w:jc w:val="center"/>
-              <w:rPr>
+            <w:tcMar>
+              <w:top w:w="100" w:type="dxa"/>
+              <w:left w:w="100" w:type="dxa"/>
+              <w:bottom w:w="100" w:type="dxa"/>
+              <w:right w:w="100" w:type="dxa"/>
+            </w:tcMar>
+            <w:vAlign w:val="center"/>
+          </w:tcPr>
+          <w:p>
+            <w:pPr>
+              <w:widowControl w:val="0"/>
+              <w:spacing w:line="240" w:lineRule="auto"/>
+              <w:jc w:val="center"/>
+              <w:rPr>
+                <w:rFonts w:ascii="Consolas" w:hAnsi="Consolas"/>
+                <w:b/>
+                <w:bCs/>
                 <w:u w:val="single"/>
               </w:rPr>
             </w:pPr>
             <w:r>
+              <w:rPr>
+                <w:rFonts w:ascii="Consolas" w:hAnsi="Consolas"/>
+                <w:b/>
+                <w:bCs/>
+              </w:rPr>
               <w:t>TP#</w:t>
             </w:r>
           </w:p>
         </w:tc>
         <w:tc>
           <w:tcPr>
-            <w:tcW w:w="4514" w:type="dxa"/>
-            <w:shd w:val="clear" w:color="auto" w:fill="auto"/>
+            <w:tcW w:w="4515" w:type="dxa"/>
             <w:tcMar>
               <w:top w:w="100" w:type="dxa"/>
               <w:left w:w="100" w:type="dxa"/>
@@ -2839,40 +2975,57 @@
         <w:tc>
           <w:tcPr>
             <w:tcW w:w="4514" w:type="dxa"/>
-            <w:shd w:val="clear" w:color="auto" w:fill="auto"/>
-            <w:tcMar>
-              <w:top w:w="100" w:type="dxa"/>
-              <w:left w:w="100" w:type="dxa"/>
-              <w:bottom w:w="100" w:type="dxa"/>
-              <w:right w:w="100" w:type="dxa"/>
-            </w:tcMar>
-          </w:tcPr>
-          <w:p>
-            <w:pPr>
-              <w:widowControl w:val="0"/>
-              <w:spacing w:line="240" w:lineRule="auto"/>
-              <w:jc w:val="center"/>
-              <w:rPr>
+            <w:tcMar>
+              <w:top w:w="100" w:type="dxa"/>
+              <w:left w:w="100" w:type="dxa"/>
+              <w:bottom w:w="100" w:type="dxa"/>
+              <w:right w:w="100" w:type="dxa"/>
+            </w:tcMar>
+            <w:vAlign w:val="center"/>
+          </w:tcPr>
+          <w:p>
+            <w:pPr>
+              <w:widowControl w:val="0"/>
+              <w:spacing w:line="240" w:lineRule="auto"/>
+              <w:jc w:val="center"/>
+              <w:rPr>
+                <w:rFonts w:ascii="Consolas" w:hAnsi="Consolas"/>
+                <w:b/>
+                <w:bCs/>
                 <w:u w:val="single"/>
               </w:rPr>
             </w:pPr>
             <w:r>
+              <w:rPr>
+                <w:rFonts w:ascii="Consolas" w:hAnsi="Consolas"/>
+                <w:b/>
+                <w:bCs/>
+              </w:rPr>
               <w:t>&lt;</w:t>
             </w:r>
             <w:proofErr w:type="spellStart"/>
             <w:r>
+              <w:rPr>
+                <w:rFonts w:ascii="Consolas" w:hAnsi="Consolas"/>
+                <w:b/>
+                <w:bCs/>
+              </w:rPr>
               <w:t>NombrePresentación</w:t>
             </w:r>
             <w:proofErr w:type="spellEnd"/>
             <w:r>
+              <w:rPr>
+                <w:rFonts w:ascii="Consolas" w:hAnsi="Consolas"/>
+                <w:b/>
+                <w:bCs/>
+              </w:rPr>
               <w:t>&gt;</w:t>
             </w:r>
           </w:p>
         </w:tc>
         <w:tc>
           <w:tcPr>
-            <w:tcW w:w="4514" w:type="dxa"/>
-            <w:shd w:val="clear" w:color="auto" w:fill="auto"/>
+            <w:tcW w:w="4515" w:type="dxa"/>
             <w:tcMar>
               <w:top w:w="100" w:type="dxa"/>
               <w:left w:w="100" w:type="dxa"/>
@@ -2906,13 +3059,13 @@
         <w:tc>
           <w:tcPr>
             <w:tcW w:w="4514" w:type="dxa"/>
-            <w:shd w:val="clear" w:color="auto" w:fill="auto"/>
-            <w:tcMar>
-              <w:top w:w="100" w:type="dxa"/>
-              <w:left w:w="100" w:type="dxa"/>
-              <w:bottom w:w="100" w:type="dxa"/>
-              <w:right w:w="100" w:type="dxa"/>
-            </w:tcMar>
+            <w:tcMar>
+              <w:top w:w="100" w:type="dxa"/>
+              <w:left w:w="100" w:type="dxa"/>
+              <w:bottom w:w="100" w:type="dxa"/>
+              <w:right w:w="100" w:type="dxa"/>
+            </w:tcMar>
+            <w:vAlign w:val="center"/>
           </w:tcPr>
           <w:p>
             <w:pPr>
@@ -2926,16 +3079,25 @@
               </w:pBdr>
               <w:spacing w:line="240" w:lineRule="auto"/>
               <w:jc w:val="center"/>
-            </w:pPr>
-            <w:r>
+              <w:rPr>
+                <w:rFonts w:ascii="Consolas" w:hAnsi="Consolas"/>
+                <w:b/>
+                <w:bCs/>
+              </w:rPr>
+            </w:pPr>
+            <w:r>
+              <w:rPr>
+                <w:rFonts w:ascii="Consolas" w:hAnsi="Consolas"/>
+                <w:b/>
+                <w:bCs/>
+              </w:rPr>
               <w:t>&lt;Fecha&gt;</w:t>
             </w:r>
           </w:p>
         </w:tc>
         <w:tc>
           <w:tcPr>
-            <w:tcW w:w="4514" w:type="dxa"/>
-            <w:shd w:val="clear" w:color="auto" w:fill="auto"/>
+            <w:tcW w:w="4515" w:type="dxa"/>
             <w:tcMar>
               <w:top w:w="100" w:type="dxa"/>
               <w:left w:w="100" w:type="dxa"/>
@@ -2959,11 +3121,9 @@
             <w:r>
               <w:t xml:space="preserve">Fecha correspondiente al </w:t>
             </w:r>
-            <w:proofErr w:type="spellStart"/>
-            <w:r>
-              <w:t>dia</w:t>
-            </w:r>
-            <w:proofErr w:type="spellEnd"/>
+            <w:r>
+              <w:t>día</w:t>
+            </w:r>
             <w:r>
               <w:t xml:space="preserve"> que se tomó la minuta.</w:t>
             </w:r>
@@ -2977,40 +3137,57 @@
         <w:tc>
           <w:tcPr>
             <w:tcW w:w="4514" w:type="dxa"/>
-            <w:shd w:val="clear" w:color="auto" w:fill="auto"/>
-            <w:tcMar>
-              <w:top w:w="100" w:type="dxa"/>
-              <w:left w:w="100" w:type="dxa"/>
-              <w:bottom w:w="100" w:type="dxa"/>
-              <w:right w:w="100" w:type="dxa"/>
-            </w:tcMar>
-          </w:tcPr>
-          <w:p>
-            <w:pPr>
-              <w:widowControl w:val="0"/>
-              <w:spacing w:line="240" w:lineRule="auto"/>
-              <w:jc w:val="center"/>
-              <w:rPr>
+            <w:tcMar>
+              <w:top w:w="100" w:type="dxa"/>
+              <w:left w:w="100" w:type="dxa"/>
+              <w:bottom w:w="100" w:type="dxa"/>
+              <w:right w:w="100" w:type="dxa"/>
+            </w:tcMar>
+            <w:vAlign w:val="center"/>
+          </w:tcPr>
+          <w:p>
+            <w:pPr>
+              <w:widowControl w:val="0"/>
+              <w:spacing w:line="240" w:lineRule="auto"/>
+              <w:jc w:val="center"/>
+              <w:rPr>
+                <w:rFonts w:ascii="Consolas" w:hAnsi="Consolas"/>
+                <w:b/>
+                <w:bCs/>
                 <w:u w:val="single"/>
               </w:rPr>
             </w:pPr>
             <w:r>
+              <w:rPr>
+                <w:rFonts w:ascii="Consolas" w:hAnsi="Consolas"/>
+                <w:b/>
+                <w:bCs/>
+              </w:rPr>
               <w:t>&lt;</w:t>
             </w:r>
             <w:proofErr w:type="spellStart"/>
             <w:r>
+              <w:rPr>
+                <w:rFonts w:ascii="Consolas" w:hAnsi="Consolas"/>
+                <w:b/>
+                <w:bCs/>
+              </w:rPr>
               <w:t>NombreDeTema</w:t>
             </w:r>
             <w:proofErr w:type="spellEnd"/>
             <w:r>
+              <w:rPr>
+                <w:rFonts w:ascii="Consolas" w:hAnsi="Consolas"/>
+                <w:b/>
+                <w:bCs/>
+              </w:rPr>
               <w:t>&gt;</w:t>
             </w:r>
           </w:p>
         </w:tc>
         <w:tc>
           <w:tcPr>
-            <w:tcW w:w="4514" w:type="dxa"/>
-            <w:shd w:val="clear" w:color="auto" w:fill="auto"/>
+            <w:tcW w:w="4515" w:type="dxa"/>
             <w:tcMar>
               <w:top w:w="100" w:type="dxa"/>
               <w:left w:w="100" w:type="dxa"/>
@@ -3050,29 +3227,38 @@
         <w:tc>
           <w:tcPr>
             <w:tcW w:w="4514" w:type="dxa"/>
-            <w:shd w:val="clear" w:color="auto" w:fill="auto"/>
-            <w:tcMar>
-              <w:top w:w="100" w:type="dxa"/>
-              <w:left w:w="100" w:type="dxa"/>
-              <w:bottom w:w="100" w:type="dxa"/>
-              <w:right w:w="100" w:type="dxa"/>
-            </w:tcMar>
-          </w:tcPr>
-          <w:p>
-            <w:pPr>
-              <w:widowControl w:val="0"/>
-              <w:spacing w:line="240" w:lineRule="auto"/>
-              <w:jc w:val="center"/>
-            </w:pPr>
-            <w:r>
+            <w:tcMar>
+              <w:top w:w="100" w:type="dxa"/>
+              <w:left w:w="100" w:type="dxa"/>
+              <w:bottom w:w="100" w:type="dxa"/>
+              <w:right w:w="100" w:type="dxa"/>
+            </w:tcMar>
+            <w:vAlign w:val="center"/>
+          </w:tcPr>
+          <w:p>
+            <w:pPr>
+              <w:widowControl w:val="0"/>
+              <w:spacing w:line="240" w:lineRule="auto"/>
+              <w:jc w:val="center"/>
+              <w:rPr>
+                <w:rFonts w:ascii="Consolas" w:hAnsi="Consolas"/>
+                <w:b/>
+                <w:bCs/>
+              </w:rPr>
+            </w:pPr>
+            <w:r>
+              <w:rPr>
+                <w:rFonts w:ascii="Consolas" w:hAnsi="Consolas"/>
+                <w:b/>
+                <w:bCs/>
+              </w:rPr>
               <w:t>&lt;Apellido&gt;</w:t>
             </w:r>
           </w:p>
         </w:tc>
         <w:tc>
           <w:tcPr>
-            <w:tcW w:w="4514" w:type="dxa"/>
-            <w:shd w:val="clear" w:color="auto" w:fill="auto"/>
+            <w:tcW w:w="4515" w:type="dxa"/>
             <w:tcMar>
               <w:top w:w="100" w:type="dxa"/>
               <w:left w:w="100" w:type="dxa"/>
@@ -3094,10 +3280,13 @@
               <w:jc w:val="center"/>
             </w:pPr>
             <w:r>
-              <w:t>Apellido del autor que identifica unívocamente una minuta</w:t>
-            </w:r>
-            <w:r>
-              <w:t xml:space="preserve">  / Resumen / Ejercicio Práctico</w:t>
+              <w:t xml:space="preserve">Apellido del autor que identifica unívocamente una </w:t>
+            </w:r>
+            <w:r>
+              <w:t>minuta /</w:t>
+            </w:r>
+            <w:r>
+              <w:t xml:space="preserve"> Resumen / Ejercicio Práctico</w:t>
             </w:r>
             <w:r>
               <w:t>.</w:t>
@@ -3112,29 +3301,38 @@
         <w:tc>
           <w:tcPr>
             <w:tcW w:w="4514" w:type="dxa"/>
-            <w:shd w:val="clear" w:color="auto" w:fill="auto"/>
-            <w:tcMar>
-              <w:top w:w="100" w:type="dxa"/>
-              <w:left w:w="100" w:type="dxa"/>
-              <w:bottom w:w="100" w:type="dxa"/>
-              <w:right w:w="100" w:type="dxa"/>
-            </w:tcMar>
-          </w:tcPr>
-          <w:p>
-            <w:pPr>
-              <w:widowControl w:val="0"/>
-              <w:spacing w:line="240" w:lineRule="auto"/>
-              <w:jc w:val="center"/>
-            </w:pPr>
-            <w:r>
+            <w:tcMar>
+              <w:top w:w="100" w:type="dxa"/>
+              <w:left w:w="100" w:type="dxa"/>
+              <w:bottom w:w="100" w:type="dxa"/>
+              <w:right w:w="100" w:type="dxa"/>
+            </w:tcMar>
+            <w:vAlign w:val="center"/>
+          </w:tcPr>
+          <w:p>
+            <w:pPr>
+              <w:widowControl w:val="0"/>
+              <w:spacing w:line="240" w:lineRule="auto"/>
+              <w:jc w:val="center"/>
+              <w:rPr>
+                <w:rFonts w:ascii="Consolas" w:hAnsi="Consolas"/>
+                <w:b/>
+                <w:bCs/>
+              </w:rPr>
+            </w:pPr>
+            <w:r>
+              <w:rPr>
+                <w:rFonts w:ascii="Consolas" w:hAnsi="Consolas"/>
+                <w:b/>
+                <w:bCs/>
+              </w:rPr>
               <w:t>&lt;Apellidos&gt;</w:t>
             </w:r>
           </w:p>
         </w:tc>
         <w:tc>
           <w:tcPr>
-            <w:tcW w:w="4514" w:type="dxa"/>
-            <w:shd w:val="clear" w:color="auto" w:fill="auto"/>
+            <w:tcW w:w="4515" w:type="dxa"/>
             <w:tcMar>
               <w:top w:w="100" w:type="dxa"/>
               <w:left w:w="100" w:type="dxa"/>
@@ -3168,66 +3366,83 @@
         <w:tc>
           <w:tcPr>
             <w:tcW w:w="4514" w:type="dxa"/>
-            <w:shd w:val="clear" w:color="auto" w:fill="auto"/>
-            <w:tcMar>
-              <w:top w:w="100" w:type="dxa"/>
-              <w:left w:w="100" w:type="dxa"/>
-              <w:bottom w:w="100" w:type="dxa"/>
-              <w:right w:w="100" w:type="dxa"/>
-            </w:tcMar>
-          </w:tcPr>
-          <w:p>
-            <w:pPr>
-              <w:widowControl w:val="0"/>
-              <w:spacing w:line="240" w:lineRule="auto"/>
-              <w:jc w:val="center"/>
-            </w:pPr>
-            <w:r>
+            <w:tcMar>
+              <w:top w:w="100" w:type="dxa"/>
+              <w:left w:w="100" w:type="dxa"/>
+              <w:bottom w:w="100" w:type="dxa"/>
+              <w:right w:w="100" w:type="dxa"/>
+            </w:tcMar>
+            <w:vAlign w:val="center"/>
+          </w:tcPr>
+          <w:p>
+            <w:pPr>
+              <w:widowControl w:val="0"/>
+              <w:spacing w:line="240" w:lineRule="auto"/>
+              <w:jc w:val="center"/>
+              <w:rPr>
+                <w:rFonts w:ascii="Consolas" w:hAnsi="Consolas"/>
+                <w:b/>
+                <w:bCs/>
+              </w:rPr>
+            </w:pPr>
+            <w:r>
+              <w:rPr>
+                <w:rFonts w:ascii="Consolas" w:hAnsi="Consolas"/>
+                <w:b/>
+                <w:bCs/>
+              </w:rPr>
               <w:t>&lt;Extensión&gt;</w:t>
             </w:r>
           </w:p>
         </w:tc>
         <w:tc>
           <w:tcPr>
-            <w:tcW w:w="4514" w:type="dxa"/>
-            <w:shd w:val="clear" w:color="auto" w:fill="auto"/>
-            <w:tcMar>
-              <w:top w:w="100" w:type="dxa"/>
-              <w:left w:w="100" w:type="dxa"/>
-              <w:bottom w:w="100" w:type="dxa"/>
-              <w:right w:w="100" w:type="dxa"/>
-            </w:tcMar>
-          </w:tcPr>
-          <w:p>
-            <w:pPr>
-              <w:widowControl w:val="0"/>
-              <w:spacing w:line="240" w:lineRule="auto"/>
-              <w:jc w:val="center"/>
-            </w:pPr>
-            <w:r>
-              <w:t>Determina la extensión del archivo identificado como ítem de configuración. Ejemplo: .</w:t>
+            <w:tcW w:w="4515" w:type="dxa"/>
+            <w:tcMar>
+              <w:top w:w="100" w:type="dxa"/>
+              <w:left w:w="100" w:type="dxa"/>
+              <w:bottom w:w="100" w:type="dxa"/>
+              <w:right w:w="100" w:type="dxa"/>
+            </w:tcMar>
+          </w:tcPr>
+          <w:p>
+            <w:pPr>
+              <w:widowControl w:val="0"/>
+              <w:spacing w:line="240" w:lineRule="auto"/>
+              <w:jc w:val="center"/>
+            </w:pPr>
+            <w:r>
+              <w:t xml:space="preserve">Determina la extensión del archivo identificado como ítem de configuración. Ejemplo: </w:t>
+            </w:r>
+            <w:r>
+              <w:rPr>
+                <w:rFonts w:ascii="Consolas" w:hAnsi="Consolas" w:cstheme="majorHAnsi"/>
+              </w:rPr>
+              <w:t>.docx</w:t>
+            </w:r>
+            <w:r>
+              <w:t xml:space="preserve">, </w:t>
+            </w:r>
+            <w:r>
+              <w:rPr>
+                <w:rFonts w:ascii="Consolas" w:hAnsi="Consolas"/>
+              </w:rPr>
+              <w:t>.</w:t>
             </w:r>
             <w:proofErr w:type="spellStart"/>
             <w:r>
-              <w:t>docx</w:t>
+              <w:rPr>
+                <w:rFonts w:ascii="Consolas" w:hAnsi="Consolas"/>
+              </w:rPr>
+              <w:t>txt</w:t>
             </w:r>
             <w:proofErr w:type="spellEnd"/>
             <w:r>
-              <w:t>, .</w:t>
-            </w:r>
-            <w:proofErr w:type="spellStart"/>
-            <w:r>
-              <w:t>txt</w:t>
-            </w:r>
-            <w:proofErr w:type="spellEnd"/>
-            <w:r>
-              <w:t xml:space="preserve">, </w:t>
-            </w:r>
-            <w:proofErr w:type="spellStart"/>
-            <w:r>
-              <w:t>etc</w:t>
-            </w:r>
-            <w:proofErr w:type="spellEnd"/>
+              <w:t>, e</w:t>
+            </w:r>
+            <w:r>
+              <w:t>tc.</w:t>
+            </w:r>
           </w:p>
         </w:tc>
       </w:tr>
@@ -3238,29 +3453,38 @@
         <w:tc>
           <w:tcPr>
             <w:tcW w:w="4514" w:type="dxa"/>
-            <w:shd w:val="clear" w:color="auto" w:fill="auto"/>
-            <w:tcMar>
-              <w:top w:w="100" w:type="dxa"/>
-              <w:left w:w="100" w:type="dxa"/>
-              <w:bottom w:w="100" w:type="dxa"/>
-              <w:right w:w="100" w:type="dxa"/>
-            </w:tcMar>
-          </w:tcPr>
-          <w:p>
-            <w:pPr>
-              <w:widowControl w:val="0"/>
-              <w:spacing w:line="240" w:lineRule="auto"/>
-              <w:jc w:val="center"/>
-            </w:pPr>
-            <w:r>
+            <w:tcMar>
+              <w:top w:w="100" w:type="dxa"/>
+              <w:left w:w="100" w:type="dxa"/>
+              <w:bottom w:w="100" w:type="dxa"/>
+              <w:right w:w="100" w:type="dxa"/>
+            </w:tcMar>
+            <w:vAlign w:val="center"/>
+          </w:tcPr>
+          <w:p>
+            <w:pPr>
+              <w:widowControl w:val="0"/>
+              <w:spacing w:line="240" w:lineRule="auto"/>
+              <w:jc w:val="center"/>
+              <w:rPr>
+                <w:rFonts w:ascii="Consolas" w:hAnsi="Consolas"/>
+                <w:b/>
+                <w:bCs/>
+              </w:rPr>
+            </w:pPr>
+            <w:r>
+              <w:rPr>
+                <w:rFonts w:ascii="Consolas" w:hAnsi="Consolas"/>
+                <w:b/>
+                <w:bCs/>
+              </w:rPr>
               <w:t>SCM</w:t>
             </w:r>
           </w:p>
         </w:tc>
         <w:tc>
           <w:tcPr>
-            <w:tcW w:w="4514" w:type="dxa"/>
-            <w:shd w:val="clear" w:color="auto" w:fill="auto"/>
+            <w:tcW w:w="4515" w:type="dxa"/>
             <w:tcMar>
               <w:top w:w="100" w:type="dxa"/>
               <w:left w:w="100" w:type="dxa"/>
@@ -3295,29 +3519,38 @@
         <w:tc>
           <w:tcPr>
             <w:tcW w:w="4514" w:type="dxa"/>
-            <w:shd w:val="clear" w:color="auto" w:fill="auto"/>
-            <w:tcMar>
-              <w:top w:w="100" w:type="dxa"/>
-              <w:left w:w="100" w:type="dxa"/>
-              <w:bottom w:w="100" w:type="dxa"/>
-              <w:right w:w="100" w:type="dxa"/>
-            </w:tcMar>
-          </w:tcPr>
-          <w:p>
-            <w:pPr>
-              <w:widowControl w:val="0"/>
-              <w:spacing w:line="240" w:lineRule="auto"/>
-              <w:jc w:val="center"/>
-            </w:pPr>
-            <w:r>
+            <w:tcMar>
+              <w:top w:w="100" w:type="dxa"/>
+              <w:left w:w="100" w:type="dxa"/>
+              <w:bottom w:w="100" w:type="dxa"/>
+              <w:right w:w="100" w:type="dxa"/>
+            </w:tcMar>
+            <w:vAlign w:val="center"/>
+          </w:tcPr>
+          <w:p>
+            <w:pPr>
+              <w:widowControl w:val="0"/>
+              <w:spacing w:line="240" w:lineRule="auto"/>
+              <w:jc w:val="center"/>
+              <w:rPr>
+                <w:rFonts w:ascii="Consolas" w:hAnsi="Consolas"/>
+                <w:b/>
+                <w:bCs/>
+              </w:rPr>
+            </w:pPr>
+            <w:r>
+              <w:rPr>
+                <w:rFonts w:ascii="Consolas" w:hAnsi="Consolas"/>
+                <w:b/>
+                <w:bCs/>
+              </w:rPr>
               <w:t>PA</w:t>
             </w:r>
           </w:p>
         </w:tc>
         <w:tc>
           <w:tcPr>
-            <w:tcW w:w="4514" w:type="dxa"/>
-            <w:shd w:val="clear" w:color="auto" w:fill="auto"/>
+            <w:tcW w:w="4515" w:type="dxa"/>
             <w:tcMar>
               <w:top w:w="100" w:type="dxa"/>
               <w:left w:w="100" w:type="dxa"/>
@@ -3344,52 +3577,135 @@
         <w:tc>
           <w:tcPr>
             <w:tcW w:w="4514" w:type="dxa"/>
-            <w:shd w:val="clear" w:color="auto" w:fill="auto"/>
-            <w:tcMar>
-              <w:top w:w="100" w:type="dxa"/>
-              <w:left w:w="100" w:type="dxa"/>
-              <w:bottom w:w="100" w:type="dxa"/>
-              <w:right w:w="100" w:type="dxa"/>
-            </w:tcMar>
-          </w:tcPr>
-          <w:p>
-            <w:pPr>
-              <w:widowControl w:val="0"/>
-              <w:spacing w:line="240" w:lineRule="auto"/>
-              <w:jc w:val="center"/>
-            </w:pPr>
-            <w:r>
+            <w:tcMar>
+              <w:top w:w="100" w:type="dxa"/>
+              <w:left w:w="100" w:type="dxa"/>
+              <w:bottom w:w="100" w:type="dxa"/>
+              <w:right w:w="100" w:type="dxa"/>
+            </w:tcMar>
+            <w:vAlign w:val="center"/>
+          </w:tcPr>
+          <w:p>
+            <w:pPr>
+              <w:widowControl w:val="0"/>
+              <w:spacing w:line="240" w:lineRule="auto"/>
+              <w:jc w:val="center"/>
+              <w:rPr>
+                <w:rFonts w:ascii="Consolas" w:hAnsi="Consolas"/>
+                <w:b/>
+                <w:bCs/>
+              </w:rPr>
+            </w:pPr>
+            <w:r>
+              <w:rPr>
+                <w:rFonts w:ascii="Consolas" w:hAnsi="Consolas"/>
+                <w:b/>
+                <w:bCs/>
+              </w:rPr>
+              <w:t>GP</w:t>
+            </w:r>
+          </w:p>
+        </w:tc>
+        <w:tc>
+          <w:tcPr>
+            <w:tcW w:w="4515" w:type="dxa"/>
+            <w:tcMar>
+              <w:top w:w="100" w:type="dxa"/>
+              <w:left w:w="100" w:type="dxa"/>
+              <w:bottom w:w="100" w:type="dxa"/>
+              <w:right w:w="100" w:type="dxa"/>
+            </w:tcMar>
+          </w:tcPr>
+          <w:p>
+            <w:pPr>
+              <w:widowControl w:val="0"/>
+              <w:spacing w:line="240" w:lineRule="auto"/>
+              <w:jc w:val="center"/>
+            </w:pPr>
+            <w:r>
+              <w:t>Gestión de Productos</w:t>
+            </w:r>
+          </w:p>
+        </w:tc>
+      </w:tr>
+      <w:tr>
+        <w:trPr>
+          <w:jc w:val="center"/>
+        </w:trPr>
+        <w:tc>
+          <w:tcPr>
+            <w:tcW w:w="4514" w:type="dxa"/>
+            <w:tcMar>
+              <w:top w:w="100" w:type="dxa"/>
+              <w:left w:w="100" w:type="dxa"/>
+              <w:bottom w:w="100" w:type="dxa"/>
+              <w:right w:w="100" w:type="dxa"/>
+            </w:tcMar>
+            <w:vAlign w:val="center"/>
+          </w:tcPr>
+          <w:p>
+            <w:pPr>
+              <w:widowControl w:val="0"/>
+              <w:spacing w:line="240" w:lineRule="auto"/>
+              <w:jc w:val="center"/>
+              <w:rPr>
+                <w:rFonts w:ascii="Consolas" w:hAnsi="Consolas"/>
+                <w:b/>
+                <w:bCs/>
+              </w:rPr>
+            </w:pPr>
+            <w:r>
+              <w:rPr>
+                <w:rFonts w:ascii="Consolas" w:hAnsi="Consolas"/>
+                <w:b/>
+                <w:bCs/>
+              </w:rPr>
               <w:t>&lt;</w:t>
             </w:r>
             <w:proofErr w:type="spellStart"/>
             <w:r>
+              <w:rPr>
+                <w:rFonts w:ascii="Consolas" w:hAnsi="Consolas"/>
+                <w:b/>
+                <w:bCs/>
+              </w:rPr>
               <w:t>NombreLibro</w:t>
             </w:r>
             <w:proofErr w:type="spellEnd"/>
             <w:r>
-              <w:t xml:space="preserve">&gt; </w:t>
-            </w:r>
-          </w:p>
-        </w:tc>
-        <w:tc>
-          <w:tcPr>
-            <w:tcW w:w="4514" w:type="dxa"/>
-            <w:shd w:val="clear" w:color="auto" w:fill="auto"/>
-            <w:tcMar>
-              <w:top w:w="100" w:type="dxa"/>
-              <w:left w:w="100" w:type="dxa"/>
-              <w:bottom w:w="100" w:type="dxa"/>
-              <w:right w:w="100" w:type="dxa"/>
-            </w:tcMar>
-          </w:tcPr>
-          <w:p>
-            <w:pPr>
-              <w:widowControl w:val="0"/>
-              <w:spacing w:line="240" w:lineRule="auto"/>
-              <w:jc w:val="center"/>
-            </w:pPr>
-            <w:r>
-              <w:t>Nombre que permite identificar unívocamente a los libros de la catedra.</w:t>
+              <w:rPr>
+                <w:rFonts w:ascii="Consolas" w:hAnsi="Consolas"/>
+                <w:b/>
+                <w:bCs/>
+              </w:rPr>
+              <w:t>&gt;</w:t>
+            </w:r>
+          </w:p>
+        </w:tc>
+        <w:tc>
+          <w:tcPr>
+            <w:tcW w:w="4515" w:type="dxa"/>
+            <w:tcMar>
+              <w:top w:w="100" w:type="dxa"/>
+              <w:left w:w="100" w:type="dxa"/>
+              <w:bottom w:w="100" w:type="dxa"/>
+              <w:right w:w="100" w:type="dxa"/>
+            </w:tcMar>
+          </w:tcPr>
+          <w:p>
+            <w:pPr>
+              <w:widowControl w:val="0"/>
+              <w:spacing w:line="240" w:lineRule="auto"/>
+              <w:jc w:val="center"/>
+            </w:pPr>
+            <w:r>
+              <w:t xml:space="preserve">Nombre que permite identificar unívocamente a los libros de la </w:t>
+            </w:r>
+            <w:r>
+              <w:t>cátedra</w:t>
+            </w:r>
+            <w:r>
+              <w:t>.</w:t>
             </w:r>
           </w:p>
         </w:tc>
@@ -3493,18 +3809,17 @@
     <w:p/>
     <w:p>
       <w:pPr>
+        <w:ind w:firstLine="567"/>
         <w:jc w:val="both"/>
       </w:pPr>
       <w:r>
-        <w:t xml:space="preserve">La línea base será establecida en el momento posterior a una </w:t>
+        <w:t xml:space="preserve">La línea base será establecida en el momento posterior a una devolución positiva tanto verbal o escrita por parte de los docentes en los trabajos prácticos. El contenido de </w:t>
       </w:r>
-      <w:proofErr w:type="spellStart"/>
       <w:r>
-        <w:t>devolución</w:t>
+        <w:t>esta</w:t>
       </w:r>
-      <w:proofErr w:type="spellEnd"/>
       <w:r>
-        <w:t xml:space="preserve"> positiva tanto verbal o escrita por parte de los docentes en los trabajos prácticos. El contenido de la misma tendrá los ítems de configuración pertenecientes a cada trabajo practico.</w:t>
+        <w:t xml:space="preserve"> tendrá los ítems de configuración pertenecientes a cada trabajo practico.</w:t>
       </w:r>
     </w:p>
     <w:p>
@@ -3514,11 +3829,10 @@
       <w:r>
         <w:t xml:space="preserve"> </w:t>
       </w:r>
-      <w:bookmarkStart w:id="0" w:name="_GoBack"/>
-      <w:bookmarkEnd w:id="0"/>
     </w:p>
     <w:p>
       <w:pPr>
+        <w:ind w:firstLine="567"/>
         <w:jc w:val="both"/>
       </w:pPr>
       <w:r>
@@ -3543,7 +3857,7 @@
 </file>
 
 <file path=word/styles.xml><?xml version="1.0" encoding="utf-8"?>
-<w:styles xmlns:mc="http://schemas.openxmlformats.org/markup-compatibility/2006" xmlns:r="http://schemas.openxmlformats.org/officeDocument/2006/relationships" xmlns:w="http://schemas.openxmlformats.org/wordprocessingml/2006/main" xmlns:w14="http://schemas.microsoft.com/office/word/2010/wordml" xmlns:w15="http://schemas.microsoft.com/office/word/2012/wordml" xmlns:w16se="http://schemas.microsoft.com/office/word/2015/wordml/symex" mc:Ignorable="w14 w15 w16se">
+<w:styles xmlns:mc="http://schemas.openxmlformats.org/markup-compatibility/2006" xmlns:r="http://schemas.openxmlformats.org/officeDocument/2006/relationships" xmlns:w="http://schemas.openxmlformats.org/wordprocessingml/2006/main" xmlns:w14="http://schemas.microsoft.com/office/word/2010/wordml" xmlns:w15="http://schemas.microsoft.com/office/word/2012/wordml" xmlns:w16cex="http://schemas.microsoft.com/office/word/2018/wordml/cex" xmlns:w16cid="http://schemas.microsoft.com/office/word/2016/wordml/cid" xmlns:w16="http://schemas.microsoft.com/office/word/2018/wordml" xmlns:w16du="http://schemas.microsoft.com/office/word/2023/wordml/word16du" xmlns:w16sdtdh="http://schemas.microsoft.com/office/word/2020/wordml/sdtdatahash" xmlns:w16sdtfl="http://schemas.microsoft.com/office/word/2024/wordml/sdtformatlock" xmlns:w16se="http://schemas.microsoft.com/office/word/2015/wordml/symex" mc:Ignorable="w14 w15 w16se w16cid w16 w16cex w16sdtdh w16sdtfl w16du">
   <w:docDefaults>
     <w:rPrDefault>
       <w:rPr>
@@ -3559,7 +3873,7 @@
       </w:pPr>
     </w:pPrDefault>
   </w:docDefaults>
-  <w:latentStyles w:defLockedState="0" w:defUIPriority="99" w:defSemiHidden="0" w:defUnhideWhenUsed="0" w:defQFormat="0" w:count="371">
+  <w:latentStyles w:defLockedState="0" w:defUIPriority="99" w:defSemiHidden="0" w:defUnhideWhenUsed="0" w:defQFormat="0" w:count="376">
     <w:lsdException w:name="Normal" w:uiPriority="0" w:qFormat="1"/>
     <w:lsdException w:name="heading 1" w:uiPriority="9" w:qFormat="1"/>
     <w:lsdException w:name="heading 2" w:semiHidden="1" w:uiPriority="9" w:unhideWhenUsed="1" w:qFormat="1"/>
@@ -3931,6 +4245,11 @@
     <w:lsdException w:name="List Table 5 Dark Accent 6" w:uiPriority="50"/>
     <w:lsdException w:name="List Table 6 Colorful Accent 6" w:uiPriority="51"/>
     <w:lsdException w:name="List Table 7 Colorful Accent 6" w:uiPriority="52"/>
+    <w:lsdException w:name="Mention" w:semiHidden="1" w:unhideWhenUsed="1"/>
+    <w:lsdException w:name="Smart Hyperlink" w:semiHidden="1" w:unhideWhenUsed="1"/>
+    <w:lsdException w:name="Hashtag" w:semiHidden="1" w:unhideWhenUsed="1"/>
+    <w:lsdException w:name="Unresolved Mention" w:semiHidden="1" w:unhideWhenUsed="1"/>
+    <w:lsdException w:name="Smart Link" w:semiHidden="1" w:unhideWhenUsed="1"/>
   </w:latentStyles>
   <w:style w:type="paragraph" w:default="1" w:styleId="Normal">
     <w:name w:val="Normal"/>
@@ -4122,6 +4441,29 @@
       <w:tblStyleRowBandSize w:val="1"/>
       <w:tblStyleColBandSize w:val="1"/>
     </w:tblPr>
+  </w:style>
+  <w:style w:type="character" w:styleId="Hipervnculo">
+    <w:name w:val="Hyperlink"/>
+    <w:basedOn w:val="Fuentedeprrafopredeter"/>
+    <w:uiPriority w:val="99"/>
+    <w:unhideWhenUsed/>
+    <w:rsid w:val="00AC43A8"/>
+    <w:rPr>
+      <w:color w:val="0000FF" w:themeColor="hyperlink"/>
+      <w:u w:val="single"/>
+    </w:rPr>
+  </w:style>
+  <w:style w:type="character" w:styleId="Mencinsinresolver">
+    <w:name w:val="Unresolved Mention"/>
+    <w:basedOn w:val="Fuentedeprrafopredeter"/>
+    <w:uiPriority w:val="99"/>
+    <w:semiHidden/>
+    <w:unhideWhenUsed/>
+    <w:rsid w:val="00AC43A8"/>
+    <w:rPr>
+      <w:color w:val="605E5C"/>
+      <w:shd w:val="clear" w:color="auto" w:fill="E1DFDD"/>
+    </w:rPr>
   </w:style>
 </w:styles>
 </file>

</xml_diff>

<commit_message>
Agrenando bibliografia de Ingenieria de Software
</commit_message>
<xml_diff>
--- a/Plan_Gestion_Configuracion_G4_ISW_4K1.docx
+++ b/Plan_Gestion_Configuracion_G4_ISW_4K1.docx
@@ -1,6 +1,6 @@
 
 <file path=word/document.xml><?xml version="1.0" encoding="utf-8"?>
-<w:document xmlns:wpc="http://schemas.microsoft.com/office/word/2010/wordprocessingCanvas" xmlns:cx="http://schemas.microsoft.com/office/drawing/2014/chartex" xmlns:mc="http://schemas.openxmlformats.org/markup-compatibility/2006" xmlns:o="urn:schemas-microsoft-com:office:office" xmlns:r="http://schemas.openxmlformats.org/officeDocument/2006/relationships" xmlns:m="http://schemas.openxmlformats.org/officeDocument/2006/math" xmlns:v="urn:schemas-microsoft-com:vml" xmlns:wp14="http://schemas.microsoft.com/office/word/2010/wordprocessingDrawing" xmlns:wp="http://schemas.openxmlformats.org/drawingml/2006/wordprocessingDrawing" xmlns:w10="urn:schemas-microsoft-com:office:word" xmlns:w="http://schemas.openxmlformats.org/wordprocessingml/2006/main" xmlns:w14="http://schemas.microsoft.com/office/word/2010/wordml" xmlns:w15="http://schemas.microsoft.com/office/word/2012/wordml" xmlns:w16se="http://schemas.microsoft.com/office/word/2015/wordml/symex" xmlns:wpg="http://schemas.microsoft.com/office/word/2010/wordprocessingGroup" xmlns:wpi="http://schemas.microsoft.com/office/word/2010/wordprocessingInk" xmlns:wne="http://schemas.microsoft.com/office/word/2006/wordml" xmlns:wps="http://schemas.microsoft.com/office/word/2010/wordprocessingShape" mc:Ignorable="w14 w15 w16se wp14">
+<w:document xmlns:wpc="http://schemas.microsoft.com/office/word/2010/wordprocessingCanvas" xmlns:cx="http://schemas.microsoft.com/office/drawing/2014/chartex" xmlns:cx1="http://schemas.microsoft.com/office/drawing/2015/9/8/chartex" xmlns:cx2="http://schemas.microsoft.com/office/drawing/2015/10/21/chartex" xmlns:cx3="http://schemas.microsoft.com/office/drawing/2016/5/9/chartex" xmlns:cx4="http://schemas.microsoft.com/office/drawing/2016/5/10/chartex" xmlns:cx5="http://schemas.microsoft.com/office/drawing/2016/5/11/chartex" xmlns:cx6="http://schemas.microsoft.com/office/drawing/2016/5/12/chartex" xmlns:cx7="http://schemas.microsoft.com/office/drawing/2016/5/13/chartex" xmlns:cx8="http://schemas.microsoft.com/office/drawing/2016/5/14/chartex" xmlns:mc="http://schemas.openxmlformats.org/markup-compatibility/2006" xmlns:aink="http://schemas.microsoft.com/office/drawing/2016/ink" xmlns:am3d="http://schemas.microsoft.com/office/drawing/2017/model3d" xmlns:o="urn:schemas-microsoft-com:office:office" xmlns:oel="http://schemas.microsoft.com/office/2019/extlst" xmlns:r="http://schemas.openxmlformats.org/officeDocument/2006/relationships" xmlns:m="http://schemas.openxmlformats.org/officeDocument/2006/math" xmlns:v="urn:schemas-microsoft-com:vml" xmlns:wp14="http://schemas.microsoft.com/office/word/2010/wordprocessingDrawing" xmlns:wp="http://schemas.openxmlformats.org/drawingml/2006/wordprocessingDrawing" xmlns:w10="urn:schemas-microsoft-com:office:word" xmlns:w="http://schemas.openxmlformats.org/wordprocessingml/2006/main" xmlns:w14="http://schemas.microsoft.com/office/word/2010/wordml" xmlns:w15="http://schemas.microsoft.com/office/word/2012/wordml" xmlns:w16cex="http://schemas.microsoft.com/office/word/2018/wordml/cex" xmlns:w16cid="http://schemas.microsoft.com/office/word/2016/wordml/cid" xmlns:w16="http://schemas.microsoft.com/office/word/2018/wordml" xmlns:w16du="http://schemas.microsoft.com/office/word/2023/wordml/word16du" xmlns:w16sdtdh="http://schemas.microsoft.com/office/word/2020/wordml/sdtdatahash" xmlns:w16sdtfl="http://schemas.microsoft.com/office/word/2024/wordml/sdtformatlock" xmlns:w16se="http://schemas.microsoft.com/office/word/2015/wordml/symex" xmlns:wpg="http://schemas.microsoft.com/office/word/2010/wordprocessingGroup" xmlns:wpi="http://schemas.microsoft.com/office/word/2010/wordprocessingInk" xmlns:wne="http://schemas.microsoft.com/office/word/2006/wordml" xmlns:wps="http://schemas.microsoft.com/office/word/2010/wordprocessingShape" mc:Ignorable="w14 w15 w16se w16cid w16 w16cex w16sdtdh w16sdtfl w16du wp14">
   <w:body>
     <w:p>
       <w:pPr>
@@ -22,7 +22,7 @@
           <w:lang w:val="en-US"/>
         </w:rPr>
         <w:drawing>
-          <wp:inline distT="0" distB="0" distL="0" distR="0">
+          <wp:inline distT="0" distB="0" distL="0" distR="0" wp14:anchorId="742BF586" wp14:editId="55770852">
             <wp:extent cx="1247035" cy="1465004"/>
             <wp:effectExtent l="0" t="0" r="0" b="0"/>
             <wp:docPr id="1" name="image1.png"/>
@@ -201,7 +201,6 @@
           <w:sz w:val="24"/>
           <w:szCs w:val="24"/>
         </w:rPr>
-        <w:lastRenderedPageBreak/>
         <w:t>Docentes</w:t>
       </w:r>
     </w:p>
@@ -322,7 +321,6 @@
           <w:sz w:val="24"/>
           <w:szCs w:val="24"/>
         </w:rPr>
-        <w:lastRenderedPageBreak/>
         <w:tab/>
       </w:r>
       <w:r>
@@ -565,21 +563,12 @@
               </w:rPr>
             </w:pPr>
             <w:hyperlink r:id="rId6">
-              <w:proofErr w:type="spellStart"/>
               <w:r>
                 <w:rPr>
                   <w:sz w:val="24"/>
                   <w:szCs w:val="24"/>
                 </w:rPr>
-                <w:t>Cufré</w:t>
-              </w:r>
-              <w:proofErr w:type="spellEnd"/>
-              <w:r>
-                <w:rPr>
-                  <w:sz w:val="24"/>
-                  <w:szCs w:val="24"/>
-                </w:rPr>
-                <w:t>, Ángel Hugo</w:t>
+                <w:t>Cufré, Ángel Hugo</w:t>
               </w:r>
             </w:hyperlink>
           </w:p>
@@ -623,7 +612,6 @@
               </w:rPr>
             </w:pPr>
             <w:hyperlink r:id="rId7">
-              <w:proofErr w:type="spellStart"/>
               <w:r>
                 <w:t>C</w:t>
               </w:r>
@@ -634,15 +622,7 @@
                   <w:sz w:val="24"/>
                   <w:szCs w:val="24"/>
                 </w:rPr>
-                <w:t>arrió</w:t>
-              </w:r>
-              <w:proofErr w:type="spellEnd"/>
-              <w:r>
-                <w:rPr>
-                  <w:sz w:val="24"/>
-                  <w:szCs w:val="24"/>
-                </w:rPr>
-                <w:t xml:space="preserve">, Tomás </w:t>
+                <w:t xml:space="preserve">arrió, Tomás </w:t>
               </w:r>
             </w:hyperlink>
           </w:p>
@@ -872,21 +852,12 @@
               <w:jc w:val="center"/>
             </w:pPr>
             <w:hyperlink r:id="rId13">
-              <w:proofErr w:type="spellStart"/>
               <w:r>
                 <w:rPr>
                   <w:sz w:val="24"/>
                   <w:szCs w:val="24"/>
                 </w:rPr>
-                <w:t>Patolsky</w:t>
-              </w:r>
-              <w:proofErr w:type="spellEnd"/>
-              <w:r>
-                <w:rPr>
-                  <w:sz w:val="24"/>
-                  <w:szCs w:val="24"/>
-                </w:rPr>
-                <w:t xml:space="preserve">, Daniel </w:t>
+                <w:t xml:space="preserve">Patolsky, Daniel </w:t>
               </w:r>
             </w:hyperlink>
           </w:p>
@@ -2028,7 +1999,25 @@
                   <w:szCs w:val="20"/>
                   <w:u w:val="single"/>
                 </w:rPr>
-                <w:t>Material_De_Estudio</w:t>
+                <w:t>Material_De_E</w:t>
+              </w:r>
+              <w:r>
+                <w:rPr>
+                  <w:color w:val="1155CC"/>
+                  <w:sz w:val="20"/>
+                  <w:szCs w:val="20"/>
+                  <w:u w:val="single"/>
+                </w:rPr>
+                <w:t>s</w:t>
+              </w:r>
+              <w:r>
+                <w:rPr>
+                  <w:color w:val="1155CC"/>
+                  <w:sz w:val="20"/>
+                  <w:szCs w:val="20"/>
+                  <w:u w:val="single"/>
+                </w:rPr>
+                <w:t>tudio</w:t>
               </w:r>
               <w:proofErr w:type="spellEnd"/>
             </w:hyperlink>
@@ -2323,9 +2312,152 @@
                   <w:szCs w:val="20"/>
                   <w:u w:val="single"/>
                 </w:rPr>
-                <w:t>Bibliografia/Bibliografia_De_La_Catedra/Material_Bibliografico/Pensamiento_Ágil</w:t>
+                <w:t>Bibliografia/Bibliografia_De_La_Catedra/Material_Bibliografico/Pe</w:t>
+              </w:r>
+              <w:r>
+                <w:rPr>
+                  <w:color w:val="0000FF"/>
+                  <w:sz w:val="20"/>
+                  <w:szCs w:val="20"/>
+                  <w:u w:val="single"/>
+                </w:rPr>
+                <w:t>n</w:t>
+              </w:r>
+              <w:r>
+                <w:rPr>
+                  <w:color w:val="0000FF"/>
+                  <w:sz w:val="20"/>
+                  <w:szCs w:val="20"/>
+                  <w:u w:val="single"/>
+                </w:rPr>
+                <w:t>samiento_Ágil</w:t>
               </w:r>
             </w:hyperlink>
+          </w:p>
+        </w:tc>
+      </w:tr>
+      <w:tr>
+        <w:trPr>
+          <w:trHeight w:val="610"/>
+        </w:trPr>
+        <w:tc>
+          <w:tcPr>
+            <w:tcW w:w="1560" w:type="dxa"/>
+            <w:tcMar>
+              <w:top w:w="100" w:type="dxa"/>
+              <w:left w:w="100" w:type="dxa"/>
+              <w:bottom w:w="100" w:type="dxa"/>
+              <w:right w:w="100" w:type="dxa"/>
+            </w:tcMar>
+            <w:vAlign w:val="center"/>
+          </w:tcPr>
+          <w:p>
+            <w:pPr>
+              <w:widowControl w:val="0"/>
+              <w:pBdr>
+                <w:top w:val="nil"/>
+                <w:left w:val="nil"/>
+                <w:bottom w:val="nil"/>
+                <w:right w:val="nil"/>
+                <w:between w:val="nil"/>
+              </w:pBdr>
+              <w:spacing w:line="240" w:lineRule="auto"/>
+              <w:jc w:val="center"/>
+            </w:pPr>
+            <w:r>
+              <w:t>Bibliografía Ingeniería de Software</w:t>
+            </w:r>
+          </w:p>
+        </w:tc>
+        <w:tc>
+          <w:tcPr>
+            <w:tcW w:w="3237" w:type="dxa"/>
+            <w:tcMar>
+              <w:top w:w="100" w:type="dxa"/>
+              <w:left w:w="100" w:type="dxa"/>
+              <w:bottom w:w="100" w:type="dxa"/>
+              <w:right w:w="100" w:type="dxa"/>
+            </w:tcMar>
+            <w:vAlign w:val="center"/>
+          </w:tcPr>
+          <w:p>
+            <w:pPr>
+              <w:widowControl w:val="0"/>
+              <w:pBdr>
+                <w:top w:val="nil"/>
+                <w:left w:val="nil"/>
+                <w:bottom w:val="nil"/>
+                <w:right w:val="nil"/>
+                <w:between w:val="nil"/>
+              </w:pBdr>
+              <w:spacing w:line="240" w:lineRule="auto"/>
+              <w:jc w:val="center"/>
+              <w:rPr>
+                <w:sz w:val="20"/>
+                <w:szCs w:val="20"/>
+              </w:rPr>
+            </w:pPr>
+            <w:r>
+              <w:rPr>
+                <w:sz w:val="20"/>
+                <w:szCs w:val="20"/>
+              </w:rPr>
+              <w:t>IS_&lt;</w:t>
+            </w:r>
+            <w:proofErr w:type="spellStart"/>
+            <w:r>
+              <w:rPr>
+                <w:sz w:val="20"/>
+                <w:szCs w:val="20"/>
+              </w:rPr>
+              <w:t>NombreLibro</w:t>
+            </w:r>
+            <w:proofErr w:type="spellEnd"/>
+            <w:r>
+              <w:rPr>
+                <w:sz w:val="20"/>
+                <w:szCs w:val="20"/>
+              </w:rPr>
+              <w:t>&gt;.</w:t>
+            </w:r>
+            <w:proofErr w:type="spellStart"/>
+            <w:r>
+              <w:rPr>
+                <w:sz w:val="20"/>
+                <w:szCs w:val="20"/>
+              </w:rPr>
+              <w:t>pdf</w:t>
+            </w:r>
+            <w:proofErr w:type="spellEnd"/>
+          </w:p>
+        </w:tc>
+        <w:tc>
+          <w:tcPr>
+            <w:tcW w:w="5662" w:type="dxa"/>
+            <w:tcMar>
+              <w:top w:w="100" w:type="dxa"/>
+              <w:left w:w="100" w:type="dxa"/>
+              <w:bottom w:w="100" w:type="dxa"/>
+              <w:right w:w="100" w:type="dxa"/>
+            </w:tcMar>
+            <w:vAlign w:val="center"/>
+          </w:tcPr>
+          <w:p>
+            <w:pPr>
+              <w:widowControl w:val="0"/>
+              <w:pBdr>
+                <w:top w:val="nil"/>
+                <w:left w:val="nil"/>
+                <w:bottom w:val="nil"/>
+                <w:right w:val="nil"/>
+                <w:between w:val="nil"/>
+              </w:pBdr>
+              <w:spacing w:line="240" w:lineRule="auto"/>
+              <w:jc w:val="center"/>
+            </w:pPr>
+            <w:r>
+              <w:t>Bibliografia/Bibliografia_De_La_Catedra/Materoañ_Bibliografico/Ingeniería_de_Software</w:t>
+            </w:r>
           </w:p>
         </w:tc>
       </w:tr>
@@ -2533,8 +2665,11 @@
         </w:sectPr>
       </w:pPr>
       <w:r>
+        <w:rPr>
+          <w:noProof/>
+        </w:rPr>
         <w:drawing>
-          <wp:inline distT="0" distB="0" distL="0" distR="0" wp14:anchorId="3C3F85FB" wp14:editId="6800A125">
+          <wp:inline distT="0" distB="0" distL="0" distR="0" wp14:anchorId="52870855" wp14:editId="215776DA">
             <wp:extent cx="3753374" cy="6554115"/>
             <wp:effectExtent l="0" t="0" r="0" b="0"/>
             <wp:docPr id="3" name="Imagen 3"/>
@@ -2630,7 +2765,6 @@
         <w:tc>
           <w:tcPr>
             <w:tcW w:w="4514" w:type="dxa"/>
-            <w:shd w:val="clear" w:color="auto" w:fill="auto"/>
             <w:tcMar>
               <w:top w:w="100" w:type="dxa"/>
               <w:left w:w="100" w:type="dxa"/>
@@ -2668,8 +2802,7 @@
         </w:tc>
         <w:tc>
           <w:tcPr>
-            <w:tcW w:w="4514" w:type="dxa"/>
-            <w:shd w:val="clear" w:color="auto" w:fill="auto"/>
+            <w:tcW w:w="4515" w:type="dxa"/>
             <w:tcMar>
               <w:top w:w="100" w:type="dxa"/>
               <w:left w:w="100" w:type="dxa"/>
@@ -2713,7 +2846,6 @@
         <w:tc>
           <w:tcPr>
             <w:tcW w:w="4514" w:type="dxa"/>
-            <w:shd w:val="clear" w:color="auto" w:fill="auto"/>
             <w:tcMar>
               <w:top w:w="100" w:type="dxa"/>
               <w:left w:w="100" w:type="dxa"/>
@@ -2745,8 +2877,7 @@
         </w:tc>
         <w:tc>
           <w:tcPr>
-            <w:tcW w:w="4514" w:type="dxa"/>
-            <w:shd w:val="clear" w:color="auto" w:fill="auto"/>
+            <w:tcW w:w="4515" w:type="dxa"/>
             <w:tcMar>
               <w:top w:w="100" w:type="dxa"/>
               <w:left w:w="100" w:type="dxa"/>
@@ -2780,7 +2911,6 @@
         <w:tc>
           <w:tcPr>
             <w:tcW w:w="4514" w:type="dxa"/>
-            <w:shd w:val="clear" w:color="auto" w:fill="auto"/>
             <w:tcMar>
               <w:top w:w="100" w:type="dxa"/>
               <w:left w:w="100" w:type="dxa"/>
@@ -2804,8 +2934,7 @@
         </w:tc>
         <w:tc>
           <w:tcPr>
-            <w:tcW w:w="4514" w:type="dxa"/>
-            <w:shd w:val="clear" w:color="auto" w:fill="auto"/>
+            <w:tcW w:w="4515" w:type="dxa"/>
             <w:tcMar>
               <w:top w:w="100" w:type="dxa"/>
               <w:left w:w="100" w:type="dxa"/>
@@ -2839,7 +2968,6 @@
         <w:tc>
           <w:tcPr>
             <w:tcW w:w="4514" w:type="dxa"/>
-            <w:shd w:val="clear" w:color="auto" w:fill="auto"/>
             <w:tcMar>
               <w:top w:w="100" w:type="dxa"/>
               <w:left w:w="100" w:type="dxa"/>
@@ -2871,8 +2999,7 @@
         </w:tc>
         <w:tc>
           <w:tcPr>
-            <w:tcW w:w="4514" w:type="dxa"/>
-            <w:shd w:val="clear" w:color="auto" w:fill="auto"/>
+            <w:tcW w:w="4515" w:type="dxa"/>
             <w:tcMar>
               <w:top w:w="100" w:type="dxa"/>
               <w:left w:w="100" w:type="dxa"/>
@@ -2906,7 +3033,6 @@
         <w:tc>
           <w:tcPr>
             <w:tcW w:w="4514" w:type="dxa"/>
-            <w:shd w:val="clear" w:color="auto" w:fill="auto"/>
             <w:tcMar>
               <w:top w:w="100" w:type="dxa"/>
               <w:left w:w="100" w:type="dxa"/>
@@ -2934,8 +3060,7 @@
         </w:tc>
         <w:tc>
           <w:tcPr>
-            <w:tcW w:w="4514" w:type="dxa"/>
-            <w:shd w:val="clear" w:color="auto" w:fill="auto"/>
+            <w:tcW w:w="4515" w:type="dxa"/>
             <w:tcMar>
               <w:top w:w="100" w:type="dxa"/>
               <w:left w:w="100" w:type="dxa"/>
@@ -2977,7 +3102,6 @@
         <w:tc>
           <w:tcPr>
             <w:tcW w:w="4514" w:type="dxa"/>
-            <w:shd w:val="clear" w:color="auto" w:fill="auto"/>
             <w:tcMar>
               <w:top w:w="100" w:type="dxa"/>
               <w:left w:w="100" w:type="dxa"/>
@@ -3009,8 +3133,7 @@
         </w:tc>
         <w:tc>
           <w:tcPr>
-            <w:tcW w:w="4514" w:type="dxa"/>
-            <w:shd w:val="clear" w:color="auto" w:fill="auto"/>
+            <w:tcW w:w="4515" w:type="dxa"/>
             <w:tcMar>
               <w:top w:w="100" w:type="dxa"/>
               <w:left w:w="100" w:type="dxa"/>
@@ -3050,7 +3173,6 @@
         <w:tc>
           <w:tcPr>
             <w:tcW w:w="4514" w:type="dxa"/>
-            <w:shd w:val="clear" w:color="auto" w:fill="auto"/>
             <w:tcMar>
               <w:top w:w="100" w:type="dxa"/>
               <w:left w:w="100" w:type="dxa"/>
@@ -3071,8 +3193,7 @@
         </w:tc>
         <w:tc>
           <w:tcPr>
-            <w:tcW w:w="4514" w:type="dxa"/>
-            <w:shd w:val="clear" w:color="auto" w:fill="auto"/>
+            <w:tcW w:w="4515" w:type="dxa"/>
             <w:tcMar>
               <w:top w:w="100" w:type="dxa"/>
               <w:left w:w="100" w:type="dxa"/>
@@ -3112,7 +3233,6 @@
         <w:tc>
           <w:tcPr>
             <w:tcW w:w="4514" w:type="dxa"/>
-            <w:shd w:val="clear" w:color="auto" w:fill="auto"/>
             <w:tcMar>
               <w:top w:w="100" w:type="dxa"/>
               <w:left w:w="100" w:type="dxa"/>
@@ -3133,8 +3253,7 @@
         </w:tc>
         <w:tc>
           <w:tcPr>
-            <w:tcW w:w="4514" w:type="dxa"/>
-            <w:shd w:val="clear" w:color="auto" w:fill="auto"/>
+            <w:tcW w:w="4515" w:type="dxa"/>
             <w:tcMar>
               <w:top w:w="100" w:type="dxa"/>
               <w:left w:w="100" w:type="dxa"/>
@@ -3168,7 +3287,6 @@
         <w:tc>
           <w:tcPr>
             <w:tcW w:w="4514" w:type="dxa"/>
-            <w:shd w:val="clear" w:color="auto" w:fill="auto"/>
             <w:tcMar>
               <w:top w:w="100" w:type="dxa"/>
               <w:left w:w="100" w:type="dxa"/>
@@ -3189,31 +3307,22 @@
         </w:tc>
         <w:tc>
           <w:tcPr>
-            <w:tcW w:w="4514" w:type="dxa"/>
-            <w:shd w:val="clear" w:color="auto" w:fill="auto"/>
-            <w:tcMar>
-              <w:top w:w="100" w:type="dxa"/>
-              <w:left w:w="100" w:type="dxa"/>
-              <w:bottom w:w="100" w:type="dxa"/>
-              <w:right w:w="100" w:type="dxa"/>
-            </w:tcMar>
-          </w:tcPr>
-          <w:p>
-            <w:pPr>
-              <w:widowControl w:val="0"/>
-              <w:spacing w:line="240" w:lineRule="auto"/>
-              <w:jc w:val="center"/>
-            </w:pPr>
-            <w:r>
-              <w:t>Determina la extensión del archivo identificado como ítem de configuración. Ejemplo: .</w:t>
-            </w:r>
-            <w:proofErr w:type="spellStart"/>
-            <w:r>
-              <w:t>docx</w:t>
-            </w:r>
-            <w:proofErr w:type="spellEnd"/>
-            <w:r>
-              <w:t>, .</w:t>
+            <w:tcW w:w="4515" w:type="dxa"/>
+            <w:tcMar>
+              <w:top w:w="100" w:type="dxa"/>
+              <w:left w:w="100" w:type="dxa"/>
+              <w:bottom w:w="100" w:type="dxa"/>
+              <w:right w:w="100" w:type="dxa"/>
+            </w:tcMar>
+          </w:tcPr>
+          <w:p>
+            <w:pPr>
+              <w:widowControl w:val="0"/>
+              <w:spacing w:line="240" w:lineRule="auto"/>
+              <w:jc w:val="center"/>
+            </w:pPr>
+            <w:r>
+              <w:t>Determina la extensión del archivo identificado como ítem de configuración. Ejemplo: .docx, .</w:t>
             </w:r>
             <w:proofErr w:type="spellStart"/>
             <w:r>
@@ -3238,7 +3347,6 @@
         <w:tc>
           <w:tcPr>
             <w:tcW w:w="4514" w:type="dxa"/>
-            <w:shd w:val="clear" w:color="auto" w:fill="auto"/>
             <w:tcMar>
               <w:top w:w="100" w:type="dxa"/>
               <w:left w:w="100" w:type="dxa"/>
@@ -3259,8 +3367,7 @@
         </w:tc>
         <w:tc>
           <w:tcPr>
-            <w:tcW w:w="4514" w:type="dxa"/>
-            <w:shd w:val="clear" w:color="auto" w:fill="auto"/>
+            <w:tcW w:w="4515" w:type="dxa"/>
             <w:tcMar>
               <w:top w:w="100" w:type="dxa"/>
               <w:left w:w="100" w:type="dxa"/>
@@ -3295,7 +3402,6 @@
         <w:tc>
           <w:tcPr>
             <w:tcW w:w="4514" w:type="dxa"/>
-            <w:shd w:val="clear" w:color="auto" w:fill="auto"/>
             <w:tcMar>
               <w:top w:w="100" w:type="dxa"/>
               <w:left w:w="100" w:type="dxa"/>
@@ -3316,8 +3422,7 @@
         </w:tc>
         <w:tc>
           <w:tcPr>
-            <w:tcW w:w="4514" w:type="dxa"/>
-            <w:shd w:val="clear" w:color="auto" w:fill="auto"/>
+            <w:tcW w:w="4515" w:type="dxa"/>
             <w:tcMar>
               <w:top w:w="100" w:type="dxa"/>
               <w:left w:w="100" w:type="dxa"/>
@@ -3344,7 +3449,6 @@
         <w:tc>
           <w:tcPr>
             <w:tcW w:w="4514" w:type="dxa"/>
-            <w:shd w:val="clear" w:color="auto" w:fill="auto"/>
             <w:tcMar>
               <w:top w:w="100" w:type="dxa"/>
               <w:left w:w="100" w:type="dxa"/>
@@ -3373,23 +3477,69 @@
         </w:tc>
         <w:tc>
           <w:tcPr>
+            <w:tcW w:w="4515" w:type="dxa"/>
+            <w:tcMar>
+              <w:top w:w="100" w:type="dxa"/>
+              <w:left w:w="100" w:type="dxa"/>
+              <w:bottom w:w="100" w:type="dxa"/>
+              <w:right w:w="100" w:type="dxa"/>
+            </w:tcMar>
+          </w:tcPr>
+          <w:p>
+            <w:pPr>
+              <w:widowControl w:val="0"/>
+              <w:spacing w:line="240" w:lineRule="auto"/>
+              <w:jc w:val="center"/>
+            </w:pPr>
+            <w:r>
+              <w:t>Nombre que permite identificar unívocamente a los libros de la catedra.</w:t>
+            </w:r>
+          </w:p>
+        </w:tc>
+      </w:tr>
+      <w:tr>
+        <w:trPr>
+          <w:jc w:val="center"/>
+        </w:trPr>
+        <w:tc>
+          <w:tcPr>
             <w:tcW w:w="4514" w:type="dxa"/>
-            <w:shd w:val="clear" w:color="auto" w:fill="auto"/>
-            <w:tcMar>
-              <w:top w:w="100" w:type="dxa"/>
-              <w:left w:w="100" w:type="dxa"/>
-              <w:bottom w:w="100" w:type="dxa"/>
-              <w:right w:w="100" w:type="dxa"/>
-            </w:tcMar>
-          </w:tcPr>
-          <w:p>
-            <w:pPr>
-              <w:widowControl w:val="0"/>
-              <w:spacing w:line="240" w:lineRule="auto"/>
-              <w:jc w:val="center"/>
-            </w:pPr>
-            <w:r>
-              <w:t>Nombre que permite identificar unívocamente a los libros de la catedra.</w:t>
+            <w:tcMar>
+              <w:top w:w="100" w:type="dxa"/>
+              <w:left w:w="100" w:type="dxa"/>
+              <w:bottom w:w="100" w:type="dxa"/>
+              <w:right w:w="100" w:type="dxa"/>
+            </w:tcMar>
+          </w:tcPr>
+          <w:p>
+            <w:pPr>
+              <w:widowControl w:val="0"/>
+              <w:spacing w:line="240" w:lineRule="auto"/>
+              <w:jc w:val="center"/>
+            </w:pPr>
+            <w:r>
+              <w:t>IS</w:t>
+            </w:r>
+          </w:p>
+        </w:tc>
+        <w:tc>
+          <w:tcPr>
+            <w:tcW w:w="4515" w:type="dxa"/>
+            <w:tcMar>
+              <w:top w:w="100" w:type="dxa"/>
+              <w:left w:w="100" w:type="dxa"/>
+              <w:bottom w:w="100" w:type="dxa"/>
+              <w:right w:w="100" w:type="dxa"/>
+            </w:tcMar>
+          </w:tcPr>
+          <w:p>
+            <w:pPr>
+              <w:widowControl w:val="0"/>
+              <w:spacing w:line="240" w:lineRule="auto"/>
+              <w:jc w:val="center"/>
+            </w:pPr>
+            <w:r>
+              <w:t>Ingeniería de Software</w:t>
             </w:r>
           </w:p>
         </w:tc>
@@ -3496,15 +3646,7 @@
         <w:jc w:val="both"/>
       </w:pPr>
       <w:r>
-        <w:t xml:space="preserve">La línea base será establecida en el momento posterior a una </w:t>
-      </w:r>
-      <w:proofErr w:type="spellStart"/>
-      <w:r>
-        <w:t>devolución</w:t>
-      </w:r>
-      <w:proofErr w:type="spellEnd"/>
-      <w:r>
-        <w:t xml:space="preserve"> positiva tanto verbal o escrita por parte de los docentes en los trabajos prácticos. El contenido de la misma tendrá los ítems de configuración pertenecientes a cada trabajo practico.</w:t>
+        <w:t>La línea base será establecida en el momento posterior a una devolución positiva tanto verbal o escrita por parte de los docentes en los trabajos prácticos. El contenido de la misma tendrá los ítems de configuración pertenecientes a cada trabajo practico.</w:t>
       </w:r>
     </w:p>
     <w:p>
@@ -3514,8 +3656,6 @@
       <w:r>
         <w:t xml:space="preserve"> </w:t>
       </w:r>
-      <w:bookmarkStart w:id="0" w:name="_GoBack"/>
-      <w:bookmarkEnd w:id="0"/>
     </w:p>
     <w:p>
       <w:pPr>
@@ -3543,7 +3683,7 @@
 </file>
 
 <file path=word/styles.xml><?xml version="1.0" encoding="utf-8"?>
-<w:styles xmlns:mc="http://schemas.openxmlformats.org/markup-compatibility/2006" xmlns:r="http://schemas.openxmlformats.org/officeDocument/2006/relationships" xmlns:w="http://schemas.openxmlformats.org/wordprocessingml/2006/main" xmlns:w14="http://schemas.microsoft.com/office/word/2010/wordml" xmlns:w15="http://schemas.microsoft.com/office/word/2012/wordml" xmlns:w16se="http://schemas.microsoft.com/office/word/2015/wordml/symex" mc:Ignorable="w14 w15 w16se">
+<w:styles xmlns:mc="http://schemas.openxmlformats.org/markup-compatibility/2006" xmlns:r="http://schemas.openxmlformats.org/officeDocument/2006/relationships" xmlns:w="http://schemas.openxmlformats.org/wordprocessingml/2006/main" xmlns:w14="http://schemas.microsoft.com/office/word/2010/wordml" xmlns:w15="http://schemas.microsoft.com/office/word/2012/wordml" xmlns:w16cex="http://schemas.microsoft.com/office/word/2018/wordml/cex" xmlns:w16cid="http://schemas.microsoft.com/office/word/2016/wordml/cid" xmlns:w16="http://schemas.microsoft.com/office/word/2018/wordml" xmlns:w16du="http://schemas.microsoft.com/office/word/2023/wordml/word16du" xmlns:w16sdtdh="http://schemas.microsoft.com/office/word/2020/wordml/sdtdatahash" xmlns:w16sdtfl="http://schemas.microsoft.com/office/word/2024/wordml/sdtformatlock" xmlns:w16se="http://schemas.microsoft.com/office/word/2015/wordml/symex" mc:Ignorable="w14 w15 w16se w16cid w16 w16cex w16sdtdh w16sdtfl w16du">
   <w:docDefaults>
     <w:rPrDefault>
       <w:rPr>
@@ -3559,7 +3699,7 @@
       </w:pPr>
     </w:pPrDefault>
   </w:docDefaults>
-  <w:latentStyles w:defLockedState="0" w:defUIPriority="99" w:defSemiHidden="0" w:defUnhideWhenUsed="0" w:defQFormat="0" w:count="371">
+  <w:latentStyles w:defLockedState="0" w:defUIPriority="99" w:defSemiHidden="0" w:defUnhideWhenUsed="0" w:defQFormat="0" w:count="376">
     <w:lsdException w:name="Normal" w:uiPriority="0" w:qFormat="1"/>
     <w:lsdException w:name="heading 1" w:uiPriority="9" w:qFormat="1"/>
     <w:lsdException w:name="heading 2" w:semiHidden="1" w:uiPriority="9" w:unhideWhenUsed="1" w:qFormat="1"/>
@@ -3931,6 +4071,11 @@
     <w:lsdException w:name="List Table 5 Dark Accent 6" w:uiPriority="50"/>
     <w:lsdException w:name="List Table 6 Colorful Accent 6" w:uiPriority="51"/>
     <w:lsdException w:name="List Table 7 Colorful Accent 6" w:uiPriority="52"/>
+    <w:lsdException w:name="Mention" w:semiHidden="1" w:unhideWhenUsed="1"/>
+    <w:lsdException w:name="Smart Hyperlink" w:semiHidden="1" w:unhideWhenUsed="1"/>
+    <w:lsdException w:name="Hashtag" w:semiHidden="1" w:unhideWhenUsed="1"/>
+    <w:lsdException w:name="Unresolved Mention" w:semiHidden="1" w:unhideWhenUsed="1"/>
+    <w:lsdException w:name="Smart Link" w:semiHidden="1" w:unhideWhenUsed="1"/>
   </w:latentStyles>
   <w:style w:type="paragraph" w:default="1" w:styleId="Normal">
     <w:name w:val="Normal"/>

</xml_diff>

<commit_message>
Actualización de plag de gestión de configuración
</commit_message>
<xml_diff>
--- a/Plan_Gestion_Configuracion_G4_ISW_4K1.docx
+++ b/Plan_Gestion_Configuracion_G4_ISW_4K1.docx
@@ -235,17 +235,8 @@
           <w:szCs w:val="24"/>
         </w:rPr>
         <w:tab/>
-        <w:t xml:space="preserve">Ing. Judith </w:t>
+        <w:t>Ing. Judith Meles</w:t>
       </w:r>
-      <w:proofErr w:type="spellStart"/>
-      <w:r>
-        <w:rPr>
-          <w:sz w:val="24"/>
-          <w:szCs w:val="24"/>
-        </w:rPr>
-        <w:t>Meles</w:t>
-      </w:r>
-      <w:proofErr w:type="spellEnd"/>
     </w:p>
     <w:p>
       <w:pPr>
@@ -277,23 +268,7 @@
           <w:szCs w:val="24"/>
         </w:rPr>
         <w:tab/>
-        <w:t xml:space="preserve">Ing. </w:t>
-      </w:r>
-      <w:proofErr w:type="spellStart"/>
-      <w:r>
-        <w:rPr>
-          <w:sz w:val="24"/>
-          <w:szCs w:val="24"/>
-        </w:rPr>
-        <w:t>Mickaela</w:t>
-      </w:r>
-      <w:proofErr w:type="spellEnd"/>
-      <w:r>
-        <w:rPr>
-          <w:sz w:val="24"/>
-          <w:szCs w:val="24"/>
-        </w:rPr>
-        <w:t xml:space="preserve"> Crespo</w:t>
+        <w:t>Ing. Mickaela Crespo</w:t>
       </w:r>
     </w:p>
     <w:p>
@@ -360,17 +335,8 @@
           <w:sz w:val="24"/>
           <w:szCs w:val="24"/>
         </w:rPr>
-        <w:t xml:space="preserve">Salvador Barbera – Marcos </w:t>
+        <w:t>Salvador Barbera – Marcos Pomenich</w:t>
       </w:r>
-      <w:proofErr w:type="spellStart"/>
-      <w:r>
-        <w:rPr>
-          <w:sz w:val="24"/>
-          <w:szCs w:val="24"/>
-        </w:rPr>
-        <w:t>Pomenich</w:t>
-      </w:r>
-      <w:proofErr w:type="spellEnd"/>
     </w:p>
     <w:p>
       <w:pPr>
@@ -896,74 +862,56 @@
               <w:jc w:val="center"/>
             </w:pPr>
             <w:hyperlink r:id="rId14">
-              <w:proofErr w:type="spellStart"/>
               <w:r>
                 <w:rPr>
                   <w:sz w:val="24"/>
                   <w:szCs w:val="24"/>
                 </w:rPr>
-                <w:t>Titón</w:t>
+                <w:t xml:space="preserve">Titón, Máximo </w:t>
               </w:r>
-              <w:proofErr w:type="spellEnd"/>
+            </w:hyperlink>
+          </w:p>
+        </w:tc>
+        <w:tc>
+          <w:tcPr>
+            <w:tcW w:w="5219" w:type="dxa"/>
+          </w:tcPr>
+          <w:p>
+            <w:pPr>
+              <w:spacing w:before="40" w:after="40"/>
+              <w:jc w:val="center"/>
+              <w:rPr>
+                <w:sz w:val="24"/>
+                <w:szCs w:val="24"/>
+              </w:rPr>
+            </w:pPr>
+            <w:r>
+              <w:rPr>
+                <w:sz w:val="24"/>
+                <w:szCs w:val="24"/>
+              </w:rPr>
+              <w:t>98175</w:t>
+            </w:r>
+          </w:p>
+        </w:tc>
+      </w:tr>
+      <w:tr>
+        <w:tc>
+          <w:tcPr>
+            <w:tcW w:w="5220" w:type="dxa"/>
+          </w:tcPr>
+          <w:p>
+            <w:pPr>
+              <w:spacing w:before="40" w:after="40"/>
+              <w:jc w:val="center"/>
+            </w:pPr>
+            <w:hyperlink r:id="rId15">
               <w:r>
                 <w:rPr>
                   <w:sz w:val="24"/>
                   <w:szCs w:val="24"/>
                 </w:rPr>
-                <w:t xml:space="preserve">, Máximo </w:t>
-              </w:r>
-            </w:hyperlink>
-          </w:p>
-        </w:tc>
-        <w:tc>
-          <w:tcPr>
-            <w:tcW w:w="5219" w:type="dxa"/>
-          </w:tcPr>
-          <w:p>
-            <w:pPr>
-              <w:spacing w:before="40" w:after="40"/>
-              <w:jc w:val="center"/>
-              <w:rPr>
-                <w:sz w:val="24"/>
-                <w:szCs w:val="24"/>
-              </w:rPr>
-            </w:pPr>
-            <w:r>
-              <w:rPr>
-                <w:sz w:val="24"/>
-                <w:szCs w:val="24"/>
-              </w:rPr>
-              <w:t>98175</w:t>
-            </w:r>
-          </w:p>
-        </w:tc>
-      </w:tr>
-      <w:tr>
-        <w:tc>
-          <w:tcPr>
-            <w:tcW w:w="5220" w:type="dxa"/>
-          </w:tcPr>
-          <w:p>
-            <w:pPr>
-              <w:spacing w:before="40" w:after="40"/>
-              <w:jc w:val="center"/>
-            </w:pPr>
-            <w:hyperlink r:id="rId15">
-              <w:proofErr w:type="spellStart"/>
-              <w:r>
-                <w:rPr>
-                  <w:sz w:val="24"/>
-                  <w:szCs w:val="24"/>
-                </w:rPr>
-                <w:t>Uliana</w:t>
-              </w:r>
-              <w:proofErr w:type="spellEnd"/>
-              <w:r>
-                <w:rPr>
-                  <w:sz w:val="24"/>
-                  <w:szCs w:val="24"/>
-                </w:rPr>
-                <w:t>, Agustín</w:t>
+                <w:t>Uliana, Agustín</w:t>
               </w:r>
             </w:hyperlink>
           </w:p>
@@ -1292,23 +1240,7 @@
                 <w:sz w:val="20"/>
                 <w:szCs w:val="20"/>
               </w:rPr>
-              <w:t>TP#_&lt;</w:t>
-            </w:r>
-            <w:proofErr w:type="spellStart"/>
-            <w:r>
-              <w:rPr>
-                <w:sz w:val="20"/>
-                <w:szCs w:val="20"/>
-              </w:rPr>
-              <w:t>NombreTrabajoPractico</w:t>
-            </w:r>
-            <w:proofErr w:type="spellEnd"/>
-            <w:r>
-              <w:rPr>
-                <w:sz w:val="20"/>
-                <w:szCs w:val="20"/>
-              </w:rPr>
-              <w:t>&gt;</w:t>
+              <w:t>TP#_&lt;NombreTrabajoPractico&gt;</w:t>
             </w:r>
           </w:p>
         </w:tc>
@@ -1420,33 +1352,8 @@
                 <w:sz w:val="20"/>
                 <w:szCs w:val="20"/>
               </w:rPr>
-              <w:t># &lt;</w:t>
-            </w:r>
-            <w:proofErr w:type="spellStart"/>
-            <w:r>
-              <w:rPr>
-                <w:sz w:val="20"/>
-                <w:szCs w:val="20"/>
-              </w:rPr>
-              <w:t>NombrePresentación</w:t>
-            </w:r>
-            <w:proofErr w:type="spellEnd"/>
-            <w:r>
-              <w:rPr>
-                <w:sz w:val="20"/>
-                <w:szCs w:val="20"/>
-              </w:rPr>
-              <w:t>&gt;.</w:t>
-            </w:r>
-            <w:proofErr w:type="spellStart"/>
-            <w:r>
-              <w:rPr>
-                <w:sz w:val="20"/>
-                <w:szCs w:val="20"/>
-              </w:rPr>
-              <w:t>pdf</w:t>
-            </w:r>
-            <w:proofErr w:type="spellEnd"/>
+              <w:t># &lt;NombrePresentación&gt;.pdf</w:t>
+            </w:r>
           </w:p>
         </w:tc>
         <w:tc>
@@ -1478,7 +1385,6 @@
               </w:rPr>
             </w:pPr>
             <w:hyperlink r:id="rId18">
-              <w:proofErr w:type="spellStart"/>
               <w:r>
                 <w:rPr>
                   <w:color w:val="1155CC"/>
@@ -1486,9 +1392,111 @@
                   <w:szCs w:val="20"/>
                   <w:u w:val="single"/>
                 </w:rPr>
-                <w:t>Bibliografia</w:t>
+                <w:t>Bibliografia/Bibliografia_De_La_Catedra/Diaspositivas</w:t>
               </w:r>
-              <w:proofErr w:type="spellEnd"/>
+            </w:hyperlink>
+          </w:p>
+        </w:tc>
+      </w:tr>
+      <w:tr>
+        <w:trPr>
+          <w:trHeight w:val="480"/>
+        </w:trPr>
+        <w:tc>
+          <w:tcPr>
+            <w:tcW w:w="1560" w:type="dxa"/>
+            <w:tcMar>
+              <w:top w:w="100" w:type="dxa"/>
+              <w:left w:w="100" w:type="dxa"/>
+              <w:bottom w:w="100" w:type="dxa"/>
+              <w:right w:w="100" w:type="dxa"/>
+            </w:tcMar>
+            <w:vAlign w:val="center"/>
+          </w:tcPr>
+          <w:p>
+            <w:pPr>
+              <w:widowControl w:val="0"/>
+              <w:pBdr>
+                <w:top w:val="nil"/>
+                <w:left w:val="nil"/>
+                <w:bottom w:val="nil"/>
+                <w:right w:val="nil"/>
+                <w:between w:val="nil"/>
+              </w:pBdr>
+              <w:spacing w:line="240" w:lineRule="auto"/>
+              <w:jc w:val="center"/>
+            </w:pPr>
+            <w:r>
+              <w:t>Minutas</w:t>
+            </w:r>
+          </w:p>
+        </w:tc>
+        <w:tc>
+          <w:tcPr>
+            <w:tcW w:w="3237" w:type="dxa"/>
+            <w:tcMar>
+              <w:top w:w="100" w:type="dxa"/>
+              <w:left w:w="100" w:type="dxa"/>
+              <w:bottom w:w="100" w:type="dxa"/>
+              <w:right w:w="100" w:type="dxa"/>
+            </w:tcMar>
+            <w:vAlign w:val="center"/>
+          </w:tcPr>
+          <w:p>
+            <w:pPr>
+              <w:widowControl w:val="0"/>
+              <w:pBdr>
+                <w:top w:val="nil"/>
+                <w:left w:val="nil"/>
+                <w:bottom w:val="nil"/>
+                <w:right w:val="nil"/>
+                <w:between w:val="nil"/>
+              </w:pBdr>
+              <w:spacing w:line="240" w:lineRule="auto"/>
+              <w:jc w:val="center"/>
+              <w:rPr>
+                <w:sz w:val="20"/>
+                <w:szCs w:val="20"/>
+              </w:rPr>
+            </w:pPr>
+            <w:r>
+              <w:rPr>
+                <w:sz w:val="20"/>
+                <w:szCs w:val="20"/>
+              </w:rPr>
+              <w:t>&lt;fecha&gt;_&lt;NombreDeTema&gt;_&lt;Apellido&gt;.&lt;Extensión&gt;</w:t>
+            </w:r>
+          </w:p>
+        </w:tc>
+        <w:tc>
+          <w:tcPr>
+            <w:tcW w:w="5662" w:type="dxa"/>
+            <w:tcMar>
+              <w:top w:w="100" w:type="dxa"/>
+              <w:left w:w="100" w:type="dxa"/>
+              <w:bottom w:w="100" w:type="dxa"/>
+              <w:right w:w="100" w:type="dxa"/>
+            </w:tcMar>
+            <w:vAlign w:val="center"/>
+          </w:tcPr>
+          <w:p>
+            <w:pPr>
+              <w:widowControl w:val="0"/>
+              <w:pBdr>
+                <w:top w:val="nil"/>
+                <w:left w:val="nil"/>
+                <w:bottom w:val="nil"/>
+                <w:right w:val="nil"/>
+                <w:between w:val="nil"/>
+              </w:pBdr>
+              <w:spacing w:line="240" w:lineRule="auto"/>
+              <w:jc w:val="center"/>
+              <w:rPr>
+                <w:sz w:val="20"/>
+                <w:szCs w:val="20"/>
+              </w:rPr>
+            </w:pPr>
+            <w:hyperlink r:id="rId19">
               <w:r>
                 <w:rPr>
                   <w:color w:val="1155CC"/>
@@ -1496,9 +1504,116 @@
                   <w:szCs w:val="20"/>
                   <w:u w:val="single"/>
                 </w:rPr>
-                <w:t>/</w:t>
+                <w:t>Bibliografia/Material_De_Estudio</w:t>
               </w:r>
-              <w:proofErr w:type="spellStart"/>
+            </w:hyperlink>
+            <w:r>
+              <w:rPr>
+                <w:color w:val="1155CC"/>
+                <w:sz w:val="20"/>
+                <w:szCs w:val="20"/>
+                <w:u w:val="single"/>
+              </w:rPr>
+              <w:t>/Minutas</w:t>
+            </w:r>
+          </w:p>
+        </w:tc>
+      </w:tr>
+      <w:tr>
+        <w:trPr>
+          <w:trHeight w:val="480"/>
+        </w:trPr>
+        <w:tc>
+          <w:tcPr>
+            <w:tcW w:w="1560" w:type="dxa"/>
+            <w:tcMar>
+              <w:top w:w="100" w:type="dxa"/>
+              <w:left w:w="100" w:type="dxa"/>
+              <w:bottom w:w="100" w:type="dxa"/>
+              <w:right w:w="100" w:type="dxa"/>
+            </w:tcMar>
+            <w:vAlign w:val="center"/>
+          </w:tcPr>
+          <w:p>
+            <w:pPr>
+              <w:widowControl w:val="0"/>
+              <w:pBdr>
+                <w:top w:val="nil"/>
+                <w:left w:val="nil"/>
+                <w:bottom w:val="nil"/>
+                <w:right w:val="nil"/>
+                <w:between w:val="nil"/>
+              </w:pBdr>
+              <w:spacing w:line="240" w:lineRule="auto"/>
+              <w:jc w:val="center"/>
+            </w:pPr>
+            <w:r>
+              <w:t>Resumenes</w:t>
+            </w:r>
+          </w:p>
+        </w:tc>
+        <w:tc>
+          <w:tcPr>
+            <w:tcW w:w="3237" w:type="dxa"/>
+            <w:tcMar>
+              <w:top w:w="100" w:type="dxa"/>
+              <w:left w:w="100" w:type="dxa"/>
+              <w:bottom w:w="100" w:type="dxa"/>
+              <w:right w:w="100" w:type="dxa"/>
+            </w:tcMar>
+            <w:vAlign w:val="center"/>
+          </w:tcPr>
+          <w:p>
+            <w:pPr>
+              <w:widowControl w:val="0"/>
+              <w:pBdr>
+                <w:top w:val="nil"/>
+                <w:left w:val="nil"/>
+                <w:bottom w:val="nil"/>
+                <w:right w:val="nil"/>
+                <w:between w:val="nil"/>
+              </w:pBdr>
+              <w:spacing w:line="240" w:lineRule="auto"/>
+              <w:jc w:val="center"/>
+              <w:rPr>
+                <w:sz w:val="20"/>
+                <w:szCs w:val="20"/>
+              </w:rPr>
+            </w:pPr>
+            <w:r>
+              <w:rPr>
+                <w:sz w:val="20"/>
+                <w:szCs w:val="20"/>
+              </w:rPr>
+              <w:t>&lt;NombreDeTema&gt;_&lt;Apellido&gt;</w:t>
+            </w:r>
+          </w:p>
+        </w:tc>
+        <w:tc>
+          <w:tcPr>
+            <w:tcW w:w="5662" w:type="dxa"/>
+            <w:tcMar>
+              <w:top w:w="100" w:type="dxa"/>
+              <w:left w:w="100" w:type="dxa"/>
+              <w:bottom w:w="100" w:type="dxa"/>
+              <w:right w:w="100" w:type="dxa"/>
+            </w:tcMar>
+            <w:vAlign w:val="center"/>
+          </w:tcPr>
+          <w:p>
+            <w:pPr>
+              <w:widowControl w:val="0"/>
+              <w:pBdr>
+                <w:top w:val="nil"/>
+                <w:left w:val="nil"/>
+                <w:bottom w:val="nil"/>
+                <w:right w:val="nil"/>
+                <w:between w:val="nil"/>
+              </w:pBdr>
+              <w:spacing w:line="240" w:lineRule="auto"/>
+              <w:jc w:val="center"/>
+            </w:pPr>
+            <w:hyperlink r:id="rId20">
               <w:r>
                 <w:rPr>
                   <w:color w:val="1155CC"/>
@@ -1506,9 +1621,116 @@
                   <w:szCs w:val="20"/>
                   <w:u w:val="single"/>
                 </w:rPr>
-                <w:t>Bibliografia_De_La_Catedra</w:t>
+                <w:t>Bibliografia/Material_De_Estudio</w:t>
               </w:r>
-              <w:proofErr w:type="spellEnd"/>
+            </w:hyperlink>
+            <w:r>
+              <w:rPr>
+                <w:color w:val="1155CC"/>
+                <w:sz w:val="20"/>
+                <w:szCs w:val="20"/>
+                <w:u w:val="single"/>
+              </w:rPr>
+              <w:t>/Resumenes</w:t>
+            </w:r>
+          </w:p>
+        </w:tc>
+      </w:tr>
+      <w:tr>
+        <w:trPr>
+          <w:trHeight w:val="480"/>
+        </w:trPr>
+        <w:tc>
+          <w:tcPr>
+            <w:tcW w:w="1560" w:type="dxa"/>
+            <w:tcMar>
+              <w:top w:w="100" w:type="dxa"/>
+              <w:left w:w="100" w:type="dxa"/>
+              <w:bottom w:w="100" w:type="dxa"/>
+              <w:right w:w="100" w:type="dxa"/>
+            </w:tcMar>
+            <w:vAlign w:val="center"/>
+          </w:tcPr>
+          <w:p>
+            <w:pPr>
+              <w:widowControl w:val="0"/>
+              <w:pBdr>
+                <w:top w:val="nil"/>
+                <w:left w:val="nil"/>
+                <w:bottom w:val="nil"/>
+                <w:right w:val="nil"/>
+                <w:between w:val="nil"/>
+              </w:pBdr>
+              <w:spacing w:line="240" w:lineRule="auto"/>
+              <w:jc w:val="center"/>
+            </w:pPr>
+            <w:r>
+              <w:t>Ejercicios Prácticos</w:t>
+            </w:r>
+          </w:p>
+        </w:tc>
+        <w:tc>
+          <w:tcPr>
+            <w:tcW w:w="3237" w:type="dxa"/>
+            <w:tcMar>
+              <w:top w:w="100" w:type="dxa"/>
+              <w:left w:w="100" w:type="dxa"/>
+              <w:bottom w:w="100" w:type="dxa"/>
+              <w:right w:w="100" w:type="dxa"/>
+            </w:tcMar>
+            <w:vAlign w:val="center"/>
+          </w:tcPr>
+          <w:p>
+            <w:pPr>
+              <w:widowControl w:val="0"/>
+              <w:pBdr>
+                <w:top w:val="nil"/>
+                <w:left w:val="nil"/>
+                <w:bottom w:val="nil"/>
+                <w:right w:val="nil"/>
+                <w:between w:val="nil"/>
+              </w:pBdr>
+              <w:spacing w:line="240" w:lineRule="auto"/>
+              <w:jc w:val="center"/>
+              <w:rPr>
+                <w:sz w:val="20"/>
+                <w:szCs w:val="20"/>
+              </w:rPr>
+            </w:pPr>
+            <w:r>
+              <w:rPr>
+                <w:sz w:val="20"/>
+                <w:szCs w:val="20"/>
+              </w:rPr>
+              <w:t>&lt;NombreDeTema&gt;_TP#_&lt;Apellidos&gt;.&lt;Extensión&gt;</w:t>
+            </w:r>
+          </w:p>
+        </w:tc>
+        <w:tc>
+          <w:tcPr>
+            <w:tcW w:w="5662" w:type="dxa"/>
+            <w:tcMar>
+              <w:top w:w="100" w:type="dxa"/>
+              <w:left w:w="100" w:type="dxa"/>
+              <w:bottom w:w="100" w:type="dxa"/>
+              <w:right w:w="100" w:type="dxa"/>
+            </w:tcMar>
+            <w:vAlign w:val="center"/>
+          </w:tcPr>
+          <w:p>
+            <w:pPr>
+              <w:widowControl w:val="0"/>
+              <w:pBdr>
+                <w:top w:val="nil"/>
+                <w:left w:val="nil"/>
+                <w:bottom w:val="nil"/>
+                <w:right w:val="nil"/>
+                <w:between w:val="nil"/>
+              </w:pBdr>
+              <w:spacing w:line="240" w:lineRule="auto"/>
+              <w:jc w:val="center"/>
+            </w:pPr>
+            <w:hyperlink r:id="rId21">
               <w:r>
                 <w:rPr>
                   <w:color w:val="1155CC"/>
@@ -1516,26 +1738,24 @@
                   <w:szCs w:val="20"/>
                   <w:u w:val="single"/>
                 </w:rPr>
-                <w:t>/</w:t>
+                <w:t>Bibliografia/Material_De_Estudio</w:t>
               </w:r>
-              <w:proofErr w:type="spellStart"/>
-              <w:r>
-                <w:rPr>
-                  <w:color w:val="1155CC"/>
-                  <w:sz w:val="20"/>
-                  <w:szCs w:val="20"/>
-                  <w:u w:val="single"/>
-                </w:rPr>
-                <w:t>Diaspositivas</w:t>
-              </w:r>
-              <w:proofErr w:type="spellEnd"/>
             </w:hyperlink>
+            <w:r>
+              <w:rPr>
+                <w:color w:val="1155CC"/>
+                <w:sz w:val="20"/>
+                <w:szCs w:val="20"/>
+                <w:u w:val="single"/>
+              </w:rPr>
+              <w:t>/Ejercicios_Practicos</w:t>
+            </w:r>
           </w:p>
         </w:tc>
       </w:tr>
       <w:tr>
         <w:trPr>
-          <w:trHeight w:val="480"/>
+          <w:trHeight w:val="610"/>
         </w:trPr>
         <w:tc>
           <w:tcPr>
@@ -1562,7 +1782,7 @@
               <w:jc w:val="center"/>
             </w:pPr>
             <w:r>
-              <w:t>Minutas</w:t>
+              <w:t>Bibliografía SCM</w:t>
             </w:r>
           </w:p>
         </w:tc>
@@ -1599,544 +1819,8 @@
                 <w:sz w:val="20"/>
                 <w:szCs w:val="20"/>
               </w:rPr>
-              <w:t>&lt;fecha&gt;_&lt;</w:t>
-            </w:r>
-            <w:proofErr w:type="spellStart"/>
-            <w:r>
-              <w:rPr>
-                <w:sz w:val="20"/>
-                <w:szCs w:val="20"/>
-              </w:rPr>
-              <w:t>NombreDeTema</w:t>
-            </w:r>
-            <w:proofErr w:type="spellEnd"/>
-            <w:r>
-              <w:rPr>
-                <w:sz w:val="20"/>
-                <w:szCs w:val="20"/>
-              </w:rPr>
-              <w:t>&gt;_&lt;Apellido&gt;.&lt;Extensión&gt;</w:t>
-            </w:r>
-          </w:p>
-        </w:tc>
-        <w:tc>
-          <w:tcPr>
-            <w:tcW w:w="5662" w:type="dxa"/>
-            <w:tcMar>
-              <w:top w:w="100" w:type="dxa"/>
-              <w:left w:w="100" w:type="dxa"/>
-              <w:bottom w:w="100" w:type="dxa"/>
-              <w:right w:w="100" w:type="dxa"/>
-            </w:tcMar>
-            <w:vAlign w:val="center"/>
-          </w:tcPr>
-          <w:p>
-            <w:pPr>
-              <w:widowControl w:val="0"/>
-              <w:pBdr>
-                <w:top w:val="nil"/>
-                <w:left w:val="nil"/>
-                <w:bottom w:val="nil"/>
-                <w:right w:val="nil"/>
-                <w:between w:val="nil"/>
-              </w:pBdr>
-              <w:spacing w:line="240" w:lineRule="auto"/>
-              <w:jc w:val="center"/>
-              <w:rPr>
-                <w:sz w:val="20"/>
-                <w:szCs w:val="20"/>
-              </w:rPr>
-            </w:pPr>
-            <w:hyperlink r:id="rId19">
-              <w:proofErr w:type="spellStart"/>
-              <w:r>
-                <w:rPr>
-                  <w:color w:val="1155CC"/>
-                  <w:sz w:val="20"/>
-                  <w:szCs w:val="20"/>
-                  <w:u w:val="single"/>
-                </w:rPr>
-                <w:t>Bibliografia</w:t>
-              </w:r>
-              <w:proofErr w:type="spellEnd"/>
-              <w:r>
-                <w:rPr>
-                  <w:color w:val="1155CC"/>
-                  <w:sz w:val="20"/>
-                  <w:szCs w:val="20"/>
-                  <w:u w:val="single"/>
-                </w:rPr>
-                <w:t>/</w:t>
-              </w:r>
-              <w:proofErr w:type="spellStart"/>
-              <w:r>
-                <w:rPr>
-                  <w:color w:val="1155CC"/>
-                  <w:sz w:val="20"/>
-                  <w:szCs w:val="20"/>
-                  <w:u w:val="single"/>
-                </w:rPr>
-                <w:t>Material_De_Estudio</w:t>
-              </w:r>
-              <w:proofErr w:type="spellEnd"/>
-            </w:hyperlink>
-            <w:r>
-              <w:rPr>
-                <w:color w:val="1155CC"/>
-                <w:sz w:val="20"/>
-                <w:szCs w:val="20"/>
-                <w:u w:val="single"/>
-              </w:rPr>
-              <w:t>/Minutas</w:t>
-            </w:r>
-          </w:p>
-        </w:tc>
-      </w:tr>
-      <w:tr>
-        <w:trPr>
-          <w:trHeight w:val="480"/>
-        </w:trPr>
-        <w:tc>
-          <w:tcPr>
-            <w:tcW w:w="1560" w:type="dxa"/>
-            <w:tcMar>
-              <w:top w:w="100" w:type="dxa"/>
-              <w:left w:w="100" w:type="dxa"/>
-              <w:bottom w:w="100" w:type="dxa"/>
-              <w:right w:w="100" w:type="dxa"/>
-            </w:tcMar>
-            <w:vAlign w:val="center"/>
-          </w:tcPr>
-          <w:p>
-            <w:pPr>
-              <w:widowControl w:val="0"/>
-              <w:pBdr>
-                <w:top w:val="nil"/>
-                <w:left w:val="nil"/>
-                <w:bottom w:val="nil"/>
-                <w:right w:val="nil"/>
-                <w:between w:val="nil"/>
-              </w:pBdr>
-              <w:spacing w:line="240" w:lineRule="auto"/>
-              <w:jc w:val="center"/>
-            </w:pPr>
-            <w:proofErr w:type="spellStart"/>
-            <w:r>
-              <w:t>Resumenes</w:t>
-            </w:r>
-            <w:proofErr w:type="spellEnd"/>
-          </w:p>
-        </w:tc>
-        <w:tc>
-          <w:tcPr>
-            <w:tcW w:w="3237" w:type="dxa"/>
-            <w:tcMar>
-              <w:top w:w="100" w:type="dxa"/>
-              <w:left w:w="100" w:type="dxa"/>
-              <w:bottom w:w="100" w:type="dxa"/>
-              <w:right w:w="100" w:type="dxa"/>
-            </w:tcMar>
-            <w:vAlign w:val="center"/>
-          </w:tcPr>
-          <w:p>
-            <w:pPr>
-              <w:widowControl w:val="0"/>
-              <w:pBdr>
-                <w:top w:val="nil"/>
-                <w:left w:val="nil"/>
-                <w:bottom w:val="nil"/>
-                <w:right w:val="nil"/>
-                <w:between w:val="nil"/>
-              </w:pBdr>
-              <w:spacing w:line="240" w:lineRule="auto"/>
-              <w:jc w:val="center"/>
-              <w:rPr>
-                <w:sz w:val="20"/>
-                <w:szCs w:val="20"/>
-              </w:rPr>
-            </w:pPr>
-            <w:r>
-              <w:rPr>
-                <w:sz w:val="20"/>
-                <w:szCs w:val="20"/>
-              </w:rPr>
-              <w:t>&lt;</w:t>
-            </w:r>
-            <w:proofErr w:type="spellStart"/>
-            <w:r>
-              <w:rPr>
-                <w:sz w:val="20"/>
-                <w:szCs w:val="20"/>
-              </w:rPr>
-              <w:t>NombreDeTema</w:t>
-            </w:r>
-            <w:proofErr w:type="spellEnd"/>
-            <w:r>
-              <w:rPr>
-                <w:sz w:val="20"/>
-                <w:szCs w:val="20"/>
-              </w:rPr>
-              <w:t>&gt;_&lt;Apellido&gt;</w:t>
-            </w:r>
-          </w:p>
-        </w:tc>
-        <w:tc>
-          <w:tcPr>
-            <w:tcW w:w="5662" w:type="dxa"/>
-            <w:tcMar>
-              <w:top w:w="100" w:type="dxa"/>
-              <w:left w:w="100" w:type="dxa"/>
-              <w:bottom w:w="100" w:type="dxa"/>
-              <w:right w:w="100" w:type="dxa"/>
-            </w:tcMar>
-            <w:vAlign w:val="center"/>
-          </w:tcPr>
-          <w:p>
-            <w:pPr>
-              <w:widowControl w:val="0"/>
-              <w:pBdr>
-                <w:top w:val="nil"/>
-                <w:left w:val="nil"/>
-                <w:bottom w:val="nil"/>
-                <w:right w:val="nil"/>
-                <w:between w:val="nil"/>
-              </w:pBdr>
-              <w:spacing w:line="240" w:lineRule="auto"/>
-              <w:jc w:val="center"/>
-            </w:pPr>
-            <w:hyperlink r:id="rId20">
-              <w:proofErr w:type="spellStart"/>
-              <w:r>
-                <w:rPr>
-                  <w:color w:val="1155CC"/>
-                  <w:sz w:val="20"/>
-                  <w:szCs w:val="20"/>
-                  <w:u w:val="single"/>
-                </w:rPr>
-                <w:t>Bibliografia</w:t>
-              </w:r>
-              <w:proofErr w:type="spellEnd"/>
-              <w:r>
-                <w:rPr>
-                  <w:color w:val="1155CC"/>
-                  <w:sz w:val="20"/>
-                  <w:szCs w:val="20"/>
-                  <w:u w:val="single"/>
-                </w:rPr>
-                <w:t>/</w:t>
-              </w:r>
-              <w:proofErr w:type="spellStart"/>
-              <w:r>
-                <w:rPr>
-                  <w:color w:val="1155CC"/>
-                  <w:sz w:val="20"/>
-                  <w:szCs w:val="20"/>
-                  <w:u w:val="single"/>
-                </w:rPr>
-                <w:t>Material_De_Estudio</w:t>
-              </w:r>
-              <w:proofErr w:type="spellEnd"/>
-            </w:hyperlink>
-            <w:r>
-              <w:rPr>
-                <w:color w:val="1155CC"/>
-                <w:sz w:val="20"/>
-                <w:szCs w:val="20"/>
-                <w:u w:val="single"/>
-              </w:rPr>
-              <w:t>/</w:t>
-            </w:r>
-            <w:proofErr w:type="spellStart"/>
-            <w:r>
-              <w:rPr>
-                <w:color w:val="1155CC"/>
-                <w:sz w:val="20"/>
-                <w:szCs w:val="20"/>
-                <w:u w:val="single"/>
-              </w:rPr>
-              <w:t>Resumenes</w:t>
-            </w:r>
-            <w:proofErr w:type="spellEnd"/>
-          </w:p>
-        </w:tc>
-      </w:tr>
-      <w:tr>
-        <w:trPr>
-          <w:trHeight w:val="480"/>
-        </w:trPr>
-        <w:tc>
-          <w:tcPr>
-            <w:tcW w:w="1560" w:type="dxa"/>
-            <w:tcMar>
-              <w:top w:w="100" w:type="dxa"/>
-              <w:left w:w="100" w:type="dxa"/>
-              <w:bottom w:w="100" w:type="dxa"/>
-              <w:right w:w="100" w:type="dxa"/>
-            </w:tcMar>
-            <w:vAlign w:val="center"/>
-          </w:tcPr>
-          <w:p>
-            <w:pPr>
-              <w:widowControl w:val="0"/>
-              <w:pBdr>
-                <w:top w:val="nil"/>
-                <w:left w:val="nil"/>
-                <w:bottom w:val="nil"/>
-                <w:right w:val="nil"/>
-                <w:between w:val="nil"/>
-              </w:pBdr>
-              <w:spacing w:line="240" w:lineRule="auto"/>
-              <w:jc w:val="center"/>
-            </w:pPr>
-            <w:r>
-              <w:t>Ejercicios Prácticos</w:t>
-            </w:r>
-          </w:p>
-        </w:tc>
-        <w:tc>
-          <w:tcPr>
-            <w:tcW w:w="3237" w:type="dxa"/>
-            <w:tcMar>
-              <w:top w:w="100" w:type="dxa"/>
-              <w:left w:w="100" w:type="dxa"/>
-              <w:bottom w:w="100" w:type="dxa"/>
-              <w:right w:w="100" w:type="dxa"/>
-            </w:tcMar>
-            <w:vAlign w:val="center"/>
-          </w:tcPr>
-          <w:p>
-            <w:pPr>
-              <w:widowControl w:val="0"/>
-              <w:pBdr>
-                <w:top w:val="nil"/>
-                <w:left w:val="nil"/>
-                <w:bottom w:val="nil"/>
-                <w:right w:val="nil"/>
-                <w:between w:val="nil"/>
-              </w:pBdr>
-              <w:spacing w:line="240" w:lineRule="auto"/>
-              <w:jc w:val="center"/>
-              <w:rPr>
-                <w:sz w:val="20"/>
-                <w:szCs w:val="20"/>
-              </w:rPr>
-            </w:pPr>
-            <w:r>
-              <w:rPr>
-                <w:sz w:val="20"/>
-                <w:szCs w:val="20"/>
-              </w:rPr>
-              <w:t>&lt;</w:t>
-            </w:r>
-            <w:proofErr w:type="spellStart"/>
-            <w:r>
-              <w:rPr>
-                <w:sz w:val="20"/>
-                <w:szCs w:val="20"/>
-              </w:rPr>
-              <w:t>NombreDeTema</w:t>
-            </w:r>
-            <w:proofErr w:type="spellEnd"/>
-            <w:r>
-              <w:rPr>
-                <w:sz w:val="20"/>
-                <w:szCs w:val="20"/>
-              </w:rPr>
-              <w:t>&gt;_TP#_&lt;Apellidos&gt;.&lt;Extensión&gt;</w:t>
-            </w:r>
-          </w:p>
-        </w:tc>
-        <w:tc>
-          <w:tcPr>
-            <w:tcW w:w="5662" w:type="dxa"/>
-            <w:tcMar>
-              <w:top w:w="100" w:type="dxa"/>
-              <w:left w:w="100" w:type="dxa"/>
-              <w:bottom w:w="100" w:type="dxa"/>
-              <w:right w:w="100" w:type="dxa"/>
-            </w:tcMar>
-            <w:vAlign w:val="center"/>
-          </w:tcPr>
-          <w:p>
-            <w:pPr>
-              <w:widowControl w:val="0"/>
-              <w:pBdr>
-                <w:top w:val="nil"/>
-                <w:left w:val="nil"/>
-                <w:bottom w:val="nil"/>
-                <w:right w:val="nil"/>
-                <w:between w:val="nil"/>
-              </w:pBdr>
-              <w:spacing w:line="240" w:lineRule="auto"/>
-              <w:jc w:val="center"/>
-            </w:pPr>
-            <w:hyperlink r:id="rId21">
-              <w:proofErr w:type="spellStart"/>
-              <w:r>
-                <w:rPr>
-                  <w:color w:val="1155CC"/>
-                  <w:sz w:val="20"/>
-                  <w:szCs w:val="20"/>
-                  <w:u w:val="single"/>
-                </w:rPr>
-                <w:t>Bibliografia</w:t>
-              </w:r>
-              <w:proofErr w:type="spellEnd"/>
-              <w:r>
-                <w:rPr>
-                  <w:color w:val="1155CC"/>
-                  <w:sz w:val="20"/>
-                  <w:szCs w:val="20"/>
-                  <w:u w:val="single"/>
-                </w:rPr>
-                <w:t>/</w:t>
-              </w:r>
-              <w:proofErr w:type="spellStart"/>
-              <w:r>
-                <w:rPr>
-                  <w:color w:val="1155CC"/>
-                  <w:sz w:val="20"/>
-                  <w:szCs w:val="20"/>
-                  <w:u w:val="single"/>
-                </w:rPr>
-                <w:t>Material_De_E</w:t>
-              </w:r>
-              <w:r>
-                <w:rPr>
-                  <w:color w:val="1155CC"/>
-                  <w:sz w:val="20"/>
-                  <w:szCs w:val="20"/>
-                  <w:u w:val="single"/>
-                </w:rPr>
-                <w:t>s</w:t>
-              </w:r>
-              <w:r>
-                <w:rPr>
-                  <w:color w:val="1155CC"/>
-                  <w:sz w:val="20"/>
-                  <w:szCs w:val="20"/>
-                  <w:u w:val="single"/>
-                </w:rPr>
-                <w:t>tudio</w:t>
-              </w:r>
-              <w:proofErr w:type="spellEnd"/>
-            </w:hyperlink>
-            <w:r>
-              <w:rPr>
-                <w:color w:val="1155CC"/>
-                <w:sz w:val="20"/>
-                <w:szCs w:val="20"/>
-                <w:u w:val="single"/>
-              </w:rPr>
-              <w:t>/</w:t>
-            </w:r>
-            <w:proofErr w:type="spellStart"/>
-            <w:r>
-              <w:rPr>
-                <w:color w:val="1155CC"/>
-                <w:sz w:val="20"/>
-                <w:szCs w:val="20"/>
-                <w:u w:val="single"/>
-              </w:rPr>
-              <w:t>Ejercicios_Practicos</w:t>
-            </w:r>
-            <w:proofErr w:type="spellEnd"/>
-          </w:p>
-        </w:tc>
-      </w:tr>
-      <w:tr>
-        <w:trPr>
-          <w:trHeight w:val="610"/>
-        </w:trPr>
-        <w:tc>
-          <w:tcPr>
-            <w:tcW w:w="1560" w:type="dxa"/>
-            <w:tcMar>
-              <w:top w:w="100" w:type="dxa"/>
-              <w:left w:w="100" w:type="dxa"/>
-              <w:bottom w:w="100" w:type="dxa"/>
-              <w:right w:w="100" w:type="dxa"/>
-            </w:tcMar>
-            <w:vAlign w:val="center"/>
-          </w:tcPr>
-          <w:p>
-            <w:pPr>
-              <w:widowControl w:val="0"/>
-              <w:pBdr>
-                <w:top w:val="nil"/>
-                <w:left w:val="nil"/>
-                <w:bottom w:val="nil"/>
-                <w:right w:val="nil"/>
-                <w:between w:val="nil"/>
-              </w:pBdr>
-              <w:spacing w:line="240" w:lineRule="auto"/>
-              <w:jc w:val="center"/>
-            </w:pPr>
-            <w:r>
-              <w:t>Bibliografía SCM</w:t>
-            </w:r>
-          </w:p>
-        </w:tc>
-        <w:tc>
-          <w:tcPr>
-            <w:tcW w:w="3237" w:type="dxa"/>
-            <w:tcMar>
-              <w:top w:w="100" w:type="dxa"/>
-              <w:left w:w="100" w:type="dxa"/>
-              <w:bottom w:w="100" w:type="dxa"/>
-              <w:right w:w="100" w:type="dxa"/>
-            </w:tcMar>
-            <w:vAlign w:val="center"/>
-          </w:tcPr>
-          <w:p>
-            <w:pPr>
-              <w:widowControl w:val="0"/>
-              <w:pBdr>
-                <w:top w:val="nil"/>
-                <w:left w:val="nil"/>
-                <w:bottom w:val="nil"/>
-                <w:right w:val="nil"/>
-                <w:between w:val="nil"/>
-              </w:pBdr>
-              <w:spacing w:line="240" w:lineRule="auto"/>
-              <w:jc w:val="center"/>
-              <w:rPr>
-                <w:sz w:val="20"/>
-                <w:szCs w:val="20"/>
-              </w:rPr>
-            </w:pPr>
-            <w:r>
-              <w:rPr>
-                <w:sz w:val="20"/>
-                <w:szCs w:val="20"/>
-              </w:rPr>
-              <w:t>SCM_&lt;</w:t>
-            </w:r>
-            <w:proofErr w:type="spellStart"/>
-            <w:r>
-              <w:rPr>
-                <w:sz w:val="20"/>
-                <w:szCs w:val="20"/>
-              </w:rPr>
-              <w:t>NombreLibro</w:t>
-            </w:r>
-            <w:proofErr w:type="spellEnd"/>
-            <w:r>
-              <w:rPr>
-                <w:sz w:val="20"/>
-                <w:szCs w:val="20"/>
-              </w:rPr>
-              <w:t>&gt;.</w:t>
-            </w:r>
-            <w:proofErr w:type="spellStart"/>
-            <w:r>
-              <w:rPr>
-                <w:sz w:val="20"/>
-                <w:szCs w:val="20"/>
-              </w:rPr>
-              <w:t>pdf</w:t>
-            </w:r>
-            <w:proofErr w:type="spellEnd"/>
+              <w:t>SCM_&lt;NombreLibro&gt;.pdf</w:t>
+            </w:r>
           </w:p>
         </w:tc>
         <w:tc>
@@ -2247,33 +1931,8 @@
                 <w:sz w:val="20"/>
                 <w:szCs w:val="20"/>
               </w:rPr>
-              <w:t>PA_&lt;</w:t>
-            </w:r>
-            <w:proofErr w:type="spellStart"/>
-            <w:r>
-              <w:rPr>
-                <w:sz w:val="20"/>
-                <w:szCs w:val="20"/>
-              </w:rPr>
-              <w:t>NombreLibro</w:t>
-            </w:r>
-            <w:proofErr w:type="spellEnd"/>
-            <w:r>
-              <w:rPr>
-                <w:sz w:val="20"/>
-                <w:szCs w:val="20"/>
-              </w:rPr>
-              <w:t>&gt;.</w:t>
-            </w:r>
-            <w:proofErr w:type="spellStart"/>
-            <w:r>
-              <w:rPr>
-                <w:sz w:val="20"/>
-                <w:szCs w:val="20"/>
-              </w:rPr>
-              <w:t>pdf</w:t>
-            </w:r>
-            <w:proofErr w:type="spellEnd"/>
+              <w:t>PA_&lt;NombreLibro&gt;.pdf</w:t>
+            </w:r>
           </w:p>
         </w:tc>
         <w:tc>
@@ -2312,25 +1971,7 @@
                   <w:szCs w:val="20"/>
                   <w:u w:val="single"/>
                 </w:rPr>
-                <w:t>Bibliografia/Bibliografia_De_La_Catedra/Material_Bibliografico/Pe</w:t>
-              </w:r>
-              <w:r>
-                <w:rPr>
-                  <w:color w:val="0000FF"/>
-                  <w:sz w:val="20"/>
-                  <w:szCs w:val="20"/>
-                  <w:u w:val="single"/>
-                </w:rPr>
-                <w:t>n</w:t>
-              </w:r>
-              <w:r>
-                <w:rPr>
-                  <w:color w:val="0000FF"/>
-                  <w:sz w:val="20"/>
-                  <w:szCs w:val="20"/>
-                  <w:u w:val="single"/>
-                </w:rPr>
-                <w:t>samiento_Ágil</w:t>
+                <w:t>Bibliografia/Bibliografia_De_La_Catedra/Material_Bibliografico/Pensamiento_Ágil</w:t>
               </w:r>
             </w:hyperlink>
           </w:p>
@@ -2402,33 +2043,8 @@
                 <w:sz w:val="20"/>
                 <w:szCs w:val="20"/>
               </w:rPr>
-              <w:t>IS_&lt;</w:t>
-            </w:r>
-            <w:proofErr w:type="spellStart"/>
-            <w:r>
-              <w:rPr>
-                <w:sz w:val="20"/>
-                <w:szCs w:val="20"/>
-              </w:rPr>
-              <w:t>NombreLibro</w:t>
-            </w:r>
-            <w:proofErr w:type="spellEnd"/>
-            <w:r>
-              <w:rPr>
-                <w:sz w:val="20"/>
-                <w:szCs w:val="20"/>
-              </w:rPr>
-              <w:t>&gt;.</w:t>
-            </w:r>
-            <w:proofErr w:type="spellStart"/>
-            <w:r>
-              <w:rPr>
-                <w:sz w:val="20"/>
-                <w:szCs w:val="20"/>
-              </w:rPr>
-              <w:t>pdf</w:t>
-            </w:r>
-            <w:proofErr w:type="spellEnd"/>
+              <w:t>IS_&lt;NombreLibro&gt;.pdf</w:t>
+            </w:r>
           </w:p>
         </w:tc>
         <w:tc>
@@ -2455,9 +2071,14 @@
               <w:spacing w:line="240" w:lineRule="auto"/>
               <w:jc w:val="center"/>
             </w:pPr>
-            <w:r>
-              <w:t>Bibliografia/Bibliografia_De_La_Catedra/Materoañ_Bibliografico/Ingeniería_de_Software</w:t>
-            </w:r>
+            <w:hyperlink r:id="rId24" w:history="1">
+              <w:r>
+                <w:rPr>
+                  <w:rStyle w:val="Hipervnculo"/>
+                </w:rPr>
+                <w:t>Bibliografia/Bibliografia_De_La_Catedra/Material_Bibliografico/Ingeniería_de_Software</w:t>
+              </w:r>
+            </w:hyperlink>
           </w:p>
         </w:tc>
       </w:tr>
@@ -2527,39 +2148,7 @@
                 <w:sz w:val="20"/>
                 <w:szCs w:val="20"/>
               </w:rPr>
-              <w:t>ISW_TP#_&lt;</w:t>
-            </w:r>
-            <w:proofErr w:type="spellStart"/>
-            <w:r>
-              <w:rPr>
-                <w:sz w:val="20"/>
-                <w:szCs w:val="20"/>
-              </w:rPr>
-              <w:t>NombreTrabajoPractico</w:t>
-            </w:r>
-            <w:proofErr w:type="spellEnd"/>
-            <w:r>
-              <w:rPr>
-                <w:sz w:val="20"/>
-                <w:szCs w:val="20"/>
-              </w:rPr>
-              <w:t>&gt;.&lt;</w:t>
-            </w:r>
-            <w:proofErr w:type="spellStart"/>
-            <w:r>
-              <w:rPr>
-                <w:sz w:val="20"/>
-                <w:szCs w:val="20"/>
-              </w:rPr>
-              <w:t>Extension</w:t>
-            </w:r>
-            <w:proofErr w:type="spellEnd"/>
-            <w:r>
-              <w:rPr>
-                <w:sz w:val="20"/>
-                <w:szCs w:val="20"/>
-              </w:rPr>
-              <w:t>&gt;</w:t>
+              <w:t>ISW_TP#_&lt;NombreTrabajoPractico&gt;.&lt;Extension&gt;</w:t>
             </w:r>
           </w:p>
         </w:tc>
@@ -2591,7 +2180,7 @@
                 <w:szCs w:val="20"/>
               </w:rPr>
             </w:pPr>
-            <w:hyperlink r:id="rId24">
+            <w:hyperlink r:id="rId25">
               <w:r>
                 <w:rPr>
                   <w:color w:val="0000FF"/>
@@ -2665,14 +2254,11 @@
         </w:sectPr>
       </w:pPr>
       <w:r>
-        <w:rPr>
-          <w:noProof/>
-        </w:rPr>
         <w:drawing>
-          <wp:inline distT="0" distB="0" distL="0" distR="0" wp14:anchorId="52870855" wp14:editId="215776DA">
-            <wp:extent cx="3753374" cy="6554115"/>
-            <wp:effectExtent l="0" t="0" r="0" b="0"/>
-            <wp:docPr id="3" name="Imagen 3"/>
+          <wp:inline distT="0" distB="0" distL="0" distR="0" wp14:anchorId="42393F5D" wp14:editId="30147458">
+            <wp:extent cx="4820323" cy="5915851"/>
+            <wp:effectExtent l="0" t="0" r="0" b="8890"/>
+            <wp:docPr id="1886845273" name="Imagen 1" descr="Texto&#10;&#10;El contenido generado por IA puede ser incorrecto."/>
             <wp:cNvGraphicFramePr>
               <a:graphicFrameLocks xmlns:a="http://schemas.openxmlformats.org/drawingml/2006/main" noChangeAspect="1"/>
             </wp:cNvGraphicFramePr>
@@ -2680,11 +2266,11 @@
               <a:graphicData uri="http://schemas.openxmlformats.org/drawingml/2006/picture">
                 <pic:pic xmlns:pic="http://schemas.openxmlformats.org/drawingml/2006/picture">
                   <pic:nvPicPr>
-                    <pic:cNvPr id="1" name=""/>
+                    <pic:cNvPr id="1886845273" name="Imagen 1" descr="Texto&#10;&#10;El contenido generado por IA puede ser incorrecto."/>
                     <pic:cNvPicPr/>
                   </pic:nvPicPr>
                   <pic:blipFill>
-                    <a:blip r:embed="rId25"/>
+                    <a:blip r:embed="rId26"/>
                     <a:stretch>
                       <a:fillRect/>
                     </a:stretch>
@@ -2692,7 +2278,7 @@
                   <pic:spPr>
                     <a:xfrm>
                       <a:off x="0" y="0"/>
-                      <a:ext cx="3753374" cy="6554115"/>
+                      <a:ext cx="4820323" cy="5915851"/>
                     </a:xfrm>
                     <a:prstGeom prst="rect">
                       <a:avLst/>
@@ -2863,15 +2449,7 @@
               </w:rPr>
             </w:pPr>
             <w:r>
-              <w:t>&lt;</w:t>
-            </w:r>
-            <w:proofErr w:type="spellStart"/>
-            <w:r>
-              <w:t>NombreTrabajoPractico</w:t>
-            </w:r>
-            <w:proofErr w:type="spellEnd"/>
-            <w:r>
-              <w:t>&gt;</w:t>
+              <w:t>&lt;NombreTrabajoPractico&gt;</w:t>
             </w:r>
           </w:p>
         </w:tc>
@@ -2985,15 +2563,7 @@
               </w:rPr>
             </w:pPr>
             <w:r>
-              <w:t>&lt;</w:t>
-            </w:r>
-            <w:proofErr w:type="spellStart"/>
-            <w:r>
-              <w:t>NombrePresentación</w:t>
-            </w:r>
-            <w:proofErr w:type="spellEnd"/>
-            <w:r>
-              <w:t>&gt;</w:t>
+              <w:t>&lt;NombrePresentación&gt;</w:t>
             </w:r>
           </w:p>
         </w:tc>
@@ -3082,15 +2652,7 @@
               <w:jc w:val="center"/>
             </w:pPr>
             <w:r>
-              <w:t xml:space="preserve">Fecha correspondiente al </w:t>
-            </w:r>
-            <w:proofErr w:type="spellStart"/>
-            <w:r>
-              <w:t>dia</w:t>
-            </w:r>
-            <w:proofErr w:type="spellEnd"/>
-            <w:r>
-              <w:t xml:space="preserve"> que se tomó la minuta.</w:t>
+              <w:t>Fecha correspondiente al dia que se tomó la minuta.</w:t>
             </w:r>
           </w:p>
         </w:tc>
@@ -3119,15 +2681,7 @@
               </w:rPr>
             </w:pPr>
             <w:r>
-              <w:t>&lt;</w:t>
-            </w:r>
-            <w:proofErr w:type="spellStart"/>
-            <w:r>
-              <w:t>NombreDeTema</w:t>
-            </w:r>
-            <w:proofErr w:type="spellEnd"/>
-            <w:r>
-              <w:t>&gt;</w:t>
+              <w:t>&lt;NombreDeTema&gt;</w:t>
             </w:r>
           </w:p>
         </w:tc>
@@ -3322,21 +2876,8 @@
               <w:jc w:val="center"/>
             </w:pPr>
             <w:r>
-              <w:t>Determina la extensión del archivo identificado como ítem de configuración. Ejemplo: .docx, .</w:t>
-            </w:r>
-            <w:proofErr w:type="spellStart"/>
-            <w:r>
-              <w:t>txt</w:t>
-            </w:r>
-            <w:proofErr w:type="spellEnd"/>
-            <w:r>
-              <w:t xml:space="preserve">, </w:t>
-            </w:r>
-            <w:proofErr w:type="spellStart"/>
-            <w:r>
-              <w:t>etc</w:t>
-            </w:r>
-            <w:proofErr w:type="spellEnd"/>
+              <w:t>Determina la extensión del archivo identificado como ítem de configuración. Ejemplo: .docx, .txt, etc</w:t>
+            </w:r>
           </w:p>
         </w:tc>
       </w:tr>
@@ -3382,15 +2923,7 @@
               <w:jc w:val="center"/>
             </w:pPr>
             <w:r>
-              <w:t xml:space="preserve">Software </w:t>
-            </w:r>
-            <w:proofErr w:type="spellStart"/>
-            <w:r>
-              <w:t>Configuration</w:t>
-            </w:r>
-            <w:proofErr w:type="spellEnd"/>
-            <w:r>
-              <w:t xml:space="preserve"> Management</w:t>
+              <w:t>Software Configuration Management</w:t>
             </w:r>
           </w:p>
         </w:tc>
@@ -3463,15 +2996,7 @@
               <w:jc w:val="center"/>
             </w:pPr>
             <w:r>
-              <w:t>&lt;</w:t>
-            </w:r>
-            <w:proofErr w:type="spellStart"/>
-            <w:r>
-              <w:t>NombreLibro</w:t>
-            </w:r>
-            <w:proofErr w:type="spellEnd"/>
-            <w:r>
-              <w:t xml:space="preserve">&gt; </w:t>
+              <w:t xml:space="preserve">&lt;NombreLibro&gt; </w:t>
             </w:r>
           </w:p>
         </w:tc>
@@ -4268,6 +3793,41 @@
       <w:tblStyleColBandSize w:val="1"/>
     </w:tblPr>
   </w:style>
+  <w:style w:type="character" w:styleId="Hipervnculo">
+    <w:name w:val="Hyperlink"/>
+    <w:basedOn w:val="Fuentedeprrafopredeter"/>
+    <w:uiPriority w:val="99"/>
+    <w:unhideWhenUsed/>
+    <w:rsid w:val="00892958"/>
+    <w:rPr>
+      <w:color w:val="0000FF" w:themeColor="hyperlink"/>
+      <w:u w:val="single"/>
+    </w:rPr>
+  </w:style>
+  <w:style w:type="character" w:styleId="Mencinsinresolver">
+    <w:name w:val="Unresolved Mention"/>
+    <w:basedOn w:val="Fuentedeprrafopredeter"/>
+    <w:uiPriority w:val="99"/>
+    <w:semiHidden/>
+    <w:unhideWhenUsed/>
+    <w:rsid w:val="00892958"/>
+    <w:rPr>
+      <w:color w:val="605E5C"/>
+      <w:shd w:val="clear" w:color="auto" w:fill="E1DFDD"/>
+    </w:rPr>
+  </w:style>
+  <w:style w:type="character" w:styleId="Hipervnculovisitado">
+    <w:name w:val="FollowedHyperlink"/>
+    <w:basedOn w:val="Fuentedeprrafopredeter"/>
+    <w:uiPriority w:val="99"/>
+    <w:semiHidden/>
+    <w:unhideWhenUsed/>
+    <w:rsid w:val="00892958"/>
+    <w:rPr>
+      <w:color w:val="800080" w:themeColor="followedHyperlink"/>
+      <w:u w:val="single"/>
+    </w:rPr>
+  </w:style>
 </w:styles>
 </file>
 

</xml_diff>

<commit_message>
Actualizacion de plan de configuracion p1
</commit_message>
<xml_diff>
--- a/Plan_Gestion_Configuracion_G4_ISW_4K1.docx
+++ b/Plan_Gestion_Configuracion_G4_ISW_4K1.docx
@@ -844,21 +844,12 @@
               <w:jc w:val="center"/>
             </w:pPr>
             <w:hyperlink r:id="rId13">
-              <w:proofErr w:type="spellStart"/>
               <w:r>
                 <w:rPr>
                   <w:sz w:val="24"/>
                   <w:szCs w:val="24"/>
                 </w:rPr>
-                <w:t>Patolsky</w:t>
-              </w:r>
-              <w:proofErr w:type="spellEnd"/>
-              <w:r>
-                <w:rPr>
-                  <w:sz w:val="24"/>
-                  <w:szCs w:val="24"/>
-                </w:rPr>
-                <w:t xml:space="preserve">, Daniel </w:t>
+                <w:t xml:space="preserve">Patolsky, Daniel </w:t>
               </w:r>
             </w:hyperlink>
           </w:p>
@@ -2520,13 +2511,7 @@
               <w:rPr>
                 <w:lang w:val="en-US"/>
               </w:rPr>
-              <w:t xml:space="preserve"> </w:t>
-            </w:r>
-            <w:r>
-              <w:rPr>
-                <w:lang w:val="en-US"/>
-              </w:rPr>
-              <w:t>Development</w:t>
+              <w:t xml:space="preserve"> Development</w:t>
             </w:r>
           </w:p>
         </w:tc>
@@ -2765,6 +2750,136 @@
                 <w:t>ISW_4K1_G4\Entregas\Trabajos_Prácticos\TP#_&lt;NombreTrabajoPractico&gt;</w:t>
               </w:r>
             </w:hyperlink>
+          </w:p>
+        </w:tc>
+      </w:tr>
+      <w:tr>
+        <w:trPr>
+          <w:trHeight w:val="610"/>
+        </w:trPr>
+        <w:tc>
+          <w:tcPr>
+            <w:tcW w:w="1560" w:type="dxa"/>
+            <w:tcMar>
+              <w:top w:w="100" w:type="dxa"/>
+              <w:left w:w="100" w:type="dxa"/>
+              <w:bottom w:w="100" w:type="dxa"/>
+              <w:right w:w="100" w:type="dxa"/>
+            </w:tcMar>
+            <w:vAlign w:val="center"/>
+          </w:tcPr>
+          <w:p>
+            <w:pPr>
+              <w:widowControl w:val="0"/>
+              <w:pBdr>
+                <w:top w:val="nil"/>
+                <w:left w:val="nil"/>
+                <w:bottom w:val="nil"/>
+                <w:right w:val="nil"/>
+                <w:between w:val="nil"/>
+              </w:pBdr>
+              <w:spacing w:line="240" w:lineRule="auto"/>
+              <w:jc w:val="center"/>
+            </w:pPr>
+            <w:r>
+              <w:t xml:space="preserve">Bibliografía de </w:t>
+            </w:r>
+            <w:proofErr w:type="spellStart"/>
+            <w:r>
+              <w:t>Testing</w:t>
+            </w:r>
+            <w:proofErr w:type="spellEnd"/>
+            <w:r>
+              <w:t xml:space="preserve"> de Software</w:t>
+            </w:r>
+          </w:p>
+        </w:tc>
+        <w:tc>
+          <w:tcPr>
+            <w:tcW w:w="3237" w:type="dxa"/>
+            <w:tcMar>
+              <w:top w:w="100" w:type="dxa"/>
+              <w:left w:w="100" w:type="dxa"/>
+              <w:bottom w:w="100" w:type="dxa"/>
+              <w:right w:w="100" w:type="dxa"/>
+            </w:tcMar>
+            <w:vAlign w:val="center"/>
+          </w:tcPr>
+          <w:p>
+            <w:pPr>
+              <w:widowControl w:val="0"/>
+              <w:pBdr>
+                <w:top w:val="nil"/>
+                <w:left w:val="nil"/>
+                <w:bottom w:val="nil"/>
+                <w:right w:val="nil"/>
+                <w:between w:val="nil"/>
+              </w:pBdr>
+              <w:spacing w:line="240" w:lineRule="auto"/>
+              <w:jc w:val="center"/>
+              <w:rPr>
+                <w:sz w:val="20"/>
+                <w:szCs w:val="20"/>
+              </w:rPr>
+            </w:pPr>
+            <w:r>
+              <w:rPr>
+                <w:sz w:val="20"/>
+                <w:szCs w:val="20"/>
+              </w:rPr>
+              <w:t>TS_&lt;</w:t>
+            </w:r>
+            <w:proofErr w:type="spellStart"/>
+            <w:r>
+              <w:rPr>
+                <w:sz w:val="20"/>
+                <w:szCs w:val="20"/>
+              </w:rPr>
+              <w:t>NombreLibro</w:t>
+            </w:r>
+            <w:proofErr w:type="spellEnd"/>
+            <w:r>
+              <w:rPr>
+                <w:sz w:val="20"/>
+                <w:szCs w:val="20"/>
+              </w:rPr>
+              <w:t>&gt;.</w:t>
+            </w:r>
+            <w:proofErr w:type="spellStart"/>
+            <w:r>
+              <w:rPr>
+                <w:sz w:val="20"/>
+                <w:szCs w:val="20"/>
+              </w:rPr>
+              <w:t>pdf</w:t>
+            </w:r>
+            <w:proofErr w:type="spellEnd"/>
+          </w:p>
+        </w:tc>
+        <w:tc>
+          <w:tcPr>
+            <w:tcW w:w="5662" w:type="dxa"/>
+            <w:tcMar>
+              <w:top w:w="100" w:type="dxa"/>
+              <w:left w:w="100" w:type="dxa"/>
+              <w:bottom w:w="100" w:type="dxa"/>
+              <w:right w:w="100" w:type="dxa"/>
+            </w:tcMar>
+            <w:vAlign w:val="center"/>
+          </w:tcPr>
+          <w:p>
+            <w:pPr>
+              <w:widowControl w:val="0"/>
+              <w:pBdr>
+                <w:top w:val="nil"/>
+                <w:left w:val="nil"/>
+                <w:bottom w:val="nil"/>
+                <w:right w:val="nil"/>
+                <w:between w:val="nil"/>
+              </w:pBdr>
+              <w:spacing w:line="240" w:lineRule="auto"/>
+              <w:jc w:val="center"/>
+            </w:pPr>
           </w:p>
         </w:tc>
       </w:tr>
@@ -3711,6 +3826,58 @@
             </w:pPr>
             <w:r>
               <w:t>Ingeniería de Software</w:t>
+            </w:r>
+          </w:p>
+        </w:tc>
+      </w:tr>
+      <w:tr>
+        <w:trPr>
+          <w:jc w:val="center"/>
+        </w:trPr>
+        <w:tc>
+          <w:tcPr>
+            <w:tcW w:w="4514" w:type="dxa"/>
+            <w:tcMar>
+              <w:top w:w="100" w:type="dxa"/>
+              <w:left w:w="100" w:type="dxa"/>
+              <w:bottom w:w="100" w:type="dxa"/>
+              <w:right w:w="100" w:type="dxa"/>
+            </w:tcMar>
+          </w:tcPr>
+          <w:p>
+            <w:pPr>
+              <w:widowControl w:val="0"/>
+              <w:spacing w:line="240" w:lineRule="auto"/>
+              <w:jc w:val="center"/>
+            </w:pPr>
+            <w:r>
+              <w:t>TS</w:t>
+            </w:r>
+          </w:p>
+        </w:tc>
+        <w:tc>
+          <w:tcPr>
+            <w:tcW w:w="4515" w:type="dxa"/>
+            <w:tcMar>
+              <w:top w:w="100" w:type="dxa"/>
+              <w:left w:w="100" w:type="dxa"/>
+              <w:bottom w:w="100" w:type="dxa"/>
+              <w:right w:w="100" w:type="dxa"/>
+            </w:tcMar>
+          </w:tcPr>
+          <w:p>
+            <w:pPr>
+              <w:widowControl w:val="0"/>
+              <w:spacing w:line="240" w:lineRule="auto"/>
+              <w:jc w:val="center"/>
+            </w:pPr>
+            <w:proofErr w:type="spellStart"/>
+            <w:r>
+              <w:t>Testing</w:t>
+            </w:r>
+            <w:proofErr w:type="spellEnd"/>
+            <w:r>
+              <w:t xml:space="preserve"> de Software</w:t>
             </w:r>
           </w:p>
         </w:tc>

</xml_diff>

<commit_message>
Update plan de gestion de condiguracion p2
</commit_message>
<xml_diff>
--- a/Plan_Gestion_Configuracion_G4_ISW_4K1.docx
+++ b/Plan_Gestion_Configuracion_G4_ISW_4K1.docx
@@ -888,74 +888,56 @@
               <w:jc w:val="center"/>
             </w:pPr>
             <w:hyperlink r:id="rId14">
-              <w:proofErr w:type="spellStart"/>
               <w:r>
                 <w:rPr>
                   <w:sz w:val="24"/>
                   <w:szCs w:val="24"/>
                 </w:rPr>
-                <w:t>Titón</w:t>
+                <w:t xml:space="preserve">Titón, Máximo </w:t>
               </w:r>
-              <w:proofErr w:type="spellEnd"/>
+            </w:hyperlink>
+          </w:p>
+        </w:tc>
+        <w:tc>
+          <w:tcPr>
+            <w:tcW w:w="5219" w:type="dxa"/>
+          </w:tcPr>
+          <w:p>
+            <w:pPr>
+              <w:spacing w:before="40" w:after="40"/>
+              <w:jc w:val="center"/>
+              <w:rPr>
+                <w:sz w:val="24"/>
+                <w:szCs w:val="24"/>
+              </w:rPr>
+            </w:pPr>
+            <w:r>
+              <w:rPr>
+                <w:sz w:val="24"/>
+                <w:szCs w:val="24"/>
+              </w:rPr>
+              <w:t>98175</w:t>
+            </w:r>
+          </w:p>
+        </w:tc>
+      </w:tr>
+      <w:tr>
+        <w:tc>
+          <w:tcPr>
+            <w:tcW w:w="5220" w:type="dxa"/>
+          </w:tcPr>
+          <w:p>
+            <w:pPr>
+              <w:spacing w:before="40" w:after="40"/>
+              <w:jc w:val="center"/>
+            </w:pPr>
+            <w:hyperlink r:id="rId15">
               <w:r>
                 <w:rPr>
                   <w:sz w:val="24"/>
                   <w:szCs w:val="24"/>
                 </w:rPr>
-                <w:t xml:space="preserve">, Máximo </w:t>
-              </w:r>
-            </w:hyperlink>
-          </w:p>
-        </w:tc>
-        <w:tc>
-          <w:tcPr>
-            <w:tcW w:w="5219" w:type="dxa"/>
-          </w:tcPr>
-          <w:p>
-            <w:pPr>
-              <w:spacing w:before="40" w:after="40"/>
-              <w:jc w:val="center"/>
-              <w:rPr>
-                <w:sz w:val="24"/>
-                <w:szCs w:val="24"/>
-              </w:rPr>
-            </w:pPr>
-            <w:r>
-              <w:rPr>
-                <w:sz w:val="24"/>
-                <w:szCs w:val="24"/>
-              </w:rPr>
-              <w:t>98175</w:t>
-            </w:r>
-          </w:p>
-        </w:tc>
-      </w:tr>
-      <w:tr>
-        <w:tc>
-          <w:tcPr>
-            <w:tcW w:w="5220" w:type="dxa"/>
-          </w:tcPr>
-          <w:p>
-            <w:pPr>
-              <w:spacing w:before="40" w:after="40"/>
-              <w:jc w:val="center"/>
-            </w:pPr>
-            <w:hyperlink r:id="rId15">
-              <w:proofErr w:type="spellStart"/>
-              <w:r>
-                <w:rPr>
-                  <w:sz w:val="24"/>
-                  <w:szCs w:val="24"/>
-                </w:rPr>
-                <w:t>Uliana</w:t>
-              </w:r>
-              <w:proofErr w:type="spellEnd"/>
-              <w:r>
-                <w:rPr>
-                  <w:sz w:val="24"/>
-                  <w:szCs w:val="24"/>
-                </w:rPr>
-                <w:t>, Agustín</w:t>
+                <w:t>Uliana, Agustín</w:t>
               </w:r>
             </w:hyperlink>
           </w:p>
@@ -1284,23 +1266,7 @@
                 <w:sz w:val="20"/>
                 <w:szCs w:val="20"/>
               </w:rPr>
-              <w:t>TP#_&lt;</w:t>
-            </w:r>
-            <w:proofErr w:type="spellStart"/>
-            <w:r>
-              <w:rPr>
-                <w:sz w:val="20"/>
-                <w:szCs w:val="20"/>
-              </w:rPr>
-              <w:t>NombreTrabajoPractico</w:t>
-            </w:r>
-            <w:proofErr w:type="spellEnd"/>
-            <w:r>
-              <w:rPr>
-                <w:sz w:val="20"/>
-                <w:szCs w:val="20"/>
-              </w:rPr>
-              <w:t>&gt;</w:t>
+              <w:t>TP#_&lt;NombreTrabajoPractico&gt;</w:t>
             </w:r>
           </w:p>
         </w:tc>
@@ -1412,33 +1378,8 @@
                 <w:sz w:val="20"/>
                 <w:szCs w:val="20"/>
               </w:rPr>
-              <w:t># &lt;</w:t>
-            </w:r>
-            <w:proofErr w:type="spellStart"/>
-            <w:r>
-              <w:rPr>
-                <w:sz w:val="20"/>
-                <w:szCs w:val="20"/>
-              </w:rPr>
-              <w:t>NombrePresentación</w:t>
-            </w:r>
-            <w:proofErr w:type="spellEnd"/>
-            <w:r>
-              <w:rPr>
-                <w:sz w:val="20"/>
-                <w:szCs w:val="20"/>
-              </w:rPr>
-              <w:t>&gt;.</w:t>
-            </w:r>
-            <w:proofErr w:type="spellStart"/>
-            <w:r>
-              <w:rPr>
-                <w:sz w:val="20"/>
-                <w:szCs w:val="20"/>
-              </w:rPr>
-              <w:t>pdf</w:t>
-            </w:r>
-            <w:proofErr w:type="spellEnd"/>
+              <w:t># &lt;NombrePresentación&gt;.pdf</w:t>
+            </w:r>
           </w:p>
         </w:tc>
         <w:tc>
@@ -1470,7 +1411,6 @@
               </w:rPr>
             </w:pPr>
             <w:hyperlink r:id="rId18">
-              <w:proofErr w:type="spellStart"/>
               <w:r>
                 <w:rPr>
                   <w:color w:val="1155CC"/>
@@ -1478,9 +1418,127 @@
                   <w:szCs w:val="20"/>
                   <w:u w:val="single"/>
                 </w:rPr>
-                <w:t>Bibliografia</w:t>
+                <w:t>Bibliografia/Bibliografia_De_La_Catedra/Diaspositivas</w:t>
               </w:r>
-              <w:proofErr w:type="spellEnd"/>
+            </w:hyperlink>
+          </w:p>
+        </w:tc>
+      </w:tr>
+      <w:tr>
+        <w:trPr>
+          <w:trHeight w:val="480"/>
+        </w:trPr>
+        <w:tc>
+          <w:tcPr>
+            <w:tcW w:w="1560" w:type="dxa"/>
+            <w:tcMar>
+              <w:top w:w="100" w:type="dxa"/>
+              <w:left w:w="100" w:type="dxa"/>
+              <w:bottom w:w="100" w:type="dxa"/>
+              <w:right w:w="100" w:type="dxa"/>
+            </w:tcMar>
+            <w:vAlign w:val="center"/>
+          </w:tcPr>
+          <w:p>
+            <w:pPr>
+              <w:widowControl w:val="0"/>
+              <w:pBdr>
+                <w:top w:val="nil"/>
+                <w:left w:val="nil"/>
+                <w:bottom w:val="nil"/>
+                <w:right w:val="nil"/>
+                <w:between w:val="nil"/>
+              </w:pBdr>
+              <w:spacing w:line="240" w:lineRule="auto"/>
+              <w:jc w:val="center"/>
+            </w:pPr>
+            <w:r>
+              <w:t>Minutas</w:t>
+            </w:r>
+          </w:p>
+        </w:tc>
+        <w:tc>
+          <w:tcPr>
+            <w:tcW w:w="3237" w:type="dxa"/>
+            <w:tcMar>
+              <w:top w:w="100" w:type="dxa"/>
+              <w:left w:w="100" w:type="dxa"/>
+              <w:bottom w:w="100" w:type="dxa"/>
+              <w:right w:w="100" w:type="dxa"/>
+            </w:tcMar>
+            <w:vAlign w:val="center"/>
+          </w:tcPr>
+          <w:p>
+            <w:pPr>
+              <w:widowControl w:val="0"/>
+              <w:pBdr>
+                <w:top w:val="nil"/>
+                <w:left w:val="nil"/>
+                <w:bottom w:val="nil"/>
+                <w:right w:val="nil"/>
+                <w:between w:val="nil"/>
+              </w:pBdr>
+              <w:spacing w:line="240" w:lineRule="auto"/>
+              <w:jc w:val="center"/>
+              <w:rPr>
+                <w:sz w:val="20"/>
+                <w:szCs w:val="20"/>
+              </w:rPr>
+            </w:pPr>
+            <w:r>
+              <w:rPr>
+                <w:sz w:val="20"/>
+                <w:szCs w:val="20"/>
+              </w:rPr>
+              <w:t>&lt;fecha&gt;_&lt;NombreDeTema&gt;_&lt;Apellido</w:t>
+            </w:r>
+            <w:proofErr w:type="gramStart"/>
+            <w:r>
+              <w:rPr>
+                <w:sz w:val="20"/>
+                <w:szCs w:val="20"/>
+              </w:rPr>
+              <w:t>&gt;.&lt;</w:t>
+            </w:r>
+            <w:proofErr w:type="gramEnd"/>
+            <w:r>
+              <w:rPr>
+                <w:sz w:val="20"/>
+                <w:szCs w:val="20"/>
+              </w:rPr>
+              <w:t>Extensión&gt;</w:t>
+            </w:r>
+          </w:p>
+        </w:tc>
+        <w:tc>
+          <w:tcPr>
+            <w:tcW w:w="5662" w:type="dxa"/>
+            <w:tcMar>
+              <w:top w:w="100" w:type="dxa"/>
+              <w:left w:w="100" w:type="dxa"/>
+              <w:bottom w:w="100" w:type="dxa"/>
+              <w:right w:w="100" w:type="dxa"/>
+            </w:tcMar>
+            <w:vAlign w:val="center"/>
+          </w:tcPr>
+          <w:p>
+            <w:pPr>
+              <w:widowControl w:val="0"/>
+              <w:pBdr>
+                <w:top w:val="nil"/>
+                <w:left w:val="nil"/>
+                <w:bottom w:val="nil"/>
+                <w:right w:val="nil"/>
+                <w:between w:val="nil"/>
+              </w:pBdr>
+              <w:spacing w:line="240" w:lineRule="auto"/>
+              <w:jc w:val="center"/>
+              <w:rPr>
+                <w:sz w:val="20"/>
+                <w:szCs w:val="20"/>
+              </w:rPr>
+            </w:pPr>
+            <w:hyperlink r:id="rId19">
               <w:r>
                 <w:rPr>
                   <w:color w:val="1155CC"/>
@@ -1488,9 +1546,116 @@
                   <w:szCs w:val="20"/>
                   <w:u w:val="single"/>
                 </w:rPr>
-                <w:t>/</w:t>
+                <w:t>Bibliografia/Material_De_Estudio</w:t>
               </w:r>
-              <w:proofErr w:type="spellStart"/>
+            </w:hyperlink>
+            <w:r>
+              <w:rPr>
+                <w:color w:val="1155CC"/>
+                <w:sz w:val="20"/>
+                <w:szCs w:val="20"/>
+                <w:u w:val="single"/>
+              </w:rPr>
+              <w:t>/Minutas</w:t>
+            </w:r>
+          </w:p>
+        </w:tc>
+      </w:tr>
+      <w:tr>
+        <w:trPr>
+          <w:trHeight w:val="480"/>
+        </w:trPr>
+        <w:tc>
+          <w:tcPr>
+            <w:tcW w:w="1560" w:type="dxa"/>
+            <w:tcMar>
+              <w:top w:w="100" w:type="dxa"/>
+              <w:left w:w="100" w:type="dxa"/>
+              <w:bottom w:w="100" w:type="dxa"/>
+              <w:right w:w="100" w:type="dxa"/>
+            </w:tcMar>
+            <w:vAlign w:val="center"/>
+          </w:tcPr>
+          <w:p>
+            <w:pPr>
+              <w:widowControl w:val="0"/>
+              <w:pBdr>
+                <w:top w:val="nil"/>
+                <w:left w:val="nil"/>
+                <w:bottom w:val="nil"/>
+                <w:right w:val="nil"/>
+                <w:between w:val="nil"/>
+              </w:pBdr>
+              <w:spacing w:line="240" w:lineRule="auto"/>
+              <w:jc w:val="center"/>
+            </w:pPr>
+            <w:r>
+              <w:t>Resumenes</w:t>
+            </w:r>
+          </w:p>
+        </w:tc>
+        <w:tc>
+          <w:tcPr>
+            <w:tcW w:w="3237" w:type="dxa"/>
+            <w:tcMar>
+              <w:top w:w="100" w:type="dxa"/>
+              <w:left w:w="100" w:type="dxa"/>
+              <w:bottom w:w="100" w:type="dxa"/>
+              <w:right w:w="100" w:type="dxa"/>
+            </w:tcMar>
+            <w:vAlign w:val="center"/>
+          </w:tcPr>
+          <w:p>
+            <w:pPr>
+              <w:widowControl w:val="0"/>
+              <w:pBdr>
+                <w:top w:val="nil"/>
+                <w:left w:val="nil"/>
+                <w:bottom w:val="nil"/>
+                <w:right w:val="nil"/>
+                <w:between w:val="nil"/>
+              </w:pBdr>
+              <w:spacing w:line="240" w:lineRule="auto"/>
+              <w:jc w:val="center"/>
+              <w:rPr>
+                <w:sz w:val="20"/>
+                <w:szCs w:val="20"/>
+              </w:rPr>
+            </w:pPr>
+            <w:r>
+              <w:rPr>
+                <w:sz w:val="20"/>
+                <w:szCs w:val="20"/>
+              </w:rPr>
+              <w:t>&lt;NombreDeTema&gt;_&lt;Apellido&gt;</w:t>
+            </w:r>
+          </w:p>
+        </w:tc>
+        <w:tc>
+          <w:tcPr>
+            <w:tcW w:w="5662" w:type="dxa"/>
+            <w:tcMar>
+              <w:top w:w="100" w:type="dxa"/>
+              <w:left w:w="100" w:type="dxa"/>
+              <w:bottom w:w="100" w:type="dxa"/>
+              <w:right w:w="100" w:type="dxa"/>
+            </w:tcMar>
+            <w:vAlign w:val="center"/>
+          </w:tcPr>
+          <w:p>
+            <w:pPr>
+              <w:widowControl w:val="0"/>
+              <w:pBdr>
+                <w:top w:val="nil"/>
+                <w:left w:val="nil"/>
+                <w:bottom w:val="nil"/>
+                <w:right w:val="nil"/>
+                <w:between w:val="nil"/>
+              </w:pBdr>
+              <w:spacing w:line="240" w:lineRule="auto"/>
+              <w:jc w:val="center"/>
+            </w:pPr>
+            <w:hyperlink r:id="rId20">
               <w:r>
                 <w:rPr>
                   <w:color w:val="1155CC"/>
@@ -1498,9 +1663,132 @@
                   <w:szCs w:val="20"/>
                   <w:u w:val="single"/>
                 </w:rPr>
-                <w:t>Bibliografia_De_La_Catedra</w:t>
+                <w:t>Bibliografia/Material_De_Estudio</w:t>
               </w:r>
-              <w:proofErr w:type="spellEnd"/>
+            </w:hyperlink>
+            <w:r>
+              <w:rPr>
+                <w:color w:val="1155CC"/>
+                <w:sz w:val="20"/>
+                <w:szCs w:val="20"/>
+                <w:u w:val="single"/>
+              </w:rPr>
+              <w:t>/Resumenes</w:t>
+            </w:r>
+          </w:p>
+        </w:tc>
+      </w:tr>
+      <w:tr>
+        <w:trPr>
+          <w:trHeight w:val="480"/>
+        </w:trPr>
+        <w:tc>
+          <w:tcPr>
+            <w:tcW w:w="1560" w:type="dxa"/>
+            <w:tcMar>
+              <w:top w:w="100" w:type="dxa"/>
+              <w:left w:w="100" w:type="dxa"/>
+              <w:bottom w:w="100" w:type="dxa"/>
+              <w:right w:w="100" w:type="dxa"/>
+            </w:tcMar>
+            <w:vAlign w:val="center"/>
+          </w:tcPr>
+          <w:p>
+            <w:pPr>
+              <w:widowControl w:val="0"/>
+              <w:pBdr>
+                <w:top w:val="nil"/>
+                <w:left w:val="nil"/>
+                <w:bottom w:val="nil"/>
+                <w:right w:val="nil"/>
+                <w:between w:val="nil"/>
+              </w:pBdr>
+              <w:spacing w:line="240" w:lineRule="auto"/>
+              <w:jc w:val="center"/>
+            </w:pPr>
+            <w:r>
+              <w:t>Ejercicios Prácticos</w:t>
+            </w:r>
+          </w:p>
+        </w:tc>
+        <w:tc>
+          <w:tcPr>
+            <w:tcW w:w="3237" w:type="dxa"/>
+            <w:tcMar>
+              <w:top w:w="100" w:type="dxa"/>
+              <w:left w:w="100" w:type="dxa"/>
+              <w:bottom w:w="100" w:type="dxa"/>
+              <w:right w:w="100" w:type="dxa"/>
+            </w:tcMar>
+            <w:vAlign w:val="center"/>
+          </w:tcPr>
+          <w:p>
+            <w:pPr>
+              <w:widowControl w:val="0"/>
+              <w:pBdr>
+                <w:top w:val="nil"/>
+                <w:left w:val="nil"/>
+                <w:bottom w:val="nil"/>
+                <w:right w:val="nil"/>
+                <w:between w:val="nil"/>
+              </w:pBdr>
+              <w:spacing w:line="240" w:lineRule="auto"/>
+              <w:jc w:val="center"/>
+              <w:rPr>
+                <w:sz w:val="20"/>
+                <w:szCs w:val="20"/>
+              </w:rPr>
+            </w:pPr>
+            <w:r>
+              <w:rPr>
+                <w:sz w:val="20"/>
+                <w:szCs w:val="20"/>
+              </w:rPr>
+              <w:t>&lt;NombreDeTema&gt;_TP#_&lt;Apellidos</w:t>
+            </w:r>
+            <w:proofErr w:type="gramStart"/>
+            <w:r>
+              <w:rPr>
+                <w:sz w:val="20"/>
+                <w:szCs w:val="20"/>
+              </w:rPr>
+              <w:t>&gt;.&lt;</w:t>
+            </w:r>
+            <w:proofErr w:type="gramEnd"/>
+            <w:r>
+              <w:rPr>
+                <w:sz w:val="20"/>
+                <w:szCs w:val="20"/>
+              </w:rPr>
+              <w:t>Extensión&gt;</w:t>
+            </w:r>
+          </w:p>
+        </w:tc>
+        <w:tc>
+          <w:tcPr>
+            <w:tcW w:w="5662" w:type="dxa"/>
+            <w:tcMar>
+              <w:top w:w="100" w:type="dxa"/>
+              <w:left w:w="100" w:type="dxa"/>
+              <w:bottom w:w="100" w:type="dxa"/>
+              <w:right w:w="100" w:type="dxa"/>
+            </w:tcMar>
+            <w:vAlign w:val="center"/>
+          </w:tcPr>
+          <w:p>
+            <w:pPr>
+              <w:widowControl w:val="0"/>
+              <w:pBdr>
+                <w:top w:val="nil"/>
+                <w:left w:val="nil"/>
+                <w:bottom w:val="nil"/>
+                <w:right w:val="nil"/>
+                <w:between w:val="nil"/>
+              </w:pBdr>
+              <w:spacing w:line="240" w:lineRule="auto"/>
+              <w:jc w:val="center"/>
+            </w:pPr>
+            <w:hyperlink r:id="rId21">
               <w:r>
                 <w:rPr>
                   <w:color w:val="1155CC"/>
@@ -1508,26 +1796,24 @@
                   <w:szCs w:val="20"/>
                   <w:u w:val="single"/>
                 </w:rPr>
-                <w:t>/</w:t>
+                <w:t>Bibliografia/Material_De_Estudio</w:t>
               </w:r>
-              <w:proofErr w:type="spellStart"/>
-              <w:r>
-                <w:rPr>
-                  <w:color w:val="1155CC"/>
-                  <w:sz w:val="20"/>
-                  <w:szCs w:val="20"/>
-                  <w:u w:val="single"/>
-                </w:rPr>
-                <w:t>Diaspositivas</w:t>
-              </w:r>
-              <w:proofErr w:type="spellEnd"/>
             </w:hyperlink>
+            <w:r>
+              <w:rPr>
+                <w:color w:val="1155CC"/>
+                <w:sz w:val="20"/>
+                <w:szCs w:val="20"/>
+                <w:u w:val="single"/>
+              </w:rPr>
+              <w:t>/Ejercicios_Practicos</w:t>
+            </w:r>
           </w:p>
         </w:tc>
       </w:tr>
       <w:tr>
         <w:trPr>
-          <w:trHeight w:val="480"/>
+          <w:trHeight w:val="610"/>
         </w:trPr>
         <w:tc>
           <w:tcPr>
@@ -1554,7 +1840,7 @@
               <w:jc w:val="center"/>
             </w:pPr>
             <w:r>
-              <w:t>Minutas</w:t>
+              <w:t>Bibliografía SCM</w:t>
             </w:r>
           </w:p>
         </w:tc>
@@ -1591,558 +1877,8 @@
                 <w:sz w:val="20"/>
                 <w:szCs w:val="20"/>
               </w:rPr>
-              <w:t>&lt;fecha&gt;_&lt;</w:t>
-            </w:r>
-            <w:proofErr w:type="spellStart"/>
-            <w:r>
-              <w:rPr>
-                <w:sz w:val="20"/>
-                <w:szCs w:val="20"/>
-              </w:rPr>
-              <w:t>NombreDeTema</w:t>
-            </w:r>
-            <w:proofErr w:type="spellEnd"/>
-            <w:r>
-              <w:rPr>
-                <w:sz w:val="20"/>
-                <w:szCs w:val="20"/>
-              </w:rPr>
-              <w:t>&gt;_&lt;Apellido</w:t>
-            </w:r>
-            <w:proofErr w:type="gramStart"/>
-            <w:r>
-              <w:rPr>
-                <w:sz w:val="20"/>
-                <w:szCs w:val="20"/>
-              </w:rPr>
-              <w:t>&gt;.&lt;</w:t>
-            </w:r>
-            <w:proofErr w:type="gramEnd"/>
-            <w:r>
-              <w:rPr>
-                <w:sz w:val="20"/>
-                <w:szCs w:val="20"/>
-              </w:rPr>
-              <w:t>Extensión&gt;</w:t>
-            </w:r>
-          </w:p>
-        </w:tc>
-        <w:tc>
-          <w:tcPr>
-            <w:tcW w:w="5662" w:type="dxa"/>
-            <w:tcMar>
-              <w:top w:w="100" w:type="dxa"/>
-              <w:left w:w="100" w:type="dxa"/>
-              <w:bottom w:w="100" w:type="dxa"/>
-              <w:right w:w="100" w:type="dxa"/>
-            </w:tcMar>
-            <w:vAlign w:val="center"/>
-          </w:tcPr>
-          <w:p>
-            <w:pPr>
-              <w:widowControl w:val="0"/>
-              <w:pBdr>
-                <w:top w:val="nil"/>
-                <w:left w:val="nil"/>
-                <w:bottom w:val="nil"/>
-                <w:right w:val="nil"/>
-                <w:between w:val="nil"/>
-              </w:pBdr>
-              <w:spacing w:line="240" w:lineRule="auto"/>
-              <w:jc w:val="center"/>
-              <w:rPr>
-                <w:sz w:val="20"/>
-                <w:szCs w:val="20"/>
-              </w:rPr>
-            </w:pPr>
-            <w:hyperlink r:id="rId19">
-              <w:proofErr w:type="spellStart"/>
-              <w:r>
-                <w:rPr>
-                  <w:color w:val="1155CC"/>
-                  <w:sz w:val="20"/>
-                  <w:szCs w:val="20"/>
-                  <w:u w:val="single"/>
-                </w:rPr>
-                <w:t>Bibliografia</w:t>
-              </w:r>
-              <w:proofErr w:type="spellEnd"/>
-              <w:r>
-                <w:rPr>
-                  <w:color w:val="1155CC"/>
-                  <w:sz w:val="20"/>
-                  <w:szCs w:val="20"/>
-                  <w:u w:val="single"/>
-                </w:rPr>
-                <w:t>/</w:t>
-              </w:r>
-              <w:proofErr w:type="spellStart"/>
-              <w:r>
-                <w:rPr>
-                  <w:color w:val="1155CC"/>
-                  <w:sz w:val="20"/>
-                  <w:szCs w:val="20"/>
-                  <w:u w:val="single"/>
-                </w:rPr>
-                <w:t>Material_De_Estudio</w:t>
-              </w:r>
-              <w:proofErr w:type="spellEnd"/>
-            </w:hyperlink>
-            <w:r>
-              <w:rPr>
-                <w:color w:val="1155CC"/>
-                <w:sz w:val="20"/>
-                <w:szCs w:val="20"/>
-                <w:u w:val="single"/>
-              </w:rPr>
-              <w:t>/Minutas</w:t>
-            </w:r>
-          </w:p>
-        </w:tc>
-      </w:tr>
-      <w:tr>
-        <w:trPr>
-          <w:trHeight w:val="480"/>
-        </w:trPr>
-        <w:tc>
-          <w:tcPr>
-            <w:tcW w:w="1560" w:type="dxa"/>
-            <w:tcMar>
-              <w:top w:w="100" w:type="dxa"/>
-              <w:left w:w="100" w:type="dxa"/>
-              <w:bottom w:w="100" w:type="dxa"/>
-              <w:right w:w="100" w:type="dxa"/>
-            </w:tcMar>
-            <w:vAlign w:val="center"/>
-          </w:tcPr>
-          <w:p>
-            <w:pPr>
-              <w:widowControl w:val="0"/>
-              <w:pBdr>
-                <w:top w:val="nil"/>
-                <w:left w:val="nil"/>
-                <w:bottom w:val="nil"/>
-                <w:right w:val="nil"/>
-                <w:between w:val="nil"/>
-              </w:pBdr>
-              <w:spacing w:line="240" w:lineRule="auto"/>
-              <w:jc w:val="center"/>
-            </w:pPr>
-            <w:proofErr w:type="spellStart"/>
-            <w:r>
-              <w:t>Resumenes</w:t>
-            </w:r>
-            <w:proofErr w:type="spellEnd"/>
-          </w:p>
-        </w:tc>
-        <w:tc>
-          <w:tcPr>
-            <w:tcW w:w="3237" w:type="dxa"/>
-            <w:tcMar>
-              <w:top w:w="100" w:type="dxa"/>
-              <w:left w:w="100" w:type="dxa"/>
-              <w:bottom w:w="100" w:type="dxa"/>
-              <w:right w:w="100" w:type="dxa"/>
-            </w:tcMar>
-            <w:vAlign w:val="center"/>
-          </w:tcPr>
-          <w:p>
-            <w:pPr>
-              <w:widowControl w:val="0"/>
-              <w:pBdr>
-                <w:top w:val="nil"/>
-                <w:left w:val="nil"/>
-                <w:bottom w:val="nil"/>
-                <w:right w:val="nil"/>
-                <w:between w:val="nil"/>
-              </w:pBdr>
-              <w:spacing w:line="240" w:lineRule="auto"/>
-              <w:jc w:val="center"/>
-              <w:rPr>
-                <w:sz w:val="20"/>
-                <w:szCs w:val="20"/>
-              </w:rPr>
-            </w:pPr>
-            <w:r>
-              <w:rPr>
-                <w:sz w:val="20"/>
-                <w:szCs w:val="20"/>
-              </w:rPr>
-              <w:t>&lt;</w:t>
-            </w:r>
-            <w:proofErr w:type="spellStart"/>
-            <w:r>
-              <w:rPr>
-                <w:sz w:val="20"/>
-                <w:szCs w:val="20"/>
-              </w:rPr>
-              <w:t>NombreDeTema</w:t>
-            </w:r>
-            <w:proofErr w:type="spellEnd"/>
-            <w:r>
-              <w:rPr>
-                <w:sz w:val="20"/>
-                <w:szCs w:val="20"/>
-              </w:rPr>
-              <w:t>&gt;_&lt;Apellido&gt;</w:t>
-            </w:r>
-          </w:p>
-        </w:tc>
-        <w:tc>
-          <w:tcPr>
-            <w:tcW w:w="5662" w:type="dxa"/>
-            <w:tcMar>
-              <w:top w:w="100" w:type="dxa"/>
-              <w:left w:w="100" w:type="dxa"/>
-              <w:bottom w:w="100" w:type="dxa"/>
-              <w:right w:w="100" w:type="dxa"/>
-            </w:tcMar>
-            <w:vAlign w:val="center"/>
-          </w:tcPr>
-          <w:p>
-            <w:pPr>
-              <w:widowControl w:val="0"/>
-              <w:pBdr>
-                <w:top w:val="nil"/>
-                <w:left w:val="nil"/>
-                <w:bottom w:val="nil"/>
-                <w:right w:val="nil"/>
-                <w:between w:val="nil"/>
-              </w:pBdr>
-              <w:spacing w:line="240" w:lineRule="auto"/>
-              <w:jc w:val="center"/>
-            </w:pPr>
-            <w:hyperlink r:id="rId20">
-              <w:proofErr w:type="spellStart"/>
-              <w:r>
-                <w:rPr>
-                  <w:color w:val="1155CC"/>
-                  <w:sz w:val="20"/>
-                  <w:szCs w:val="20"/>
-                  <w:u w:val="single"/>
-                </w:rPr>
-                <w:t>Bibliografia</w:t>
-              </w:r>
-              <w:proofErr w:type="spellEnd"/>
-              <w:r>
-                <w:rPr>
-                  <w:color w:val="1155CC"/>
-                  <w:sz w:val="20"/>
-                  <w:szCs w:val="20"/>
-                  <w:u w:val="single"/>
-                </w:rPr>
-                <w:t>/</w:t>
-              </w:r>
-              <w:proofErr w:type="spellStart"/>
-              <w:r>
-                <w:rPr>
-                  <w:color w:val="1155CC"/>
-                  <w:sz w:val="20"/>
-                  <w:szCs w:val="20"/>
-                  <w:u w:val="single"/>
-                </w:rPr>
-                <w:t>Material_De_Estudio</w:t>
-              </w:r>
-              <w:proofErr w:type="spellEnd"/>
-            </w:hyperlink>
-            <w:r>
-              <w:rPr>
-                <w:color w:val="1155CC"/>
-                <w:sz w:val="20"/>
-                <w:szCs w:val="20"/>
-                <w:u w:val="single"/>
-              </w:rPr>
-              <w:t>/</w:t>
-            </w:r>
-            <w:proofErr w:type="spellStart"/>
-            <w:r>
-              <w:rPr>
-                <w:color w:val="1155CC"/>
-                <w:sz w:val="20"/>
-                <w:szCs w:val="20"/>
-                <w:u w:val="single"/>
-              </w:rPr>
-              <w:t>Resumenes</w:t>
-            </w:r>
-            <w:proofErr w:type="spellEnd"/>
-          </w:p>
-        </w:tc>
-      </w:tr>
-      <w:tr>
-        <w:trPr>
-          <w:trHeight w:val="480"/>
-        </w:trPr>
-        <w:tc>
-          <w:tcPr>
-            <w:tcW w:w="1560" w:type="dxa"/>
-            <w:tcMar>
-              <w:top w:w="100" w:type="dxa"/>
-              <w:left w:w="100" w:type="dxa"/>
-              <w:bottom w:w="100" w:type="dxa"/>
-              <w:right w:w="100" w:type="dxa"/>
-            </w:tcMar>
-            <w:vAlign w:val="center"/>
-          </w:tcPr>
-          <w:p>
-            <w:pPr>
-              <w:widowControl w:val="0"/>
-              <w:pBdr>
-                <w:top w:val="nil"/>
-                <w:left w:val="nil"/>
-                <w:bottom w:val="nil"/>
-                <w:right w:val="nil"/>
-                <w:between w:val="nil"/>
-              </w:pBdr>
-              <w:spacing w:line="240" w:lineRule="auto"/>
-              <w:jc w:val="center"/>
-            </w:pPr>
-            <w:r>
-              <w:t>Ejercicios Prácticos</w:t>
-            </w:r>
-          </w:p>
-        </w:tc>
-        <w:tc>
-          <w:tcPr>
-            <w:tcW w:w="3237" w:type="dxa"/>
-            <w:tcMar>
-              <w:top w:w="100" w:type="dxa"/>
-              <w:left w:w="100" w:type="dxa"/>
-              <w:bottom w:w="100" w:type="dxa"/>
-              <w:right w:w="100" w:type="dxa"/>
-            </w:tcMar>
-            <w:vAlign w:val="center"/>
-          </w:tcPr>
-          <w:p>
-            <w:pPr>
-              <w:widowControl w:val="0"/>
-              <w:pBdr>
-                <w:top w:val="nil"/>
-                <w:left w:val="nil"/>
-                <w:bottom w:val="nil"/>
-                <w:right w:val="nil"/>
-                <w:between w:val="nil"/>
-              </w:pBdr>
-              <w:spacing w:line="240" w:lineRule="auto"/>
-              <w:jc w:val="center"/>
-              <w:rPr>
-                <w:sz w:val="20"/>
-                <w:szCs w:val="20"/>
-              </w:rPr>
-            </w:pPr>
-            <w:r>
-              <w:rPr>
-                <w:sz w:val="20"/>
-                <w:szCs w:val="20"/>
-              </w:rPr>
-              <w:t>&lt;</w:t>
-            </w:r>
-            <w:proofErr w:type="spellStart"/>
-            <w:r>
-              <w:rPr>
-                <w:sz w:val="20"/>
-                <w:szCs w:val="20"/>
-              </w:rPr>
-              <w:t>NombreDeTema</w:t>
-            </w:r>
-            <w:proofErr w:type="spellEnd"/>
-            <w:r>
-              <w:rPr>
-                <w:sz w:val="20"/>
-                <w:szCs w:val="20"/>
-              </w:rPr>
-              <w:t>&gt;_TP#_&lt;Apellidos</w:t>
-            </w:r>
-            <w:proofErr w:type="gramStart"/>
-            <w:r>
-              <w:rPr>
-                <w:sz w:val="20"/>
-                <w:szCs w:val="20"/>
-              </w:rPr>
-              <w:t>&gt;.&lt;</w:t>
-            </w:r>
-            <w:proofErr w:type="gramEnd"/>
-            <w:r>
-              <w:rPr>
-                <w:sz w:val="20"/>
-                <w:szCs w:val="20"/>
-              </w:rPr>
-              <w:t>Extensión&gt;</w:t>
-            </w:r>
-          </w:p>
-        </w:tc>
-        <w:tc>
-          <w:tcPr>
-            <w:tcW w:w="5662" w:type="dxa"/>
-            <w:tcMar>
-              <w:top w:w="100" w:type="dxa"/>
-              <w:left w:w="100" w:type="dxa"/>
-              <w:bottom w:w="100" w:type="dxa"/>
-              <w:right w:w="100" w:type="dxa"/>
-            </w:tcMar>
-            <w:vAlign w:val="center"/>
-          </w:tcPr>
-          <w:p>
-            <w:pPr>
-              <w:widowControl w:val="0"/>
-              <w:pBdr>
-                <w:top w:val="nil"/>
-                <w:left w:val="nil"/>
-                <w:bottom w:val="nil"/>
-                <w:right w:val="nil"/>
-                <w:between w:val="nil"/>
-              </w:pBdr>
-              <w:spacing w:line="240" w:lineRule="auto"/>
-              <w:jc w:val="center"/>
-            </w:pPr>
-            <w:hyperlink r:id="rId21">
-              <w:proofErr w:type="spellStart"/>
-              <w:r>
-                <w:rPr>
-                  <w:color w:val="1155CC"/>
-                  <w:sz w:val="20"/>
-                  <w:szCs w:val="20"/>
-                  <w:u w:val="single"/>
-                </w:rPr>
-                <w:t>Bibliografia</w:t>
-              </w:r>
-              <w:proofErr w:type="spellEnd"/>
-              <w:r>
-                <w:rPr>
-                  <w:color w:val="1155CC"/>
-                  <w:sz w:val="20"/>
-                  <w:szCs w:val="20"/>
-                  <w:u w:val="single"/>
-                </w:rPr>
-                <w:t>/</w:t>
-              </w:r>
-              <w:proofErr w:type="spellStart"/>
-              <w:r>
-                <w:rPr>
-                  <w:color w:val="1155CC"/>
-                  <w:sz w:val="20"/>
-                  <w:szCs w:val="20"/>
-                  <w:u w:val="single"/>
-                </w:rPr>
-                <w:t>Material_De_Estudio</w:t>
-              </w:r>
-              <w:proofErr w:type="spellEnd"/>
-            </w:hyperlink>
-            <w:r>
-              <w:rPr>
-                <w:color w:val="1155CC"/>
-                <w:sz w:val="20"/>
-                <w:szCs w:val="20"/>
-                <w:u w:val="single"/>
-              </w:rPr>
-              <w:t>/</w:t>
-            </w:r>
-            <w:proofErr w:type="spellStart"/>
-            <w:r>
-              <w:rPr>
-                <w:color w:val="1155CC"/>
-                <w:sz w:val="20"/>
-                <w:szCs w:val="20"/>
-                <w:u w:val="single"/>
-              </w:rPr>
-              <w:t>Ejercicios_Practicos</w:t>
-            </w:r>
-            <w:proofErr w:type="spellEnd"/>
-          </w:p>
-        </w:tc>
-      </w:tr>
-      <w:tr>
-        <w:trPr>
-          <w:trHeight w:val="610"/>
-        </w:trPr>
-        <w:tc>
-          <w:tcPr>
-            <w:tcW w:w="1560" w:type="dxa"/>
-            <w:tcMar>
-              <w:top w:w="100" w:type="dxa"/>
-              <w:left w:w="100" w:type="dxa"/>
-              <w:bottom w:w="100" w:type="dxa"/>
-              <w:right w:w="100" w:type="dxa"/>
-            </w:tcMar>
-            <w:vAlign w:val="center"/>
-          </w:tcPr>
-          <w:p>
-            <w:pPr>
-              <w:widowControl w:val="0"/>
-              <w:pBdr>
-                <w:top w:val="nil"/>
-                <w:left w:val="nil"/>
-                <w:bottom w:val="nil"/>
-                <w:right w:val="nil"/>
-                <w:between w:val="nil"/>
-              </w:pBdr>
-              <w:spacing w:line="240" w:lineRule="auto"/>
-              <w:jc w:val="center"/>
-            </w:pPr>
-            <w:r>
-              <w:t>Bibliografía SCM</w:t>
-            </w:r>
-          </w:p>
-        </w:tc>
-        <w:tc>
-          <w:tcPr>
-            <w:tcW w:w="3237" w:type="dxa"/>
-            <w:tcMar>
-              <w:top w:w="100" w:type="dxa"/>
-              <w:left w:w="100" w:type="dxa"/>
-              <w:bottom w:w="100" w:type="dxa"/>
-              <w:right w:w="100" w:type="dxa"/>
-            </w:tcMar>
-            <w:vAlign w:val="center"/>
-          </w:tcPr>
-          <w:p>
-            <w:pPr>
-              <w:widowControl w:val="0"/>
-              <w:pBdr>
-                <w:top w:val="nil"/>
-                <w:left w:val="nil"/>
-                <w:bottom w:val="nil"/>
-                <w:right w:val="nil"/>
-                <w:between w:val="nil"/>
-              </w:pBdr>
-              <w:spacing w:line="240" w:lineRule="auto"/>
-              <w:jc w:val="center"/>
-              <w:rPr>
-                <w:sz w:val="20"/>
-                <w:szCs w:val="20"/>
-              </w:rPr>
-            </w:pPr>
-            <w:r>
-              <w:rPr>
-                <w:sz w:val="20"/>
-                <w:szCs w:val="20"/>
-              </w:rPr>
-              <w:t>SCM_&lt;</w:t>
-            </w:r>
-            <w:proofErr w:type="spellStart"/>
-            <w:r>
-              <w:rPr>
-                <w:sz w:val="20"/>
-                <w:szCs w:val="20"/>
-              </w:rPr>
-              <w:t>NombreLibro</w:t>
-            </w:r>
-            <w:proofErr w:type="spellEnd"/>
-            <w:r>
-              <w:rPr>
-                <w:sz w:val="20"/>
-                <w:szCs w:val="20"/>
-              </w:rPr>
-              <w:t>&gt;.</w:t>
-            </w:r>
-            <w:proofErr w:type="spellStart"/>
-            <w:r>
-              <w:rPr>
-                <w:sz w:val="20"/>
-                <w:szCs w:val="20"/>
-              </w:rPr>
-              <w:t>pdf</w:t>
-            </w:r>
-            <w:proofErr w:type="spellEnd"/>
+              <w:t>SCM_&lt;NombreLibro&gt;.pdf</w:t>
+            </w:r>
           </w:p>
         </w:tc>
         <w:tc>
@@ -2253,33 +1989,8 @@
                 <w:sz w:val="20"/>
                 <w:szCs w:val="20"/>
               </w:rPr>
-              <w:t>PA_&lt;</w:t>
-            </w:r>
-            <w:proofErr w:type="spellStart"/>
-            <w:r>
-              <w:rPr>
-                <w:sz w:val="20"/>
-                <w:szCs w:val="20"/>
-              </w:rPr>
-              <w:t>NombreLibro</w:t>
-            </w:r>
-            <w:proofErr w:type="spellEnd"/>
-            <w:r>
-              <w:rPr>
-                <w:sz w:val="20"/>
-                <w:szCs w:val="20"/>
-              </w:rPr>
-              <w:t>&gt;.</w:t>
-            </w:r>
-            <w:proofErr w:type="spellStart"/>
-            <w:r>
-              <w:rPr>
-                <w:sz w:val="20"/>
-                <w:szCs w:val="20"/>
-              </w:rPr>
-              <w:t>pdf</w:t>
-            </w:r>
-            <w:proofErr w:type="spellEnd"/>
+              <w:t>PA_&lt;NombreLibro&gt;.pdf</w:t>
+            </w:r>
           </w:p>
         </w:tc>
         <w:tc>
@@ -2390,33 +2101,8 @@
                 <w:sz w:val="20"/>
                 <w:szCs w:val="20"/>
               </w:rPr>
-              <w:t>IS_&lt;</w:t>
-            </w:r>
-            <w:proofErr w:type="spellStart"/>
-            <w:r>
-              <w:rPr>
-                <w:sz w:val="20"/>
-                <w:szCs w:val="20"/>
-              </w:rPr>
-              <w:t>NombreLibro</w:t>
-            </w:r>
-            <w:proofErr w:type="spellEnd"/>
-            <w:r>
-              <w:rPr>
-                <w:sz w:val="20"/>
-                <w:szCs w:val="20"/>
-              </w:rPr>
-              <w:t>&gt;.</w:t>
-            </w:r>
-            <w:proofErr w:type="spellStart"/>
-            <w:r>
-              <w:rPr>
-                <w:sz w:val="20"/>
-                <w:szCs w:val="20"/>
-              </w:rPr>
-              <w:t>pdf</w:t>
-            </w:r>
-            <w:proofErr w:type="spellEnd"/>
+              <w:t>IS_&lt;NombreLibro&gt;.pdf</w:t>
+            </w:r>
           </w:p>
         </w:tc>
         <w:tc>
@@ -2485,19 +2171,11 @@
                 <w:lang w:val="en-US"/>
               </w:rPr>
             </w:pPr>
-            <w:proofErr w:type="spellStart"/>
             <w:r>
               <w:rPr>
                 <w:lang w:val="en-US"/>
               </w:rPr>
-              <w:t>Bibliografía</w:t>
-            </w:r>
-            <w:proofErr w:type="spellEnd"/>
-            <w:r>
-              <w:rPr>
-                <w:lang w:val="en-US"/>
-              </w:rPr>
-              <w:t xml:space="preserve"> de </w:t>
+              <w:t xml:space="preserve">Bibliografía de </w:t>
             </w:r>
             <w:proofErr w:type="gramStart"/>
             <w:r>
@@ -2550,25 +2228,7 @@
                 <w:szCs w:val="20"/>
                 <w:lang w:val="en-US"/>
               </w:rPr>
-              <w:t>TDD_&lt;</w:t>
-            </w:r>
-            <w:proofErr w:type="spellStart"/>
-            <w:r>
-              <w:rPr>
-                <w:sz w:val="20"/>
-                <w:szCs w:val="20"/>
-                <w:lang w:val="en-US"/>
-              </w:rPr>
-              <w:t>NombreLibro</w:t>
-            </w:r>
-            <w:proofErr w:type="spellEnd"/>
-            <w:r>
-              <w:rPr>
-                <w:sz w:val="20"/>
-                <w:szCs w:val="20"/>
-                <w:lang w:val="en-US"/>
-              </w:rPr>
-              <w:t>&gt;.pdf</w:t>
+              <w:t>TDD_&lt;NombreLibro&gt;.pdf</w:t>
             </w:r>
           </w:p>
         </w:tc>
@@ -2673,41 +2333,23 @@
                 <w:sz w:val="20"/>
                 <w:szCs w:val="20"/>
               </w:rPr>
-              <w:t>ISW_TP#_&lt;</w:t>
-            </w:r>
-            <w:proofErr w:type="spellStart"/>
+              <w:t>ISW_TP#_&lt;NombreTrabajoPractico</w:t>
+            </w:r>
+            <w:proofErr w:type="gramStart"/>
             <w:r>
               <w:rPr>
                 <w:sz w:val="20"/>
                 <w:szCs w:val="20"/>
               </w:rPr>
-              <w:t>NombreTrabajoPractico</w:t>
-            </w:r>
-            <w:proofErr w:type="spellEnd"/>
-            <w:proofErr w:type="gramStart"/>
+              <w:t>&gt;.&lt;</w:t>
+            </w:r>
+            <w:proofErr w:type="gramEnd"/>
             <w:r>
               <w:rPr>
                 <w:sz w:val="20"/>
                 <w:szCs w:val="20"/>
               </w:rPr>
-              <w:t>&gt;.&lt;</w:t>
-            </w:r>
-            <w:proofErr w:type="spellStart"/>
-            <w:proofErr w:type="gramEnd"/>
-            <w:r>
-              <w:rPr>
-                <w:sz w:val="20"/>
-                <w:szCs w:val="20"/>
-              </w:rPr>
-              <w:t>Extension</w:t>
-            </w:r>
-            <w:proofErr w:type="spellEnd"/>
-            <w:r>
-              <w:rPr>
-                <w:sz w:val="20"/>
-                <w:szCs w:val="20"/>
-              </w:rPr>
-              <w:t>&gt;</w:t>
+              <w:t>Extension&gt;</w:t>
             </w:r>
           </w:p>
         </w:tc>
@@ -2782,15 +2424,7 @@
               <w:jc w:val="center"/>
             </w:pPr>
             <w:r>
-              <w:t xml:space="preserve">Bibliografía de </w:t>
-            </w:r>
-            <w:proofErr w:type="spellStart"/>
-            <w:r>
-              <w:t>Testing</w:t>
-            </w:r>
-            <w:proofErr w:type="spellEnd"/>
-            <w:r>
-              <w:t xml:space="preserve"> de Software</w:t>
+              <w:t>Bibliografía de Testing de Software</w:t>
             </w:r>
           </w:p>
         </w:tc>
@@ -2827,33 +2461,8 @@
                 <w:sz w:val="20"/>
                 <w:szCs w:val="20"/>
               </w:rPr>
-              <w:t>TS_&lt;</w:t>
-            </w:r>
-            <w:proofErr w:type="spellStart"/>
-            <w:r>
-              <w:rPr>
-                <w:sz w:val="20"/>
-                <w:szCs w:val="20"/>
-              </w:rPr>
-              <w:t>NombreLibro</w:t>
-            </w:r>
-            <w:proofErr w:type="spellEnd"/>
-            <w:r>
-              <w:rPr>
-                <w:sz w:val="20"/>
-                <w:szCs w:val="20"/>
-              </w:rPr>
-              <w:t>&gt;.</w:t>
-            </w:r>
-            <w:proofErr w:type="spellStart"/>
-            <w:r>
-              <w:rPr>
-                <w:sz w:val="20"/>
-                <w:szCs w:val="20"/>
-              </w:rPr>
-              <w:t>pdf</w:t>
-            </w:r>
-            <w:proofErr w:type="spellEnd"/>
+              <w:t>TS_&lt;NombreLibro&gt;.pdf</w:t>
+            </w:r>
           </w:p>
         </w:tc>
         <w:tc>
@@ -2880,6 +2489,14 @@
               <w:spacing w:line="240" w:lineRule="auto"/>
               <w:jc w:val="center"/>
             </w:pPr>
+            <w:hyperlink r:id="rId27" w:history="1">
+              <w:r>
+                <w:rPr>
+                  <w:rStyle w:val="Hipervnculo"/>
+                </w:rPr>
+                <w:t>Bibliografia/Bibliografia_De_La_Catedra/Material_Bibliografico/Testing_de_Software</w:t>
+              </w:r>
+            </w:hyperlink>
           </w:p>
         </w:tc>
       </w:tr>
@@ -2947,10 +2564,10 @@
           <w:noProof/>
         </w:rPr>
         <w:drawing>
-          <wp:inline distT="0" distB="0" distL="0" distR="0" wp14:anchorId="688E91D4" wp14:editId="36C6E597">
-            <wp:extent cx="3390900" cy="6381750"/>
+          <wp:inline distT="0" distB="0" distL="0" distR="0" wp14:anchorId="0405250B" wp14:editId="1F175EF1">
+            <wp:extent cx="4305901" cy="6373114"/>
             <wp:effectExtent l="0" t="0" r="0" b="0"/>
-            <wp:docPr id="1046882243" name="Imagen 1" descr="Texto&#10;&#10;El contenido generado por IA puede ser incorrecto."/>
+            <wp:docPr id="14139827" name="Imagen 1" descr="Texto&#10;&#10;El contenido generado por IA puede ser incorrecto."/>
             <wp:cNvGraphicFramePr>
               <a:graphicFrameLocks xmlns:a="http://schemas.openxmlformats.org/drawingml/2006/main" noChangeAspect="1"/>
             </wp:cNvGraphicFramePr>
@@ -2958,11 +2575,11 @@
               <a:graphicData uri="http://schemas.openxmlformats.org/drawingml/2006/picture">
                 <pic:pic xmlns:pic="http://schemas.openxmlformats.org/drawingml/2006/picture">
                   <pic:nvPicPr>
-                    <pic:cNvPr id="1046882243" name="Imagen 1" descr="Texto&#10;&#10;El contenido generado por IA puede ser incorrecto."/>
+                    <pic:cNvPr id="14139827" name="Imagen 1" descr="Texto&#10;&#10;El contenido generado por IA puede ser incorrecto."/>
                     <pic:cNvPicPr/>
                   </pic:nvPicPr>
                   <pic:blipFill>
-                    <a:blip r:embed="rId27"/>
+                    <a:blip r:embed="rId28"/>
                     <a:stretch>
                       <a:fillRect/>
                     </a:stretch>
@@ -2970,7 +2587,7 @@
                   <pic:spPr>
                     <a:xfrm>
                       <a:off x="0" y="0"/>
-                      <a:ext cx="3390900" cy="6381750"/>
+                      <a:ext cx="4305901" cy="6373114"/>
                     </a:xfrm>
                     <a:prstGeom prst="rect">
                       <a:avLst/>
@@ -3141,15 +2758,7 @@
               </w:rPr>
             </w:pPr>
             <w:r>
-              <w:t>&lt;</w:t>
-            </w:r>
-            <w:proofErr w:type="spellStart"/>
-            <w:r>
-              <w:t>NombreTrabajoPractico</w:t>
-            </w:r>
-            <w:proofErr w:type="spellEnd"/>
-            <w:r>
-              <w:t>&gt;</w:t>
+              <w:t>&lt;NombreTrabajoPractico&gt;</w:t>
             </w:r>
           </w:p>
         </w:tc>
@@ -3263,15 +2872,7 @@
               </w:rPr>
             </w:pPr>
             <w:r>
-              <w:t>&lt;</w:t>
-            </w:r>
-            <w:proofErr w:type="spellStart"/>
-            <w:r>
-              <w:t>NombrePresentación</w:t>
-            </w:r>
-            <w:proofErr w:type="spellEnd"/>
-            <w:r>
-              <w:t>&gt;</w:t>
+              <w:t>&lt;NombrePresentación&gt;</w:t>
             </w:r>
           </w:p>
         </w:tc>
@@ -3360,15 +2961,7 @@
               <w:jc w:val="center"/>
             </w:pPr>
             <w:r>
-              <w:t xml:space="preserve">Fecha correspondiente al </w:t>
-            </w:r>
-            <w:proofErr w:type="spellStart"/>
-            <w:r>
-              <w:t>dia</w:t>
-            </w:r>
-            <w:proofErr w:type="spellEnd"/>
-            <w:r>
-              <w:t xml:space="preserve"> que se tomó la minuta.</w:t>
+              <w:t>Fecha correspondiente al dia que se tomó la minuta.</w:t>
             </w:r>
           </w:p>
         </w:tc>
@@ -3397,15 +2990,7 @@
               </w:rPr>
             </w:pPr>
             <w:r>
-              <w:t>&lt;</w:t>
-            </w:r>
-            <w:proofErr w:type="spellStart"/>
-            <w:r>
-              <w:t>NombreDeTema</w:t>
-            </w:r>
-            <w:proofErr w:type="spellEnd"/>
-            <w:r>
-              <w:t>&gt;</w:t>
+              <w:t>&lt;NombreDeTema&gt;</w:t>
             </w:r>
           </w:p>
         </w:tc>
@@ -3608,21 +3193,8 @@
               <w:jc w:val="center"/>
             </w:pPr>
             <w:r>
-              <w:t>Determina la extensión del archivo identificado como ítem de configuración. Ejemplo: .docx, .</w:t>
-            </w:r>
-            <w:proofErr w:type="spellStart"/>
-            <w:r>
-              <w:t>txt</w:t>
-            </w:r>
-            <w:proofErr w:type="spellEnd"/>
-            <w:r>
-              <w:t xml:space="preserve">, </w:t>
-            </w:r>
-            <w:proofErr w:type="spellStart"/>
-            <w:r>
-              <w:t>etc</w:t>
-            </w:r>
-            <w:proofErr w:type="spellEnd"/>
+              <w:t>Determina la extensión del archivo identificado como ítem de configuración. Ejemplo: .docx, .txt, etc</w:t>
+            </w:r>
           </w:p>
         </w:tc>
       </w:tr>
@@ -3668,15 +3240,7 @@
               <w:jc w:val="center"/>
             </w:pPr>
             <w:r>
-              <w:t xml:space="preserve">Software </w:t>
-            </w:r>
-            <w:proofErr w:type="spellStart"/>
-            <w:r>
-              <w:t>Configuration</w:t>
-            </w:r>
-            <w:proofErr w:type="spellEnd"/>
-            <w:r>
-              <w:t xml:space="preserve"> Management</w:t>
+              <w:t>Software Configuration Management</w:t>
             </w:r>
           </w:p>
         </w:tc>
@@ -3749,15 +3313,7 @@
               <w:jc w:val="center"/>
             </w:pPr>
             <w:r>
-              <w:t>&lt;</w:t>
-            </w:r>
-            <w:proofErr w:type="spellStart"/>
-            <w:r>
-              <w:t>NombreLibro</w:t>
-            </w:r>
-            <w:proofErr w:type="spellEnd"/>
-            <w:r>
-              <w:t xml:space="preserve">&gt; </w:t>
+              <w:t xml:space="preserve">&lt;NombreLibro&gt; </w:t>
             </w:r>
           </w:p>
         </w:tc>
@@ -3871,13 +3427,8 @@
               <w:spacing w:line="240" w:lineRule="auto"/>
               <w:jc w:val="center"/>
             </w:pPr>
-            <w:proofErr w:type="spellStart"/>
-            <w:r>
-              <w:t>Testing</w:t>
-            </w:r>
-            <w:proofErr w:type="spellEnd"/>
-            <w:r>
-              <w:t xml:space="preserve"> de Software</w:t>
+            <w:r>
+              <w:t>Testing de Software</w:t>
             </w:r>
           </w:p>
         </w:tc>

</xml_diff>

<commit_message>
cambio en el glosario
</commit_message>
<xml_diff>
--- a/Plan_Gestion_Configuracion_G4_ISW_4K1.docx
+++ b/Plan_Gestion_Configuracion_G4_ISW_4K1.docx
@@ -1,12 +1,12 @@
 
 <file path=word/document.xml><?xml version="1.0" encoding="utf-8"?>
-<w:document xmlns:wpc="http://schemas.microsoft.com/office/word/2010/wordprocessingCanvas" xmlns:cx="http://schemas.microsoft.com/office/drawing/2014/chartex" xmlns:mc="http://schemas.openxmlformats.org/markup-compatibility/2006" xmlns:o="urn:schemas-microsoft-com:office:office" xmlns:r="http://schemas.openxmlformats.org/officeDocument/2006/relationships" xmlns:m="http://schemas.openxmlformats.org/officeDocument/2006/math" xmlns:v="urn:schemas-microsoft-com:vml" xmlns:wp14="http://schemas.microsoft.com/office/word/2010/wordprocessingDrawing" xmlns:wp="http://schemas.openxmlformats.org/drawingml/2006/wordprocessingDrawing" xmlns:w10="urn:schemas-microsoft-com:office:word" xmlns:w="http://schemas.openxmlformats.org/wordprocessingml/2006/main" xmlns:w14="http://schemas.microsoft.com/office/word/2010/wordml" xmlns:w15="http://schemas.microsoft.com/office/word/2012/wordml" xmlns:w16se="http://schemas.microsoft.com/office/word/2015/wordml/symex" xmlns:wpg="http://schemas.microsoft.com/office/word/2010/wordprocessingGroup" xmlns:wpi="http://schemas.microsoft.com/office/word/2010/wordprocessingInk" xmlns:wne="http://schemas.microsoft.com/office/word/2006/wordml" xmlns:wps="http://schemas.microsoft.com/office/word/2010/wordprocessingShape" mc:Ignorable="w14 w15 w16se wp14">
+<w:document xmlns:wpc="http://schemas.microsoft.com/office/word/2010/wordprocessingCanvas" xmlns:cx="http://schemas.microsoft.com/office/drawing/2014/chartex" xmlns:mc="http://schemas.openxmlformats.org/markup-compatibility/2006" xmlns:o="urn:schemas-microsoft-com:office:office" xmlns:r="http://schemas.openxmlformats.org/officeDocument/2006/relationships" xmlns:m="http://schemas.openxmlformats.org/officeDocument/2006/math" xmlns:v="urn:schemas-microsoft-com:vml" xmlns:wp14="http://schemas.microsoft.com/office/word/2010/wordprocessingDrawing" xmlns:wp="http://schemas.openxmlformats.org/drawingml/2006/wordprocessingDrawing" xmlns:w10="urn:schemas-microsoft-com:office:word" xmlns:w="http://schemas.openxmlformats.org/wordprocessingml/2006/main" xmlns:w14="http://schemas.microsoft.com/office/word/2010/wordml" xmlns:w15="http://schemas.microsoft.com/office/word/2012/wordml" xmlns:w16se="http://schemas.microsoft.com/office/word/2015/wordml/symex" xmlns:wpg="http://schemas.microsoft.com/office/word/2010/wordprocessingGroup" xmlns:wpi="http://schemas.microsoft.com/office/word/2010/wordprocessingInk" xmlns:wne="http://schemas.microsoft.com/office/word/2006/wordml" xmlns:wps="http://schemas.microsoft.com/office/word/2010/wordprocessingShape" xmlns:a="http://schemas.openxmlformats.org/drawingml/2006/main" xmlns:pic="http://schemas.openxmlformats.org/drawingml/2006/picture" mc:Ignorable="w14 w15 w16se wp14">
   <w:body>
     <w:p>
       <w:pPr>
         <w:jc w:val="center"/>
         <w:rPr>
-          <w:rFonts w:ascii="Quattrocento Sans" w:eastAsia="Quattrocento Sans" w:hAnsi="Quattrocento Sans" w:cs="Quattrocento Sans"/>
+          <w:rFonts w:ascii="Quattrocento Sans" w:hAnsi="Quattrocento Sans" w:eastAsia="Quattrocento Sans" w:cs="Quattrocento Sans"/>
           <w:b/>
           <w:sz w:val="32"/>
           <w:szCs w:val="32"/>
@@ -14,7 +14,7 @@
       </w:pPr>
       <w:r>
         <w:rPr>
-          <w:rFonts w:ascii="Quattrocento Sans" w:eastAsia="Quattrocento Sans" w:hAnsi="Quattrocento Sans" w:cs="Quattrocento Sans"/>
+          <w:rFonts w:ascii="Quattrocento Sans" w:hAnsi="Quattrocento Sans" w:eastAsia="Quattrocento Sans" w:cs="Quattrocento Sans"/>
           <w:b/>
           <w:noProof/>
           <w:sz w:val="32"/>
@@ -66,7 +66,7 @@
         <w:spacing w:after="240" w:line="240" w:lineRule="auto"/>
         <w:jc w:val="center"/>
         <w:rPr>
-          <w:rFonts w:ascii="Quattrocento Sans" w:eastAsia="Quattrocento Sans" w:hAnsi="Quattrocento Sans" w:cs="Quattrocento Sans"/>
+          <w:rFonts w:ascii="Quattrocento Sans" w:hAnsi="Quattrocento Sans" w:eastAsia="Quattrocento Sans" w:cs="Quattrocento Sans"/>
           <w:b/>
           <w:sz w:val="32"/>
           <w:szCs w:val="32"/>
@@ -74,7 +74,7 @@
       </w:pPr>
       <w:r>
         <w:rPr>
-          <w:rFonts w:ascii="Quattrocento Sans" w:eastAsia="Quattrocento Sans" w:hAnsi="Quattrocento Sans" w:cs="Quattrocento Sans"/>
+          <w:rFonts w:ascii="Quattrocento Sans" w:hAnsi="Quattrocento Sans" w:eastAsia="Quattrocento Sans" w:cs="Quattrocento Sans"/>
           <w:sz w:val="32"/>
           <w:szCs w:val="32"/>
         </w:rPr>
@@ -82,30 +82,52 @@
       </w:r>
       <w:r>
         <w:rPr>
-          <w:rFonts w:ascii="Quattrocento Sans" w:eastAsia="Quattrocento Sans" w:hAnsi="Quattrocento Sans" w:cs="Quattrocento Sans"/>
+          <w:rFonts w:ascii="Quattrocento Sans" w:hAnsi="Quattrocento Sans" w:eastAsia="Quattrocento Sans" w:cs="Quattrocento Sans"/>
           <w:sz w:val="32"/>
           <w:szCs w:val="32"/>
         </w:rPr>
         <w:br/>
+      </w:r>
+      <w:r>
+        <w:rPr>
+          <w:rFonts w:ascii="Quattrocento Sans" w:hAnsi="Quattrocento Sans" w:eastAsia="Quattrocento Sans" w:cs="Quattrocento Sans"/>
+          <w:sz w:val="32"/>
+          <w:szCs w:val="32"/>
+        </w:rPr>
         <w:t>Facultad Regional Córdoba</w:t>
       </w:r>
       <w:r>
         <w:rPr>
-          <w:rFonts w:ascii="Quattrocento Sans" w:eastAsia="Quattrocento Sans" w:hAnsi="Quattrocento Sans" w:cs="Quattrocento Sans"/>
+          <w:rFonts w:ascii="Quattrocento Sans" w:hAnsi="Quattrocento Sans" w:eastAsia="Quattrocento Sans" w:cs="Quattrocento Sans"/>
           <w:sz w:val="32"/>
           <w:szCs w:val="32"/>
         </w:rPr>
         <w:br/>
+      </w:r>
+      <w:r>
+        <w:rPr>
+          <w:rFonts w:ascii="Quattrocento Sans" w:hAnsi="Quattrocento Sans" w:eastAsia="Quattrocento Sans" w:cs="Quattrocento Sans"/>
+          <w:sz w:val="32"/>
+          <w:szCs w:val="32"/>
+        </w:rPr>
         <w:t>Ingeniería y Calidad de Software (ISW)</w:t>
       </w:r>
       <w:r>
         <w:rPr>
-          <w:rFonts w:ascii="Quattrocento Sans" w:eastAsia="Quattrocento Sans" w:hAnsi="Quattrocento Sans" w:cs="Quattrocento Sans"/>
+          <w:rFonts w:ascii="Quattrocento Sans" w:hAnsi="Quattrocento Sans" w:eastAsia="Quattrocento Sans" w:cs="Quattrocento Sans"/>
           <w:b/>
           <w:sz w:val="32"/>
           <w:szCs w:val="32"/>
         </w:rPr>
         <w:br/>
+      </w:r>
+      <w:r>
+        <w:rPr>
+          <w:rFonts w:ascii="Quattrocento Sans" w:hAnsi="Quattrocento Sans" w:eastAsia="Quattrocento Sans" w:cs="Quattrocento Sans"/>
+          <w:b/>
+          <w:sz w:val="32"/>
+          <w:szCs w:val="32"/>
+        </w:rPr>
         <w:t>Gestión de Configuración del Software</w:t>
       </w:r>
     </w:p>
@@ -171,7 +193,7 @@
           <w:szCs w:val="20"/>
         </w:rPr>
         <w:sectPr>
-          <w:pgSz w:w="11909" w:h="16834"/>
+          <w:pgSz w:w="11909" w:h="16834" w:orient="portrait"/>
           <w:pgMar w:top="720" w:right="720" w:bottom="720" w:left="720" w:header="720" w:footer="720" w:gutter="0"/>
           <w:pgNumType w:start="1"/>
           <w:cols w:space="720"/>
@@ -201,7 +223,6 @@
           <w:sz w:val="24"/>
           <w:szCs w:val="24"/>
         </w:rPr>
-        <w:lastRenderedPageBreak/>
         <w:t>Docentes</w:t>
       </w:r>
     </w:p>
@@ -237,6 +258,12 @@
           <w:szCs w:val="24"/>
         </w:rPr>
         <w:tab/>
+      </w:r>
+      <w:r>
+        <w:rPr>
+          <w:sz w:val="24"/>
+          <w:szCs w:val="24"/>
+        </w:rPr>
         <w:t xml:space="preserve">Ing. </w:t>
       </w:r>
       <w:r>
@@ -355,7 +382,6 @@
           <w:szCs w:val="24"/>
           <w:lang w:val="en-US"/>
         </w:rPr>
-        <w:lastRenderedPageBreak/>
         <w:tab/>
       </w:r>
       <w:r>
@@ -421,12 +447,12 @@
         </w:rPr>
         <w:sectPr>
           <w:type w:val="continuous"/>
-          <w:pgSz w:w="11909" w:h="16834"/>
+          <w:pgSz w:w="11909" w:h="16834" w:orient="portrait"/>
           <w:pgMar w:top="720" w:right="720" w:bottom="720" w:left="720" w:header="720" w:footer="720" w:gutter="0"/>
           <w:pgNumType w:start="1"/>
-          <w:cols w:num="2" w:space="720" w:equalWidth="0">
+          <w:cols w:equalWidth="0" w:space="720" w:num="2">
             <w:col w:w="4874" w:space="720"/>
-            <w:col w:w="4874" w:space="0"/>
+            <w:col w:w="4874"/>
           </w:cols>
         </w:sectPr>
       </w:pPr>
@@ -477,12 +503,12 @@
         <w:tblW w:w="10439" w:type="dxa"/>
         <w:tblInd w:w="0" w:type="dxa"/>
         <w:tblBorders>
-          <w:top w:val="single" w:sz="12" w:space="0" w:color="000000"/>
-          <w:left w:val="single" w:sz="12" w:space="0" w:color="000000"/>
-          <w:bottom w:val="single" w:sz="12" w:space="0" w:color="000000"/>
-          <w:right w:val="single" w:sz="12" w:space="0" w:color="000000"/>
-          <w:insideH w:val="single" w:sz="12" w:space="0" w:color="000000"/>
-          <w:insideV w:val="single" w:sz="12" w:space="0" w:color="000000"/>
+          <w:top w:val="single" w:color="000000" w:sz="12" w:space="0"/>
+          <w:left w:val="single" w:color="000000" w:sz="12" w:space="0"/>
+          <w:bottom w:val="single" w:color="000000" w:sz="12" w:space="0"/>
+          <w:right w:val="single" w:color="000000" w:sz="12" w:space="0"/>
+          <w:insideH w:val="single" w:color="000000" w:sz="12" w:space="0"/>
+          <w:insideV w:val="single" w:color="000000" w:sz="12" w:space="0"/>
         </w:tblBorders>
         <w:tblLayout w:type="fixed"/>
         <w:tblLook w:val="0400" w:firstRow="0" w:lastRow="0" w:firstColumn="0" w:lastColumn="0" w:noHBand="0" w:noVBand="1"/>
@@ -1117,7 +1143,7 @@
         </w:rPr>
         <w:sectPr>
           <w:type w:val="continuous"/>
-          <w:pgSz w:w="11909" w:h="16834"/>
+          <w:pgSz w:w="11909" w:h="16834" w:orient="portrait"/>
           <w:pgMar w:top="720" w:right="720" w:bottom="720" w:left="720" w:header="720" w:footer="720" w:gutter="0"/>
           <w:pgNumType w:start="1"/>
           <w:cols w:space="720"/>
@@ -1144,7 +1170,6 @@
           <w:szCs w:val="30"/>
           <w:u w:val="single"/>
         </w:rPr>
-        <w:lastRenderedPageBreak/>
         <w:t>Ítems de configuración</w:t>
       </w:r>
     </w:p>
@@ -1155,12 +1180,12 @@
         <w:tblW w:w="10459" w:type="dxa"/>
         <w:tblInd w:w="-10" w:type="dxa"/>
         <w:tblBorders>
-          <w:top w:val="single" w:sz="8" w:space="0" w:color="000000"/>
-          <w:left w:val="single" w:sz="8" w:space="0" w:color="000000"/>
-          <w:bottom w:val="single" w:sz="8" w:space="0" w:color="000000"/>
-          <w:right w:val="single" w:sz="8" w:space="0" w:color="000000"/>
-          <w:insideH w:val="single" w:sz="8" w:space="0" w:color="000000"/>
-          <w:insideV w:val="single" w:sz="8" w:space="0" w:color="000000"/>
+          <w:top w:val="single" w:color="000000" w:sz="8" w:space="0"/>
+          <w:left w:val="single" w:color="000000" w:sz="8" w:space="0"/>
+          <w:bottom w:val="single" w:color="000000" w:sz="8" w:space="0"/>
+          <w:right w:val="single" w:color="000000" w:sz="8" w:space="0"/>
+          <w:insideH w:val="single" w:color="000000" w:sz="8" w:space="0"/>
+          <w:insideV w:val="single" w:color="000000" w:sz="8" w:space="0"/>
         </w:tblBorders>
         <w:tblLayout w:type="fixed"/>
         <w:tblLook w:val="0600" w:firstRow="0" w:lastRow="0" w:firstColumn="0" w:lastColumn="0" w:noHBand="1" w:noVBand="1"/>
@@ -2485,7 +2510,7 @@
               <w:spacing w:line="240" w:lineRule="auto"/>
               <w:jc w:val="center"/>
             </w:pPr>
-            <w:hyperlink r:id="rId24" w:history="1">
+            <w:hyperlink w:history="1" r:id="rId24">
               <w:r>
                 <w:rPr>
                   <w:rStyle w:val="Hipervnculo"/>
@@ -2624,7 +2649,7 @@
               <w:spacing w:line="240" w:lineRule="auto"/>
               <w:jc w:val="center"/>
             </w:pPr>
-            <w:hyperlink r:id="rId25" w:history="1">
+            <w:hyperlink w:history="1" r:id="rId25">
               <w:r>
                 <w:rPr>
                   <w:rStyle w:val="Hipervnculo"/>
@@ -2906,7 +2931,7 @@
               <w:spacing w:line="240" w:lineRule="auto"/>
               <w:jc w:val="center"/>
             </w:pPr>
-            <w:hyperlink r:id="rId27" w:history="1">
+            <w:hyperlink w:history="1" r:id="rId27">
               <w:r>
                 <w:rPr>
                   <w:rStyle w:val="Hipervnculo"/>
@@ -3060,7 +3085,7 @@
               <w:spacing w:line="240" w:lineRule="auto"/>
               <w:jc w:val="center"/>
             </w:pPr>
-            <w:hyperlink r:id="rId28" w:history="1">
+            <w:hyperlink w:history="1" r:id="rId28">
               <w:r>
                 <w:rPr>
                   <w:rStyle w:val="Hipervnculo"/>
@@ -3122,7 +3147,7 @@
           <w:u w:val="single"/>
         </w:rPr>
         <w:sectPr>
-          <w:pgSz w:w="11909" w:h="16834"/>
+          <w:pgSz w:w="11909" w:h="16834" w:orient="portrait"/>
           <w:pgMar w:top="720" w:right="720" w:bottom="720" w:left="720" w:header="720" w:footer="720" w:gutter="0"/>
           <w:pgNumType w:start="1"/>
           <w:cols w:space="720"/>
@@ -3146,7 +3171,6 @@
           <w:szCs w:val="30"/>
           <w:u w:val="single"/>
         </w:rPr>
-        <w:lastRenderedPageBreak/>
         <w:t>Estructura del repositorio</w:t>
       </w:r>
     </w:p>
@@ -3165,7 +3189,7 @@
       <w:pPr>
         <w:jc w:val="center"/>
         <w:sectPr>
-          <w:pgSz w:w="11909" w:h="16834"/>
+          <w:pgSz w:w="11909" w:h="16834" w:orient="portrait"/>
           <w:pgMar w:top="1440" w:right="1440" w:bottom="1440" w:left="1440" w:header="720" w:footer="720" w:gutter="0"/>
           <w:cols w:space="720"/>
         </w:sectPr>
@@ -3229,7 +3253,6 @@
           <w:szCs w:val="30"/>
           <w:u w:val="single"/>
         </w:rPr>
-        <w:lastRenderedPageBreak/>
         <w:t>Glosario</w:t>
       </w:r>
     </w:p>
@@ -3246,17 +3269,16 @@
     </w:p>
     <w:tbl>
       <w:tblPr>
-        <w:tblStyle w:val="a1"/>
         <w:tblW w:w="9029" w:type="dxa"/>
         <w:jc w:val="center"/>
         <w:tblInd w:w="0" w:type="dxa"/>
         <w:tblBorders>
-          <w:top w:val="single" w:sz="8" w:space="0" w:color="000000"/>
-          <w:left w:val="single" w:sz="8" w:space="0" w:color="000000"/>
-          <w:bottom w:val="single" w:sz="8" w:space="0" w:color="000000"/>
-          <w:right w:val="single" w:sz="8" w:space="0" w:color="000000"/>
-          <w:insideH w:val="single" w:sz="8" w:space="0" w:color="000000"/>
-          <w:insideV w:val="single" w:sz="8" w:space="0" w:color="000000"/>
+          <w:top w:val="single" w:color="000000" w:themeColor="text1" w:sz="8" w:space="0"/>
+          <w:left w:val="single" w:color="000000" w:themeColor="text1" w:sz="8" w:space="0"/>
+          <w:bottom w:val="single" w:color="000000" w:themeColor="text1" w:sz="8" w:space="0"/>
+          <w:right w:val="single" w:color="000000" w:themeColor="text1" w:sz="8" w:space="0"/>
+          <w:insideH w:val="single" w:color="000000" w:themeColor="text1" w:sz="8" w:space="0"/>
+          <w:insideV w:val="single" w:color="000000" w:themeColor="text1" w:sz="8" w:space="0"/>
         </w:tblBorders>
         <w:tblLayout w:type="fixed"/>
         <w:tblLook w:val="0600" w:firstRow="0" w:lastRow="0" w:firstColumn="0" w:lastColumn="0" w:noHBand="1" w:noVBand="1"/>
@@ -3266,9 +3288,7 @@
         <w:gridCol w:w="4515"/>
       </w:tblGrid>
       <w:tr>
-        <w:trPr>
-          <w:jc w:val="center"/>
-        </w:trPr>
+        <w:trPr/>
         <w:tc>
           <w:tcPr>
             <w:tcW w:w="4514" w:type="dxa"/>
@@ -3347,9 +3367,7 @@
         </w:tc>
       </w:tr>
       <w:tr>
-        <w:trPr>
-          <w:jc w:val="center"/>
-        </w:trPr>
+        <w:trPr/>
         <w:tc>
           <w:tcPr>
             <w:tcW w:w="4514" w:type="dxa"/>
@@ -3412,9 +3430,7 @@
         </w:tc>
       </w:tr>
       <w:tr>
-        <w:trPr>
-          <w:jc w:val="center"/>
-        </w:trPr>
+        <w:trPr/>
         <w:tc>
           <w:tcPr>
             <w:tcW w:w="4514" w:type="dxa"/>
@@ -3469,9 +3485,7 @@
         </w:tc>
       </w:tr>
       <w:tr>
-        <w:trPr>
-          <w:jc w:val="center"/>
-        </w:trPr>
+        <w:trPr/>
         <w:tc>
           <w:tcPr>
             <w:tcW w:w="4514" w:type="dxa"/>
@@ -3534,9 +3548,7 @@
         </w:tc>
       </w:tr>
       <w:tr>
-        <w:trPr>
-          <w:jc w:val="center"/>
-        </w:trPr>
+        <w:trPr/>
         <w:tc>
           <w:tcPr>
             <w:tcW w:w="4514" w:type="dxa"/>
@@ -3603,9 +3615,7 @@
         </w:tc>
       </w:tr>
       <w:tr>
-        <w:trPr>
-          <w:jc w:val="center"/>
-        </w:trPr>
+        <w:trPr/>
         <w:tc>
           <w:tcPr>
             <w:tcW w:w="4514" w:type="dxa"/>
@@ -3674,9 +3684,7 @@
         </w:tc>
       </w:tr>
       <w:tr>
-        <w:trPr>
-          <w:jc w:val="center"/>
-        </w:trPr>
+        <w:trPr/>
         <w:tc>
           <w:tcPr>
             <w:tcW w:w="4514" w:type="dxa"/>
@@ -3734,9 +3742,7 @@
         </w:tc>
       </w:tr>
       <w:tr>
-        <w:trPr>
-          <w:jc w:val="center"/>
-        </w:trPr>
+        <w:trPr/>
         <w:tc>
           <w:tcPr>
             <w:tcW w:w="4514" w:type="dxa"/>
@@ -3788,9 +3794,7 @@
         </w:tc>
       </w:tr>
       <w:tr>
-        <w:trPr>
-          <w:jc w:val="center"/>
-        </w:trPr>
+        <w:trPr/>
         <w:tc>
           <w:tcPr>
             <w:tcW w:w="4514" w:type="dxa"/>
@@ -3829,37 +3833,299 @@
               <w:jc w:val="center"/>
             </w:pPr>
             <w:r>
+              <w:rPr/>
               <w:t>Determina la extensión del archivo identificado como ítem de configuración. Ejemplo: .</w:t>
             </w:r>
+            <w:r>
+              <w:rPr/>
+              <w:t>docx</w:t>
+            </w:r>
+            <w:r>
+              <w:rPr/>
+              <w:t>, .</w:t>
+            </w:r>
+            <w:r>
+              <w:rPr/>
+              <w:t>txt</w:t>
+            </w:r>
+            <w:bookmarkStart w:name="_GoBack" w:id="0"/>
+            <w:bookmarkEnd w:id="0"/>
+            <w:r>
+              <w:rPr/>
+              <w:t>,</w:t>
+            </w:r>
+            <w:r>
+              <w:rPr/>
+              <w:t xml:space="preserve"> </w:t>
+            </w:r>
+            <w:r>
+              <w:rPr/>
+              <w:t>jpg</w:t>
+            </w:r>
+            <w:r>
+              <w:rPr/>
+              <w:t>, png</w:t>
+            </w:r>
+            <w:r>
+              <w:rPr/>
+              <w:t xml:space="preserve"> </w:t>
+            </w:r>
+            <w:r>
+              <w:rPr/>
+              <w:t>etc</w:t>
+            </w:r>
+          </w:p>
+        </w:tc>
+      </w:tr>
+      <w:tr>
+        <w:trPr/>
+        <w:tc>
+          <w:tcPr>
+            <w:tcW w:w="4514" w:type="dxa"/>
+            <w:tcMar>
+              <w:top w:w="100" w:type="dxa"/>
+              <w:left w:w="100" w:type="dxa"/>
+              <w:bottom w:w="100" w:type="dxa"/>
+              <w:right w:w="100" w:type="dxa"/>
+            </w:tcMar>
+          </w:tcPr>
+          <w:p>
+            <w:pPr>
+              <w:widowControl w:val="0"/>
+              <w:spacing w:line="240" w:lineRule="auto"/>
+              <w:jc w:val="center"/>
+            </w:pPr>
+            <w:r>
+              <w:t>SCM</w:t>
+            </w:r>
+          </w:p>
+        </w:tc>
+        <w:tc>
+          <w:tcPr>
+            <w:tcW w:w="4515" w:type="dxa"/>
+            <w:tcMar>
+              <w:top w:w="100" w:type="dxa"/>
+              <w:left w:w="100" w:type="dxa"/>
+              <w:bottom w:w="100" w:type="dxa"/>
+              <w:right w:w="100" w:type="dxa"/>
+            </w:tcMar>
+          </w:tcPr>
+          <w:p>
+            <w:pPr>
+              <w:widowControl w:val="0"/>
+              <w:spacing w:line="240" w:lineRule="auto"/>
+              <w:jc w:val="center"/>
+            </w:pPr>
+            <w:r>
+              <w:t xml:space="preserve">Software </w:t>
+            </w:r>
             <w:proofErr w:type="spellStart"/>
             <w:r>
-              <w:t>docx</w:t>
+              <w:t>Configuration</w:t>
             </w:r>
             <w:proofErr w:type="spellEnd"/>
             <w:r>
-              <w:t>, .</w:t>
+              <w:t xml:space="preserve"> Management</w:t>
+            </w:r>
+          </w:p>
+        </w:tc>
+      </w:tr>
+      <w:tr>
+        <w:trPr/>
+        <w:tc>
+          <w:tcPr>
+            <w:tcW w:w="4514" w:type="dxa"/>
+            <w:tcMar>
+              <w:top w:w="100" w:type="dxa"/>
+              <w:left w:w="100" w:type="dxa"/>
+              <w:bottom w:w="100" w:type="dxa"/>
+              <w:right w:w="100" w:type="dxa"/>
+            </w:tcMar>
+          </w:tcPr>
+          <w:p>
+            <w:pPr>
+              <w:widowControl w:val="0"/>
+              <w:spacing w:line="240" w:lineRule="auto"/>
+              <w:jc w:val="center"/>
+            </w:pPr>
+            <w:r>
+              <w:t>PA</w:t>
+            </w:r>
+          </w:p>
+        </w:tc>
+        <w:tc>
+          <w:tcPr>
+            <w:tcW w:w="4515" w:type="dxa"/>
+            <w:tcMar>
+              <w:top w:w="100" w:type="dxa"/>
+              <w:left w:w="100" w:type="dxa"/>
+              <w:bottom w:w="100" w:type="dxa"/>
+              <w:right w:w="100" w:type="dxa"/>
+            </w:tcMar>
+          </w:tcPr>
+          <w:p>
+            <w:pPr>
+              <w:widowControl w:val="0"/>
+              <w:spacing w:line="240" w:lineRule="auto"/>
+              <w:jc w:val="center"/>
+            </w:pPr>
+            <w:r>
+              <w:t>Pensamiento Ágil</w:t>
+            </w:r>
+          </w:p>
+        </w:tc>
+      </w:tr>
+      <w:tr>
+        <w:trPr/>
+        <w:tc>
+          <w:tcPr>
+            <w:tcW w:w="4514" w:type="dxa"/>
+            <w:tcMar>
+              <w:top w:w="100" w:type="dxa"/>
+              <w:left w:w="100" w:type="dxa"/>
+              <w:bottom w:w="100" w:type="dxa"/>
+              <w:right w:w="100" w:type="dxa"/>
+            </w:tcMar>
+          </w:tcPr>
+          <w:p>
+            <w:pPr>
+              <w:widowControl w:val="0"/>
+              <w:spacing w:line="240" w:lineRule="auto"/>
+              <w:jc w:val="center"/>
+            </w:pPr>
+            <w:r>
+              <w:t>&lt;</w:t>
             </w:r>
             <w:proofErr w:type="spellStart"/>
             <w:r>
-              <w:t>txt</w:t>
-            </w:r>
-            <w:bookmarkStart w:id="0" w:name="_GoBack"/>
-            <w:bookmarkEnd w:id="0"/>
+              <w:t>NombreLibro</w:t>
+            </w:r>
             <w:proofErr w:type="spellEnd"/>
             <w:r>
-              <w:t xml:space="preserve">, </w:t>
-            </w:r>
+              <w:t xml:space="preserve">&gt; </w:t>
+            </w:r>
+          </w:p>
+        </w:tc>
+        <w:tc>
+          <w:tcPr>
+            <w:tcW w:w="4515" w:type="dxa"/>
+            <w:tcMar>
+              <w:top w:w="100" w:type="dxa"/>
+              <w:left w:w="100" w:type="dxa"/>
+              <w:bottom w:w="100" w:type="dxa"/>
+              <w:right w:w="100" w:type="dxa"/>
+            </w:tcMar>
+          </w:tcPr>
+          <w:p>
+            <w:pPr>
+              <w:widowControl w:val="0"/>
+              <w:spacing w:line="240" w:lineRule="auto"/>
+              <w:jc w:val="center"/>
+            </w:pPr>
+            <w:r>
+              <w:t>Nombre que permite identificar unívocamente a los libros de la catedra.</w:t>
+            </w:r>
+          </w:p>
+        </w:tc>
+      </w:tr>
+      <w:tr>
+        <w:trPr/>
+        <w:tc>
+          <w:tcPr>
+            <w:tcW w:w="4514" w:type="dxa"/>
+            <w:tcMar>
+              <w:top w:w="100" w:type="dxa"/>
+              <w:left w:w="100" w:type="dxa"/>
+              <w:bottom w:w="100" w:type="dxa"/>
+              <w:right w:w="100" w:type="dxa"/>
+            </w:tcMar>
+          </w:tcPr>
+          <w:p>
+            <w:pPr>
+              <w:widowControl w:val="0"/>
+              <w:spacing w:line="240" w:lineRule="auto"/>
+              <w:jc w:val="center"/>
+            </w:pPr>
+            <w:r>
+              <w:t>IS</w:t>
+            </w:r>
+          </w:p>
+        </w:tc>
+        <w:tc>
+          <w:tcPr>
+            <w:tcW w:w="4515" w:type="dxa"/>
+            <w:tcMar>
+              <w:top w:w="100" w:type="dxa"/>
+              <w:left w:w="100" w:type="dxa"/>
+              <w:bottom w:w="100" w:type="dxa"/>
+              <w:right w:w="100" w:type="dxa"/>
+            </w:tcMar>
+          </w:tcPr>
+          <w:p>
+            <w:pPr>
+              <w:widowControl w:val="0"/>
+              <w:spacing w:line="240" w:lineRule="auto"/>
+              <w:jc w:val="center"/>
+            </w:pPr>
+            <w:r>
+              <w:t>Ingeniería de Software</w:t>
+            </w:r>
+          </w:p>
+        </w:tc>
+      </w:tr>
+      <w:tr>
+        <w:trPr/>
+        <w:tc>
+          <w:tcPr>
+            <w:tcW w:w="4514" w:type="dxa"/>
+            <w:tcMar>
+              <w:top w:w="100" w:type="dxa"/>
+              <w:left w:w="100" w:type="dxa"/>
+              <w:bottom w:w="100" w:type="dxa"/>
+              <w:right w:w="100" w:type="dxa"/>
+            </w:tcMar>
+          </w:tcPr>
+          <w:p>
+            <w:pPr>
+              <w:widowControl w:val="0"/>
+              <w:spacing w:line="240" w:lineRule="auto"/>
+              <w:jc w:val="center"/>
+            </w:pPr>
+            <w:r>
+              <w:t>TS</w:t>
+            </w:r>
+          </w:p>
+        </w:tc>
+        <w:tc>
+          <w:tcPr>
+            <w:tcW w:w="4515" w:type="dxa"/>
+            <w:tcMar>
+              <w:top w:w="100" w:type="dxa"/>
+              <w:left w:w="100" w:type="dxa"/>
+              <w:bottom w:w="100" w:type="dxa"/>
+              <w:right w:w="100" w:type="dxa"/>
+            </w:tcMar>
+          </w:tcPr>
+          <w:p>
+            <w:pPr>
+              <w:widowControl w:val="0"/>
+              <w:spacing w:line="240" w:lineRule="auto"/>
+              <w:jc w:val="center"/>
+            </w:pPr>
             <w:proofErr w:type="spellStart"/>
             <w:r>
-              <w:t>etc</w:t>
+              <w:t>Testing</w:t>
             </w:r>
             <w:proofErr w:type="spellEnd"/>
+            <w:r>
+              <w:t xml:space="preserve"> de Software</w:t>
+            </w:r>
           </w:p>
         </w:tc>
       </w:tr>
       <w:tr>
         <w:trPr>
-          <w:jc w:val="center"/>
+          <w:trHeight w:val="300"/>
         </w:trPr>
         <w:tc>
           <w:tcPr>
@@ -3873,12 +4139,20 @@
           </w:tcPr>
           <w:p>
             <w:pPr>
-              <w:widowControl w:val="0"/>
-              <w:spacing w:line="240" w:lineRule="auto"/>
-              <w:jc w:val="center"/>
-            </w:pPr>
-            <w:r>
-              <w:t>SCM</w:t>
+              <w:pStyle w:val="Normal"/>
+              <w:spacing w:line="240" w:lineRule="auto"/>
+              <w:jc w:val="center"/>
+              <w:rPr>
+                <w:sz w:val="20"/>
+                <w:szCs w:val="20"/>
+              </w:rPr>
+            </w:pPr>
+            <w:r>
+              <w:rPr>
+                <w:sz w:val="20"/>
+                <w:szCs w:val="20"/>
+              </w:rPr>
+              <w:t>&lt;NombreDescriptivo&gt;</w:t>
             </w:r>
           </w:p>
         </w:tc>
@@ -3894,221 +4168,13 @@
           </w:tcPr>
           <w:p>
             <w:pPr>
-              <w:widowControl w:val="0"/>
-              <w:spacing w:line="240" w:lineRule="auto"/>
-              <w:jc w:val="center"/>
-            </w:pPr>
-            <w:r>
-              <w:t xml:space="preserve">Software </w:t>
-            </w:r>
-            <w:proofErr w:type="spellStart"/>
-            <w:r>
-              <w:t>Configuration</w:t>
-            </w:r>
-            <w:proofErr w:type="spellEnd"/>
-            <w:r>
-              <w:t xml:space="preserve"> Management</w:t>
-            </w:r>
-          </w:p>
-        </w:tc>
-      </w:tr>
-      <w:tr>
-        <w:trPr>
-          <w:jc w:val="center"/>
-        </w:trPr>
-        <w:tc>
-          <w:tcPr>
-            <w:tcW w:w="4514" w:type="dxa"/>
-            <w:tcMar>
-              <w:top w:w="100" w:type="dxa"/>
-              <w:left w:w="100" w:type="dxa"/>
-              <w:bottom w:w="100" w:type="dxa"/>
-              <w:right w:w="100" w:type="dxa"/>
-            </w:tcMar>
-          </w:tcPr>
-          <w:p>
-            <w:pPr>
-              <w:widowControl w:val="0"/>
-              <w:spacing w:line="240" w:lineRule="auto"/>
-              <w:jc w:val="center"/>
-            </w:pPr>
-            <w:r>
-              <w:t>PA</w:t>
-            </w:r>
-          </w:p>
-        </w:tc>
-        <w:tc>
-          <w:tcPr>
-            <w:tcW w:w="4515" w:type="dxa"/>
-            <w:tcMar>
-              <w:top w:w="100" w:type="dxa"/>
-              <w:left w:w="100" w:type="dxa"/>
-              <w:bottom w:w="100" w:type="dxa"/>
-              <w:right w:w="100" w:type="dxa"/>
-            </w:tcMar>
-          </w:tcPr>
-          <w:p>
-            <w:pPr>
-              <w:widowControl w:val="0"/>
-              <w:spacing w:line="240" w:lineRule="auto"/>
-              <w:jc w:val="center"/>
-            </w:pPr>
-            <w:r>
-              <w:t>Pensamiento Ágil</w:t>
-            </w:r>
-          </w:p>
-        </w:tc>
-      </w:tr>
-      <w:tr>
-        <w:trPr>
-          <w:jc w:val="center"/>
-        </w:trPr>
-        <w:tc>
-          <w:tcPr>
-            <w:tcW w:w="4514" w:type="dxa"/>
-            <w:tcMar>
-              <w:top w:w="100" w:type="dxa"/>
-              <w:left w:w="100" w:type="dxa"/>
-              <w:bottom w:w="100" w:type="dxa"/>
-              <w:right w:w="100" w:type="dxa"/>
-            </w:tcMar>
-          </w:tcPr>
-          <w:p>
-            <w:pPr>
-              <w:widowControl w:val="0"/>
-              <w:spacing w:line="240" w:lineRule="auto"/>
-              <w:jc w:val="center"/>
-            </w:pPr>
-            <w:r>
-              <w:t>&lt;</w:t>
-            </w:r>
-            <w:proofErr w:type="spellStart"/>
-            <w:r>
-              <w:t>NombreLibro</w:t>
-            </w:r>
-            <w:proofErr w:type="spellEnd"/>
-            <w:r>
-              <w:t xml:space="preserve">&gt; </w:t>
-            </w:r>
-          </w:p>
-        </w:tc>
-        <w:tc>
-          <w:tcPr>
-            <w:tcW w:w="4515" w:type="dxa"/>
-            <w:tcMar>
-              <w:top w:w="100" w:type="dxa"/>
-              <w:left w:w="100" w:type="dxa"/>
-              <w:bottom w:w="100" w:type="dxa"/>
-              <w:right w:w="100" w:type="dxa"/>
-            </w:tcMar>
-          </w:tcPr>
-          <w:p>
-            <w:pPr>
-              <w:widowControl w:val="0"/>
-              <w:spacing w:line="240" w:lineRule="auto"/>
-              <w:jc w:val="center"/>
-            </w:pPr>
-            <w:r>
-              <w:t>Nombre que permite identificar unívocamente a los libros de la catedra.</w:t>
-            </w:r>
-          </w:p>
-        </w:tc>
-      </w:tr>
-      <w:tr>
-        <w:trPr>
-          <w:jc w:val="center"/>
-        </w:trPr>
-        <w:tc>
-          <w:tcPr>
-            <w:tcW w:w="4514" w:type="dxa"/>
-            <w:tcMar>
-              <w:top w:w="100" w:type="dxa"/>
-              <w:left w:w="100" w:type="dxa"/>
-              <w:bottom w:w="100" w:type="dxa"/>
-              <w:right w:w="100" w:type="dxa"/>
-            </w:tcMar>
-          </w:tcPr>
-          <w:p>
-            <w:pPr>
-              <w:widowControl w:val="0"/>
-              <w:spacing w:line="240" w:lineRule="auto"/>
-              <w:jc w:val="center"/>
-            </w:pPr>
-            <w:r>
-              <w:t>IS</w:t>
-            </w:r>
-          </w:p>
-        </w:tc>
-        <w:tc>
-          <w:tcPr>
-            <w:tcW w:w="4515" w:type="dxa"/>
-            <w:tcMar>
-              <w:top w:w="100" w:type="dxa"/>
-              <w:left w:w="100" w:type="dxa"/>
-              <w:bottom w:w="100" w:type="dxa"/>
-              <w:right w:w="100" w:type="dxa"/>
-            </w:tcMar>
-          </w:tcPr>
-          <w:p>
-            <w:pPr>
-              <w:widowControl w:val="0"/>
-              <w:spacing w:line="240" w:lineRule="auto"/>
-              <w:jc w:val="center"/>
-            </w:pPr>
-            <w:r>
-              <w:t>Ingeniería de Software</w:t>
-            </w:r>
-          </w:p>
-        </w:tc>
-      </w:tr>
-      <w:tr>
-        <w:trPr>
-          <w:jc w:val="center"/>
-        </w:trPr>
-        <w:tc>
-          <w:tcPr>
-            <w:tcW w:w="4514" w:type="dxa"/>
-            <w:tcMar>
-              <w:top w:w="100" w:type="dxa"/>
-              <w:left w:w="100" w:type="dxa"/>
-              <w:bottom w:w="100" w:type="dxa"/>
-              <w:right w:w="100" w:type="dxa"/>
-            </w:tcMar>
-          </w:tcPr>
-          <w:p>
-            <w:pPr>
-              <w:widowControl w:val="0"/>
-              <w:spacing w:line="240" w:lineRule="auto"/>
-              <w:jc w:val="center"/>
-            </w:pPr>
-            <w:r>
-              <w:t>TS</w:t>
-            </w:r>
-          </w:p>
-        </w:tc>
-        <w:tc>
-          <w:tcPr>
-            <w:tcW w:w="4515" w:type="dxa"/>
-            <w:tcMar>
-              <w:top w:w="100" w:type="dxa"/>
-              <w:left w:w="100" w:type="dxa"/>
-              <w:bottom w:w="100" w:type="dxa"/>
-              <w:right w:w="100" w:type="dxa"/>
-            </w:tcMar>
-          </w:tcPr>
-          <w:p>
-            <w:pPr>
-              <w:widowControl w:val="0"/>
-              <w:spacing w:line="240" w:lineRule="auto"/>
-              <w:jc w:val="center"/>
-            </w:pPr>
-            <w:proofErr w:type="spellStart"/>
-            <w:r>
-              <w:t>Testing</w:t>
-            </w:r>
-            <w:proofErr w:type="spellEnd"/>
-            <w:r>
-              <w:t xml:space="preserve"> de Software</w:t>
+              <w:pStyle w:val="Normal"/>
+              <w:spacing w:line="240" w:lineRule="auto"/>
+              <w:jc w:val="center"/>
+            </w:pPr>
+            <w:r>
+              <w:rPr/>
+              <w:t>Nombre descriptivo y representativo sobre la evidencia a la que hace referencia</w:t>
             </w:r>
           </w:p>
         </w:tc>
@@ -4205,7 +4271,6 @@
           <w:szCs w:val="30"/>
           <w:u w:val="single"/>
         </w:rPr>
-        <w:lastRenderedPageBreak/>
         <w:t>Criterios de Línea Base</w:t>
       </w:r>
     </w:p>
@@ -4251,7 +4316,7 @@
       </w:pPr>
     </w:p>
     <w:sectPr>
-      <w:pgSz w:w="11909" w:h="16834"/>
+      <w:pgSz w:w="11909" w:h="16834" w:orient="portrait"/>
       <w:pgMar w:top="1440" w:right="1440" w:bottom="1440" w:left="1440" w:header="720" w:footer="720" w:gutter="0"/>
       <w:cols w:space="720"/>
     </w:sectPr>
@@ -4260,11 +4325,11 @@
 </file>
 
 <file path=word/styles.xml><?xml version="1.0" encoding="utf-8"?>
-<w:styles xmlns:mc="http://schemas.openxmlformats.org/markup-compatibility/2006" xmlns:r="http://schemas.openxmlformats.org/officeDocument/2006/relationships" xmlns:w="http://schemas.openxmlformats.org/wordprocessingml/2006/main" xmlns:w14="http://schemas.microsoft.com/office/word/2010/wordml" xmlns:w15="http://schemas.microsoft.com/office/word/2012/wordml" xmlns:w16se="http://schemas.microsoft.com/office/word/2015/wordml/symex" mc:Ignorable="w14 w15 w16se">
+<w:styles xmlns:wp14="http://schemas.microsoft.com/office/word/2010/wordprocessingDrawing" xmlns:mc="http://schemas.openxmlformats.org/markup-compatibility/2006" xmlns:r="http://schemas.openxmlformats.org/officeDocument/2006/relationships" xmlns:w="http://schemas.openxmlformats.org/wordprocessingml/2006/main" xmlns:w14="http://schemas.microsoft.com/office/word/2010/wordml" xmlns:w15="http://schemas.microsoft.com/office/word/2012/wordml" xmlns:w16se="http://schemas.microsoft.com/office/word/2015/wordml/symex" mc:Ignorable="w14 w15 w16se wp14">
   <w:docDefaults>
     <w:rPrDefault>
       <w:rPr>
-        <w:rFonts w:ascii="Arial" w:eastAsia="Arial" w:hAnsi="Arial" w:cs="Arial"/>
+        <w:rFonts w:ascii="Arial" w:hAnsi="Arial" w:eastAsia="Arial" w:cs="Arial"/>
         <w:sz w:val="22"/>
         <w:szCs w:val="22"/>
         <w:lang w:val="es-AR" w:eastAsia="en-US" w:bidi="ar-SA"/>
@@ -4279,14 +4344,14 @@
   <w:latentStyles w:defLockedState="0" w:defUIPriority="99" w:defSemiHidden="0" w:defUnhideWhenUsed="0" w:defQFormat="0" w:count="371">
     <w:lsdException w:name="Normal" w:uiPriority="0" w:qFormat="1"/>
     <w:lsdException w:name="heading 1" w:uiPriority="9" w:qFormat="1"/>
-    <w:lsdException w:name="heading 2" w:semiHidden="1" w:uiPriority="9" w:unhideWhenUsed="1" w:qFormat="1"/>
-    <w:lsdException w:name="heading 3" w:semiHidden="1" w:uiPriority="9" w:unhideWhenUsed="1" w:qFormat="1"/>
-    <w:lsdException w:name="heading 4" w:semiHidden="1" w:uiPriority="9" w:unhideWhenUsed="1" w:qFormat="1"/>
-    <w:lsdException w:name="heading 5" w:semiHidden="1" w:uiPriority="9" w:unhideWhenUsed="1" w:qFormat="1"/>
-    <w:lsdException w:name="heading 6" w:semiHidden="1" w:uiPriority="9" w:unhideWhenUsed="1" w:qFormat="1"/>
-    <w:lsdException w:name="heading 7" w:semiHidden="1" w:uiPriority="9" w:unhideWhenUsed="1" w:qFormat="1"/>
-    <w:lsdException w:name="heading 8" w:semiHidden="1" w:uiPriority="9" w:unhideWhenUsed="1" w:qFormat="1"/>
-    <w:lsdException w:name="heading 9" w:semiHidden="1" w:uiPriority="9" w:unhideWhenUsed="1" w:qFormat="1"/>
+    <w:lsdException w:name="heading 2" w:uiPriority="9" w:semiHidden="1" w:unhideWhenUsed="1" w:qFormat="1"/>
+    <w:lsdException w:name="heading 3" w:uiPriority="9" w:semiHidden="1" w:unhideWhenUsed="1" w:qFormat="1"/>
+    <w:lsdException w:name="heading 4" w:uiPriority="9" w:semiHidden="1" w:unhideWhenUsed="1" w:qFormat="1"/>
+    <w:lsdException w:name="heading 5" w:uiPriority="9" w:semiHidden="1" w:unhideWhenUsed="1" w:qFormat="1"/>
+    <w:lsdException w:name="heading 6" w:uiPriority="9" w:semiHidden="1" w:unhideWhenUsed="1" w:qFormat="1"/>
+    <w:lsdException w:name="heading 7" w:uiPriority="9" w:semiHidden="1" w:unhideWhenUsed="1" w:qFormat="1"/>
+    <w:lsdException w:name="heading 8" w:uiPriority="9" w:semiHidden="1" w:unhideWhenUsed="1" w:qFormat="1"/>
+    <w:lsdException w:name="heading 9" w:uiPriority="9" w:semiHidden="1" w:unhideWhenUsed="1" w:qFormat="1"/>
     <w:lsdException w:name="index 1" w:semiHidden="1" w:unhideWhenUsed="1"/>
     <w:lsdException w:name="index 2" w:semiHidden="1" w:unhideWhenUsed="1"/>
     <w:lsdException w:name="index 3" w:semiHidden="1" w:unhideWhenUsed="1"/>
@@ -4296,22 +4361,22 @@
     <w:lsdException w:name="index 7" w:semiHidden="1" w:unhideWhenUsed="1"/>
     <w:lsdException w:name="index 8" w:semiHidden="1" w:unhideWhenUsed="1"/>
     <w:lsdException w:name="index 9" w:semiHidden="1" w:unhideWhenUsed="1"/>
-    <w:lsdException w:name="toc 1" w:semiHidden="1" w:uiPriority="39" w:unhideWhenUsed="1"/>
-    <w:lsdException w:name="toc 2" w:semiHidden="1" w:uiPriority="39" w:unhideWhenUsed="1"/>
-    <w:lsdException w:name="toc 3" w:semiHidden="1" w:uiPriority="39" w:unhideWhenUsed="1"/>
-    <w:lsdException w:name="toc 4" w:semiHidden="1" w:uiPriority="39" w:unhideWhenUsed="1"/>
-    <w:lsdException w:name="toc 5" w:semiHidden="1" w:uiPriority="39" w:unhideWhenUsed="1"/>
-    <w:lsdException w:name="toc 6" w:semiHidden="1" w:uiPriority="39" w:unhideWhenUsed="1"/>
-    <w:lsdException w:name="toc 7" w:semiHidden="1" w:uiPriority="39" w:unhideWhenUsed="1"/>
-    <w:lsdException w:name="toc 8" w:semiHidden="1" w:uiPriority="39" w:unhideWhenUsed="1"/>
-    <w:lsdException w:name="toc 9" w:semiHidden="1" w:uiPriority="39" w:unhideWhenUsed="1"/>
+    <w:lsdException w:name="toc 1" w:uiPriority="39" w:semiHidden="1" w:unhideWhenUsed="1"/>
+    <w:lsdException w:name="toc 2" w:uiPriority="39" w:semiHidden="1" w:unhideWhenUsed="1"/>
+    <w:lsdException w:name="toc 3" w:uiPriority="39" w:semiHidden="1" w:unhideWhenUsed="1"/>
+    <w:lsdException w:name="toc 4" w:uiPriority="39" w:semiHidden="1" w:unhideWhenUsed="1"/>
+    <w:lsdException w:name="toc 5" w:uiPriority="39" w:semiHidden="1" w:unhideWhenUsed="1"/>
+    <w:lsdException w:name="toc 6" w:uiPriority="39" w:semiHidden="1" w:unhideWhenUsed="1"/>
+    <w:lsdException w:name="toc 7" w:uiPriority="39" w:semiHidden="1" w:unhideWhenUsed="1"/>
+    <w:lsdException w:name="toc 8" w:uiPriority="39" w:semiHidden="1" w:unhideWhenUsed="1"/>
+    <w:lsdException w:name="toc 9" w:uiPriority="39" w:semiHidden="1" w:unhideWhenUsed="1"/>
     <w:lsdException w:name="Normal Indent" w:semiHidden="1" w:unhideWhenUsed="1"/>
     <w:lsdException w:name="footnote text" w:semiHidden="1" w:unhideWhenUsed="1"/>
     <w:lsdException w:name="annotation text" w:semiHidden="1" w:unhideWhenUsed="1"/>
     <w:lsdException w:name="header" w:semiHidden="1" w:unhideWhenUsed="1"/>
     <w:lsdException w:name="footer" w:semiHidden="1" w:unhideWhenUsed="1"/>
     <w:lsdException w:name="index heading" w:semiHidden="1" w:unhideWhenUsed="1"/>
-    <w:lsdException w:name="caption" w:semiHidden="1" w:uiPriority="35" w:unhideWhenUsed="1" w:qFormat="1"/>
+    <w:lsdException w:name="caption" w:uiPriority="35" w:semiHidden="1" w:unhideWhenUsed="1" w:qFormat="1"/>
     <w:lsdException w:name="table of figures" w:semiHidden="1" w:unhideWhenUsed="1"/>
     <w:lsdException w:name="envelope address" w:semiHidden="1" w:unhideWhenUsed="1"/>
     <w:lsdException w:name="envelope return" w:semiHidden="1" w:unhideWhenUsed="1"/>
@@ -4342,7 +4407,7 @@
     <w:lsdException w:name="Title" w:uiPriority="10" w:qFormat="1"/>
     <w:lsdException w:name="Closing" w:semiHidden="1" w:unhideWhenUsed="1"/>
     <w:lsdException w:name="Signature" w:semiHidden="1" w:unhideWhenUsed="1"/>
-    <w:lsdException w:name="Default Paragraph Font" w:semiHidden="1" w:uiPriority="1" w:unhideWhenUsed="1"/>
+    <w:lsdException w:name="Default Paragraph Font" w:uiPriority="1" w:semiHidden="1" w:unhideWhenUsed="1"/>
     <w:lsdException w:name="Body Text" w:semiHidden="1" w:unhideWhenUsed="1"/>
     <w:lsdException w:name="Body Text Indent" w:semiHidden="1" w:unhideWhenUsed="1"/>
     <w:lsdException w:name="List Continue" w:semiHidden="1" w:unhideWhenUsed="1"/>
@@ -4542,8 +4607,8 @@
     <w:lsdException w:name="Subtle Reference" w:uiPriority="31" w:qFormat="1"/>
     <w:lsdException w:name="Intense Reference" w:uiPriority="32" w:qFormat="1"/>
     <w:lsdException w:name="Book Title" w:uiPriority="33" w:qFormat="1"/>
-    <w:lsdException w:name="Bibliography" w:semiHidden="1" w:uiPriority="37" w:unhideWhenUsed="1"/>
-    <w:lsdException w:name="TOC Heading" w:semiHidden="1" w:uiPriority="39" w:unhideWhenUsed="1" w:qFormat="1"/>
+    <w:lsdException w:name="Bibliography" w:uiPriority="37" w:semiHidden="1" w:unhideWhenUsed="1"/>
+    <w:lsdException w:name="TOC Heading" w:uiPriority="39" w:semiHidden="1" w:unhideWhenUsed="1" w:qFormat="1"/>
     <w:lsdException w:name="Plain Table 1" w:uiPriority="41"/>
     <w:lsdException w:name="Plain Table 2" w:uiPriority="42"/>
     <w:lsdException w:name="Plain Table 3" w:uiPriority="43"/>
@@ -4649,7 +4714,7 @@
     <w:lsdException w:name="List Table 6 Colorful Accent 6" w:uiPriority="51"/>
     <w:lsdException w:name="List Table 7 Colorful Accent 6" w:uiPriority="52"/>
   </w:latentStyles>
-  <w:style w:type="paragraph" w:default="1" w:styleId="Normal">
+  <w:style w:type="paragraph" w:styleId="Normal" w:default="1">
     <w:name w:val="Normal"/>
   </w:style>
   <w:style w:type="paragraph" w:styleId="Ttulo1">
@@ -4743,13 +4808,13 @@
       <w:color w:val="666666"/>
     </w:rPr>
   </w:style>
-  <w:style w:type="character" w:default="1" w:styleId="Fuentedeprrafopredeter">
+  <w:style w:type="character" w:styleId="Fuentedeprrafopredeter" w:default="1">
     <w:name w:val="Default Paragraph Font"/>
     <w:uiPriority w:val="1"/>
     <w:semiHidden/>
     <w:unhideWhenUsed/>
   </w:style>
-  <w:style w:type="table" w:default="1" w:styleId="Tablanormal">
+  <w:style w:type="table" w:styleId="Tablanormal" w:default="1">
     <w:name w:val="Normal Table"/>
     <w:uiPriority w:val="99"/>
     <w:semiHidden/>
@@ -4764,13 +4829,13 @@
       </w:tblCellMar>
     </w:tblPr>
   </w:style>
-  <w:style w:type="numbering" w:default="1" w:styleId="Sinlista">
+  <w:style w:type="numbering" w:styleId="Sinlista" w:default="1">
     <w:name w:val="No List"/>
     <w:uiPriority w:val="99"/>
     <w:semiHidden/>
     <w:unhideWhenUsed/>
   </w:style>
-  <w:style w:type="table" w:customStyle="1" w:styleId="TableNormal">
+  <w:style w:type="table" w:styleId="TableNormal" w:customStyle="1">
     <w:name w:val="TableNormal"/>
     <w:tblPr>
       <w:tblCellMar>
@@ -4810,7 +4875,7 @@
       <w:szCs w:val="30"/>
     </w:rPr>
   </w:style>
-  <w:style w:type="table" w:customStyle="1" w:styleId="a">
+  <w:style w:type="table" w:styleId="a" w:customStyle="1">
     <w:basedOn w:val="TableNormal"/>
     <w:pPr>
       <w:spacing w:line="240" w:lineRule="auto"/>
@@ -4826,14 +4891,14 @@
       </w:tblCellMar>
     </w:tblPr>
   </w:style>
-  <w:style w:type="table" w:customStyle="1" w:styleId="a0">
+  <w:style w:type="table" w:styleId="a0" w:customStyle="1">
     <w:basedOn w:val="TableNormal"/>
     <w:tblPr>
       <w:tblStyleRowBandSize w:val="1"/>
       <w:tblStyleColBandSize w:val="1"/>
     </w:tblPr>
   </w:style>
-  <w:style w:type="table" w:customStyle="1" w:styleId="a1">
+  <w:style w:type="table" w:styleId="a1" w:customStyle="1">
     <w:basedOn w:val="TableNormal"/>
     <w:tblPr>
       <w:tblStyleRowBandSize w:val="1"/>
@@ -4851,7 +4916,7 @@
       <w:u w:val="single"/>
     </w:rPr>
   </w:style>
-  <w:style w:type="character" w:customStyle="1" w:styleId="UnresolvedMention">
+  <w:style w:type="character" w:styleId="UnresolvedMention" w:customStyle="1">
     <w:name w:val="Unresolved Mention"/>
     <w:basedOn w:val="Fuentedeprrafopredeter"/>
     <w:uiPriority w:val="99"/>

</xml_diff>

<commit_message>
Nuevo término en el glosario y bibliografía
</commit_message>
<xml_diff>
--- a/Plan_Gestion_Configuracion_G4_ISW_4K1.docx
+++ b/Plan_Gestion_Configuracion_G4_ISW_4K1.docx
@@ -1,12 +1,12 @@
 
 <file path=word/document.xml><?xml version="1.0" encoding="utf-8"?>
-<w:document xmlns:wpc="http://schemas.microsoft.com/office/word/2010/wordprocessingCanvas" xmlns:cx="http://schemas.microsoft.com/office/drawing/2014/chartex" xmlns:mc="http://schemas.openxmlformats.org/markup-compatibility/2006" xmlns:o="urn:schemas-microsoft-com:office:office" xmlns:r="http://schemas.openxmlformats.org/officeDocument/2006/relationships" xmlns:m="http://schemas.openxmlformats.org/officeDocument/2006/math" xmlns:v="urn:schemas-microsoft-com:vml" xmlns:wp14="http://schemas.microsoft.com/office/word/2010/wordprocessingDrawing" xmlns:wp="http://schemas.openxmlformats.org/drawingml/2006/wordprocessingDrawing" xmlns:w10="urn:schemas-microsoft-com:office:word" xmlns:w="http://schemas.openxmlformats.org/wordprocessingml/2006/main" xmlns:w14="http://schemas.microsoft.com/office/word/2010/wordml" xmlns:w15="http://schemas.microsoft.com/office/word/2012/wordml" xmlns:w16se="http://schemas.microsoft.com/office/word/2015/wordml/symex" xmlns:wpg="http://schemas.microsoft.com/office/word/2010/wordprocessingGroup" xmlns:wpi="http://schemas.microsoft.com/office/word/2010/wordprocessingInk" xmlns:wne="http://schemas.microsoft.com/office/word/2006/wordml" xmlns:wps="http://schemas.microsoft.com/office/word/2010/wordprocessingShape" xmlns:a="http://schemas.openxmlformats.org/drawingml/2006/main" xmlns:pic="http://schemas.openxmlformats.org/drawingml/2006/picture" mc:Ignorable="w14 w15 w16se wp14">
+<w:document xmlns:wpc="http://schemas.microsoft.com/office/word/2010/wordprocessingCanvas" xmlns:cx="http://schemas.microsoft.com/office/drawing/2014/chartex" xmlns:cx1="http://schemas.microsoft.com/office/drawing/2015/9/8/chartex" xmlns:cx2="http://schemas.microsoft.com/office/drawing/2015/10/21/chartex" xmlns:cx3="http://schemas.microsoft.com/office/drawing/2016/5/9/chartex" xmlns:cx4="http://schemas.microsoft.com/office/drawing/2016/5/10/chartex" xmlns:cx5="http://schemas.microsoft.com/office/drawing/2016/5/11/chartex" xmlns:cx6="http://schemas.microsoft.com/office/drawing/2016/5/12/chartex" xmlns:cx7="http://schemas.microsoft.com/office/drawing/2016/5/13/chartex" xmlns:cx8="http://schemas.microsoft.com/office/drawing/2016/5/14/chartex" xmlns:mc="http://schemas.openxmlformats.org/markup-compatibility/2006" xmlns:aink="http://schemas.microsoft.com/office/drawing/2016/ink" xmlns:am3d="http://schemas.microsoft.com/office/drawing/2017/model3d" xmlns:o="urn:schemas-microsoft-com:office:office" xmlns:oel="http://schemas.microsoft.com/office/2019/extlst" xmlns:r="http://schemas.openxmlformats.org/officeDocument/2006/relationships" xmlns:m="http://schemas.openxmlformats.org/officeDocument/2006/math" xmlns:v="urn:schemas-microsoft-com:vml" xmlns:wp14="http://schemas.microsoft.com/office/word/2010/wordprocessingDrawing" xmlns:wp="http://schemas.openxmlformats.org/drawingml/2006/wordprocessingDrawing" xmlns:w10="urn:schemas-microsoft-com:office:word" xmlns:w="http://schemas.openxmlformats.org/wordprocessingml/2006/main" xmlns:w14="http://schemas.microsoft.com/office/word/2010/wordml" xmlns:w15="http://schemas.microsoft.com/office/word/2012/wordml" xmlns:w16cex="http://schemas.microsoft.com/office/word/2018/wordml/cex" xmlns:w16cid="http://schemas.microsoft.com/office/word/2016/wordml/cid" xmlns:w16="http://schemas.microsoft.com/office/word/2018/wordml" xmlns:w16du="http://schemas.microsoft.com/office/word/2023/wordml/word16du" xmlns:w16sdtdh="http://schemas.microsoft.com/office/word/2020/wordml/sdtdatahash" xmlns:w16sdtfl="http://schemas.microsoft.com/office/word/2024/wordml/sdtformatlock" xmlns:w16se="http://schemas.microsoft.com/office/word/2015/wordml/symex" xmlns:wpg="http://schemas.microsoft.com/office/word/2010/wordprocessingGroup" xmlns:wpi="http://schemas.microsoft.com/office/word/2010/wordprocessingInk" xmlns:wne="http://schemas.microsoft.com/office/word/2006/wordml" xmlns:wps="http://schemas.microsoft.com/office/word/2010/wordprocessingShape" mc:Ignorable="w14 w15 w16se w16cid w16 w16cex w16sdtdh w16sdtfl w16du wp14">
   <w:body>
     <w:p>
       <w:pPr>
         <w:jc w:val="center"/>
         <w:rPr>
-          <w:rFonts w:ascii="Quattrocento Sans" w:hAnsi="Quattrocento Sans" w:eastAsia="Quattrocento Sans" w:cs="Quattrocento Sans"/>
+          <w:rFonts w:ascii="Quattrocento Sans" w:eastAsia="Quattrocento Sans" w:hAnsi="Quattrocento Sans" w:cs="Quattrocento Sans"/>
           <w:b/>
           <w:sz w:val="32"/>
           <w:szCs w:val="32"/>
@@ -14,7 +14,7 @@
       </w:pPr>
       <w:r>
         <w:rPr>
-          <w:rFonts w:ascii="Quattrocento Sans" w:hAnsi="Quattrocento Sans" w:eastAsia="Quattrocento Sans" w:cs="Quattrocento Sans"/>
+          <w:rFonts w:ascii="Quattrocento Sans" w:eastAsia="Quattrocento Sans" w:hAnsi="Quattrocento Sans" w:cs="Quattrocento Sans"/>
           <w:b/>
           <w:noProof/>
           <w:sz w:val="32"/>
@@ -66,7 +66,7 @@
         <w:spacing w:after="240" w:line="240" w:lineRule="auto"/>
         <w:jc w:val="center"/>
         <w:rPr>
-          <w:rFonts w:ascii="Quattrocento Sans" w:hAnsi="Quattrocento Sans" w:eastAsia="Quattrocento Sans" w:cs="Quattrocento Sans"/>
+          <w:rFonts w:ascii="Quattrocento Sans" w:eastAsia="Quattrocento Sans" w:hAnsi="Quattrocento Sans" w:cs="Quattrocento Sans"/>
           <w:b/>
           <w:sz w:val="32"/>
           <w:szCs w:val="32"/>
@@ -74,7 +74,7 @@
       </w:pPr>
       <w:r>
         <w:rPr>
-          <w:rFonts w:ascii="Quattrocento Sans" w:hAnsi="Quattrocento Sans" w:eastAsia="Quattrocento Sans" w:cs="Quattrocento Sans"/>
+          <w:rFonts w:ascii="Quattrocento Sans" w:eastAsia="Quattrocento Sans" w:hAnsi="Quattrocento Sans" w:cs="Quattrocento Sans"/>
           <w:sz w:val="32"/>
           <w:szCs w:val="32"/>
         </w:rPr>
@@ -82,52 +82,30 @@
       </w:r>
       <w:r>
         <w:rPr>
-          <w:rFonts w:ascii="Quattrocento Sans" w:hAnsi="Quattrocento Sans" w:eastAsia="Quattrocento Sans" w:cs="Quattrocento Sans"/>
+          <w:rFonts w:ascii="Quattrocento Sans" w:eastAsia="Quattrocento Sans" w:hAnsi="Quattrocento Sans" w:cs="Quattrocento Sans"/>
           <w:sz w:val="32"/>
           <w:szCs w:val="32"/>
         </w:rPr>
         <w:br/>
-      </w:r>
-      <w:r>
-        <w:rPr>
-          <w:rFonts w:ascii="Quattrocento Sans" w:hAnsi="Quattrocento Sans" w:eastAsia="Quattrocento Sans" w:cs="Quattrocento Sans"/>
-          <w:sz w:val="32"/>
-          <w:szCs w:val="32"/>
-        </w:rPr>
         <w:t>Facultad Regional Córdoba</w:t>
       </w:r>
       <w:r>
         <w:rPr>
-          <w:rFonts w:ascii="Quattrocento Sans" w:hAnsi="Quattrocento Sans" w:eastAsia="Quattrocento Sans" w:cs="Quattrocento Sans"/>
+          <w:rFonts w:ascii="Quattrocento Sans" w:eastAsia="Quattrocento Sans" w:hAnsi="Quattrocento Sans" w:cs="Quattrocento Sans"/>
           <w:sz w:val="32"/>
           <w:szCs w:val="32"/>
         </w:rPr>
         <w:br/>
-      </w:r>
-      <w:r>
-        <w:rPr>
-          <w:rFonts w:ascii="Quattrocento Sans" w:hAnsi="Quattrocento Sans" w:eastAsia="Quattrocento Sans" w:cs="Quattrocento Sans"/>
-          <w:sz w:val="32"/>
-          <w:szCs w:val="32"/>
-        </w:rPr>
         <w:t>Ingeniería y Calidad de Software (ISW)</w:t>
       </w:r>
       <w:r>
         <w:rPr>
-          <w:rFonts w:ascii="Quattrocento Sans" w:hAnsi="Quattrocento Sans" w:eastAsia="Quattrocento Sans" w:cs="Quattrocento Sans"/>
+          <w:rFonts w:ascii="Quattrocento Sans" w:eastAsia="Quattrocento Sans" w:hAnsi="Quattrocento Sans" w:cs="Quattrocento Sans"/>
           <w:b/>
           <w:sz w:val="32"/>
           <w:szCs w:val="32"/>
         </w:rPr>
         <w:br/>
-      </w:r>
-      <w:r>
-        <w:rPr>
-          <w:rFonts w:ascii="Quattrocento Sans" w:hAnsi="Quattrocento Sans" w:eastAsia="Quattrocento Sans" w:cs="Quattrocento Sans"/>
-          <w:b/>
-          <w:sz w:val="32"/>
-          <w:szCs w:val="32"/>
-        </w:rPr>
         <w:t>Gestión de Configuración del Software</w:t>
       </w:r>
     </w:p>
@@ -193,7 +171,7 @@
           <w:szCs w:val="20"/>
         </w:rPr>
         <w:sectPr>
-          <w:pgSz w:w="11909" w:h="16834" w:orient="portrait"/>
+          <w:pgSz w:w="11909" w:h="16834"/>
           <w:pgMar w:top="720" w:right="720" w:bottom="720" w:left="720" w:header="720" w:footer="720" w:gutter="0"/>
           <w:pgNumType w:start="1"/>
           <w:cols w:space="720"/>
@@ -258,12 +236,6 @@
           <w:szCs w:val="24"/>
         </w:rPr>
         <w:tab/>
-      </w:r>
-      <w:r>
-        <w:rPr>
-          <w:sz w:val="24"/>
-          <w:szCs w:val="24"/>
-        </w:rPr>
         <w:t xml:space="preserve">Ing. </w:t>
       </w:r>
       <w:r>
@@ -272,18 +244,8 @@
           <w:szCs w:val="24"/>
           <w:lang w:val="en-US"/>
         </w:rPr>
-        <w:t xml:space="preserve">Judith </w:t>
+        <w:t>Judith Meles</w:t>
       </w:r>
-      <w:proofErr w:type="spellStart"/>
-      <w:r>
-        <w:rPr>
-          <w:sz w:val="24"/>
-          <w:szCs w:val="24"/>
-          <w:lang w:val="en-US"/>
-        </w:rPr>
-        <w:t>Meles</w:t>
-      </w:r>
-      <w:proofErr w:type="spellEnd"/>
     </w:p>
     <w:p>
       <w:pPr>
@@ -300,14 +262,12 @@
         </w:tabs>
         <w:rPr>
           <w:color w:val="000000"/>
-          <w:lang w:val="en-US"/>
         </w:rPr>
       </w:pPr>
       <w:r>
         <w:rPr>
           <w:sz w:val="24"/>
           <w:szCs w:val="24"/>
-          <w:lang w:val="en-US"/>
         </w:rPr>
         <w:t xml:space="preserve">JTP </w:t>
       </w:r>
@@ -315,45 +275,9 @@
         <w:rPr>
           <w:sz w:val="24"/>
           <w:szCs w:val="24"/>
-          <w:lang w:val="en-US"/>
         </w:rPr>
         <w:tab/>
-      </w:r>
-      <w:proofErr w:type="spellStart"/>
-      <w:r>
-        <w:rPr>
-          <w:sz w:val="24"/>
-          <w:szCs w:val="24"/>
-          <w:lang w:val="en-US"/>
-        </w:rPr>
-        <w:t>Ing</w:t>
-      </w:r>
-      <w:proofErr w:type="spellEnd"/>
-      <w:r>
-        <w:rPr>
-          <w:sz w:val="24"/>
-          <w:szCs w:val="24"/>
-          <w:lang w:val="en-US"/>
-        </w:rPr>
-        <w:t xml:space="preserve">. </w:t>
-      </w:r>
-      <w:proofErr w:type="spellStart"/>
-      <w:r>
-        <w:rPr>
-          <w:sz w:val="24"/>
-          <w:szCs w:val="24"/>
-          <w:lang w:val="en-US"/>
-        </w:rPr>
-        <w:t>Mickaela</w:t>
-      </w:r>
-      <w:proofErr w:type="spellEnd"/>
-      <w:r>
-        <w:rPr>
-          <w:sz w:val="24"/>
-          <w:szCs w:val="24"/>
-          <w:lang w:val="en-US"/>
-        </w:rPr>
-        <w:t xml:space="preserve"> Crespo</w:t>
+        <w:t>Ing. Mickaela Crespo</w:t>
       </w:r>
     </w:p>
     <w:p>
@@ -380,7 +304,6 @@
           <w:b/>
           <w:sz w:val="24"/>
           <w:szCs w:val="24"/>
-          <w:lang w:val="en-US"/>
         </w:rPr>
         <w:tab/>
       </w:r>
@@ -389,7 +312,6 @@
           <w:b/>
           <w:sz w:val="24"/>
           <w:szCs w:val="24"/>
-          <w:lang w:val="en-US"/>
         </w:rPr>
         <w:tab/>
       </w:r>
@@ -398,7 +320,6 @@
           <w:b/>
           <w:sz w:val="24"/>
           <w:szCs w:val="24"/>
-          <w:lang w:val="en-US"/>
         </w:rPr>
         <w:tab/>
       </w:r>
@@ -447,10 +368,10 @@
         </w:rPr>
         <w:sectPr>
           <w:type w:val="continuous"/>
-          <w:pgSz w:w="11909" w:h="16834" w:orient="portrait"/>
+          <w:pgSz w:w="11909" w:h="16834"/>
           <w:pgMar w:top="720" w:right="720" w:bottom="720" w:left="720" w:header="720" w:footer="720" w:gutter="0"/>
           <w:pgNumType w:start="1"/>
-          <w:cols w:equalWidth="0" w:space="720" w:num="2">
+          <w:cols w:num="2" w:space="720" w:equalWidth="0">
             <w:col w:w="4874" w:space="720"/>
             <w:col w:w="4874"/>
           </w:cols>
@@ -503,12 +424,12 @@
         <w:tblW w:w="10439" w:type="dxa"/>
         <w:tblInd w:w="0" w:type="dxa"/>
         <w:tblBorders>
-          <w:top w:val="single" w:color="000000" w:sz="12" w:space="0"/>
-          <w:left w:val="single" w:color="000000" w:sz="12" w:space="0"/>
-          <w:bottom w:val="single" w:color="000000" w:sz="12" w:space="0"/>
-          <w:right w:val="single" w:color="000000" w:sz="12" w:space="0"/>
-          <w:insideH w:val="single" w:color="000000" w:sz="12" w:space="0"/>
-          <w:insideV w:val="single" w:color="000000" w:sz="12" w:space="0"/>
+          <w:top w:val="single" w:sz="12" w:space="0" w:color="000000"/>
+          <w:left w:val="single" w:sz="12" w:space="0" w:color="000000"/>
+          <w:bottom w:val="single" w:sz="12" w:space="0" w:color="000000"/>
+          <w:right w:val="single" w:sz="12" w:space="0" w:color="000000"/>
+          <w:insideH w:val="single" w:sz="12" w:space="0" w:color="000000"/>
+          <w:insideV w:val="single" w:sz="12" w:space="0" w:color="000000"/>
         </w:tblBorders>
         <w:tblLayout w:type="fixed"/>
         <w:tblLook w:val="0400" w:firstRow="0" w:lastRow="0" w:firstColumn="0" w:lastColumn="0" w:noHBand="0" w:noVBand="1"/>
@@ -628,21 +549,12 @@
               </w:rPr>
             </w:pPr>
             <w:hyperlink r:id="rId6">
-              <w:proofErr w:type="spellStart"/>
               <w:r>
                 <w:rPr>
                   <w:sz w:val="24"/>
                   <w:szCs w:val="24"/>
                 </w:rPr>
-                <w:t>Cufré</w:t>
-              </w:r>
-              <w:proofErr w:type="spellEnd"/>
-              <w:r>
-                <w:rPr>
-                  <w:sz w:val="24"/>
-                  <w:szCs w:val="24"/>
-                </w:rPr>
-                <w:t>, Ángel Hugo</w:t>
+                <w:t>Cufré, Ángel Hugo</w:t>
               </w:r>
             </w:hyperlink>
           </w:p>
@@ -686,7 +598,6 @@
               </w:rPr>
             </w:pPr>
             <w:hyperlink r:id="rId7">
-              <w:proofErr w:type="spellStart"/>
               <w:r>
                 <w:t>C</w:t>
               </w:r>
@@ -697,15 +608,7 @@
                   <w:sz w:val="24"/>
                   <w:szCs w:val="24"/>
                 </w:rPr>
-                <w:t>arrió</w:t>
-              </w:r>
-              <w:proofErr w:type="spellEnd"/>
-              <w:r>
-                <w:rPr>
-                  <w:sz w:val="24"/>
-                  <w:szCs w:val="24"/>
-                </w:rPr>
-                <w:t xml:space="preserve">, Tomás </w:t>
+                <w:t xml:space="preserve">arrió, Tomás </w:t>
               </w:r>
             </w:hyperlink>
           </w:p>
@@ -935,21 +838,56 @@
               <w:jc w:val="center"/>
             </w:pPr>
             <w:hyperlink r:id="rId13">
-              <w:proofErr w:type="spellStart"/>
               <w:r>
                 <w:rPr>
                   <w:sz w:val="24"/>
                   <w:szCs w:val="24"/>
                 </w:rPr>
-                <w:t>Patolsky</w:t>
+                <w:t xml:space="preserve">Patolsky, Daniel </w:t>
               </w:r>
-              <w:proofErr w:type="spellEnd"/>
+            </w:hyperlink>
+          </w:p>
+        </w:tc>
+        <w:tc>
+          <w:tcPr>
+            <w:tcW w:w="5219" w:type="dxa"/>
+          </w:tcPr>
+          <w:p>
+            <w:pPr>
+              <w:spacing w:before="40" w:after="40"/>
+              <w:jc w:val="center"/>
+              <w:rPr>
+                <w:sz w:val="24"/>
+                <w:szCs w:val="24"/>
+              </w:rPr>
+            </w:pPr>
+            <w:r>
+              <w:rPr>
+                <w:sz w:val="24"/>
+                <w:szCs w:val="24"/>
+              </w:rPr>
+              <w:t>92847</w:t>
+            </w:r>
+          </w:p>
+        </w:tc>
+      </w:tr>
+      <w:tr>
+        <w:tc>
+          <w:tcPr>
+            <w:tcW w:w="5220" w:type="dxa"/>
+          </w:tcPr>
+          <w:p>
+            <w:pPr>
+              <w:spacing w:before="40" w:after="40"/>
+              <w:jc w:val="center"/>
+            </w:pPr>
+            <w:hyperlink r:id="rId14">
               <w:r>
                 <w:rPr>
                   <w:sz w:val="24"/>
                   <w:szCs w:val="24"/>
                 </w:rPr>
-                <w:t xml:space="preserve">, Daniel </w:t>
+                <w:t xml:space="preserve">Titón, Máximo </w:t>
               </w:r>
             </w:hyperlink>
           </w:p>
@@ -972,7 +910,7 @@
                 <w:sz w:val="24"/>
                 <w:szCs w:val="24"/>
               </w:rPr>
-              <w:t>92847</w:t>
+              <w:t>98175</w:t>
             </w:r>
           </w:p>
         </w:tc>
@@ -987,75 +925,13 @@
               <w:spacing w:before="40" w:after="40"/>
               <w:jc w:val="center"/>
             </w:pPr>
-            <w:hyperlink r:id="rId14">
-              <w:proofErr w:type="spellStart"/>
+            <w:hyperlink r:id="rId15">
               <w:r>
                 <w:rPr>
                   <w:sz w:val="24"/>
                   <w:szCs w:val="24"/>
                 </w:rPr>
-                <w:t>Titón</w:t>
-              </w:r>
-              <w:proofErr w:type="spellEnd"/>
-              <w:r>
-                <w:rPr>
-                  <w:sz w:val="24"/>
-                  <w:szCs w:val="24"/>
-                </w:rPr>
-                <w:t xml:space="preserve">, Máximo </w:t>
-              </w:r>
-            </w:hyperlink>
-          </w:p>
-        </w:tc>
-        <w:tc>
-          <w:tcPr>
-            <w:tcW w:w="5219" w:type="dxa"/>
-          </w:tcPr>
-          <w:p>
-            <w:pPr>
-              <w:spacing w:before="40" w:after="40"/>
-              <w:jc w:val="center"/>
-              <w:rPr>
-                <w:sz w:val="24"/>
-                <w:szCs w:val="24"/>
-              </w:rPr>
-            </w:pPr>
-            <w:r>
-              <w:rPr>
-                <w:sz w:val="24"/>
-                <w:szCs w:val="24"/>
-              </w:rPr>
-              <w:t>98175</w:t>
-            </w:r>
-          </w:p>
-        </w:tc>
-      </w:tr>
-      <w:tr>
-        <w:tc>
-          <w:tcPr>
-            <w:tcW w:w="5220" w:type="dxa"/>
-          </w:tcPr>
-          <w:p>
-            <w:pPr>
-              <w:spacing w:before="40" w:after="40"/>
-              <w:jc w:val="center"/>
-            </w:pPr>
-            <w:hyperlink r:id="rId15">
-              <w:proofErr w:type="spellStart"/>
-              <w:r>
-                <w:rPr>
-                  <w:sz w:val="24"/>
-                  <w:szCs w:val="24"/>
-                </w:rPr>
-                <w:t>Uliana</w:t>
-              </w:r>
-              <w:proofErr w:type="spellEnd"/>
-              <w:r>
-                <w:rPr>
-                  <w:sz w:val="24"/>
-                  <w:szCs w:val="24"/>
-                </w:rPr>
-                <w:t>, Agustín</w:t>
+                <w:t>Uliana, Agustín</w:t>
               </w:r>
             </w:hyperlink>
           </w:p>
@@ -1143,7 +1019,7 @@
         </w:rPr>
         <w:sectPr>
           <w:type w:val="continuous"/>
-          <w:pgSz w:w="11909" w:h="16834" w:orient="portrait"/>
+          <w:pgSz w:w="11909" w:h="16834"/>
           <w:pgMar w:top="720" w:right="720" w:bottom="720" w:left="720" w:header="720" w:footer="720" w:gutter="0"/>
           <w:pgNumType w:start="1"/>
           <w:cols w:space="720"/>
@@ -1170,6 +1046,7 @@
           <w:szCs w:val="30"/>
           <w:u w:val="single"/>
         </w:rPr>
+        <w:lastRenderedPageBreak/>
         <w:t>Ítems de configuración</w:t>
       </w:r>
     </w:p>
@@ -1180,12 +1057,12 @@
         <w:tblW w:w="10459" w:type="dxa"/>
         <w:tblInd w:w="-10" w:type="dxa"/>
         <w:tblBorders>
-          <w:top w:val="single" w:color="000000" w:sz="8" w:space="0"/>
-          <w:left w:val="single" w:color="000000" w:sz="8" w:space="0"/>
-          <w:bottom w:val="single" w:color="000000" w:sz="8" w:space="0"/>
-          <w:right w:val="single" w:color="000000" w:sz="8" w:space="0"/>
-          <w:insideH w:val="single" w:color="000000" w:sz="8" w:space="0"/>
-          <w:insideV w:val="single" w:color="000000" w:sz="8" w:space="0"/>
+          <w:top w:val="single" w:sz="8" w:space="0" w:color="000000"/>
+          <w:left w:val="single" w:sz="8" w:space="0" w:color="000000"/>
+          <w:bottom w:val="single" w:sz="8" w:space="0" w:color="000000"/>
+          <w:right w:val="single" w:sz="8" w:space="0" w:color="000000"/>
+          <w:insideH w:val="single" w:sz="8" w:space="0" w:color="000000"/>
+          <w:insideV w:val="single" w:sz="8" w:space="0" w:color="000000"/>
         </w:tblBorders>
         <w:tblLayout w:type="fixed"/>
         <w:tblLook w:val="0600" w:firstRow="0" w:lastRow="0" w:firstColumn="0" w:lastColumn="0" w:noHBand="1" w:noVBand="1"/>
@@ -1383,23 +1260,7 @@
                 <w:sz w:val="20"/>
                 <w:szCs w:val="20"/>
               </w:rPr>
-              <w:t>TP#_&lt;</w:t>
-            </w:r>
-            <w:proofErr w:type="spellStart"/>
-            <w:r>
-              <w:rPr>
-                <w:sz w:val="20"/>
-                <w:szCs w:val="20"/>
-              </w:rPr>
-              <w:t>NombreTrabajoPractico</w:t>
-            </w:r>
-            <w:proofErr w:type="spellEnd"/>
-            <w:r>
-              <w:rPr>
-                <w:sz w:val="20"/>
-                <w:szCs w:val="20"/>
-              </w:rPr>
-              <w:t>&gt;</w:t>
+              <w:t>TP#_&lt;NombreTrabajoPractico&gt;</w:t>
             </w:r>
           </w:p>
         </w:tc>
@@ -1511,65 +1372,39 @@
                 <w:sz w:val="20"/>
                 <w:szCs w:val="20"/>
               </w:rPr>
-              <w:t># &lt;</w:t>
-            </w:r>
-            <w:proofErr w:type="spellStart"/>
-            <w:r>
+              <w:t># &lt;NombrePresentación&gt;.pdf</w:t>
+            </w:r>
+          </w:p>
+        </w:tc>
+        <w:tc>
+          <w:tcPr>
+            <w:tcW w:w="5662" w:type="dxa"/>
+            <w:tcMar>
+              <w:top w:w="100" w:type="dxa"/>
+              <w:left w:w="100" w:type="dxa"/>
+              <w:bottom w:w="100" w:type="dxa"/>
+              <w:right w:w="100" w:type="dxa"/>
+            </w:tcMar>
+            <w:vAlign w:val="center"/>
+          </w:tcPr>
+          <w:p>
+            <w:pPr>
+              <w:widowControl w:val="0"/>
+              <w:pBdr>
+                <w:top w:val="nil"/>
+                <w:left w:val="nil"/>
+                <w:bottom w:val="nil"/>
+                <w:right w:val="nil"/>
+                <w:between w:val="nil"/>
+              </w:pBdr>
+              <w:spacing w:line="240" w:lineRule="auto"/>
+              <w:jc w:val="center"/>
               <w:rPr>
                 <w:sz w:val="20"/>
                 <w:szCs w:val="20"/>
               </w:rPr>
-              <w:t>NombrePresentación</w:t>
-            </w:r>
-            <w:proofErr w:type="spellEnd"/>
-            <w:r>
-              <w:rPr>
-                <w:sz w:val="20"/>
-                <w:szCs w:val="20"/>
-              </w:rPr>
-              <w:t>&gt;.</w:t>
-            </w:r>
-            <w:proofErr w:type="spellStart"/>
-            <w:r>
-              <w:rPr>
-                <w:sz w:val="20"/>
-                <w:szCs w:val="20"/>
-              </w:rPr>
-              <w:t>pdf</w:t>
-            </w:r>
-            <w:proofErr w:type="spellEnd"/>
-          </w:p>
-        </w:tc>
-        <w:tc>
-          <w:tcPr>
-            <w:tcW w:w="5662" w:type="dxa"/>
-            <w:tcMar>
-              <w:top w:w="100" w:type="dxa"/>
-              <w:left w:w="100" w:type="dxa"/>
-              <w:bottom w:w="100" w:type="dxa"/>
-              <w:right w:w="100" w:type="dxa"/>
-            </w:tcMar>
-            <w:vAlign w:val="center"/>
-          </w:tcPr>
-          <w:p>
-            <w:pPr>
-              <w:widowControl w:val="0"/>
-              <w:pBdr>
-                <w:top w:val="nil"/>
-                <w:left w:val="nil"/>
-                <w:bottom w:val="nil"/>
-                <w:right w:val="nil"/>
-                <w:between w:val="nil"/>
-              </w:pBdr>
-              <w:spacing w:line="240" w:lineRule="auto"/>
-              <w:jc w:val="center"/>
-              <w:rPr>
-                <w:sz w:val="20"/>
-                <w:szCs w:val="20"/>
-              </w:rPr>
             </w:pPr>
             <w:hyperlink r:id="rId18">
-              <w:proofErr w:type="spellStart"/>
               <w:r>
                 <w:rPr>
                   <w:color w:val="1155CC"/>
@@ -1577,9 +1412,111 @@
                   <w:szCs w:val="20"/>
                   <w:u w:val="single"/>
                 </w:rPr>
-                <w:t>Bibliografia</w:t>
+                <w:t>Bibliografia/Bibliografia_De_La_Catedra/Diaspositivas</w:t>
               </w:r>
-              <w:proofErr w:type="spellEnd"/>
+            </w:hyperlink>
+          </w:p>
+        </w:tc>
+      </w:tr>
+      <w:tr>
+        <w:trPr>
+          <w:trHeight w:val="480"/>
+        </w:trPr>
+        <w:tc>
+          <w:tcPr>
+            <w:tcW w:w="1560" w:type="dxa"/>
+            <w:tcMar>
+              <w:top w:w="100" w:type="dxa"/>
+              <w:left w:w="100" w:type="dxa"/>
+              <w:bottom w:w="100" w:type="dxa"/>
+              <w:right w:w="100" w:type="dxa"/>
+            </w:tcMar>
+            <w:vAlign w:val="center"/>
+          </w:tcPr>
+          <w:p>
+            <w:pPr>
+              <w:widowControl w:val="0"/>
+              <w:pBdr>
+                <w:top w:val="nil"/>
+                <w:left w:val="nil"/>
+                <w:bottom w:val="nil"/>
+                <w:right w:val="nil"/>
+                <w:between w:val="nil"/>
+              </w:pBdr>
+              <w:spacing w:line="240" w:lineRule="auto"/>
+              <w:jc w:val="center"/>
+            </w:pPr>
+            <w:r>
+              <w:t>Minutas</w:t>
+            </w:r>
+          </w:p>
+        </w:tc>
+        <w:tc>
+          <w:tcPr>
+            <w:tcW w:w="3237" w:type="dxa"/>
+            <w:tcMar>
+              <w:top w:w="100" w:type="dxa"/>
+              <w:left w:w="100" w:type="dxa"/>
+              <w:bottom w:w="100" w:type="dxa"/>
+              <w:right w:w="100" w:type="dxa"/>
+            </w:tcMar>
+            <w:vAlign w:val="center"/>
+          </w:tcPr>
+          <w:p>
+            <w:pPr>
+              <w:widowControl w:val="0"/>
+              <w:pBdr>
+                <w:top w:val="nil"/>
+                <w:left w:val="nil"/>
+                <w:bottom w:val="nil"/>
+                <w:right w:val="nil"/>
+                <w:between w:val="nil"/>
+              </w:pBdr>
+              <w:spacing w:line="240" w:lineRule="auto"/>
+              <w:jc w:val="center"/>
+              <w:rPr>
+                <w:sz w:val="20"/>
+                <w:szCs w:val="20"/>
+              </w:rPr>
+            </w:pPr>
+            <w:r>
+              <w:rPr>
+                <w:sz w:val="20"/>
+                <w:szCs w:val="20"/>
+              </w:rPr>
+              <w:t>&lt;fecha&gt;_&lt;NombreDeTema&gt;_&lt;Apellido&gt;.&lt;Extensión&gt;</w:t>
+            </w:r>
+          </w:p>
+        </w:tc>
+        <w:tc>
+          <w:tcPr>
+            <w:tcW w:w="5662" w:type="dxa"/>
+            <w:tcMar>
+              <w:top w:w="100" w:type="dxa"/>
+              <w:left w:w="100" w:type="dxa"/>
+              <w:bottom w:w="100" w:type="dxa"/>
+              <w:right w:w="100" w:type="dxa"/>
+            </w:tcMar>
+            <w:vAlign w:val="center"/>
+          </w:tcPr>
+          <w:p>
+            <w:pPr>
+              <w:widowControl w:val="0"/>
+              <w:pBdr>
+                <w:top w:val="nil"/>
+                <w:left w:val="nil"/>
+                <w:bottom w:val="nil"/>
+                <w:right w:val="nil"/>
+                <w:between w:val="nil"/>
+              </w:pBdr>
+              <w:spacing w:line="240" w:lineRule="auto"/>
+              <w:jc w:val="center"/>
+              <w:rPr>
+                <w:sz w:val="20"/>
+                <w:szCs w:val="20"/>
+              </w:rPr>
+            </w:pPr>
+            <w:hyperlink r:id="rId19">
               <w:r>
                 <w:rPr>
                   <w:color w:val="1155CC"/>
@@ -1587,9 +1524,116 @@
                   <w:szCs w:val="20"/>
                   <w:u w:val="single"/>
                 </w:rPr>
-                <w:t>/</w:t>
+                <w:t>Bibliografia/Material_De_Estudio</w:t>
               </w:r>
-              <w:proofErr w:type="spellStart"/>
+            </w:hyperlink>
+            <w:r>
+              <w:rPr>
+                <w:color w:val="1155CC"/>
+                <w:sz w:val="20"/>
+                <w:szCs w:val="20"/>
+                <w:u w:val="single"/>
+              </w:rPr>
+              <w:t>/Minutas</w:t>
+            </w:r>
+          </w:p>
+        </w:tc>
+      </w:tr>
+      <w:tr>
+        <w:trPr>
+          <w:trHeight w:val="480"/>
+        </w:trPr>
+        <w:tc>
+          <w:tcPr>
+            <w:tcW w:w="1560" w:type="dxa"/>
+            <w:tcMar>
+              <w:top w:w="100" w:type="dxa"/>
+              <w:left w:w="100" w:type="dxa"/>
+              <w:bottom w:w="100" w:type="dxa"/>
+              <w:right w:w="100" w:type="dxa"/>
+            </w:tcMar>
+            <w:vAlign w:val="center"/>
+          </w:tcPr>
+          <w:p>
+            <w:pPr>
+              <w:widowControl w:val="0"/>
+              <w:pBdr>
+                <w:top w:val="nil"/>
+                <w:left w:val="nil"/>
+                <w:bottom w:val="nil"/>
+                <w:right w:val="nil"/>
+                <w:between w:val="nil"/>
+              </w:pBdr>
+              <w:spacing w:line="240" w:lineRule="auto"/>
+              <w:jc w:val="center"/>
+            </w:pPr>
+            <w:r>
+              <w:t>Resumenes</w:t>
+            </w:r>
+          </w:p>
+        </w:tc>
+        <w:tc>
+          <w:tcPr>
+            <w:tcW w:w="3237" w:type="dxa"/>
+            <w:tcMar>
+              <w:top w:w="100" w:type="dxa"/>
+              <w:left w:w="100" w:type="dxa"/>
+              <w:bottom w:w="100" w:type="dxa"/>
+              <w:right w:w="100" w:type="dxa"/>
+            </w:tcMar>
+            <w:vAlign w:val="center"/>
+          </w:tcPr>
+          <w:p>
+            <w:pPr>
+              <w:widowControl w:val="0"/>
+              <w:pBdr>
+                <w:top w:val="nil"/>
+                <w:left w:val="nil"/>
+                <w:bottom w:val="nil"/>
+                <w:right w:val="nil"/>
+                <w:between w:val="nil"/>
+              </w:pBdr>
+              <w:spacing w:line="240" w:lineRule="auto"/>
+              <w:jc w:val="center"/>
+              <w:rPr>
+                <w:sz w:val="20"/>
+                <w:szCs w:val="20"/>
+              </w:rPr>
+            </w:pPr>
+            <w:r>
+              <w:rPr>
+                <w:sz w:val="20"/>
+                <w:szCs w:val="20"/>
+              </w:rPr>
+              <w:t>&lt;NombreDeTema&gt;_&lt;Apellido&gt;</w:t>
+            </w:r>
+          </w:p>
+        </w:tc>
+        <w:tc>
+          <w:tcPr>
+            <w:tcW w:w="5662" w:type="dxa"/>
+            <w:tcMar>
+              <w:top w:w="100" w:type="dxa"/>
+              <w:left w:w="100" w:type="dxa"/>
+              <w:bottom w:w="100" w:type="dxa"/>
+              <w:right w:w="100" w:type="dxa"/>
+            </w:tcMar>
+            <w:vAlign w:val="center"/>
+          </w:tcPr>
+          <w:p>
+            <w:pPr>
+              <w:widowControl w:val="0"/>
+              <w:pBdr>
+                <w:top w:val="nil"/>
+                <w:left w:val="nil"/>
+                <w:bottom w:val="nil"/>
+                <w:right w:val="nil"/>
+                <w:between w:val="nil"/>
+              </w:pBdr>
+              <w:spacing w:line="240" w:lineRule="auto"/>
+              <w:jc w:val="center"/>
+            </w:pPr>
+            <w:hyperlink r:id="rId20">
               <w:r>
                 <w:rPr>
                   <w:color w:val="1155CC"/>
@@ -1597,9 +1641,116 @@
                   <w:szCs w:val="20"/>
                   <w:u w:val="single"/>
                 </w:rPr>
-                <w:t>Bibliografia_De_La_Catedra</w:t>
+                <w:t>Bibliografia/Material_De_Estudio</w:t>
               </w:r>
-              <w:proofErr w:type="spellEnd"/>
+            </w:hyperlink>
+            <w:r>
+              <w:rPr>
+                <w:color w:val="1155CC"/>
+                <w:sz w:val="20"/>
+                <w:szCs w:val="20"/>
+                <w:u w:val="single"/>
+              </w:rPr>
+              <w:t>/Resumenes</w:t>
+            </w:r>
+          </w:p>
+        </w:tc>
+      </w:tr>
+      <w:tr>
+        <w:trPr>
+          <w:trHeight w:val="480"/>
+        </w:trPr>
+        <w:tc>
+          <w:tcPr>
+            <w:tcW w:w="1560" w:type="dxa"/>
+            <w:tcMar>
+              <w:top w:w="100" w:type="dxa"/>
+              <w:left w:w="100" w:type="dxa"/>
+              <w:bottom w:w="100" w:type="dxa"/>
+              <w:right w:w="100" w:type="dxa"/>
+            </w:tcMar>
+            <w:vAlign w:val="center"/>
+          </w:tcPr>
+          <w:p>
+            <w:pPr>
+              <w:widowControl w:val="0"/>
+              <w:pBdr>
+                <w:top w:val="nil"/>
+                <w:left w:val="nil"/>
+                <w:bottom w:val="nil"/>
+                <w:right w:val="nil"/>
+                <w:between w:val="nil"/>
+              </w:pBdr>
+              <w:spacing w:line="240" w:lineRule="auto"/>
+              <w:jc w:val="center"/>
+            </w:pPr>
+            <w:r>
+              <w:t>Ejercicios Prácticos</w:t>
+            </w:r>
+          </w:p>
+        </w:tc>
+        <w:tc>
+          <w:tcPr>
+            <w:tcW w:w="3237" w:type="dxa"/>
+            <w:tcMar>
+              <w:top w:w="100" w:type="dxa"/>
+              <w:left w:w="100" w:type="dxa"/>
+              <w:bottom w:w="100" w:type="dxa"/>
+              <w:right w:w="100" w:type="dxa"/>
+            </w:tcMar>
+            <w:vAlign w:val="center"/>
+          </w:tcPr>
+          <w:p>
+            <w:pPr>
+              <w:widowControl w:val="0"/>
+              <w:pBdr>
+                <w:top w:val="nil"/>
+                <w:left w:val="nil"/>
+                <w:bottom w:val="nil"/>
+                <w:right w:val="nil"/>
+                <w:between w:val="nil"/>
+              </w:pBdr>
+              <w:spacing w:line="240" w:lineRule="auto"/>
+              <w:jc w:val="center"/>
+              <w:rPr>
+                <w:sz w:val="20"/>
+                <w:szCs w:val="20"/>
+              </w:rPr>
+            </w:pPr>
+            <w:r>
+              <w:rPr>
+                <w:sz w:val="20"/>
+                <w:szCs w:val="20"/>
+              </w:rPr>
+              <w:t>&lt;NombreDeTema&gt;_TP#_&lt;Apellidos&gt;.&lt;Extensión&gt;</w:t>
+            </w:r>
+          </w:p>
+        </w:tc>
+        <w:tc>
+          <w:tcPr>
+            <w:tcW w:w="5662" w:type="dxa"/>
+            <w:tcMar>
+              <w:top w:w="100" w:type="dxa"/>
+              <w:left w:w="100" w:type="dxa"/>
+              <w:bottom w:w="100" w:type="dxa"/>
+              <w:right w:w="100" w:type="dxa"/>
+            </w:tcMar>
+            <w:vAlign w:val="center"/>
+          </w:tcPr>
+          <w:p>
+            <w:pPr>
+              <w:widowControl w:val="0"/>
+              <w:pBdr>
+                <w:top w:val="nil"/>
+                <w:left w:val="nil"/>
+                <w:bottom w:val="nil"/>
+                <w:right w:val="nil"/>
+                <w:between w:val="nil"/>
+              </w:pBdr>
+              <w:spacing w:line="240" w:lineRule="auto"/>
+              <w:jc w:val="center"/>
+            </w:pPr>
+            <w:hyperlink r:id="rId21">
               <w:r>
                 <w:rPr>
                   <w:color w:val="1155CC"/>
@@ -1607,169 +1758,8 @@
                   <w:szCs w:val="20"/>
                   <w:u w:val="single"/>
                 </w:rPr>
-                <w:t>/</w:t>
+                <w:t>Bibliografia/Material_De_Estudio</w:t>
               </w:r>
-              <w:proofErr w:type="spellStart"/>
-              <w:r>
-                <w:rPr>
-                  <w:color w:val="1155CC"/>
-                  <w:sz w:val="20"/>
-                  <w:szCs w:val="20"/>
-                  <w:u w:val="single"/>
-                </w:rPr>
-                <w:t>Diaspositivas</w:t>
-              </w:r>
-              <w:proofErr w:type="spellEnd"/>
-            </w:hyperlink>
-          </w:p>
-        </w:tc>
-      </w:tr>
-      <w:tr>
-        <w:trPr>
-          <w:trHeight w:val="480"/>
-        </w:trPr>
-        <w:tc>
-          <w:tcPr>
-            <w:tcW w:w="1560" w:type="dxa"/>
-            <w:tcMar>
-              <w:top w:w="100" w:type="dxa"/>
-              <w:left w:w="100" w:type="dxa"/>
-              <w:bottom w:w="100" w:type="dxa"/>
-              <w:right w:w="100" w:type="dxa"/>
-            </w:tcMar>
-            <w:vAlign w:val="center"/>
-          </w:tcPr>
-          <w:p>
-            <w:pPr>
-              <w:widowControl w:val="0"/>
-              <w:pBdr>
-                <w:top w:val="nil"/>
-                <w:left w:val="nil"/>
-                <w:bottom w:val="nil"/>
-                <w:right w:val="nil"/>
-                <w:between w:val="nil"/>
-              </w:pBdr>
-              <w:spacing w:line="240" w:lineRule="auto"/>
-              <w:jc w:val="center"/>
-            </w:pPr>
-            <w:r>
-              <w:t>Minutas</w:t>
-            </w:r>
-          </w:p>
-        </w:tc>
-        <w:tc>
-          <w:tcPr>
-            <w:tcW w:w="3237" w:type="dxa"/>
-            <w:tcMar>
-              <w:top w:w="100" w:type="dxa"/>
-              <w:left w:w="100" w:type="dxa"/>
-              <w:bottom w:w="100" w:type="dxa"/>
-              <w:right w:w="100" w:type="dxa"/>
-            </w:tcMar>
-            <w:vAlign w:val="center"/>
-          </w:tcPr>
-          <w:p>
-            <w:pPr>
-              <w:widowControl w:val="0"/>
-              <w:pBdr>
-                <w:top w:val="nil"/>
-                <w:left w:val="nil"/>
-                <w:bottom w:val="nil"/>
-                <w:right w:val="nil"/>
-                <w:between w:val="nil"/>
-              </w:pBdr>
-              <w:spacing w:line="240" w:lineRule="auto"/>
-              <w:jc w:val="center"/>
-              <w:rPr>
-                <w:sz w:val="20"/>
-                <w:szCs w:val="20"/>
-              </w:rPr>
-            </w:pPr>
-            <w:r>
-              <w:rPr>
-                <w:sz w:val="20"/>
-                <w:szCs w:val="20"/>
-              </w:rPr>
-              <w:t>&lt;fecha&gt;_&lt;</w:t>
-            </w:r>
-            <w:proofErr w:type="spellStart"/>
-            <w:r>
-              <w:rPr>
-                <w:sz w:val="20"/>
-                <w:szCs w:val="20"/>
-              </w:rPr>
-              <w:t>NombreDeTema</w:t>
-            </w:r>
-            <w:proofErr w:type="spellEnd"/>
-            <w:r>
-              <w:rPr>
-                <w:sz w:val="20"/>
-                <w:szCs w:val="20"/>
-              </w:rPr>
-              <w:t>&gt;_&lt;Apellido&gt;.&lt;Extensión&gt;</w:t>
-            </w:r>
-          </w:p>
-        </w:tc>
-        <w:tc>
-          <w:tcPr>
-            <w:tcW w:w="5662" w:type="dxa"/>
-            <w:tcMar>
-              <w:top w:w="100" w:type="dxa"/>
-              <w:left w:w="100" w:type="dxa"/>
-              <w:bottom w:w="100" w:type="dxa"/>
-              <w:right w:w="100" w:type="dxa"/>
-            </w:tcMar>
-            <w:vAlign w:val="center"/>
-          </w:tcPr>
-          <w:p>
-            <w:pPr>
-              <w:widowControl w:val="0"/>
-              <w:pBdr>
-                <w:top w:val="nil"/>
-                <w:left w:val="nil"/>
-                <w:bottom w:val="nil"/>
-                <w:right w:val="nil"/>
-                <w:between w:val="nil"/>
-              </w:pBdr>
-              <w:spacing w:line="240" w:lineRule="auto"/>
-              <w:jc w:val="center"/>
-              <w:rPr>
-                <w:sz w:val="20"/>
-                <w:szCs w:val="20"/>
-              </w:rPr>
-            </w:pPr>
-            <w:hyperlink r:id="rId19">
-              <w:proofErr w:type="spellStart"/>
-              <w:r>
-                <w:rPr>
-                  <w:color w:val="1155CC"/>
-                  <w:sz w:val="20"/>
-                  <w:szCs w:val="20"/>
-                  <w:u w:val="single"/>
-                </w:rPr>
-                <w:t>Bibliografia</w:t>
-              </w:r>
-              <w:proofErr w:type="spellEnd"/>
-              <w:r>
-                <w:rPr>
-                  <w:color w:val="1155CC"/>
-                  <w:sz w:val="20"/>
-                  <w:szCs w:val="20"/>
-                  <w:u w:val="single"/>
-                </w:rPr>
-                <w:t>/</w:t>
-              </w:r>
-              <w:proofErr w:type="spellStart"/>
-              <w:r>
-                <w:rPr>
-                  <w:color w:val="1155CC"/>
-                  <w:sz w:val="20"/>
-                  <w:szCs w:val="20"/>
-                  <w:u w:val="single"/>
-                </w:rPr>
-                <w:t>Material_De_Estudio</w:t>
-              </w:r>
-              <w:proofErr w:type="spellEnd"/>
             </w:hyperlink>
             <w:r>
               <w:rPr>
@@ -1778,342 +1768,8 @@
                 <w:szCs w:val="20"/>
                 <w:u w:val="single"/>
               </w:rPr>
-              <w:t>/Minutas</w:t>
-            </w:r>
-          </w:p>
-        </w:tc>
-      </w:tr>
-      <w:tr>
-        <w:trPr>
-          <w:trHeight w:val="480"/>
-        </w:trPr>
-        <w:tc>
-          <w:tcPr>
-            <w:tcW w:w="1560" w:type="dxa"/>
-            <w:tcMar>
-              <w:top w:w="100" w:type="dxa"/>
-              <w:left w:w="100" w:type="dxa"/>
-              <w:bottom w:w="100" w:type="dxa"/>
-              <w:right w:w="100" w:type="dxa"/>
-            </w:tcMar>
-            <w:vAlign w:val="center"/>
-          </w:tcPr>
-          <w:p>
-            <w:pPr>
-              <w:widowControl w:val="0"/>
-              <w:pBdr>
-                <w:top w:val="nil"/>
-                <w:left w:val="nil"/>
-                <w:bottom w:val="nil"/>
-                <w:right w:val="nil"/>
-                <w:between w:val="nil"/>
-              </w:pBdr>
-              <w:spacing w:line="240" w:lineRule="auto"/>
-              <w:jc w:val="center"/>
-            </w:pPr>
-            <w:proofErr w:type="spellStart"/>
-            <w:r>
-              <w:t>Resumenes</w:t>
-            </w:r>
-            <w:proofErr w:type="spellEnd"/>
-          </w:p>
-        </w:tc>
-        <w:tc>
-          <w:tcPr>
-            <w:tcW w:w="3237" w:type="dxa"/>
-            <w:tcMar>
-              <w:top w:w="100" w:type="dxa"/>
-              <w:left w:w="100" w:type="dxa"/>
-              <w:bottom w:w="100" w:type="dxa"/>
-              <w:right w:w="100" w:type="dxa"/>
-            </w:tcMar>
-            <w:vAlign w:val="center"/>
-          </w:tcPr>
-          <w:p>
-            <w:pPr>
-              <w:widowControl w:val="0"/>
-              <w:pBdr>
-                <w:top w:val="nil"/>
-                <w:left w:val="nil"/>
-                <w:bottom w:val="nil"/>
-                <w:right w:val="nil"/>
-                <w:between w:val="nil"/>
-              </w:pBdr>
-              <w:spacing w:line="240" w:lineRule="auto"/>
-              <w:jc w:val="center"/>
-              <w:rPr>
-                <w:sz w:val="20"/>
-                <w:szCs w:val="20"/>
-              </w:rPr>
-            </w:pPr>
-            <w:r>
-              <w:rPr>
-                <w:sz w:val="20"/>
-                <w:szCs w:val="20"/>
-              </w:rPr>
-              <w:t>&lt;</w:t>
-            </w:r>
-            <w:proofErr w:type="spellStart"/>
-            <w:r>
-              <w:rPr>
-                <w:sz w:val="20"/>
-                <w:szCs w:val="20"/>
-              </w:rPr>
-              <w:t>NombreDeTema</w:t>
-            </w:r>
-            <w:proofErr w:type="spellEnd"/>
-            <w:r>
-              <w:rPr>
-                <w:sz w:val="20"/>
-                <w:szCs w:val="20"/>
-              </w:rPr>
-              <w:t>&gt;_&lt;Apellido&gt;</w:t>
-            </w:r>
-          </w:p>
-        </w:tc>
-        <w:tc>
-          <w:tcPr>
-            <w:tcW w:w="5662" w:type="dxa"/>
-            <w:tcMar>
-              <w:top w:w="100" w:type="dxa"/>
-              <w:left w:w="100" w:type="dxa"/>
-              <w:bottom w:w="100" w:type="dxa"/>
-              <w:right w:w="100" w:type="dxa"/>
-            </w:tcMar>
-            <w:vAlign w:val="center"/>
-          </w:tcPr>
-          <w:p>
-            <w:pPr>
-              <w:widowControl w:val="0"/>
-              <w:pBdr>
-                <w:top w:val="nil"/>
-                <w:left w:val="nil"/>
-                <w:bottom w:val="nil"/>
-                <w:right w:val="nil"/>
-                <w:between w:val="nil"/>
-              </w:pBdr>
-              <w:spacing w:line="240" w:lineRule="auto"/>
-              <w:jc w:val="center"/>
-            </w:pPr>
-            <w:hyperlink r:id="rId20">
-              <w:proofErr w:type="spellStart"/>
-              <w:r>
-                <w:rPr>
-                  <w:color w:val="1155CC"/>
-                  <w:sz w:val="20"/>
-                  <w:szCs w:val="20"/>
-                  <w:u w:val="single"/>
-                </w:rPr>
-                <w:t>Bibliografia</w:t>
-              </w:r>
-              <w:proofErr w:type="spellEnd"/>
-              <w:r>
-                <w:rPr>
-                  <w:color w:val="1155CC"/>
-                  <w:sz w:val="20"/>
-                  <w:szCs w:val="20"/>
-                  <w:u w:val="single"/>
-                </w:rPr>
-                <w:t>/</w:t>
-              </w:r>
-              <w:proofErr w:type="spellStart"/>
-              <w:r>
-                <w:rPr>
-                  <w:color w:val="1155CC"/>
-                  <w:sz w:val="20"/>
-                  <w:szCs w:val="20"/>
-                  <w:u w:val="single"/>
-                </w:rPr>
-                <w:t>Material_De_Estudio</w:t>
-              </w:r>
-              <w:proofErr w:type="spellEnd"/>
-            </w:hyperlink>
-            <w:r>
-              <w:rPr>
-                <w:color w:val="1155CC"/>
-                <w:sz w:val="20"/>
-                <w:szCs w:val="20"/>
-                <w:u w:val="single"/>
-              </w:rPr>
-              <w:t>/</w:t>
-            </w:r>
-            <w:proofErr w:type="spellStart"/>
-            <w:r>
-              <w:rPr>
-                <w:color w:val="1155CC"/>
-                <w:sz w:val="20"/>
-                <w:szCs w:val="20"/>
-                <w:u w:val="single"/>
-              </w:rPr>
-              <w:t>Resumenes</w:t>
-            </w:r>
-            <w:proofErr w:type="spellEnd"/>
-          </w:p>
-        </w:tc>
-      </w:tr>
-      <w:tr>
-        <w:trPr>
-          <w:trHeight w:val="480"/>
-        </w:trPr>
-        <w:tc>
-          <w:tcPr>
-            <w:tcW w:w="1560" w:type="dxa"/>
-            <w:tcMar>
-              <w:top w:w="100" w:type="dxa"/>
-              <w:left w:w="100" w:type="dxa"/>
-              <w:bottom w:w="100" w:type="dxa"/>
-              <w:right w:w="100" w:type="dxa"/>
-            </w:tcMar>
-            <w:vAlign w:val="center"/>
-          </w:tcPr>
-          <w:p>
-            <w:pPr>
-              <w:widowControl w:val="0"/>
-              <w:pBdr>
-                <w:top w:val="nil"/>
-                <w:left w:val="nil"/>
-                <w:bottom w:val="nil"/>
-                <w:right w:val="nil"/>
-                <w:between w:val="nil"/>
-              </w:pBdr>
-              <w:spacing w:line="240" w:lineRule="auto"/>
-              <w:jc w:val="center"/>
-            </w:pPr>
-            <w:r>
-              <w:t>Ejercicios Prácticos</w:t>
-            </w:r>
-          </w:p>
-        </w:tc>
-        <w:tc>
-          <w:tcPr>
-            <w:tcW w:w="3237" w:type="dxa"/>
-            <w:tcMar>
-              <w:top w:w="100" w:type="dxa"/>
-              <w:left w:w="100" w:type="dxa"/>
-              <w:bottom w:w="100" w:type="dxa"/>
-              <w:right w:w="100" w:type="dxa"/>
-            </w:tcMar>
-            <w:vAlign w:val="center"/>
-          </w:tcPr>
-          <w:p>
-            <w:pPr>
-              <w:widowControl w:val="0"/>
-              <w:pBdr>
-                <w:top w:val="nil"/>
-                <w:left w:val="nil"/>
-                <w:bottom w:val="nil"/>
-                <w:right w:val="nil"/>
-                <w:between w:val="nil"/>
-              </w:pBdr>
-              <w:spacing w:line="240" w:lineRule="auto"/>
-              <w:jc w:val="center"/>
-              <w:rPr>
-                <w:sz w:val="20"/>
-                <w:szCs w:val="20"/>
-              </w:rPr>
-            </w:pPr>
-            <w:r>
-              <w:rPr>
-                <w:sz w:val="20"/>
-                <w:szCs w:val="20"/>
-              </w:rPr>
-              <w:t>&lt;</w:t>
-            </w:r>
-            <w:proofErr w:type="spellStart"/>
-            <w:r>
-              <w:rPr>
-                <w:sz w:val="20"/>
-                <w:szCs w:val="20"/>
-              </w:rPr>
-              <w:t>NombreDeTema</w:t>
-            </w:r>
-            <w:proofErr w:type="spellEnd"/>
-            <w:r>
-              <w:rPr>
-                <w:sz w:val="20"/>
-                <w:szCs w:val="20"/>
-              </w:rPr>
-              <w:t>&gt;_TP#_&lt;Apellidos&gt;.&lt;Extensión&gt;</w:t>
-            </w:r>
-          </w:p>
-        </w:tc>
-        <w:tc>
-          <w:tcPr>
-            <w:tcW w:w="5662" w:type="dxa"/>
-            <w:tcMar>
-              <w:top w:w="100" w:type="dxa"/>
-              <w:left w:w="100" w:type="dxa"/>
-              <w:bottom w:w="100" w:type="dxa"/>
-              <w:right w:w="100" w:type="dxa"/>
-            </w:tcMar>
-            <w:vAlign w:val="center"/>
-          </w:tcPr>
-          <w:p>
-            <w:pPr>
-              <w:widowControl w:val="0"/>
-              <w:pBdr>
-                <w:top w:val="nil"/>
-                <w:left w:val="nil"/>
-                <w:bottom w:val="nil"/>
-                <w:right w:val="nil"/>
-                <w:between w:val="nil"/>
-              </w:pBdr>
-              <w:spacing w:line="240" w:lineRule="auto"/>
-              <w:jc w:val="center"/>
-            </w:pPr>
-            <w:hyperlink r:id="rId21">
-              <w:proofErr w:type="spellStart"/>
-              <w:r>
-                <w:rPr>
-                  <w:color w:val="1155CC"/>
-                  <w:sz w:val="20"/>
-                  <w:szCs w:val="20"/>
-                  <w:u w:val="single"/>
-                </w:rPr>
-                <w:t>Bibliografia</w:t>
-              </w:r>
-              <w:proofErr w:type="spellEnd"/>
-              <w:r>
-                <w:rPr>
-                  <w:color w:val="1155CC"/>
-                  <w:sz w:val="20"/>
-                  <w:szCs w:val="20"/>
-                  <w:u w:val="single"/>
-                </w:rPr>
-                <w:t>/</w:t>
-              </w:r>
-              <w:proofErr w:type="spellStart"/>
-              <w:r>
-                <w:rPr>
-                  <w:color w:val="1155CC"/>
-                  <w:sz w:val="20"/>
-                  <w:szCs w:val="20"/>
-                  <w:u w:val="single"/>
-                </w:rPr>
-                <w:t>Material_De_Estudio</w:t>
-              </w:r>
-              <w:proofErr w:type="spellEnd"/>
-            </w:hyperlink>
-            <w:r>
-              <w:rPr>
-                <w:color w:val="1155CC"/>
-                <w:sz w:val="20"/>
-                <w:szCs w:val="20"/>
-                <w:u w:val="single"/>
-              </w:rPr>
-              <w:t>/</w:t>
-            </w:r>
-            <w:proofErr w:type="spellStart"/>
-            <w:r>
-              <w:rPr>
-                <w:color w:val="1155CC"/>
-                <w:sz w:val="20"/>
-                <w:szCs w:val="20"/>
-                <w:u w:val="single"/>
-              </w:rPr>
-              <w:t>Ejercicios_Practicos</w:t>
-            </w:r>
-            <w:proofErr w:type="spellEnd"/>
+              <w:t>/Ejercicios_Practicos</w:t>
+            </w:r>
           </w:p>
         </w:tc>
       </w:tr>
@@ -2183,33 +1839,8 @@
                 <w:sz w:val="20"/>
                 <w:szCs w:val="20"/>
               </w:rPr>
-              <w:t>SCM_&lt;</w:t>
-            </w:r>
-            <w:proofErr w:type="spellStart"/>
-            <w:r>
-              <w:rPr>
-                <w:sz w:val="20"/>
-                <w:szCs w:val="20"/>
-              </w:rPr>
-              <w:t>NombreLibro</w:t>
-            </w:r>
-            <w:proofErr w:type="spellEnd"/>
-            <w:r>
-              <w:rPr>
-                <w:sz w:val="20"/>
-                <w:szCs w:val="20"/>
-              </w:rPr>
-              <w:t>&gt;.</w:t>
-            </w:r>
-            <w:proofErr w:type="spellStart"/>
-            <w:r>
-              <w:rPr>
-                <w:sz w:val="20"/>
-                <w:szCs w:val="20"/>
-              </w:rPr>
-              <w:t>pdf</w:t>
-            </w:r>
-            <w:proofErr w:type="spellEnd"/>
+              <w:t>SCM_&lt;NombreLibro&gt;.pdf</w:t>
+            </w:r>
           </w:p>
         </w:tc>
         <w:tc>
@@ -2320,33 +1951,8 @@
                 <w:sz w:val="20"/>
                 <w:szCs w:val="20"/>
               </w:rPr>
-              <w:t>PA_&lt;</w:t>
-            </w:r>
-            <w:proofErr w:type="spellStart"/>
-            <w:r>
-              <w:rPr>
-                <w:sz w:val="20"/>
-                <w:szCs w:val="20"/>
-              </w:rPr>
-              <w:t>NombreLibro</w:t>
-            </w:r>
-            <w:proofErr w:type="spellEnd"/>
-            <w:r>
-              <w:rPr>
-                <w:sz w:val="20"/>
-                <w:szCs w:val="20"/>
-              </w:rPr>
-              <w:t>&gt;.</w:t>
-            </w:r>
-            <w:proofErr w:type="spellStart"/>
-            <w:r>
-              <w:rPr>
-                <w:sz w:val="20"/>
-                <w:szCs w:val="20"/>
-              </w:rPr>
-              <w:t>pdf</w:t>
-            </w:r>
-            <w:proofErr w:type="spellEnd"/>
+              <w:t>PA_&lt;NombreLibro&gt;.pdf</w:t>
+            </w:r>
           </w:p>
         </w:tc>
         <w:tc>
@@ -2457,33 +2063,8 @@
                 <w:sz w:val="20"/>
                 <w:szCs w:val="20"/>
               </w:rPr>
-              <w:t>IS_&lt;</w:t>
-            </w:r>
-            <w:proofErr w:type="spellStart"/>
-            <w:r>
-              <w:rPr>
-                <w:sz w:val="20"/>
-                <w:szCs w:val="20"/>
-              </w:rPr>
-              <w:t>NombreLibro</w:t>
-            </w:r>
-            <w:proofErr w:type="spellEnd"/>
-            <w:r>
-              <w:rPr>
-                <w:sz w:val="20"/>
-                <w:szCs w:val="20"/>
-              </w:rPr>
-              <w:t>&gt;.</w:t>
-            </w:r>
-            <w:proofErr w:type="spellStart"/>
-            <w:r>
-              <w:rPr>
-                <w:sz w:val="20"/>
-                <w:szCs w:val="20"/>
-              </w:rPr>
-              <w:t>pdf</w:t>
-            </w:r>
-            <w:proofErr w:type="spellEnd"/>
+              <w:t>IS_&lt;NombreLibro&gt;.pdf</w:t>
+            </w:r>
           </w:p>
         </w:tc>
         <w:tc>
@@ -2510,7 +2091,7 @@
               <w:spacing w:line="240" w:lineRule="auto"/>
               <w:jc w:val="center"/>
             </w:pPr>
-            <w:hyperlink w:history="1" r:id="rId24">
+            <w:hyperlink r:id="rId24" w:history="1">
               <w:r>
                 <w:rPr>
                   <w:rStyle w:val="Hipervnculo"/>
@@ -2552,19 +2133,11 @@
                 <w:lang w:val="en-US"/>
               </w:rPr>
             </w:pPr>
-            <w:proofErr w:type="spellStart"/>
             <w:r>
               <w:rPr>
                 <w:lang w:val="en-US"/>
               </w:rPr>
-              <w:t>Bibliografía</w:t>
-            </w:r>
-            <w:proofErr w:type="spellEnd"/>
-            <w:r>
-              <w:rPr>
-                <w:lang w:val="en-US"/>
-              </w:rPr>
-              <w:t xml:space="preserve"> de Test Driven Development</w:t>
+              <w:t>Bibliografía de Test Driven Development</w:t>
             </w:r>
           </w:p>
         </w:tc>
@@ -2603,25 +2176,7 @@
                 <w:szCs w:val="20"/>
                 <w:lang w:val="en-US"/>
               </w:rPr>
-              <w:t>TDD_&lt;</w:t>
-            </w:r>
-            <w:proofErr w:type="spellStart"/>
-            <w:r>
-              <w:rPr>
-                <w:sz w:val="20"/>
-                <w:szCs w:val="20"/>
-                <w:lang w:val="en-US"/>
-              </w:rPr>
-              <w:t>NombreLibro</w:t>
-            </w:r>
-            <w:proofErr w:type="spellEnd"/>
-            <w:r>
-              <w:rPr>
-                <w:sz w:val="20"/>
-                <w:szCs w:val="20"/>
-                <w:lang w:val="en-US"/>
-              </w:rPr>
-              <w:t>&gt;.pdf</w:t>
+              <w:t>TDD_&lt;NombreLibro&gt;.pdf</w:t>
             </w:r>
           </w:p>
         </w:tc>
@@ -2649,7 +2204,7 @@
               <w:spacing w:line="240" w:lineRule="auto"/>
               <w:jc w:val="center"/>
             </w:pPr>
-            <w:hyperlink w:history="1" r:id="rId25">
+            <w:hyperlink r:id="rId25" w:history="1">
               <w:r>
                 <w:rPr>
                   <w:rStyle w:val="Hipervnculo"/>
@@ -2726,39 +2281,7 @@
                 <w:sz w:val="20"/>
                 <w:szCs w:val="20"/>
               </w:rPr>
-              <w:t>ISW_TP#_&lt;</w:t>
-            </w:r>
-            <w:proofErr w:type="spellStart"/>
-            <w:r>
-              <w:rPr>
-                <w:sz w:val="20"/>
-                <w:szCs w:val="20"/>
-              </w:rPr>
-              <w:t>NombreTrabajoPractico</w:t>
-            </w:r>
-            <w:proofErr w:type="spellEnd"/>
-            <w:r>
-              <w:rPr>
-                <w:sz w:val="20"/>
-                <w:szCs w:val="20"/>
-              </w:rPr>
-              <w:t>&gt;.&lt;</w:t>
-            </w:r>
-            <w:proofErr w:type="spellStart"/>
-            <w:r>
-              <w:rPr>
-                <w:sz w:val="20"/>
-                <w:szCs w:val="20"/>
-              </w:rPr>
-              <w:t>Extension</w:t>
-            </w:r>
-            <w:proofErr w:type="spellEnd"/>
-            <w:r>
-              <w:rPr>
-                <w:sz w:val="20"/>
-                <w:szCs w:val="20"/>
-              </w:rPr>
-              <w:t>&gt;</w:t>
+              <w:t>ISW_TP#_&lt;NombreTrabajoPractico&gt;.&lt;Extension&gt;</w:t>
             </w:r>
           </w:p>
         </w:tc>
@@ -2833,15 +2356,7 @@
               <w:jc w:val="center"/>
             </w:pPr>
             <w:r>
-              <w:t xml:space="preserve">Bibliografía de </w:t>
-            </w:r>
-            <w:proofErr w:type="spellStart"/>
-            <w:r>
-              <w:t>Testing</w:t>
-            </w:r>
-            <w:proofErr w:type="spellEnd"/>
-            <w:r>
-              <w:t xml:space="preserve"> de Software</w:t>
+              <w:t>Bibliografía de Testing de Software</w:t>
             </w:r>
           </w:p>
         </w:tc>
@@ -2878,33 +2393,8 @@
                 <w:sz w:val="20"/>
                 <w:szCs w:val="20"/>
               </w:rPr>
-              <w:t>TS_&lt;</w:t>
-            </w:r>
-            <w:proofErr w:type="spellStart"/>
-            <w:r>
-              <w:rPr>
-                <w:sz w:val="20"/>
-                <w:szCs w:val="20"/>
-              </w:rPr>
-              <w:t>NombreLibro</w:t>
-            </w:r>
-            <w:proofErr w:type="spellEnd"/>
-            <w:r>
-              <w:rPr>
-                <w:sz w:val="20"/>
-                <w:szCs w:val="20"/>
-              </w:rPr>
-              <w:t>&gt;.</w:t>
-            </w:r>
-            <w:proofErr w:type="spellStart"/>
-            <w:r>
-              <w:rPr>
-                <w:sz w:val="20"/>
-                <w:szCs w:val="20"/>
-              </w:rPr>
-              <w:t>pdf</w:t>
-            </w:r>
-            <w:proofErr w:type="spellEnd"/>
+              <w:t>TS_&lt;NombreLibro&gt;.pdf</w:t>
+            </w:r>
           </w:p>
         </w:tc>
         <w:tc>
@@ -2931,24 +2421,12 @@
               <w:spacing w:line="240" w:lineRule="auto"/>
               <w:jc w:val="center"/>
             </w:pPr>
-            <w:hyperlink w:history="1" r:id="rId27">
+            <w:hyperlink r:id="rId27" w:history="1">
               <w:r>
                 <w:rPr>
                   <w:rStyle w:val="Hipervnculo"/>
                 </w:rPr>
-                <w:t>Bibliografia/Bibliografia_De_La_Catedra/Material_Bibliografico/Tes</w:t>
-              </w:r>
-              <w:r>
-                <w:rPr>
-                  <w:rStyle w:val="Hipervnculo"/>
-                </w:rPr>
-                <w:t>t</w:t>
-              </w:r>
-              <w:r>
-                <w:rPr>
-                  <w:rStyle w:val="Hipervnculo"/>
-                </w:rPr>
-                <w:t>ing_de_Software</w:t>
+                <w:t>Bibliografia/Bibliografia_De_La_Catedra/Material_Bibliografico/Testing_de_Software</w:t>
               </w:r>
             </w:hyperlink>
           </w:p>
@@ -2983,13 +2461,8 @@
               <w:jc w:val="center"/>
             </w:pPr>
             <w:r>
-              <w:t xml:space="preserve">Evidencia de </w:t>
-            </w:r>
-            <w:proofErr w:type="spellStart"/>
-            <w:r>
-              <w:t>TPs</w:t>
-            </w:r>
-            <w:proofErr w:type="spellEnd"/>
+              <w:t>Evidencia de TPs</w:t>
+            </w:r>
           </w:p>
         </w:tc>
         <w:tc>
@@ -3025,39 +2498,7 @@
                 <w:sz w:val="20"/>
                 <w:szCs w:val="20"/>
               </w:rPr>
-              <w:t>&lt;</w:t>
-            </w:r>
-            <w:proofErr w:type="spellStart"/>
-            <w:r>
-              <w:rPr>
-                <w:sz w:val="20"/>
-                <w:szCs w:val="20"/>
-              </w:rPr>
-              <w:t>NombreDescriptivo</w:t>
-            </w:r>
-            <w:proofErr w:type="spellEnd"/>
-            <w:r>
-              <w:rPr>
-                <w:sz w:val="20"/>
-                <w:szCs w:val="20"/>
-              </w:rPr>
-              <w:t>&gt;.&lt;</w:t>
-            </w:r>
-            <w:proofErr w:type="spellStart"/>
-            <w:r>
-              <w:rPr>
-                <w:sz w:val="20"/>
-                <w:szCs w:val="20"/>
-              </w:rPr>
-              <w:t>Extension</w:t>
-            </w:r>
-            <w:proofErr w:type="spellEnd"/>
-            <w:r>
-              <w:rPr>
-                <w:sz w:val="20"/>
-                <w:szCs w:val="20"/>
-              </w:rPr>
-              <w:t>&gt;</w:t>
+              <w:t>&lt;NombreDescriptivo&gt;.&lt;Extension&gt;</w:t>
             </w:r>
           </w:p>
         </w:tc>
@@ -3085,52 +2526,12 @@
               <w:spacing w:line="240" w:lineRule="auto"/>
               <w:jc w:val="center"/>
             </w:pPr>
-            <w:hyperlink w:history="1" r:id="rId28">
+            <w:hyperlink r:id="rId28" w:history="1">
               <w:r>
                 <w:rPr>
                   <w:rStyle w:val="Hipervnculo"/>
                 </w:rPr>
-                <w:t>Entregas/</w:t>
-              </w:r>
-              <w:proofErr w:type="spellStart"/>
-              <w:r>
-                <w:rPr>
-                  <w:rStyle w:val="Hipervnculo"/>
-                </w:rPr>
-                <w:t>Trabajos_Prácticos</w:t>
-              </w:r>
-              <w:proofErr w:type="spellEnd"/>
-              <w:r>
-                <w:rPr>
-                  <w:rStyle w:val="Hipervnculo"/>
-                </w:rPr>
-                <w:t>/TP#</w:t>
-              </w:r>
-              <w:r>
-                <w:rPr>
-                  <w:rStyle w:val="Hipervnculo"/>
-                </w:rPr>
-                <w:t>_</w:t>
-              </w:r>
-              <w:r>
-                <w:rPr>
-                  <w:rStyle w:val="Hipervnculo"/>
-                </w:rPr>
-                <w:t>&lt;</w:t>
-              </w:r>
-              <w:proofErr w:type="spellStart"/>
-              <w:r>
-                <w:rPr>
-                  <w:rStyle w:val="Hipervnculo"/>
-                </w:rPr>
-                <w:t>NombreTrabajoPractico</w:t>
-              </w:r>
-              <w:proofErr w:type="spellEnd"/>
-              <w:r>
-                <w:rPr>
-                  <w:rStyle w:val="Hipervnculo"/>
-                </w:rPr>
-                <w:t>&gt;</w:t>
+                <w:t>Entregas/Trabajos_Prácticos/TP#_&lt;NombreTrabajoPractico&gt;</w:t>
               </w:r>
             </w:hyperlink>
           </w:p>
@@ -3147,7 +2548,7 @@
           <w:u w:val="single"/>
         </w:rPr>
         <w:sectPr>
-          <w:pgSz w:w="11909" w:h="16834" w:orient="portrait"/>
+          <w:pgSz w:w="11909" w:h="16834"/>
           <w:pgMar w:top="720" w:right="720" w:bottom="720" w:left="720" w:header="720" w:footer="720" w:gutter="0"/>
           <w:pgNumType w:start="1"/>
           <w:cols w:space="720"/>
@@ -3171,6 +2572,7 @@
           <w:szCs w:val="30"/>
           <w:u w:val="single"/>
         </w:rPr>
+        <w:lastRenderedPageBreak/>
         <w:t>Estructura del repositorio</w:t>
       </w:r>
     </w:p>
@@ -3189,7 +2591,7 @@
       <w:pPr>
         <w:jc w:val="center"/>
         <w:sectPr>
-          <w:pgSz w:w="11909" w:h="16834" w:orient="portrait"/>
+          <w:pgSz w:w="11909" w:h="16834"/>
           <w:pgMar w:top="1440" w:right="1440" w:bottom="1440" w:left="1440" w:header="720" w:footer="720" w:gutter="0"/>
           <w:cols w:space="720"/>
         </w:sectPr>
@@ -3253,6 +2655,7 @@
           <w:szCs w:val="30"/>
           <w:u w:val="single"/>
         </w:rPr>
+        <w:lastRenderedPageBreak/>
         <w:t>Glosario</w:t>
       </w:r>
     </w:p>
@@ -3271,14 +2674,13 @@
       <w:tblPr>
         <w:tblW w:w="9029" w:type="dxa"/>
         <w:jc w:val="center"/>
-        <w:tblInd w:w="0" w:type="dxa"/>
         <w:tblBorders>
-          <w:top w:val="single" w:color="000000" w:themeColor="text1" w:sz="8" w:space="0"/>
-          <w:left w:val="single" w:color="000000" w:themeColor="text1" w:sz="8" w:space="0"/>
-          <w:bottom w:val="single" w:color="000000" w:themeColor="text1" w:sz="8" w:space="0"/>
-          <w:right w:val="single" w:color="000000" w:themeColor="text1" w:sz="8" w:space="0"/>
-          <w:insideH w:val="single" w:color="000000" w:themeColor="text1" w:sz="8" w:space="0"/>
-          <w:insideV w:val="single" w:color="000000" w:themeColor="text1" w:sz="8" w:space="0"/>
+          <w:top w:val="single" w:sz="8" w:space="0" w:color="000000" w:themeColor="text1"/>
+          <w:left w:val="single" w:sz="8" w:space="0" w:color="000000" w:themeColor="text1"/>
+          <w:bottom w:val="single" w:sz="8" w:space="0" w:color="000000" w:themeColor="text1"/>
+          <w:right w:val="single" w:sz="8" w:space="0" w:color="000000" w:themeColor="text1"/>
+          <w:insideH w:val="single" w:sz="8" w:space="0" w:color="000000" w:themeColor="text1"/>
+          <w:insideV w:val="single" w:sz="8" w:space="0" w:color="000000" w:themeColor="text1"/>
         </w:tblBorders>
         <w:tblLayout w:type="fixed"/>
         <w:tblLook w:val="0600" w:firstRow="0" w:lastRow="0" w:firstColumn="0" w:lastColumn="0" w:noHBand="1" w:noVBand="1"/>
@@ -3288,7 +2690,9 @@
         <w:gridCol w:w="4515"/>
       </w:tblGrid>
       <w:tr>
-        <w:trPr/>
+        <w:trPr>
+          <w:jc w:val="center"/>
+        </w:trPr>
         <w:tc>
           <w:tcPr>
             <w:tcW w:w="4514" w:type="dxa"/>
@@ -3367,7 +2771,9 @@
         </w:tc>
       </w:tr>
       <w:tr>
-        <w:trPr/>
+        <w:trPr>
+          <w:jc w:val="center"/>
+        </w:trPr>
         <w:tc>
           <w:tcPr>
             <w:tcW w:w="4514" w:type="dxa"/>
@@ -3388,15 +2794,7 @@
               </w:rPr>
             </w:pPr>
             <w:r>
-              <w:t>&lt;</w:t>
-            </w:r>
-            <w:proofErr w:type="spellStart"/>
-            <w:r>
-              <w:t>NombreTrabajoPractico</w:t>
-            </w:r>
-            <w:proofErr w:type="spellEnd"/>
-            <w:r>
-              <w:t>&gt;</w:t>
+              <w:t>&lt;NombreTrabajoPractico&gt;</w:t>
             </w:r>
           </w:p>
         </w:tc>
@@ -3430,7 +2828,9 @@
         </w:tc>
       </w:tr>
       <w:tr>
-        <w:trPr/>
+        <w:trPr>
+          <w:jc w:val="center"/>
+        </w:trPr>
         <w:tc>
           <w:tcPr>
             <w:tcW w:w="4514" w:type="dxa"/>
@@ -3485,7 +2885,9 @@
         </w:tc>
       </w:tr>
       <w:tr>
-        <w:trPr/>
+        <w:trPr>
+          <w:jc w:val="center"/>
+        </w:trPr>
         <w:tc>
           <w:tcPr>
             <w:tcW w:w="4514" w:type="dxa"/>
@@ -3506,15 +2908,7 @@
               </w:rPr>
             </w:pPr>
             <w:r>
-              <w:t>&lt;</w:t>
-            </w:r>
-            <w:proofErr w:type="spellStart"/>
-            <w:r>
-              <w:t>NombrePresentación</w:t>
-            </w:r>
-            <w:proofErr w:type="spellEnd"/>
-            <w:r>
-              <w:t>&gt;</w:t>
+              <w:t>&lt;NombrePresentación&gt;</w:t>
             </w:r>
           </w:p>
         </w:tc>
@@ -3548,7 +2942,9 @@
         </w:tc>
       </w:tr>
       <w:tr>
-        <w:trPr/>
+        <w:trPr>
+          <w:jc w:val="center"/>
+        </w:trPr>
         <w:tc>
           <w:tcPr>
             <w:tcW w:w="4514" w:type="dxa"/>
@@ -3601,21 +2997,15 @@
               <w:jc w:val="center"/>
             </w:pPr>
             <w:r>
-              <w:t xml:space="preserve">Fecha correspondiente al </w:t>
-            </w:r>
-            <w:proofErr w:type="spellStart"/>
-            <w:r>
-              <w:t>dia</w:t>
-            </w:r>
-            <w:proofErr w:type="spellEnd"/>
-            <w:r>
-              <w:t xml:space="preserve"> que se tomó la minuta.</w:t>
+              <w:t>Fecha correspondiente al dia que se tomó la minuta.</w:t>
             </w:r>
           </w:p>
         </w:tc>
       </w:tr>
       <w:tr>
-        <w:trPr/>
+        <w:trPr>
+          <w:jc w:val="center"/>
+        </w:trPr>
         <w:tc>
           <w:tcPr>
             <w:tcW w:w="4514" w:type="dxa"/>
@@ -3636,15 +3026,7 @@
               </w:rPr>
             </w:pPr>
             <w:r>
-              <w:t>&lt;</w:t>
-            </w:r>
-            <w:proofErr w:type="spellStart"/>
-            <w:r>
-              <w:t>NombreDeTema</w:t>
-            </w:r>
-            <w:proofErr w:type="spellEnd"/>
-            <w:r>
-              <w:t>&gt;</w:t>
+              <w:t>&lt;NombreDeTema&gt;</w:t>
             </w:r>
           </w:p>
         </w:tc>
@@ -3684,7 +3066,9 @@
         </w:tc>
       </w:tr>
       <w:tr>
-        <w:trPr/>
+        <w:trPr>
+          <w:jc w:val="center"/>
+        </w:trPr>
         <w:tc>
           <w:tcPr>
             <w:tcW w:w="4514" w:type="dxa"/>
@@ -3742,7 +3126,9 @@
         </w:tc>
       </w:tr>
       <w:tr>
-        <w:trPr/>
+        <w:trPr>
+          <w:jc w:val="center"/>
+        </w:trPr>
         <w:tc>
           <w:tcPr>
             <w:tcW w:w="4514" w:type="dxa"/>
@@ -3794,7 +3180,9 @@
         </w:tc>
       </w:tr>
       <w:tr>
-        <w:trPr/>
+        <w:trPr>
+          <w:jc w:val="center"/>
+        </w:trPr>
         <w:tc>
           <w:tcPr>
             <w:tcW w:w="4514" w:type="dxa"/>
@@ -3833,52 +3221,21 @@
               <w:jc w:val="center"/>
             </w:pPr>
             <w:r>
-              <w:rPr/>
-              <w:t>Determina la extensión del archivo identificado como ítem de configuración. Ejemplo: .</w:t>
-            </w:r>
-            <w:r>
-              <w:rPr/>
-              <w:t>docx</w:t>
-            </w:r>
-            <w:r>
-              <w:rPr/>
-              <w:t>, .</w:t>
-            </w:r>
-            <w:r>
-              <w:rPr/>
-              <w:t>txt</w:t>
-            </w:r>
-            <w:bookmarkStart w:name="_GoBack" w:id="0"/>
-            <w:bookmarkEnd w:id="0"/>
-            <w:r>
-              <w:rPr/>
-              <w:t>,</w:t>
-            </w:r>
-            <w:r>
-              <w:rPr/>
-              <w:t xml:space="preserve"> </w:t>
-            </w:r>
-            <w:r>
-              <w:rPr/>
-              <w:t>jpg</w:t>
-            </w:r>
-            <w:r>
-              <w:rPr/>
-              <w:t>, png</w:t>
-            </w:r>
-            <w:r>
-              <w:rPr/>
-              <w:t xml:space="preserve"> </w:t>
-            </w:r>
-            <w:r>
-              <w:rPr/>
-              <w:t>etc</w:t>
+              <w:t>Determina la extensión del archivo identificado como ítem de configuración. Ejemplo: .docx, .txt,</w:t>
+            </w:r>
+            <w:r>
+              <w:t xml:space="preserve"> jpg, png</w:t>
+            </w:r>
+            <w:r>
+              <w:t xml:space="preserve"> etc</w:t>
             </w:r>
           </w:p>
         </w:tc>
       </w:tr>
       <w:tr>
-        <w:trPr/>
+        <w:trPr>
+          <w:jc w:val="center"/>
+        </w:trPr>
         <w:tc>
           <w:tcPr>
             <w:tcW w:w="4514" w:type="dxa"/>
@@ -3917,21 +3274,15 @@
               <w:jc w:val="center"/>
             </w:pPr>
             <w:r>
-              <w:t xml:space="preserve">Software </w:t>
-            </w:r>
-            <w:proofErr w:type="spellStart"/>
-            <w:r>
-              <w:t>Configuration</w:t>
-            </w:r>
-            <w:proofErr w:type="spellEnd"/>
-            <w:r>
-              <w:t xml:space="preserve"> Management</w:t>
+              <w:t>Software Configuration Management</w:t>
             </w:r>
           </w:p>
         </w:tc>
       </w:tr>
       <w:tr>
-        <w:trPr/>
+        <w:trPr>
+          <w:jc w:val="center"/>
+        </w:trPr>
         <w:tc>
           <w:tcPr>
             <w:tcW w:w="4514" w:type="dxa"/>
@@ -3976,7 +3327,9 @@
         </w:tc>
       </w:tr>
       <w:tr>
-        <w:trPr/>
+        <w:trPr>
+          <w:jc w:val="center"/>
+        </w:trPr>
         <w:tc>
           <w:tcPr>
             <w:tcW w:w="4514" w:type="dxa"/>
@@ -3994,15 +3347,7 @@
               <w:jc w:val="center"/>
             </w:pPr>
             <w:r>
-              <w:t>&lt;</w:t>
-            </w:r>
-            <w:proofErr w:type="spellStart"/>
-            <w:r>
-              <w:t>NombreLibro</w:t>
-            </w:r>
-            <w:proofErr w:type="spellEnd"/>
-            <w:r>
-              <w:t xml:space="preserve">&gt; </w:t>
+              <w:t xml:space="preserve">&lt;NombreLibro&gt; </w:t>
             </w:r>
           </w:p>
         </w:tc>
@@ -4029,7 +3374,9 @@
         </w:tc>
       </w:tr>
       <w:tr>
-        <w:trPr/>
+        <w:trPr>
+          <w:jc w:val="center"/>
+        </w:trPr>
         <w:tc>
           <w:tcPr>
             <w:tcW w:w="4514" w:type="dxa"/>
@@ -4074,7 +3421,9 @@
         </w:tc>
       </w:tr>
       <w:tr>
-        <w:trPr/>
+        <w:trPr>
+          <w:jc w:val="center"/>
+        </w:trPr>
         <w:tc>
           <w:tcPr>
             <w:tcW w:w="4514" w:type="dxa"/>
@@ -4112,13 +3461,58 @@
               <w:spacing w:line="240" w:lineRule="auto"/>
               <w:jc w:val="center"/>
             </w:pPr>
-            <w:proofErr w:type="spellStart"/>
-            <w:r>
-              <w:t>Testing</w:t>
-            </w:r>
-            <w:proofErr w:type="spellEnd"/>
-            <w:r>
-              <w:t xml:space="preserve"> de Software</w:t>
+            <w:r>
+              <w:t>Testing de Software</w:t>
+            </w:r>
+          </w:p>
+        </w:tc>
+      </w:tr>
+      <w:tr>
+        <w:trPr>
+          <w:jc w:val="center"/>
+        </w:trPr>
+        <w:tc>
+          <w:tcPr>
+            <w:tcW w:w="4514" w:type="dxa"/>
+            <w:tcMar>
+              <w:top w:w="100" w:type="dxa"/>
+              <w:left w:w="100" w:type="dxa"/>
+              <w:bottom w:w="100" w:type="dxa"/>
+              <w:right w:w="100" w:type="dxa"/>
+            </w:tcMar>
+          </w:tcPr>
+          <w:p>
+            <w:pPr>
+              <w:widowControl w:val="0"/>
+              <w:spacing w:line="240" w:lineRule="auto"/>
+              <w:jc w:val="center"/>
+            </w:pPr>
+            <w:r>
+              <w:t>TDD</w:t>
+            </w:r>
+          </w:p>
+        </w:tc>
+        <w:tc>
+          <w:tcPr>
+            <w:tcW w:w="4515" w:type="dxa"/>
+            <w:tcMar>
+              <w:top w:w="100" w:type="dxa"/>
+              <w:left w:w="100" w:type="dxa"/>
+              <w:bottom w:w="100" w:type="dxa"/>
+              <w:right w:w="100" w:type="dxa"/>
+            </w:tcMar>
+          </w:tcPr>
+          <w:p>
+            <w:pPr>
+              <w:widowControl w:val="0"/>
+              <w:spacing w:line="240" w:lineRule="auto"/>
+              <w:jc w:val="center"/>
+            </w:pPr>
+            <w:r>
+              <w:rPr>
+                <w:lang w:val="en-US"/>
+              </w:rPr>
+              <w:t>Test Driven Development</w:t>
             </w:r>
           </w:p>
         </w:tc>
@@ -4126,6 +3520,7 @@
       <w:tr>
         <w:trPr>
           <w:trHeight w:val="300"/>
+          <w:jc w:val="center"/>
         </w:trPr>
         <w:tc>
           <w:tcPr>
@@ -4139,7 +3534,6 @@
           </w:tcPr>
           <w:p>
             <w:pPr>
-              <w:pStyle w:val="Normal"/>
               <w:spacing w:line="240" w:lineRule="auto"/>
               <w:jc w:val="center"/>
               <w:rPr>
@@ -4168,12 +3562,10 @@
           </w:tcPr>
           <w:p>
             <w:pPr>
-              <w:pStyle w:val="Normal"/>
-              <w:spacing w:line="240" w:lineRule="auto"/>
-              <w:jc w:val="center"/>
-            </w:pPr>
-            <w:r>
-              <w:rPr/>
+              <w:spacing w:line="240" w:lineRule="auto"/>
+              <w:jc w:val="center"/>
+            </w:pPr>
+            <w:r>
               <w:t>Nombre descriptivo y representativo sobre la evidencia a la que hace referencia</w:t>
             </w:r>
           </w:p>
@@ -4271,6 +3663,7 @@
           <w:szCs w:val="30"/>
           <w:u w:val="single"/>
         </w:rPr>
+        <w:lastRenderedPageBreak/>
         <w:t>Criterios de Línea Base</w:t>
       </w:r>
     </w:p>
@@ -4280,15 +3673,7 @@
         <w:jc w:val="both"/>
       </w:pPr>
       <w:r>
-        <w:t xml:space="preserve">La línea base será establecida en el momento posterior a una </w:t>
-      </w:r>
-      <w:proofErr w:type="spellStart"/>
-      <w:r>
-        <w:t>devolución</w:t>
-      </w:r>
-      <w:proofErr w:type="spellEnd"/>
-      <w:r>
-        <w:t xml:space="preserve"> positiva tanto verbal o escrita por parte de los docentes en los trabajos prácticos. El contenido de la misma tendrá los ítems de configuración pertenecientes a cada trabajo practico.</w:t>
+        <w:t>La línea base será establecida en el momento posterior a una devolución positiva tanto verbal o escrita por parte de los docentes en los trabajos prácticos. El contenido de la misma tendrá los ítems de configuración pertenecientes a cada trabajo practico.</w:t>
       </w:r>
     </w:p>
     <w:p>
@@ -4316,7 +3701,7 @@
       </w:pPr>
     </w:p>
     <w:sectPr>
-      <w:pgSz w:w="11909" w:h="16834" w:orient="portrait"/>
+      <w:pgSz w:w="11909" w:h="16834"/>
       <w:pgMar w:top="1440" w:right="1440" w:bottom="1440" w:left="1440" w:header="720" w:footer="720" w:gutter="0"/>
       <w:cols w:space="720"/>
     </w:sectPr>
@@ -4325,11 +3710,11 @@
 </file>
 
 <file path=word/styles.xml><?xml version="1.0" encoding="utf-8"?>
-<w:styles xmlns:wp14="http://schemas.microsoft.com/office/word/2010/wordprocessingDrawing" xmlns:mc="http://schemas.openxmlformats.org/markup-compatibility/2006" xmlns:r="http://schemas.openxmlformats.org/officeDocument/2006/relationships" xmlns:w="http://schemas.openxmlformats.org/wordprocessingml/2006/main" xmlns:w14="http://schemas.microsoft.com/office/word/2010/wordml" xmlns:w15="http://schemas.microsoft.com/office/word/2012/wordml" xmlns:w16se="http://schemas.microsoft.com/office/word/2015/wordml/symex" mc:Ignorable="w14 w15 w16se wp14">
+<w:styles xmlns:mc="http://schemas.openxmlformats.org/markup-compatibility/2006" xmlns:r="http://schemas.openxmlformats.org/officeDocument/2006/relationships" xmlns:w="http://schemas.openxmlformats.org/wordprocessingml/2006/main" xmlns:w14="http://schemas.microsoft.com/office/word/2010/wordml" xmlns:w15="http://schemas.microsoft.com/office/word/2012/wordml" xmlns:w16cex="http://schemas.microsoft.com/office/word/2018/wordml/cex" xmlns:w16cid="http://schemas.microsoft.com/office/word/2016/wordml/cid" xmlns:w16="http://schemas.microsoft.com/office/word/2018/wordml" xmlns:w16du="http://schemas.microsoft.com/office/word/2023/wordml/word16du" xmlns:w16sdtdh="http://schemas.microsoft.com/office/word/2020/wordml/sdtdatahash" xmlns:w16sdtfl="http://schemas.microsoft.com/office/word/2024/wordml/sdtformatlock" xmlns:w16se="http://schemas.microsoft.com/office/word/2015/wordml/symex" mc:Ignorable="w14 w15 w16se w16cid w16 w16cex w16sdtdh w16sdtfl w16du">
   <w:docDefaults>
     <w:rPrDefault>
       <w:rPr>
-        <w:rFonts w:ascii="Arial" w:hAnsi="Arial" w:eastAsia="Arial" w:cs="Arial"/>
+        <w:rFonts w:ascii="Arial" w:eastAsia="Arial" w:hAnsi="Arial" w:cs="Arial"/>
         <w:sz w:val="22"/>
         <w:szCs w:val="22"/>
         <w:lang w:val="es-AR" w:eastAsia="en-US" w:bidi="ar-SA"/>
@@ -4341,17 +3726,17 @@
       </w:pPr>
     </w:pPrDefault>
   </w:docDefaults>
-  <w:latentStyles w:defLockedState="0" w:defUIPriority="99" w:defSemiHidden="0" w:defUnhideWhenUsed="0" w:defQFormat="0" w:count="371">
+  <w:latentStyles w:defLockedState="0" w:defUIPriority="99" w:defSemiHidden="0" w:defUnhideWhenUsed="0" w:defQFormat="0" w:count="376">
     <w:lsdException w:name="Normal" w:uiPriority="0" w:qFormat="1"/>
     <w:lsdException w:name="heading 1" w:uiPriority="9" w:qFormat="1"/>
-    <w:lsdException w:name="heading 2" w:uiPriority="9" w:semiHidden="1" w:unhideWhenUsed="1" w:qFormat="1"/>
-    <w:lsdException w:name="heading 3" w:uiPriority="9" w:semiHidden="1" w:unhideWhenUsed="1" w:qFormat="1"/>
-    <w:lsdException w:name="heading 4" w:uiPriority="9" w:semiHidden="1" w:unhideWhenUsed="1" w:qFormat="1"/>
-    <w:lsdException w:name="heading 5" w:uiPriority="9" w:semiHidden="1" w:unhideWhenUsed="1" w:qFormat="1"/>
-    <w:lsdException w:name="heading 6" w:uiPriority="9" w:semiHidden="1" w:unhideWhenUsed="1" w:qFormat="1"/>
-    <w:lsdException w:name="heading 7" w:uiPriority="9" w:semiHidden="1" w:unhideWhenUsed="1" w:qFormat="1"/>
-    <w:lsdException w:name="heading 8" w:uiPriority="9" w:semiHidden="1" w:unhideWhenUsed="1" w:qFormat="1"/>
-    <w:lsdException w:name="heading 9" w:uiPriority="9" w:semiHidden="1" w:unhideWhenUsed="1" w:qFormat="1"/>
+    <w:lsdException w:name="heading 2" w:semiHidden="1" w:uiPriority="9" w:unhideWhenUsed="1" w:qFormat="1"/>
+    <w:lsdException w:name="heading 3" w:semiHidden="1" w:uiPriority="9" w:unhideWhenUsed="1" w:qFormat="1"/>
+    <w:lsdException w:name="heading 4" w:semiHidden="1" w:uiPriority="9" w:unhideWhenUsed="1" w:qFormat="1"/>
+    <w:lsdException w:name="heading 5" w:semiHidden="1" w:uiPriority="9" w:unhideWhenUsed="1" w:qFormat="1"/>
+    <w:lsdException w:name="heading 6" w:semiHidden="1" w:uiPriority="9" w:unhideWhenUsed="1" w:qFormat="1"/>
+    <w:lsdException w:name="heading 7" w:semiHidden="1" w:uiPriority="9" w:unhideWhenUsed="1" w:qFormat="1"/>
+    <w:lsdException w:name="heading 8" w:semiHidden="1" w:uiPriority="9" w:unhideWhenUsed="1" w:qFormat="1"/>
+    <w:lsdException w:name="heading 9" w:semiHidden="1" w:uiPriority="9" w:unhideWhenUsed="1" w:qFormat="1"/>
     <w:lsdException w:name="index 1" w:semiHidden="1" w:unhideWhenUsed="1"/>
     <w:lsdException w:name="index 2" w:semiHidden="1" w:unhideWhenUsed="1"/>
     <w:lsdException w:name="index 3" w:semiHidden="1" w:unhideWhenUsed="1"/>
@@ -4361,22 +3746,22 @@
     <w:lsdException w:name="index 7" w:semiHidden="1" w:unhideWhenUsed="1"/>
     <w:lsdException w:name="index 8" w:semiHidden="1" w:unhideWhenUsed="1"/>
     <w:lsdException w:name="index 9" w:semiHidden="1" w:unhideWhenUsed="1"/>
-    <w:lsdException w:name="toc 1" w:uiPriority="39" w:semiHidden="1" w:unhideWhenUsed="1"/>
-    <w:lsdException w:name="toc 2" w:uiPriority="39" w:semiHidden="1" w:unhideWhenUsed="1"/>
-    <w:lsdException w:name="toc 3" w:uiPriority="39" w:semiHidden="1" w:unhideWhenUsed="1"/>
-    <w:lsdException w:name="toc 4" w:uiPriority="39" w:semiHidden="1" w:unhideWhenUsed="1"/>
-    <w:lsdException w:name="toc 5" w:uiPriority="39" w:semiHidden="1" w:unhideWhenUsed="1"/>
-    <w:lsdException w:name="toc 6" w:uiPriority="39" w:semiHidden="1" w:unhideWhenUsed="1"/>
-    <w:lsdException w:name="toc 7" w:uiPriority="39" w:semiHidden="1" w:unhideWhenUsed="1"/>
-    <w:lsdException w:name="toc 8" w:uiPriority="39" w:semiHidden="1" w:unhideWhenUsed="1"/>
-    <w:lsdException w:name="toc 9" w:uiPriority="39" w:semiHidden="1" w:unhideWhenUsed="1"/>
+    <w:lsdException w:name="toc 1" w:semiHidden="1" w:uiPriority="39" w:unhideWhenUsed="1"/>
+    <w:lsdException w:name="toc 2" w:semiHidden="1" w:uiPriority="39" w:unhideWhenUsed="1"/>
+    <w:lsdException w:name="toc 3" w:semiHidden="1" w:uiPriority="39" w:unhideWhenUsed="1"/>
+    <w:lsdException w:name="toc 4" w:semiHidden="1" w:uiPriority="39" w:unhideWhenUsed="1"/>
+    <w:lsdException w:name="toc 5" w:semiHidden="1" w:uiPriority="39" w:unhideWhenUsed="1"/>
+    <w:lsdException w:name="toc 6" w:semiHidden="1" w:uiPriority="39" w:unhideWhenUsed="1"/>
+    <w:lsdException w:name="toc 7" w:semiHidden="1" w:uiPriority="39" w:unhideWhenUsed="1"/>
+    <w:lsdException w:name="toc 8" w:semiHidden="1" w:uiPriority="39" w:unhideWhenUsed="1"/>
+    <w:lsdException w:name="toc 9" w:semiHidden="1" w:uiPriority="39" w:unhideWhenUsed="1"/>
     <w:lsdException w:name="Normal Indent" w:semiHidden="1" w:unhideWhenUsed="1"/>
     <w:lsdException w:name="footnote text" w:semiHidden="1" w:unhideWhenUsed="1"/>
     <w:lsdException w:name="annotation text" w:semiHidden="1" w:unhideWhenUsed="1"/>
     <w:lsdException w:name="header" w:semiHidden="1" w:unhideWhenUsed="1"/>
     <w:lsdException w:name="footer" w:semiHidden="1" w:unhideWhenUsed="1"/>
     <w:lsdException w:name="index heading" w:semiHidden="1" w:unhideWhenUsed="1"/>
-    <w:lsdException w:name="caption" w:uiPriority="35" w:semiHidden="1" w:unhideWhenUsed="1" w:qFormat="1"/>
+    <w:lsdException w:name="caption" w:semiHidden="1" w:uiPriority="35" w:unhideWhenUsed="1" w:qFormat="1"/>
     <w:lsdException w:name="table of figures" w:semiHidden="1" w:unhideWhenUsed="1"/>
     <w:lsdException w:name="envelope address" w:semiHidden="1" w:unhideWhenUsed="1"/>
     <w:lsdException w:name="envelope return" w:semiHidden="1" w:unhideWhenUsed="1"/>
@@ -4407,7 +3792,7 @@
     <w:lsdException w:name="Title" w:uiPriority="10" w:qFormat="1"/>
     <w:lsdException w:name="Closing" w:semiHidden="1" w:unhideWhenUsed="1"/>
     <w:lsdException w:name="Signature" w:semiHidden="1" w:unhideWhenUsed="1"/>
-    <w:lsdException w:name="Default Paragraph Font" w:uiPriority="1" w:semiHidden="1" w:unhideWhenUsed="1"/>
+    <w:lsdException w:name="Default Paragraph Font" w:semiHidden="1" w:uiPriority="1" w:unhideWhenUsed="1"/>
     <w:lsdException w:name="Body Text" w:semiHidden="1" w:unhideWhenUsed="1"/>
     <w:lsdException w:name="Body Text Indent" w:semiHidden="1" w:unhideWhenUsed="1"/>
     <w:lsdException w:name="List Continue" w:semiHidden="1" w:unhideWhenUsed="1"/>
@@ -4607,8 +3992,8 @@
     <w:lsdException w:name="Subtle Reference" w:uiPriority="31" w:qFormat="1"/>
     <w:lsdException w:name="Intense Reference" w:uiPriority="32" w:qFormat="1"/>
     <w:lsdException w:name="Book Title" w:uiPriority="33" w:qFormat="1"/>
-    <w:lsdException w:name="Bibliography" w:uiPriority="37" w:semiHidden="1" w:unhideWhenUsed="1"/>
-    <w:lsdException w:name="TOC Heading" w:uiPriority="39" w:semiHidden="1" w:unhideWhenUsed="1" w:qFormat="1"/>
+    <w:lsdException w:name="Bibliography" w:semiHidden="1" w:uiPriority="37" w:unhideWhenUsed="1"/>
+    <w:lsdException w:name="TOC Heading" w:semiHidden="1" w:uiPriority="39" w:unhideWhenUsed="1" w:qFormat="1"/>
     <w:lsdException w:name="Plain Table 1" w:uiPriority="41"/>
     <w:lsdException w:name="Plain Table 2" w:uiPriority="42"/>
     <w:lsdException w:name="Plain Table 3" w:uiPriority="43"/>
@@ -4713,8 +4098,13 @@
     <w:lsdException w:name="List Table 5 Dark Accent 6" w:uiPriority="50"/>
     <w:lsdException w:name="List Table 6 Colorful Accent 6" w:uiPriority="51"/>
     <w:lsdException w:name="List Table 7 Colorful Accent 6" w:uiPriority="52"/>
+    <w:lsdException w:name="Mention" w:semiHidden="1" w:unhideWhenUsed="1"/>
+    <w:lsdException w:name="Smart Hyperlink" w:semiHidden="1" w:unhideWhenUsed="1"/>
+    <w:lsdException w:name="Hashtag" w:semiHidden="1" w:unhideWhenUsed="1"/>
+    <w:lsdException w:name="Unresolved Mention" w:semiHidden="1" w:unhideWhenUsed="1"/>
+    <w:lsdException w:name="Smart Link" w:semiHidden="1" w:unhideWhenUsed="1"/>
   </w:latentStyles>
-  <w:style w:type="paragraph" w:styleId="Normal" w:default="1">
+  <w:style w:type="paragraph" w:default="1" w:styleId="Normal">
     <w:name w:val="Normal"/>
   </w:style>
   <w:style w:type="paragraph" w:styleId="Ttulo1">
@@ -4808,13 +4198,13 @@
       <w:color w:val="666666"/>
     </w:rPr>
   </w:style>
-  <w:style w:type="character" w:styleId="Fuentedeprrafopredeter" w:default="1">
+  <w:style w:type="character" w:default="1" w:styleId="Fuentedeprrafopredeter">
     <w:name w:val="Default Paragraph Font"/>
     <w:uiPriority w:val="1"/>
     <w:semiHidden/>
     <w:unhideWhenUsed/>
   </w:style>
-  <w:style w:type="table" w:styleId="Tablanormal" w:default="1">
+  <w:style w:type="table" w:default="1" w:styleId="Tablanormal">
     <w:name w:val="Normal Table"/>
     <w:uiPriority w:val="99"/>
     <w:semiHidden/>
@@ -4829,13 +4219,13 @@
       </w:tblCellMar>
     </w:tblPr>
   </w:style>
-  <w:style w:type="numbering" w:styleId="Sinlista" w:default="1">
+  <w:style w:type="numbering" w:default="1" w:styleId="Sinlista">
     <w:name w:val="No List"/>
     <w:uiPriority w:val="99"/>
     <w:semiHidden/>
     <w:unhideWhenUsed/>
   </w:style>
-  <w:style w:type="table" w:styleId="TableNormal" w:customStyle="1">
+  <w:style w:type="table" w:customStyle="1" w:styleId="TableNormal">
     <w:name w:val="TableNormal"/>
     <w:tblPr>
       <w:tblCellMar>
@@ -4875,7 +4265,7 @@
       <w:szCs w:val="30"/>
     </w:rPr>
   </w:style>
-  <w:style w:type="table" w:styleId="a" w:customStyle="1">
+  <w:style w:type="table" w:customStyle="1" w:styleId="a">
     <w:basedOn w:val="TableNormal"/>
     <w:pPr>
       <w:spacing w:line="240" w:lineRule="auto"/>
@@ -4891,14 +4281,14 @@
       </w:tblCellMar>
     </w:tblPr>
   </w:style>
-  <w:style w:type="table" w:styleId="a0" w:customStyle="1">
+  <w:style w:type="table" w:customStyle="1" w:styleId="a0">
     <w:basedOn w:val="TableNormal"/>
     <w:tblPr>
       <w:tblStyleRowBandSize w:val="1"/>
       <w:tblStyleColBandSize w:val="1"/>
     </w:tblPr>
   </w:style>
-  <w:style w:type="table" w:styleId="a1" w:customStyle="1">
+  <w:style w:type="table" w:customStyle="1" w:styleId="a1">
     <w:basedOn w:val="TableNormal"/>
     <w:tblPr>
       <w:tblStyleRowBandSize w:val="1"/>
@@ -4916,8 +4306,8 @@
       <w:u w:val="single"/>
     </w:rPr>
   </w:style>
-  <w:style w:type="character" w:styleId="UnresolvedMention" w:customStyle="1">
-    <w:name w:val="Unresolved Mention"/>
+  <w:style w:type="character" w:customStyle="1" w:styleId="Mencinsinresolver1">
+    <w:name w:val="Mención sin resolver1"/>
     <w:basedOn w:val="Fuentedeprrafopredeter"/>
     <w:uiPriority w:val="99"/>
     <w:semiHidden/>

</xml_diff>

<commit_message>
Agrego carpeta Lean_Kanban para material bibliográfico
</commit_message>
<xml_diff>
--- a/Plan_Gestion_Configuracion_G4_ISW_4K1.docx
+++ b/Plan_Gestion_Configuracion_G4_ISW_4K1.docx
@@ -1,6 +1,6 @@
 
 <file path=word/document.xml><?xml version="1.0" encoding="utf-8"?>
-<w:document xmlns:wpc="http://schemas.microsoft.com/office/word/2010/wordprocessingCanvas" xmlns:cx="http://schemas.microsoft.com/office/drawing/2014/chartex" xmlns:cx1="http://schemas.microsoft.com/office/drawing/2015/9/8/chartex" xmlns:cx2="http://schemas.microsoft.com/office/drawing/2015/10/21/chartex" xmlns:cx3="http://schemas.microsoft.com/office/drawing/2016/5/9/chartex" xmlns:cx4="http://schemas.microsoft.com/office/drawing/2016/5/10/chartex" xmlns:cx5="http://schemas.microsoft.com/office/drawing/2016/5/11/chartex" xmlns:cx6="http://schemas.microsoft.com/office/drawing/2016/5/12/chartex" xmlns:cx7="http://schemas.microsoft.com/office/drawing/2016/5/13/chartex" xmlns:cx8="http://schemas.microsoft.com/office/drawing/2016/5/14/chartex" xmlns:mc="http://schemas.openxmlformats.org/markup-compatibility/2006" xmlns:aink="http://schemas.microsoft.com/office/drawing/2016/ink" xmlns:am3d="http://schemas.microsoft.com/office/drawing/2017/model3d" xmlns:o="urn:schemas-microsoft-com:office:office" xmlns:oel="http://schemas.microsoft.com/office/2019/extlst" xmlns:r="http://schemas.openxmlformats.org/officeDocument/2006/relationships" xmlns:m="http://schemas.openxmlformats.org/officeDocument/2006/math" xmlns:v="urn:schemas-microsoft-com:vml" xmlns:wp14="http://schemas.microsoft.com/office/word/2010/wordprocessingDrawing" xmlns:wp="http://schemas.openxmlformats.org/drawingml/2006/wordprocessingDrawing" xmlns:w10="urn:schemas-microsoft-com:office:word" xmlns:w="http://schemas.openxmlformats.org/wordprocessingml/2006/main" xmlns:w14="http://schemas.microsoft.com/office/word/2010/wordml" xmlns:w15="http://schemas.microsoft.com/office/word/2012/wordml" xmlns:w16cex="http://schemas.microsoft.com/office/word/2018/wordml/cex" xmlns:w16cid="http://schemas.microsoft.com/office/word/2016/wordml/cid" xmlns:w16="http://schemas.microsoft.com/office/word/2018/wordml" xmlns:w16du="http://schemas.microsoft.com/office/word/2023/wordml/word16du" xmlns:w16sdtdh="http://schemas.microsoft.com/office/word/2020/wordml/sdtdatahash" xmlns:w16sdtfl="http://schemas.microsoft.com/office/word/2024/wordml/sdtformatlock" xmlns:w16se="http://schemas.microsoft.com/office/word/2015/wordml/symex" xmlns:wpg="http://schemas.microsoft.com/office/word/2010/wordprocessingGroup" xmlns:wpi="http://schemas.microsoft.com/office/word/2010/wordprocessingInk" xmlns:wne="http://schemas.microsoft.com/office/word/2006/wordml" xmlns:wps="http://schemas.microsoft.com/office/word/2010/wordprocessingShape" mc:Ignorable="w14 w15 w16se w16cid w16 w16cex w16sdtdh w16sdtfl w16du wp14">
+<w:document xmlns:wpc="http://schemas.microsoft.com/office/word/2010/wordprocessingCanvas" xmlns:mc="http://schemas.openxmlformats.org/markup-compatibility/2006" xmlns:o="urn:schemas-microsoft-com:office:office" xmlns:r="http://schemas.openxmlformats.org/officeDocument/2006/relationships" xmlns:m="http://schemas.openxmlformats.org/officeDocument/2006/math" xmlns:v="urn:schemas-microsoft-com:vml" xmlns:wp14="http://schemas.microsoft.com/office/word/2010/wordprocessingDrawing" xmlns:wp="http://schemas.openxmlformats.org/drawingml/2006/wordprocessingDrawing" xmlns:w10="urn:schemas-microsoft-com:office:word" xmlns:w="http://schemas.openxmlformats.org/wordprocessingml/2006/main" xmlns:w14="http://schemas.microsoft.com/office/word/2010/wordml" xmlns:w15="http://schemas.microsoft.com/office/word/2012/wordml" xmlns:wpg="http://schemas.microsoft.com/office/word/2010/wordprocessingGroup" xmlns:wpi="http://schemas.microsoft.com/office/word/2010/wordprocessingInk" xmlns:wne="http://schemas.microsoft.com/office/word/2006/wordml" xmlns:wps="http://schemas.microsoft.com/office/word/2010/wordprocessingShape" mc:Ignorable="w14 w15 wp14">
   <w:body>
     <w:p>
       <w:pPr>
@@ -19,7 +19,7 @@
           <w:noProof/>
           <w:sz w:val="32"/>
           <w:szCs w:val="32"/>
-          <w:lang w:val="en-US"/>
+          <w:lang w:eastAsia="es-AR"/>
         </w:rPr>
         <w:drawing>
           <wp:inline distT="0" distB="0" distL="0" distR="0" wp14:anchorId="742BF586" wp14:editId="55770852">
@@ -2474,21 +2474,7 @@
               <w:rPr>
                 <w:lang w:val="en-US"/>
               </w:rPr>
-              <w:t xml:space="preserve"> de </w:t>
-            </w:r>
-            <w:proofErr w:type="gramStart"/>
-            <w:r>
-              <w:rPr>
-                <w:lang w:val="en-US"/>
-              </w:rPr>
-              <w:t>Test Driven</w:t>
-            </w:r>
-            <w:proofErr w:type="gramEnd"/>
-            <w:r>
-              <w:rPr>
-                <w:lang w:val="en-US"/>
-              </w:rPr>
-              <w:t xml:space="preserve"> Development</w:t>
+              <w:t xml:space="preserve"> de Test Driven Development</w:t>
             </w:r>
           </w:p>
         </w:tc>
@@ -2613,8 +2599,16 @@
               <w:jc w:val="center"/>
             </w:pPr>
             <w:r>
-              <w:t>Consignas del Trabajo Práctico</w:t>
-            </w:r>
+              <w:t xml:space="preserve">Bibliografía de Lean y </w:t>
+            </w:r>
+            <w:proofErr w:type="spellStart"/>
+            <w:r>
+              <w:t>K</w:t>
+            </w:r>
+            <w:r>
+              <w:t>anban</w:t>
+            </w:r>
+            <w:proofErr w:type="spellEnd"/>
           </w:p>
         </w:tc>
         <w:tc>
@@ -2650,39 +2644,33 @@
                 <w:sz w:val="20"/>
                 <w:szCs w:val="20"/>
               </w:rPr>
-              <w:t>ISW_TP#_&lt;</w:t>
+              <w:t>LK_</w:t>
+            </w:r>
+            <w:r>
+              <w:rPr>
+                <w:sz w:val="20"/>
+                <w:szCs w:val="20"/>
+                <w:lang w:val="en-US"/>
+              </w:rPr>
+              <w:t>&lt;</w:t>
             </w:r>
             <w:proofErr w:type="spellStart"/>
             <w:r>
               <w:rPr>
                 <w:sz w:val="20"/>
                 <w:szCs w:val="20"/>
-              </w:rPr>
-              <w:t>NombreTrabajoPractico</w:t>
+                <w:lang w:val="en-US"/>
+              </w:rPr>
+              <w:t>NombreLibro</w:t>
             </w:r>
             <w:proofErr w:type="spellEnd"/>
             <w:r>
               <w:rPr>
                 <w:sz w:val="20"/>
                 <w:szCs w:val="20"/>
-              </w:rPr>
-              <w:t>&gt;.&lt;</w:t>
-            </w:r>
-            <w:proofErr w:type="spellStart"/>
-            <w:r>
-              <w:rPr>
-                <w:sz w:val="20"/>
-                <w:szCs w:val="20"/>
-              </w:rPr>
-              <w:t>Extension</w:t>
-            </w:r>
-            <w:proofErr w:type="spellEnd"/>
-            <w:r>
-              <w:rPr>
-                <w:sz w:val="20"/>
-                <w:szCs w:val="20"/>
-              </w:rPr>
-              <w:t>&gt;</w:t>
+                <w:lang w:val="en-US"/>
+              </w:rPr>
+              <w:t>&gt;.pdf</w:t>
             </w:r>
           </w:p>
         </w:tc>
@@ -2710,11 +2698,159 @@
               <w:spacing w:line="240" w:lineRule="auto"/>
               <w:jc w:val="center"/>
               <w:rPr>
-                <w:sz w:val="20"/>
-                <w:szCs w:val="20"/>
-              </w:rPr>
-            </w:pPr>
-            <w:hyperlink r:id="rId26">
+                <w:rStyle w:val="Hipervnculo"/>
+              </w:rPr>
+            </w:pPr>
+            <w:hyperlink r:id="rId26" w:history="1">
+              <w:r>
+                <w:rPr>
+                  <w:rStyle w:val="Hipervnculo"/>
+                </w:rPr>
+                <w:t>Bibliografia/Bibliogradia_De_La_Catedra/Material_Bibliografico/Lean_Kan</w:t>
+              </w:r>
+              <w:bookmarkStart w:id="0" w:name="_GoBack"/>
+              <w:bookmarkEnd w:id="0"/>
+              <w:r>
+                <w:rPr>
+                  <w:rStyle w:val="Hipervnculo"/>
+                </w:rPr>
+                <w:t>ban</w:t>
+              </w:r>
+            </w:hyperlink>
+          </w:p>
+        </w:tc>
+      </w:tr>
+      <w:tr>
+        <w:trPr>
+          <w:trHeight w:val="610"/>
+        </w:trPr>
+        <w:tc>
+          <w:tcPr>
+            <w:tcW w:w="1560" w:type="dxa"/>
+            <w:tcMar>
+              <w:top w:w="100" w:type="dxa"/>
+              <w:left w:w="100" w:type="dxa"/>
+              <w:bottom w:w="100" w:type="dxa"/>
+              <w:right w:w="100" w:type="dxa"/>
+            </w:tcMar>
+            <w:vAlign w:val="center"/>
+          </w:tcPr>
+          <w:p>
+            <w:pPr>
+              <w:widowControl w:val="0"/>
+              <w:pBdr>
+                <w:top w:val="nil"/>
+                <w:left w:val="nil"/>
+                <w:bottom w:val="nil"/>
+                <w:right w:val="nil"/>
+                <w:between w:val="nil"/>
+              </w:pBdr>
+              <w:spacing w:line="240" w:lineRule="auto"/>
+              <w:jc w:val="center"/>
+            </w:pPr>
+            <w:r>
+              <w:t>Consignas del Trabajo Práctico</w:t>
+            </w:r>
+          </w:p>
+        </w:tc>
+        <w:tc>
+          <w:tcPr>
+            <w:tcW w:w="3402" w:type="dxa"/>
+            <w:tcMar>
+              <w:top w:w="100" w:type="dxa"/>
+              <w:left w:w="100" w:type="dxa"/>
+              <w:bottom w:w="100" w:type="dxa"/>
+              <w:right w:w="100" w:type="dxa"/>
+            </w:tcMar>
+            <w:vAlign w:val="center"/>
+          </w:tcPr>
+          <w:p>
+            <w:pPr>
+              <w:widowControl w:val="0"/>
+              <w:pBdr>
+                <w:top w:val="nil"/>
+                <w:left w:val="nil"/>
+                <w:bottom w:val="nil"/>
+                <w:right w:val="nil"/>
+                <w:between w:val="nil"/>
+              </w:pBdr>
+              <w:spacing w:line="240" w:lineRule="auto"/>
+              <w:jc w:val="center"/>
+              <w:rPr>
+                <w:sz w:val="20"/>
+                <w:szCs w:val="20"/>
+              </w:rPr>
+            </w:pPr>
+            <w:r>
+              <w:rPr>
+                <w:sz w:val="20"/>
+                <w:szCs w:val="20"/>
+              </w:rPr>
+              <w:t>ISW_TP#_&lt;</w:t>
+            </w:r>
+            <w:proofErr w:type="spellStart"/>
+            <w:r>
+              <w:rPr>
+                <w:sz w:val="20"/>
+                <w:szCs w:val="20"/>
+              </w:rPr>
+              <w:t>NombreTrabajoPractico</w:t>
+            </w:r>
+            <w:proofErr w:type="spellEnd"/>
+            <w:r>
+              <w:rPr>
+                <w:sz w:val="20"/>
+                <w:szCs w:val="20"/>
+              </w:rPr>
+              <w:t>&gt;.&lt;</w:t>
+            </w:r>
+            <w:proofErr w:type="spellStart"/>
+            <w:r>
+              <w:rPr>
+                <w:sz w:val="20"/>
+                <w:szCs w:val="20"/>
+              </w:rPr>
+              <w:t>Extension</w:t>
+            </w:r>
+            <w:proofErr w:type="spellEnd"/>
+            <w:r>
+              <w:rPr>
+                <w:sz w:val="20"/>
+                <w:szCs w:val="20"/>
+              </w:rPr>
+              <w:t>&gt;</w:t>
+            </w:r>
+          </w:p>
+        </w:tc>
+        <w:tc>
+          <w:tcPr>
+            <w:tcW w:w="5497" w:type="dxa"/>
+            <w:tcMar>
+              <w:top w:w="100" w:type="dxa"/>
+              <w:left w:w="100" w:type="dxa"/>
+              <w:bottom w:w="100" w:type="dxa"/>
+              <w:right w:w="100" w:type="dxa"/>
+            </w:tcMar>
+            <w:vAlign w:val="center"/>
+          </w:tcPr>
+          <w:p>
+            <w:pPr>
+              <w:widowControl w:val="0"/>
+              <w:pBdr>
+                <w:top w:val="nil"/>
+                <w:left w:val="nil"/>
+                <w:bottom w:val="nil"/>
+                <w:right w:val="nil"/>
+                <w:between w:val="nil"/>
+              </w:pBdr>
+              <w:spacing w:line="240" w:lineRule="auto"/>
+              <w:jc w:val="center"/>
+              <w:rPr>
+                <w:sz w:val="20"/>
+                <w:szCs w:val="20"/>
+              </w:rPr>
+            </w:pPr>
+            <w:hyperlink r:id="rId27">
               <w:r>
                 <w:rPr>
                   <w:color w:val="0000FF"/>
@@ -2855,7 +2991,7 @@
               <w:spacing w:line="240" w:lineRule="auto"/>
               <w:jc w:val="center"/>
             </w:pPr>
-            <w:hyperlink r:id="rId27" w:history="1">
+            <w:hyperlink r:id="rId28" w:history="1">
               <w:r>
                 <w:rPr>
                   <w:rStyle w:val="Hipervnculo"/>
@@ -2997,7 +3133,7 @@
               <w:spacing w:line="240" w:lineRule="auto"/>
               <w:jc w:val="center"/>
             </w:pPr>
-            <w:hyperlink r:id="rId28" w:history="1">
+            <w:hyperlink r:id="rId29" w:history="1">
               <w:r>
                 <w:rPr>
                   <w:rStyle w:val="Hipervnculo"/>
@@ -3096,15 +3232,11 @@
         </w:sectPr>
       </w:pPr>
       <w:r>
-        <w:rPr>
-          <w:noProof/>
-          <w:lang w:val="en-US"/>
-        </w:rPr>
         <w:drawing>
-          <wp:inline distT="0" distB="0" distL="0" distR="0" wp14:anchorId="0405250B" wp14:editId="1F175EF1">
-            <wp:extent cx="4305901" cy="6373114"/>
-            <wp:effectExtent l="0" t="0" r="0" b="0"/>
-            <wp:docPr id="14139827" name="Imagen 1" descr="Texto&#10;&#10;El contenido generado por IA puede ser incorrecto."/>
+          <wp:inline distT="0" distB="0" distL="0" distR="0" wp14:anchorId="4925544C" wp14:editId="381FBEE7">
+            <wp:extent cx="4086795" cy="7240010"/>
+            <wp:effectExtent l="0" t="0" r="9525" b="0"/>
+            <wp:docPr id="2" name="Imagen 2"/>
             <wp:cNvGraphicFramePr>
               <a:graphicFrameLocks xmlns:a="http://schemas.openxmlformats.org/drawingml/2006/main" noChangeAspect="1"/>
             </wp:cNvGraphicFramePr>
@@ -3112,11 +3244,11 @@
               <a:graphicData uri="http://schemas.openxmlformats.org/drawingml/2006/picture">
                 <pic:pic xmlns:pic="http://schemas.openxmlformats.org/drawingml/2006/picture">
                   <pic:nvPicPr>
-                    <pic:cNvPr id="14139827" name="Imagen 1" descr="Texto&#10;&#10;El contenido generado por IA puede ser incorrecto."/>
+                    <pic:cNvPr id="1" name=""/>
                     <pic:cNvPicPr/>
                   </pic:nvPicPr>
                   <pic:blipFill>
-                    <a:blip r:embed="rId29"/>
+                    <a:blip r:embed="rId30"/>
                     <a:stretch>
                       <a:fillRect/>
                     </a:stretch>
@@ -3124,7 +3256,7 @@
                   <pic:spPr>
                     <a:xfrm>
                       <a:off x="0" y="0"/>
-                      <a:ext cx="4305901" cy="6373114"/>
+                      <a:ext cx="4086795" cy="7240010"/>
                     </a:xfrm>
                     <a:prstGeom prst="rect">
                       <a:avLst/>
@@ -3752,10 +3884,18 @@
               <w:jc w:val="center"/>
             </w:pPr>
             <w:r>
-              <w:t>Determina la extensión del archivo identificado como ítem de configuración. Ejemplo: .docx, .</w:t>
+              <w:t>Determina la extensión del archivo identificado como ítem de configuración. Ejemplo: .</w:t>
             </w:r>
             <w:proofErr w:type="spellStart"/>
             <w:r>
+              <w:t>docx</w:t>
+            </w:r>
+            <w:proofErr w:type="spellEnd"/>
+            <w:r>
+              <w:t>, .</w:t>
+            </w:r>
+            <w:proofErr w:type="spellStart"/>
+            <w:r>
               <w:t>txt</w:t>
             </w:r>
             <w:proofErr w:type="spellEnd"/>
@@ -3771,8 +3911,13 @@
             </w:r>
             <w:proofErr w:type="spellEnd"/>
             <w:r>
-              <w:t>, png</w:t>
-            </w:r>
+              <w:t xml:space="preserve">, </w:t>
+            </w:r>
+            <w:proofErr w:type="spellStart"/>
+            <w:r>
+              <w:t>png</w:t>
+            </w:r>
+            <w:proofErr w:type="spellEnd"/>
             <w:r>
               <w:t xml:space="preserve"> </w:t>
             </w:r>
@@ -4160,6 +4305,65 @@
           </w:p>
         </w:tc>
       </w:tr>
+      <w:tr>
+        <w:trPr>
+          <w:trHeight w:val="300"/>
+          <w:jc w:val="center"/>
+        </w:trPr>
+        <w:tc>
+          <w:tcPr>
+            <w:tcW w:w="4514" w:type="dxa"/>
+            <w:tcMar>
+              <w:top w:w="100" w:type="dxa"/>
+              <w:left w:w="100" w:type="dxa"/>
+              <w:bottom w:w="100" w:type="dxa"/>
+              <w:right w:w="100" w:type="dxa"/>
+            </w:tcMar>
+          </w:tcPr>
+          <w:p>
+            <w:pPr>
+              <w:spacing w:line="240" w:lineRule="auto"/>
+              <w:jc w:val="center"/>
+              <w:rPr>
+                <w:sz w:val="20"/>
+                <w:szCs w:val="20"/>
+              </w:rPr>
+            </w:pPr>
+            <w:r>
+              <w:rPr>
+                <w:sz w:val="20"/>
+                <w:szCs w:val="20"/>
+              </w:rPr>
+              <w:t>LK</w:t>
+            </w:r>
+          </w:p>
+        </w:tc>
+        <w:tc>
+          <w:tcPr>
+            <w:tcW w:w="4515" w:type="dxa"/>
+            <w:tcMar>
+              <w:top w:w="100" w:type="dxa"/>
+              <w:left w:w="100" w:type="dxa"/>
+              <w:bottom w:w="100" w:type="dxa"/>
+              <w:right w:w="100" w:type="dxa"/>
+            </w:tcMar>
+          </w:tcPr>
+          <w:p>
+            <w:pPr>
+              <w:spacing w:line="240" w:lineRule="auto"/>
+              <w:jc w:val="center"/>
+            </w:pPr>
+            <w:r>
+              <w:t xml:space="preserve">Lean </w:t>
+            </w:r>
+            <w:proofErr w:type="spellStart"/>
+            <w:r>
+              <w:t>Kanban</w:t>
+            </w:r>
+            <w:proofErr w:type="spellEnd"/>
+          </w:p>
+        </w:tc>
+      </w:tr>
     </w:tbl>
     <w:p>
       <w:pPr>
@@ -4225,34 +4429,24 @@
           <w:u w:val="single"/>
         </w:rPr>
       </w:pPr>
-      <w:r>
+    </w:p>
+    <w:p>
+      <w:pPr>
+        <w:jc w:val="center"/>
         <w:rPr>
           <w:b/>
           <w:sz w:val="30"/>
           <w:szCs w:val="30"/>
           <w:u w:val="single"/>
         </w:rPr>
-        <w:br w:type="page"/>
-      </w:r>
-    </w:p>
-    <w:p>
-      <w:pPr>
-        <w:jc w:val="center"/>
+      </w:pPr>
+      <w:r>
         <w:rPr>
           <w:b/>
           <w:sz w:val="30"/>
           <w:szCs w:val="30"/>
           <w:u w:val="single"/>
         </w:rPr>
-      </w:pPr>
-      <w:r>
-        <w:rPr>
-          <w:b/>
-          <w:sz w:val="30"/>
-          <w:szCs w:val="30"/>
-          <w:u w:val="single"/>
-        </w:rPr>
-        <w:lastRenderedPageBreak/>
         <w:t>Criterios de Línea Base</w:t>
       </w:r>
     </w:p>
@@ -4299,7 +4493,7 @@
 </file>
 
 <file path=word/styles.xml><?xml version="1.0" encoding="utf-8"?>
-<w:styles xmlns:mc="http://schemas.openxmlformats.org/markup-compatibility/2006" xmlns:r="http://schemas.openxmlformats.org/officeDocument/2006/relationships" xmlns:w="http://schemas.openxmlformats.org/wordprocessingml/2006/main" xmlns:w14="http://schemas.microsoft.com/office/word/2010/wordml" xmlns:w15="http://schemas.microsoft.com/office/word/2012/wordml" xmlns:w16cex="http://schemas.microsoft.com/office/word/2018/wordml/cex" xmlns:w16cid="http://schemas.microsoft.com/office/word/2016/wordml/cid" xmlns:w16="http://schemas.microsoft.com/office/word/2018/wordml" xmlns:w16du="http://schemas.microsoft.com/office/word/2023/wordml/word16du" xmlns:w16sdtdh="http://schemas.microsoft.com/office/word/2020/wordml/sdtdatahash" xmlns:w16sdtfl="http://schemas.microsoft.com/office/word/2024/wordml/sdtformatlock" xmlns:w16se="http://schemas.microsoft.com/office/word/2015/wordml/symex" mc:Ignorable="w14 w15 w16se w16cid w16 w16cex w16sdtdh w16sdtfl w16du">
+<w:styles xmlns:mc="http://schemas.openxmlformats.org/markup-compatibility/2006" xmlns:r="http://schemas.openxmlformats.org/officeDocument/2006/relationships" xmlns:w="http://schemas.openxmlformats.org/wordprocessingml/2006/main" xmlns:w14="http://schemas.microsoft.com/office/word/2010/wordml" xmlns:w15="http://schemas.microsoft.com/office/word/2012/wordml" mc:Ignorable="w14 w15">
   <w:docDefaults>
     <w:rPrDefault>
       <w:rPr>
@@ -4315,7 +4509,7 @@
       </w:pPr>
     </w:pPrDefault>
   </w:docDefaults>
-  <w:latentStyles w:defLockedState="0" w:defUIPriority="99" w:defSemiHidden="0" w:defUnhideWhenUsed="0" w:defQFormat="0" w:count="376">
+  <w:latentStyles w:defLockedState="0" w:defUIPriority="99" w:defSemiHidden="0" w:defUnhideWhenUsed="0" w:defQFormat="0" w:count="371">
     <w:lsdException w:name="Normal" w:uiPriority="0" w:qFormat="1"/>
     <w:lsdException w:name="heading 1" w:uiPriority="9" w:qFormat="1"/>
     <w:lsdException w:name="heading 2" w:semiHidden="1" w:uiPriority="9" w:unhideWhenUsed="1" w:qFormat="1"/>
@@ -4687,11 +4881,6 @@
     <w:lsdException w:name="List Table 5 Dark Accent 6" w:uiPriority="50"/>
     <w:lsdException w:name="List Table 6 Colorful Accent 6" w:uiPriority="51"/>
     <w:lsdException w:name="List Table 7 Colorful Accent 6" w:uiPriority="52"/>
-    <w:lsdException w:name="Mention" w:semiHidden="1" w:unhideWhenUsed="1"/>
-    <w:lsdException w:name="Smart Hyperlink" w:semiHidden="1" w:unhideWhenUsed="1"/>
-    <w:lsdException w:name="Hashtag" w:semiHidden="1" w:unhideWhenUsed="1"/>
-    <w:lsdException w:name="Unresolved Mention" w:semiHidden="1" w:unhideWhenUsed="1"/>
-    <w:lsdException w:name="Smart Link" w:semiHidden="1" w:unhideWhenUsed="1"/>
   </w:latentStyles>
   <w:style w:type="paragraph" w:default="1" w:styleId="Normal">
     <w:name w:val="Normal"/>
@@ -4825,7 +5014,7 @@
       </w:tblCellMar>
     </w:tblPr>
   </w:style>
-  <w:style w:type="paragraph" w:styleId="Ttulo">
+  <w:style w:type="paragraph" w:styleId="Puesto">
     <w:name w:val="Title"/>
     <w:basedOn w:val="Normal"/>
     <w:next w:val="Normal"/>

</xml_diff>

<commit_message>
Actualizacion en nomenclatura tp11 y poster cientifico
</commit_message>
<xml_diff>
--- a/Plan_Gestion_Configuracion_G4_ISW_4K1.docx
+++ b/Plan_Gestion_Configuracion_G4_ISW_4K1.docx
@@ -1,12 +1,12 @@
 
 <file path=word/document.xml><?xml version="1.0" encoding="utf-8"?>
-<w:document xmlns:wpc="http://schemas.microsoft.com/office/word/2010/wordprocessingCanvas" xmlns:mc="http://schemas.openxmlformats.org/markup-compatibility/2006" xmlns:o="urn:schemas-microsoft-com:office:office" xmlns:r="http://schemas.openxmlformats.org/officeDocument/2006/relationships" xmlns:m="http://schemas.openxmlformats.org/officeDocument/2006/math" xmlns:v="urn:schemas-microsoft-com:vml" xmlns:wp14="http://schemas.microsoft.com/office/word/2010/wordprocessingDrawing" xmlns:wp="http://schemas.openxmlformats.org/drawingml/2006/wordprocessingDrawing" xmlns:w10="urn:schemas-microsoft-com:office:word" xmlns:w="http://schemas.openxmlformats.org/wordprocessingml/2006/main" xmlns:w14="http://schemas.microsoft.com/office/word/2010/wordml" xmlns:w15="http://schemas.microsoft.com/office/word/2012/wordml" xmlns:wpg="http://schemas.microsoft.com/office/word/2010/wordprocessingGroup" xmlns:wpi="http://schemas.microsoft.com/office/word/2010/wordprocessingInk" xmlns:wne="http://schemas.microsoft.com/office/word/2006/wordml" xmlns:wps="http://schemas.microsoft.com/office/word/2010/wordprocessingShape" mc:Ignorable="w14 w15 wp14">
+<w:document xmlns:wpc="http://schemas.microsoft.com/office/word/2010/wordprocessingCanvas" xmlns:mc="http://schemas.openxmlformats.org/markup-compatibility/2006" xmlns:o="urn:schemas-microsoft-com:office:office" xmlns:r="http://schemas.openxmlformats.org/officeDocument/2006/relationships" xmlns:m="http://schemas.openxmlformats.org/officeDocument/2006/math" xmlns:v="urn:schemas-microsoft-com:vml" xmlns:wp14="http://schemas.microsoft.com/office/word/2010/wordprocessingDrawing" xmlns:wp="http://schemas.openxmlformats.org/drawingml/2006/wordprocessingDrawing" xmlns:w10="urn:schemas-microsoft-com:office:word" xmlns:w="http://schemas.openxmlformats.org/wordprocessingml/2006/main" xmlns:w14="http://schemas.microsoft.com/office/word/2010/wordml" xmlns:w15="http://schemas.microsoft.com/office/word/2012/wordml" xmlns:wpg="http://schemas.microsoft.com/office/word/2010/wordprocessingGroup" xmlns:wpi="http://schemas.microsoft.com/office/word/2010/wordprocessingInk" xmlns:wne="http://schemas.microsoft.com/office/word/2006/wordml" xmlns:wps="http://schemas.microsoft.com/office/word/2010/wordprocessingShape" xmlns:a="http://schemas.openxmlformats.org/drawingml/2006/main" xmlns:pic="http://schemas.openxmlformats.org/drawingml/2006/picture" mc:Ignorable="w14 w15 wp14">
   <w:body>
     <w:p>
       <w:pPr>
         <w:jc w:val="center"/>
         <w:rPr>
-          <w:rFonts w:ascii="Quattrocento Sans" w:eastAsia="Quattrocento Sans" w:hAnsi="Quattrocento Sans" w:cs="Quattrocento Sans"/>
+          <w:rFonts w:ascii="Quattrocento Sans" w:hAnsi="Quattrocento Sans" w:eastAsia="Quattrocento Sans" w:cs="Quattrocento Sans"/>
           <w:b/>
           <w:sz w:val="32"/>
           <w:szCs w:val="32"/>
@@ -14,7 +14,7 @@
       </w:pPr>
       <w:r>
         <w:rPr>
-          <w:rFonts w:ascii="Quattrocento Sans" w:eastAsia="Quattrocento Sans" w:hAnsi="Quattrocento Sans" w:cs="Quattrocento Sans"/>
+          <w:rFonts w:ascii="Quattrocento Sans" w:hAnsi="Quattrocento Sans" w:eastAsia="Quattrocento Sans" w:cs="Quattrocento Sans"/>
           <w:b/>
           <w:noProof/>
           <w:sz w:val="32"/>
@@ -66,7 +66,7 @@
         <w:spacing w:after="240" w:line="240" w:lineRule="auto"/>
         <w:jc w:val="center"/>
         <w:rPr>
-          <w:rFonts w:ascii="Quattrocento Sans" w:eastAsia="Quattrocento Sans" w:hAnsi="Quattrocento Sans" w:cs="Quattrocento Sans"/>
+          <w:rFonts w:ascii="Quattrocento Sans" w:hAnsi="Quattrocento Sans" w:eastAsia="Quattrocento Sans" w:cs="Quattrocento Sans"/>
           <w:b/>
           <w:sz w:val="32"/>
           <w:szCs w:val="32"/>
@@ -74,7 +74,7 @@
       </w:pPr>
       <w:r>
         <w:rPr>
-          <w:rFonts w:ascii="Quattrocento Sans" w:eastAsia="Quattrocento Sans" w:hAnsi="Quattrocento Sans" w:cs="Quattrocento Sans"/>
+          <w:rFonts w:ascii="Quattrocento Sans" w:hAnsi="Quattrocento Sans" w:eastAsia="Quattrocento Sans" w:cs="Quattrocento Sans"/>
           <w:sz w:val="32"/>
           <w:szCs w:val="32"/>
         </w:rPr>
@@ -82,30 +82,52 @@
       </w:r>
       <w:r>
         <w:rPr>
-          <w:rFonts w:ascii="Quattrocento Sans" w:eastAsia="Quattrocento Sans" w:hAnsi="Quattrocento Sans" w:cs="Quattrocento Sans"/>
+          <w:rFonts w:ascii="Quattrocento Sans" w:hAnsi="Quattrocento Sans" w:eastAsia="Quattrocento Sans" w:cs="Quattrocento Sans"/>
           <w:sz w:val="32"/>
           <w:szCs w:val="32"/>
         </w:rPr>
         <w:br/>
+      </w:r>
+      <w:r>
+        <w:rPr>
+          <w:rFonts w:ascii="Quattrocento Sans" w:hAnsi="Quattrocento Sans" w:eastAsia="Quattrocento Sans" w:cs="Quattrocento Sans"/>
+          <w:sz w:val="32"/>
+          <w:szCs w:val="32"/>
+        </w:rPr>
         <w:t>Facultad Regional Córdoba</w:t>
       </w:r>
       <w:r>
         <w:rPr>
-          <w:rFonts w:ascii="Quattrocento Sans" w:eastAsia="Quattrocento Sans" w:hAnsi="Quattrocento Sans" w:cs="Quattrocento Sans"/>
+          <w:rFonts w:ascii="Quattrocento Sans" w:hAnsi="Quattrocento Sans" w:eastAsia="Quattrocento Sans" w:cs="Quattrocento Sans"/>
           <w:sz w:val="32"/>
           <w:szCs w:val="32"/>
         </w:rPr>
         <w:br/>
+      </w:r>
+      <w:r>
+        <w:rPr>
+          <w:rFonts w:ascii="Quattrocento Sans" w:hAnsi="Quattrocento Sans" w:eastAsia="Quattrocento Sans" w:cs="Quattrocento Sans"/>
+          <w:sz w:val="32"/>
+          <w:szCs w:val="32"/>
+        </w:rPr>
         <w:t>Ingeniería y Calidad de Software (ISW)</w:t>
       </w:r>
       <w:r>
         <w:rPr>
-          <w:rFonts w:ascii="Quattrocento Sans" w:eastAsia="Quattrocento Sans" w:hAnsi="Quattrocento Sans" w:cs="Quattrocento Sans"/>
+          <w:rFonts w:ascii="Quattrocento Sans" w:hAnsi="Quattrocento Sans" w:eastAsia="Quattrocento Sans" w:cs="Quattrocento Sans"/>
           <w:b/>
           <w:sz w:val="32"/>
           <w:szCs w:val="32"/>
         </w:rPr>
         <w:br/>
+      </w:r>
+      <w:r>
+        <w:rPr>
+          <w:rFonts w:ascii="Quattrocento Sans" w:hAnsi="Quattrocento Sans" w:eastAsia="Quattrocento Sans" w:cs="Quattrocento Sans"/>
+          <w:b/>
+          <w:sz w:val="32"/>
+          <w:szCs w:val="32"/>
+        </w:rPr>
         <w:t>Gestión de Configuración del Software</w:t>
       </w:r>
     </w:p>
@@ -171,7 +193,7 @@
           <w:szCs w:val="20"/>
         </w:rPr>
         <w:sectPr>
-          <w:pgSz w:w="11909" w:h="16834"/>
+          <w:pgSz w:w="11909" w:h="16834" w:orient="portrait"/>
           <w:pgMar w:top="720" w:right="720" w:bottom="720" w:left="720" w:header="720" w:footer="720" w:gutter="0"/>
           <w:pgNumType w:start="1"/>
           <w:cols w:space="720"/>
@@ -236,6 +258,12 @@
           <w:szCs w:val="24"/>
         </w:rPr>
         <w:tab/>
+      </w:r>
+      <w:r>
+        <w:rPr>
+          <w:sz w:val="24"/>
+          <w:szCs w:val="24"/>
+        </w:rPr>
         <w:t xml:space="preserve">Ing. </w:t>
       </w:r>
       <w:r>
@@ -280,6 +308,13 @@
           <w:lang w:val="en-US"/>
         </w:rPr>
         <w:tab/>
+      </w:r>
+      <w:r>
+        <w:rPr>
+          <w:sz w:val="24"/>
+          <w:szCs w:val="24"/>
+          <w:lang w:val="en-US"/>
+        </w:rPr>
         <w:t>Ing. Mickaela Crespo</w:t>
       </w:r>
     </w:p>
@@ -374,10 +409,10 @@
         </w:rPr>
         <w:sectPr>
           <w:type w:val="continuous"/>
-          <w:pgSz w:w="11909" w:h="16834"/>
+          <w:pgSz w:w="11909" w:h="16834" w:orient="portrait"/>
           <w:pgMar w:top="720" w:right="720" w:bottom="720" w:left="720" w:header="720" w:footer="720" w:gutter="0"/>
           <w:pgNumType w:start="1"/>
-          <w:cols w:num="2" w:space="720" w:equalWidth="0">
+          <w:cols w:equalWidth="0" w:space="720" w:num="2">
             <w:col w:w="4874" w:space="720"/>
             <w:col w:w="4874"/>
           </w:cols>
@@ -430,12 +465,12 @@
         <w:tblW w:w="10439" w:type="dxa"/>
         <w:tblInd w:w="0" w:type="dxa"/>
         <w:tblBorders>
-          <w:top w:val="single" w:sz="12" w:space="0" w:color="000000"/>
-          <w:left w:val="single" w:sz="12" w:space="0" w:color="000000"/>
-          <w:bottom w:val="single" w:sz="12" w:space="0" w:color="000000"/>
-          <w:right w:val="single" w:sz="12" w:space="0" w:color="000000"/>
-          <w:insideH w:val="single" w:sz="12" w:space="0" w:color="000000"/>
-          <w:insideV w:val="single" w:sz="12" w:space="0" w:color="000000"/>
+          <w:top w:val="single" w:color="000000" w:sz="12" w:space="0"/>
+          <w:left w:val="single" w:color="000000" w:sz="12" w:space="0"/>
+          <w:bottom w:val="single" w:color="000000" w:sz="12" w:space="0"/>
+          <w:right w:val="single" w:color="000000" w:sz="12" w:space="0"/>
+          <w:insideH w:val="single" w:color="000000" w:sz="12" w:space="0"/>
+          <w:insideV w:val="single" w:color="000000" w:sz="12" w:space="0"/>
         </w:tblBorders>
         <w:tblLayout w:type="fixed"/>
         <w:tblLook w:val="0400" w:firstRow="0" w:lastRow="0" w:firstColumn="0" w:lastColumn="0" w:noHBand="0" w:noVBand="1"/>
@@ -1052,7 +1087,7 @@
         </w:rPr>
         <w:sectPr>
           <w:type w:val="continuous"/>
-          <w:pgSz w:w="11909" w:h="16834"/>
+          <w:pgSz w:w="11909" w:h="16834" w:orient="portrait"/>
           <w:pgMar w:top="720" w:right="720" w:bottom="720" w:left="720" w:header="720" w:footer="720" w:gutter="0"/>
           <w:pgNumType w:start="1"/>
           <w:cols w:space="720"/>
@@ -1079,23 +1114,21 @@
           <w:szCs w:val="30"/>
           <w:u w:val="single"/>
         </w:rPr>
-        <w:lastRenderedPageBreak/>
         <w:t>Ítems de configuración</w:t>
       </w:r>
     </w:p>
     <w:p/>
     <w:tbl>
       <w:tblPr>
-        <w:tblStyle w:val="a0"/>
         <w:tblW w:w="10459" w:type="dxa"/>
         <w:tblInd w:w="-10" w:type="dxa"/>
         <w:tblBorders>
-          <w:top w:val="single" w:sz="8" w:space="0" w:color="000000"/>
-          <w:left w:val="single" w:sz="8" w:space="0" w:color="000000"/>
-          <w:bottom w:val="single" w:sz="8" w:space="0" w:color="000000"/>
-          <w:right w:val="single" w:sz="8" w:space="0" w:color="000000"/>
-          <w:insideH w:val="single" w:sz="8" w:space="0" w:color="000000"/>
-          <w:insideV w:val="single" w:sz="8" w:space="0" w:color="000000"/>
+          <w:top w:val="single" w:color="000000" w:themeColor="text1" w:sz="8" w:space="0"/>
+          <w:left w:val="single" w:color="000000" w:themeColor="text1" w:sz="8" w:space="0"/>
+          <w:bottom w:val="single" w:color="000000" w:themeColor="text1" w:sz="8" w:space="0"/>
+          <w:right w:val="single" w:color="000000" w:themeColor="text1" w:sz="8" w:space="0"/>
+          <w:insideH w:val="single" w:color="000000" w:themeColor="text1" w:sz="8" w:space="0"/>
+          <w:insideV w:val="single" w:color="000000" w:themeColor="text1" w:sz="8" w:space="0"/>
         </w:tblBorders>
         <w:tblLayout w:type="fixed"/>
         <w:tblLook w:val="0600" w:firstRow="0" w:lastRow="0" w:firstColumn="0" w:lastColumn="0" w:noHBand="1" w:noVBand="1"/>
@@ -2420,7 +2453,7 @@
               <w:spacing w:line="240" w:lineRule="auto"/>
               <w:jc w:val="center"/>
             </w:pPr>
-            <w:hyperlink r:id="rId24" w:history="1">
+            <w:hyperlink w:history="1" r:id="rId24">
               <w:r>
                 <w:rPr>
                   <w:rStyle w:val="Hipervnculo"/>
@@ -2559,7 +2592,7 @@
               <w:spacing w:line="240" w:lineRule="auto"/>
               <w:jc w:val="center"/>
             </w:pPr>
-            <w:hyperlink r:id="rId25" w:history="1">
+            <w:hyperlink w:history="1" r:id="rId25">
               <w:r>
                 <w:rPr>
                   <w:rStyle w:val="Hipervnculo"/>
@@ -2685,15 +2718,15 @@
             </w:tcMar>
             <w:vAlign w:val="center"/>
           </w:tcPr>
-          <w:p>
+          <w:p w14:noSpellErr="1">
             <w:pPr>
               <w:widowControl w:val="0"/>
               <w:pBdr>
-                <w:top w:val="nil"/>
-                <w:left w:val="nil"/>
-                <w:bottom w:val="nil"/>
-                <w:right w:val="nil"/>
-                <w:between w:val="nil"/>
+                <w:top w:val="nil" w:color="FF000000" w:sz="0" w:space="0"/>
+                <w:left w:val="nil" w:color="FF000000" w:sz="0" w:space="0"/>
+                <w:bottom w:val="nil" w:color="FF000000" w:sz="0" w:space="0"/>
+                <w:right w:val="nil" w:color="FF000000" w:sz="0" w:space="0"/>
+                <w:between w:val="nil" w:color="FF000000" w:sz="0" w:space="0"/>
               </w:pBdr>
               <w:spacing w:line="240" w:lineRule="auto"/>
               <w:jc w:val="center"/>
@@ -2701,20 +2734,152 @@
                 <w:rStyle w:val="Hipervnculo"/>
               </w:rPr>
             </w:pPr>
-            <w:hyperlink r:id="rId26" w:history="1">
+            <w:hyperlink r:id="R4aa19615109c4b65">
               <w:r>
                 <w:rPr>
                   <w:rStyle w:val="Hipervnculo"/>
                 </w:rPr>
                 <w:t>Bibliografia/Bibliogradia_De_La_Catedra/Material_Bibliografico/Lean_Kan</w:t>
               </w:r>
-              <w:bookmarkStart w:id="0" w:name="_GoBack"/>
-              <w:bookmarkEnd w:id="0"/>
+            </w:hyperlink>
+            <w:bookmarkStart w:name="_GoBack" w:id="0"/>
+            <w:bookmarkEnd w:id="0"/>
+            <w:r>
+              <w:rPr>
+                <w:rStyle w:val="Hipervnculo"/>
+              </w:rPr>
+              <w:t>ban</w:t>
+            </w:r>
+          </w:p>
+        </w:tc>
+      </w:tr>
+      <w:tr>
+        <w:trPr>
+          <w:trHeight w:val="610"/>
+        </w:trPr>
+        <w:tc>
+          <w:tcPr>
+            <w:tcW w:w="1560" w:type="dxa"/>
+            <w:tcMar>
+              <w:top w:w="100" w:type="dxa"/>
+              <w:left w:w="100" w:type="dxa"/>
+              <w:bottom w:w="100" w:type="dxa"/>
+              <w:right w:w="100" w:type="dxa"/>
+            </w:tcMar>
+            <w:vAlign w:val="center"/>
+          </w:tcPr>
+          <w:p>
+            <w:pPr>
+              <w:pStyle w:val="Normal"/>
+              <w:spacing w:line="240" w:lineRule="auto"/>
+              <w:jc w:val="center"/>
+            </w:pPr>
+            <w:r>
+              <w:rPr/>
+              <w:t>Archivos TP11</w:t>
+            </w:r>
+          </w:p>
+        </w:tc>
+        <w:tc>
+          <w:tcPr>
+            <w:tcW w:w="3402" w:type="dxa"/>
+            <w:tcMar>
+              <w:top w:w="100" w:type="dxa"/>
+              <w:left w:w="100" w:type="dxa"/>
+              <w:bottom w:w="100" w:type="dxa"/>
+              <w:right w:w="100" w:type="dxa"/>
+            </w:tcMar>
+            <w:vAlign w:val="center"/>
+          </w:tcPr>
+          <w:p>
+            <w:pPr>
+              <w:pStyle w:val="Normal"/>
+              <w:spacing w:line="240" w:lineRule="auto"/>
+              <w:jc w:val="center"/>
+              <w:rPr>
+                <w:sz w:val="20"/>
+                <w:szCs w:val="20"/>
+              </w:rPr>
+            </w:pPr>
+            <w:r>
+              <w:rPr>
+                <w:sz w:val="20"/>
+                <w:szCs w:val="20"/>
+              </w:rPr>
+              <w:t>TP11_&lt;</w:t>
+            </w:r>
+            <w:r>
+              <w:rPr>
+                <w:sz w:val="20"/>
+                <w:szCs w:val="20"/>
+              </w:rPr>
+              <w:t>NombreDescriptivo</w:t>
+            </w:r>
+            <w:r>
+              <w:rPr>
+                <w:sz w:val="20"/>
+                <w:szCs w:val="20"/>
+              </w:rPr>
+              <w:t>&gt;.&lt;</w:t>
+            </w:r>
+            <w:r>
+              <w:rPr>
+                <w:sz w:val="20"/>
+                <w:szCs w:val="20"/>
+              </w:rPr>
+              <w:t>Extension&gt;</w:t>
+            </w:r>
+          </w:p>
+        </w:tc>
+        <w:tc>
+          <w:tcPr>
+            <w:tcW w:w="5497" w:type="dxa"/>
+            <w:tcMar>
+              <w:top w:w="100" w:type="dxa"/>
+              <w:left w:w="100" w:type="dxa"/>
+              <w:bottom w:w="100" w:type="dxa"/>
+              <w:right w:w="100" w:type="dxa"/>
+            </w:tcMar>
+            <w:vAlign w:val="center"/>
+          </w:tcPr>
+          <w:p>
+            <w:pPr>
+              <w:spacing w:before="240" w:beforeAutospacing="off" w:after="240" w:afterAutospacing="off"/>
+              <w:jc w:val="center"/>
+            </w:pPr>
+            <w:hyperlink r:id="R06a8272f3fa14a67">
               <w:r>
                 <w:rPr>
                   <w:rStyle w:val="Hipervnculo"/>
+                  <w:rFonts w:ascii="Arial" w:hAnsi="Arial" w:eastAsia="Arial" w:cs="Arial"/>
+                  <w:noProof w:val="0"/>
+                  <w:sz w:val="22"/>
+                  <w:szCs w:val="22"/>
+                  <w:lang w:val="es-AR"/>
                 </w:rPr>
-                <w:t>ban</w:t>
+                <w:t>Entregas\</w:t>
+              </w:r>
+              <w:r>
+                <w:rPr>
+                  <w:rStyle w:val="Hipervnculo"/>
+                  <w:rFonts w:ascii="Arial" w:hAnsi="Arial" w:eastAsia="Arial" w:cs="Arial"/>
+                  <w:noProof w:val="0"/>
+                  <w:sz w:val="22"/>
+                  <w:szCs w:val="22"/>
+                  <w:lang w:val="es-AR"/>
+                </w:rPr>
+                <w:t>Trabajos_Prácticos</w:t>
+              </w:r>
+              <w:r>
+                <w:rPr>
+                  <w:rStyle w:val="Hipervnculo"/>
+                  <w:rFonts w:ascii="Arial" w:hAnsi="Arial" w:eastAsia="Arial" w:cs="Arial"/>
+                  <w:noProof w:val="0"/>
+                  <w:sz w:val="22"/>
+                  <w:szCs w:val="22"/>
+                  <w:lang w:val="es-AR"/>
+                </w:rPr>
+                <w:t>\TP11_Testing</w:t>
               </w:r>
             </w:hyperlink>
           </w:p>
@@ -2991,7 +3156,7 @@
               <w:spacing w:line="240" w:lineRule="auto"/>
               <w:jc w:val="center"/>
             </w:pPr>
-            <w:hyperlink r:id="rId28" w:history="1">
+            <w:hyperlink w:history="1" r:id="rId28">
               <w:r>
                 <w:rPr>
                   <w:rStyle w:val="Hipervnculo"/>
@@ -3120,48 +3285,44 @@
             </w:tcMar>
             <w:vAlign w:val="center"/>
           </w:tcPr>
-          <w:p>
+          <w:p w14:noSpellErr="1">
             <w:pPr>
               <w:widowControl w:val="0"/>
               <w:pBdr>
-                <w:top w:val="nil"/>
-                <w:left w:val="nil"/>
-                <w:bottom w:val="nil"/>
-                <w:right w:val="nil"/>
-                <w:between w:val="nil"/>
+                <w:top w:val="nil" w:color="FF000000" w:sz="0" w:space="0"/>
+                <w:left w:val="nil" w:color="FF000000" w:sz="0" w:space="0"/>
+                <w:bottom w:val="nil" w:color="FF000000" w:sz="0" w:space="0"/>
+                <w:right w:val="nil" w:color="FF000000" w:sz="0" w:space="0"/>
+                <w:between w:val="nil" w:color="FF000000" w:sz="0" w:space="0"/>
               </w:pBdr>
               <w:spacing w:line="240" w:lineRule="auto"/>
               <w:jc w:val="center"/>
             </w:pPr>
-            <w:hyperlink r:id="rId29" w:history="1">
+            <w:hyperlink r:id="R01d6e1fc2b4c4fe2">
               <w:r>
                 <w:rPr>
                   <w:rStyle w:val="Hipervnculo"/>
                 </w:rPr>
                 <w:t>Entregas/</w:t>
               </w:r>
-              <w:proofErr w:type="spellStart"/>
               <w:r>
                 <w:rPr>
                   <w:rStyle w:val="Hipervnculo"/>
                 </w:rPr>
                 <w:t>Trabajos_Prácticos</w:t>
               </w:r>
-              <w:proofErr w:type="spellEnd"/>
               <w:r>
                 <w:rPr>
                   <w:rStyle w:val="Hipervnculo"/>
                 </w:rPr>
                 <w:t>/TP#_&lt;</w:t>
               </w:r>
-              <w:proofErr w:type="spellStart"/>
               <w:r>
                 <w:rPr>
                   <w:rStyle w:val="Hipervnculo"/>
                 </w:rPr>
                 <w:t>NombreTrabajoPractico</w:t>
               </w:r>
-              <w:proofErr w:type="spellEnd"/>
               <w:r>
                 <w:rPr>
                   <w:rStyle w:val="Hipervnculo"/>
@@ -3172,6 +3333,115 @@
           </w:p>
         </w:tc>
       </w:tr>
+      <w:tr>
+        <w:trPr>
+          <w:trHeight w:val="610"/>
+        </w:trPr>
+        <w:tc>
+          <w:tcPr>
+            <w:tcW w:w="1560" w:type="dxa"/>
+            <w:tcMar>
+              <w:top w:w="100" w:type="dxa"/>
+              <w:left w:w="100" w:type="dxa"/>
+              <w:bottom w:w="100" w:type="dxa"/>
+              <w:right w:w="100" w:type="dxa"/>
+            </w:tcMar>
+            <w:vAlign w:val="center"/>
+          </w:tcPr>
+          <w:p>
+            <w:pPr>
+              <w:pStyle w:val="Normal"/>
+              <w:spacing w:line="240" w:lineRule="auto"/>
+              <w:jc w:val="center"/>
+            </w:pPr>
+            <w:r>
+              <w:rPr/>
+              <w:t>Poster Cientifico</w:t>
+            </w:r>
+          </w:p>
+        </w:tc>
+        <w:tc>
+          <w:tcPr>
+            <w:tcW w:w="3402" w:type="dxa"/>
+            <w:tcMar>
+              <w:top w:w="100" w:type="dxa"/>
+              <w:left w:w="100" w:type="dxa"/>
+              <w:bottom w:w="100" w:type="dxa"/>
+              <w:right w:w="100" w:type="dxa"/>
+            </w:tcMar>
+            <w:vAlign w:val="center"/>
+          </w:tcPr>
+          <w:p>
+            <w:pPr>
+              <w:spacing w:before="240" w:beforeAutospacing="off" w:after="240" w:afterAutospacing="off"/>
+              <w:jc w:val="center"/>
+            </w:pPr>
+            <w:r>
+              <w:rPr>
+                <w:rFonts w:ascii="Arial" w:hAnsi="Arial" w:eastAsia="Arial" w:cs="Arial"/>
+                <w:noProof w:val="0"/>
+                <w:sz w:val="20"/>
+                <w:szCs w:val="20"/>
+                <w:lang w:val="es-AR"/>
+              </w:rPr>
+              <w:t>ISW_ 4K1_G4 _PÓSTER CIENTÍFICO.pdf</w:t>
+            </w:r>
+          </w:p>
+        </w:tc>
+        <w:tc>
+          <w:tcPr>
+            <w:tcW w:w="5497" w:type="dxa"/>
+            <w:tcMar>
+              <w:top w:w="100" w:type="dxa"/>
+              <w:left w:w="100" w:type="dxa"/>
+              <w:bottom w:w="100" w:type="dxa"/>
+              <w:right w:w="100" w:type="dxa"/>
+            </w:tcMar>
+            <w:vAlign w:val="center"/>
+          </w:tcPr>
+          <w:p>
+            <w:pPr>
+              <w:spacing w:before="240" w:beforeAutospacing="off" w:after="240" w:afterAutospacing="off"/>
+              <w:jc w:val="center"/>
+            </w:pPr>
+            <w:hyperlink r:id="R78740dbb0a9b49a5">
+              <w:r>
+                <w:rPr>
+                  <w:rStyle w:val="Hipervnculo"/>
+                  <w:rFonts w:ascii="Arial" w:hAnsi="Arial" w:eastAsia="Arial" w:cs="Arial"/>
+                  <w:noProof w:val="0"/>
+                  <w:sz w:val="22"/>
+                  <w:szCs w:val="22"/>
+                  <w:lang w:val="es-AR"/>
+                </w:rPr>
+                <w:t>Entregas\</w:t>
+              </w:r>
+              <w:r>
+                <w:rPr>
+                  <w:rStyle w:val="Hipervnculo"/>
+                  <w:rFonts w:ascii="Arial" w:hAnsi="Arial" w:eastAsia="Arial" w:cs="Arial"/>
+                  <w:noProof w:val="0"/>
+                  <w:sz w:val="22"/>
+                  <w:szCs w:val="22"/>
+                  <w:lang w:val="es-AR"/>
+                </w:rPr>
+                <w:t>Trabajos_De_Investigación</w:t>
+              </w:r>
+              <w:r>
+                <w:rPr>
+                  <w:rStyle w:val="Hipervnculo"/>
+                  <w:rFonts w:ascii="Arial" w:hAnsi="Arial" w:eastAsia="Arial" w:cs="Arial"/>
+                  <w:noProof w:val="0"/>
+                  <w:sz w:val="22"/>
+                  <w:szCs w:val="22"/>
+                  <w:lang w:val="es-AR"/>
+                </w:rPr>
+                <w:t>\TP01_Poster Científico</w:t>
+              </w:r>
+            </w:hyperlink>
+          </w:p>
+        </w:tc>
+      </w:tr>
     </w:tbl>
     <w:p>
       <w:pPr>
@@ -3183,7 +3453,7 @@
           <w:u w:val="single"/>
         </w:rPr>
         <w:sectPr>
-          <w:pgSz w:w="11909" w:h="16834"/>
+          <w:pgSz w:w="11909" w:h="16834" w:orient="portrait"/>
           <w:pgMar w:top="720" w:right="720" w:bottom="720" w:left="720" w:header="720" w:footer="720" w:gutter="0"/>
           <w:pgNumType w:start="1"/>
           <w:cols w:space="720"/>
@@ -3207,7 +3477,6 @@
           <w:szCs w:val="30"/>
           <w:u w:val="single"/>
         </w:rPr>
-        <w:lastRenderedPageBreak/>
         <w:t>Estructura del repositorio</w:t>
       </w:r>
     </w:p>
@@ -3226,7 +3495,7 @@
       <w:pPr>
         <w:jc w:val="center"/>
         <w:sectPr>
-          <w:pgSz w:w="11909" w:h="16834"/>
+          <w:pgSz w:w="11909" w:h="16834" w:orient="portrait"/>
           <w:pgMar w:top="1440" w:right="1440" w:bottom="1440" w:left="1440" w:header="720" w:footer="720" w:gutter="0"/>
           <w:cols w:space="720"/>
         </w:sectPr>
@@ -3286,7 +3555,6 @@
           <w:szCs w:val="30"/>
           <w:u w:val="single"/>
         </w:rPr>
-        <w:lastRenderedPageBreak/>
         <w:t>Glosario</w:t>
       </w:r>
     </w:p>
@@ -3306,12 +3574,12 @@
         <w:tblW w:w="9029" w:type="dxa"/>
         <w:jc w:val="center"/>
         <w:tblBorders>
-          <w:top w:val="single" w:sz="8" w:space="0" w:color="000000" w:themeColor="text1"/>
-          <w:left w:val="single" w:sz="8" w:space="0" w:color="000000" w:themeColor="text1"/>
-          <w:bottom w:val="single" w:sz="8" w:space="0" w:color="000000" w:themeColor="text1"/>
-          <w:right w:val="single" w:sz="8" w:space="0" w:color="000000" w:themeColor="text1"/>
-          <w:insideH w:val="single" w:sz="8" w:space="0" w:color="000000" w:themeColor="text1"/>
-          <w:insideV w:val="single" w:sz="8" w:space="0" w:color="000000" w:themeColor="text1"/>
+          <w:top w:val="single" w:color="000000" w:themeColor="text1" w:sz="8" w:space="0"/>
+          <w:left w:val="single" w:color="000000" w:themeColor="text1" w:sz="8" w:space="0"/>
+          <w:bottom w:val="single" w:color="000000" w:themeColor="text1" w:sz="8" w:space="0"/>
+          <w:right w:val="single" w:color="000000" w:themeColor="text1" w:sz="8" w:space="0"/>
+          <w:insideH w:val="single" w:color="000000" w:themeColor="text1" w:sz="8" w:space="0"/>
+          <w:insideV w:val="single" w:color="000000" w:themeColor="text1" w:sz="8" w:space="0"/>
         </w:tblBorders>
         <w:tblLayout w:type="fixed"/>
         <w:tblLook w:val="0600" w:firstRow="0" w:lastRow="0" w:firstColumn="0" w:lastColumn="0" w:noHBand="1" w:noVBand="1"/>
@@ -4484,7 +4752,7 @@
       </w:pPr>
     </w:p>
     <w:sectPr>
-      <w:pgSz w:w="11909" w:h="16834"/>
+      <w:pgSz w:w="11909" w:h="16834" w:orient="portrait"/>
       <w:pgMar w:top="1440" w:right="1440" w:bottom="1440" w:left="1440" w:header="720" w:footer="720" w:gutter="0"/>
       <w:cols w:space="720"/>
     </w:sectPr>
@@ -4493,11 +4761,11 @@
 </file>
 
 <file path=word/styles.xml><?xml version="1.0" encoding="utf-8"?>
-<w:styles xmlns:mc="http://schemas.openxmlformats.org/markup-compatibility/2006" xmlns:r="http://schemas.openxmlformats.org/officeDocument/2006/relationships" xmlns:w="http://schemas.openxmlformats.org/wordprocessingml/2006/main" xmlns:w14="http://schemas.microsoft.com/office/word/2010/wordml" xmlns:w15="http://schemas.microsoft.com/office/word/2012/wordml" mc:Ignorable="w14 w15">
+<w:styles xmlns:wp14="http://schemas.microsoft.com/office/word/2010/wordprocessingDrawing" xmlns:mc="http://schemas.openxmlformats.org/markup-compatibility/2006" xmlns:r="http://schemas.openxmlformats.org/officeDocument/2006/relationships" xmlns:w="http://schemas.openxmlformats.org/wordprocessingml/2006/main" xmlns:w14="http://schemas.microsoft.com/office/word/2010/wordml" xmlns:w15="http://schemas.microsoft.com/office/word/2012/wordml" mc:Ignorable="w14 w15 wp14">
   <w:docDefaults>
     <w:rPrDefault>
       <w:rPr>
-        <w:rFonts w:ascii="Arial" w:eastAsia="Arial" w:hAnsi="Arial" w:cs="Arial"/>
+        <w:rFonts w:ascii="Arial" w:hAnsi="Arial" w:eastAsia="Arial" w:cs="Arial"/>
         <w:sz w:val="22"/>
         <w:szCs w:val="22"/>
         <w:lang w:val="es-AR" w:eastAsia="en-US" w:bidi="ar-SA"/>
@@ -4512,14 +4780,14 @@
   <w:latentStyles w:defLockedState="0" w:defUIPriority="99" w:defSemiHidden="0" w:defUnhideWhenUsed="0" w:defQFormat="0" w:count="371">
     <w:lsdException w:name="Normal" w:uiPriority="0" w:qFormat="1"/>
     <w:lsdException w:name="heading 1" w:uiPriority="9" w:qFormat="1"/>
-    <w:lsdException w:name="heading 2" w:semiHidden="1" w:uiPriority="9" w:unhideWhenUsed="1" w:qFormat="1"/>
-    <w:lsdException w:name="heading 3" w:semiHidden="1" w:uiPriority="9" w:unhideWhenUsed="1" w:qFormat="1"/>
-    <w:lsdException w:name="heading 4" w:semiHidden="1" w:uiPriority="9" w:unhideWhenUsed="1" w:qFormat="1"/>
-    <w:lsdException w:name="heading 5" w:semiHidden="1" w:uiPriority="9" w:unhideWhenUsed="1" w:qFormat="1"/>
-    <w:lsdException w:name="heading 6" w:semiHidden="1" w:uiPriority="9" w:unhideWhenUsed="1" w:qFormat="1"/>
-    <w:lsdException w:name="heading 7" w:semiHidden="1" w:uiPriority="9" w:unhideWhenUsed="1" w:qFormat="1"/>
-    <w:lsdException w:name="heading 8" w:semiHidden="1" w:uiPriority="9" w:unhideWhenUsed="1" w:qFormat="1"/>
-    <w:lsdException w:name="heading 9" w:semiHidden="1" w:uiPriority="9" w:unhideWhenUsed="1" w:qFormat="1"/>
+    <w:lsdException w:name="heading 2" w:uiPriority="9" w:semiHidden="1" w:unhideWhenUsed="1" w:qFormat="1"/>
+    <w:lsdException w:name="heading 3" w:uiPriority="9" w:semiHidden="1" w:unhideWhenUsed="1" w:qFormat="1"/>
+    <w:lsdException w:name="heading 4" w:uiPriority="9" w:semiHidden="1" w:unhideWhenUsed="1" w:qFormat="1"/>
+    <w:lsdException w:name="heading 5" w:uiPriority="9" w:semiHidden="1" w:unhideWhenUsed="1" w:qFormat="1"/>
+    <w:lsdException w:name="heading 6" w:uiPriority="9" w:semiHidden="1" w:unhideWhenUsed="1" w:qFormat="1"/>
+    <w:lsdException w:name="heading 7" w:uiPriority="9" w:semiHidden="1" w:unhideWhenUsed="1" w:qFormat="1"/>
+    <w:lsdException w:name="heading 8" w:uiPriority="9" w:semiHidden="1" w:unhideWhenUsed="1" w:qFormat="1"/>
+    <w:lsdException w:name="heading 9" w:uiPriority="9" w:semiHidden="1" w:unhideWhenUsed="1" w:qFormat="1"/>
     <w:lsdException w:name="index 1" w:semiHidden="1" w:unhideWhenUsed="1"/>
     <w:lsdException w:name="index 2" w:semiHidden="1" w:unhideWhenUsed="1"/>
     <w:lsdException w:name="index 3" w:semiHidden="1" w:unhideWhenUsed="1"/>
@@ -4529,22 +4797,22 @@
     <w:lsdException w:name="index 7" w:semiHidden="1" w:unhideWhenUsed="1"/>
     <w:lsdException w:name="index 8" w:semiHidden="1" w:unhideWhenUsed="1"/>
     <w:lsdException w:name="index 9" w:semiHidden="1" w:unhideWhenUsed="1"/>
-    <w:lsdException w:name="toc 1" w:semiHidden="1" w:uiPriority="39" w:unhideWhenUsed="1"/>
-    <w:lsdException w:name="toc 2" w:semiHidden="1" w:uiPriority="39" w:unhideWhenUsed="1"/>
-    <w:lsdException w:name="toc 3" w:semiHidden="1" w:uiPriority="39" w:unhideWhenUsed="1"/>
-    <w:lsdException w:name="toc 4" w:semiHidden="1" w:uiPriority="39" w:unhideWhenUsed="1"/>
-    <w:lsdException w:name="toc 5" w:semiHidden="1" w:uiPriority="39" w:unhideWhenUsed="1"/>
-    <w:lsdException w:name="toc 6" w:semiHidden="1" w:uiPriority="39" w:unhideWhenUsed="1"/>
-    <w:lsdException w:name="toc 7" w:semiHidden="1" w:uiPriority="39" w:unhideWhenUsed="1"/>
-    <w:lsdException w:name="toc 8" w:semiHidden="1" w:uiPriority="39" w:unhideWhenUsed="1"/>
-    <w:lsdException w:name="toc 9" w:semiHidden="1" w:uiPriority="39" w:unhideWhenUsed="1"/>
+    <w:lsdException w:name="toc 1" w:uiPriority="39" w:semiHidden="1" w:unhideWhenUsed="1"/>
+    <w:lsdException w:name="toc 2" w:uiPriority="39" w:semiHidden="1" w:unhideWhenUsed="1"/>
+    <w:lsdException w:name="toc 3" w:uiPriority="39" w:semiHidden="1" w:unhideWhenUsed="1"/>
+    <w:lsdException w:name="toc 4" w:uiPriority="39" w:semiHidden="1" w:unhideWhenUsed="1"/>
+    <w:lsdException w:name="toc 5" w:uiPriority="39" w:semiHidden="1" w:unhideWhenUsed="1"/>
+    <w:lsdException w:name="toc 6" w:uiPriority="39" w:semiHidden="1" w:unhideWhenUsed="1"/>
+    <w:lsdException w:name="toc 7" w:uiPriority="39" w:semiHidden="1" w:unhideWhenUsed="1"/>
+    <w:lsdException w:name="toc 8" w:uiPriority="39" w:semiHidden="1" w:unhideWhenUsed="1"/>
+    <w:lsdException w:name="toc 9" w:uiPriority="39" w:semiHidden="1" w:unhideWhenUsed="1"/>
     <w:lsdException w:name="Normal Indent" w:semiHidden="1" w:unhideWhenUsed="1"/>
     <w:lsdException w:name="footnote text" w:semiHidden="1" w:unhideWhenUsed="1"/>
     <w:lsdException w:name="annotation text" w:semiHidden="1" w:unhideWhenUsed="1"/>
     <w:lsdException w:name="header" w:semiHidden="1" w:unhideWhenUsed="1"/>
     <w:lsdException w:name="footer" w:semiHidden="1" w:unhideWhenUsed="1"/>
     <w:lsdException w:name="index heading" w:semiHidden="1" w:unhideWhenUsed="1"/>
-    <w:lsdException w:name="caption" w:semiHidden="1" w:uiPriority="35" w:unhideWhenUsed="1" w:qFormat="1"/>
+    <w:lsdException w:name="caption" w:uiPriority="35" w:semiHidden="1" w:unhideWhenUsed="1" w:qFormat="1"/>
     <w:lsdException w:name="table of figures" w:semiHidden="1" w:unhideWhenUsed="1"/>
     <w:lsdException w:name="envelope address" w:semiHidden="1" w:unhideWhenUsed="1"/>
     <w:lsdException w:name="envelope return" w:semiHidden="1" w:unhideWhenUsed="1"/>
@@ -4575,7 +4843,7 @@
     <w:lsdException w:name="Title" w:uiPriority="10" w:qFormat="1"/>
     <w:lsdException w:name="Closing" w:semiHidden="1" w:unhideWhenUsed="1"/>
     <w:lsdException w:name="Signature" w:semiHidden="1" w:unhideWhenUsed="1"/>
-    <w:lsdException w:name="Default Paragraph Font" w:semiHidden="1" w:uiPriority="1" w:unhideWhenUsed="1"/>
+    <w:lsdException w:name="Default Paragraph Font" w:uiPriority="1" w:semiHidden="1" w:unhideWhenUsed="1"/>
     <w:lsdException w:name="Body Text" w:semiHidden="1" w:unhideWhenUsed="1"/>
     <w:lsdException w:name="Body Text Indent" w:semiHidden="1" w:unhideWhenUsed="1"/>
     <w:lsdException w:name="List Continue" w:semiHidden="1" w:unhideWhenUsed="1"/>
@@ -4775,8 +5043,8 @@
     <w:lsdException w:name="Subtle Reference" w:uiPriority="31" w:qFormat="1"/>
     <w:lsdException w:name="Intense Reference" w:uiPriority="32" w:qFormat="1"/>
     <w:lsdException w:name="Book Title" w:uiPriority="33" w:qFormat="1"/>
-    <w:lsdException w:name="Bibliography" w:semiHidden="1" w:uiPriority="37" w:unhideWhenUsed="1"/>
-    <w:lsdException w:name="TOC Heading" w:semiHidden="1" w:uiPriority="39" w:unhideWhenUsed="1" w:qFormat="1"/>
+    <w:lsdException w:name="Bibliography" w:uiPriority="37" w:semiHidden="1" w:unhideWhenUsed="1"/>
+    <w:lsdException w:name="TOC Heading" w:uiPriority="39" w:semiHidden="1" w:unhideWhenUsed="1" w:qFormat="1"/>
     <w:lsdException w:name="Plain Table 1" w:uiPriority="41"/>
     <w:lsdException w:name="Plain Table 2" w:uiPriority="42"/>
     <w:lsdException w:name="Plain Table 3" w:uiPriority="43"/>
@@ -4882,7 +5150,7 @@
     <w:lsdException w:name="List Table 6 Colorful Accent 6" w:uiPriority="51"/>
     <w:lsdException w:name="List Table 7 Colorful Accent 6" w:uiPriority="52"/>
   </w:latentStyles>
-  <w:style w:type="paragraph" w:default="1" w:styleId="Normal">
+  <w:style w:type="paragraph" w:styleId="Normal" w:default="1">
     <w:name w:val="Normal"/>
   </w:style>
   <w:style w:type="paragraph" w:styleId="Ttulo1">
@@ -4976,13 +5244,13 @@
       <w:color w:val="666666"/>
     </w:rPr>
   </w:style>
-  <w:style w:type="character" w:default="1" w:styleId="Fuentedeprrafopredeter">
+  <w:style w:type="character" w:styleId="Fuentedeprrafopredeter" w:default="1">
     <w:name w:val="Default Paragraph Font"/>
     <w:uiPriority w:val="1"/>
     <w:semiHidden/>
     <w:unhideWhenUsed/>
   </w:style>
-  <w:style w:type="table" w:default="1" w:styleId="Tablanormal">
+  <w:style w:type="table" w:styleId="Tablanormal" w:default="1">
     <w:name w:val="Normal Table"/>
     <w:uiPriority w:val="99"/>
     <w:semiHidden/>
@@ -4997,13 +5265,13 @@
       </w:tblCellMar>
     </w:tblPr>
   </w:style>
-  <w:style w:type="numbering" w:default="1" w:styleId="Sinlista">
+  <w:style w:type="numbering" w:styleId="Sinlista" w:default="1">
     <w:name w:val="No List"/>
     <w:uiPriority w:val="99"/>
     <w:semiHidden/>
     <w:unhideWhenUsed/>
   </w:style>
-  <w:style w:type="table" w:customStyle="1" w:styleId="TableNormal">
+  <w:style w:type="table" w:styleId="TableNormal" w:customStyle="1">
     <w:name w:val="TableNormal"/>
     <w:tblPr>
       <w:tblCellMar>
@@ -5043,7 +5311,7 @@
       <w:szCs w:val="30"/>
     </w:rPr>
   </w:style>
-  <w:style w:type="table" w:customStyle="1" w:styleId="a">
+  <w:style w:type="table" w:styleId="a" w:customStyle="1">
     <w:basedOn w:val="TableNormal"/>
     <w:pPr>
       <w:spacing w:line="240" w:lineRule="auto"/>
@@ -5059,14 +5327,14 @@
       </w:tblCellMar>
     </w:tblPr>
   </w:style>
-  <w:style w:type="table" w:customStyle="1" w:styleId="a0">
+  <w:style w:type="table" w:styleId="a0" w:customStyle="1">
     <w:basedOn w:val="TableNormal"/>
     <w:tblPr>
       <w:tblStyleRowBandSize w:val="1"/>
       <w:tblStyleColBandSize w:val="1"/>
     </w:tblPr>
   </w:style>
-  <w:style w:type="table" w:customStyle="1" w:styleId="a1">
+  <w:style w:type="table" w:styleId="a1" w:customStyle="1">
     <w:basedOn w:val="TableNormal"/>
     <w:tblPr>
       <w:tblStyleRowBandSize w:val="1"/>
@@ -5084,7 +5352,7 @@
       <w:u w:val="single"/>
     </w:rPr>
   </w:style>
-  <w:style w:type="character" w:customStyle="1" w:styleId="Mencinsinresolver1">
+  <w:style w:type="character" w:styleId="Mencinsinresolver1" w:customStyle="1">
     <w:name w:val="Mención sin resolver1"/>
     <w:basedOn w:val="Fuentedeprrafopredeter"/>
     <w:uiPriority w:val="99"/>

</xml_diff>

<commit_message>
Arreglo nomenclatura y archivos del tp11
</commit_message>
<xml_diff>
--- a/Plan_Gestion_Configuracion_G4_ISW_4K1.docx
+++ b/Plan_Gestion_Configuracion_G4_ISW_4K1.docx
@@ -205,7 +205,25 @@
           <w:sz w:val="24"/>
           <w:szCs w:val="24"/>
         </w:rPr>
-        <w:t>Nro. de grupo: 4</w:t>
+        <w:t xml:space="preserve">Nro. </w:t>
+      </w:r>
+      <w:proofErr w:type="gramStart"/>
+      <w:r>
+        <w:rPr>
+          <w:b/>
+          <w:sz w:val="24"/>
+          <w:szCs w:val="24"/>
+        </w:rPr>
+        <w:t>de</w:t>
+      </w:r>
+      <w:proofErr w:type="gramEnd"/>
+      <w:r>
+        <w:rPr>
+          <w:b/>
+          <w:sz w:val="24"/>
+          <w:szCs w:val="24"/>
+        </w:rPr>
+        <w:t xml:space="preserve"> grupo: 4</w:t>
       </w:r>
     </w:p>
     <w:p>
@@ -985,21 +1003,12 @@
               <w:jc w:val="center"/>
             </w:pPr>
             <w:hyperlink r:id="rId15">
-              <w:proofErr w:type="spellStart"/>
               <w:r>
                 <w:rPr>
                   <w:sz w:val="24"/>
                   <w:szCs w:val="24"/>
                 </w:rPr>
-                <w:t>Uliana</w:t>
-              </w:r>
-              <w:proofErr w:type="spellEnd"/>
-              <w:r>
-                <w:rPr>
-                  <w:sz w:val="24"/>
-                  <w:szCs w:val="24"/>
-                </w:rPr>
-                <w:t>, Agustín</w:t>
+                <w:t>Uliana, Agustín</w:t>
               </w:r>
             </w:hyperlink>
           </w:p>
@@ -2718,15 +2727,15 @@
             </w:tcMar>
             <w:vAlign w:val="center"/>
           </w:tcPr>
-          <w:p w14:noSpellErr="1">
+          <w:p>
             <w:pPr>
               <w:widowControl w:val="0"/>
               <w:pBdr>
-                <w:top w:val="nil" w:color="FF000000" w:sz="0" w:space="0"/>
-                <w:left w:val="nil" w:color="FF000000" w:sz="0" w:space="0"/>
-                <w:bottom w:val="nil" w:color="FF000000" w:sz="0" w:space="0"/>
-                <w:right w:val="nil" w:color="FF000000" w:sz="0" w:space="0"/>
-                <w:between w:val="nil" w:color="FF000000" w:sz="0" w:space="0"/>
+                <w:top w:val="nil"/>
+                <w:left w:val="nil"/>
+                <w:bottom w:val="nil"/>
+                <w:right w:val="nil"/>
+                <w:between w:val="nil"/>
               </w:pBdr>
               <w:spacing w:line="240" w:lineRule="auto"/>
               <w:jc w:val="center"/>
@@ -2734,7 +2743,7 @@
                 <w:rStyle w:val="Hipervnculo"/>
               </w:rPr>
             </w:pPr>
-            <w:hyperlink r:id="R4aa19615109c4b65">
+            <w:hyperlink r:id="rId26">
               <w:r>
                 <w:rPr>
                   <w:rStyle w:val="Hipervnculo"/>
@@ -2742,146 +2751,12 @@
                 <w:t>Bibliografia/Bibliogradia_De_La_Catedra/Material_Bibliografico/Lean_Kan</w:t>
               </w:r>
             </w:hyperlink>
-            <w:bookmarkStart w:name="_GoBack" w:id="0"/>
-            <w:bookmarkEnd w:id="0"/>
             <w:r>
               <w:rPr>
                 <w:rStyle w:val="Hipervnculo"/>
               </w:rPr>
               <w:t>ban</w:t>
             </w:r>
-          </w:p>
-        </w:tc>
-      </w:tr>
-      <w:tr>
-        <w:trPr>
-          <w:trHeight w:val="610"/>
-        </w:trPr>
-        <w:tc>
-          <w:tcPr>
-            <w:tcW w:w="1560" w:type="dxa"/>
-            <w:tcMar>
-              <w:top w:w="100" w:type="dxa"/>
-              <w:left w:w="100" w:type="dxa"/>
-              <w:bottom w:w="100" w:type="dxa"/>
-              <w:right w:w="100" w:type="dxa"/>
-            </w:tcMar>
-            <w:vAlign w:val="center"/>
-          </w:tcPr>
-          <w:p>
-            <w:pPr>
-              <w:pStyle w:val="Normal"/>
-              <w:spacing w:line="240" w:lineRule="auto"/>
-              <w:jc w:val="center"/>
-            </w:pPr>
-            <w:r>
-              <w:rPr/>
-              <w:t>Archivos TP11</w:t>
-            </w:r>
-          </w:p>
-        </w:tc>
-        <w:tc>
-          <w:tcPr>
-            <w:tcW w:w="3402" w:type="dxa"/>
-            <w:tcMar>
-              <w:top w:w="100" w:type="dxa"/>
-              <w:left w:w="100" w:type="dxa"/>
-              <w:bottom w:w="100" w:type="dxa"/>
-              <w:right w:w="100" w:type="dxa"/>
-            </w:tcMar>
-            <w:vAlign w:val="center"/>
-          </w:tcPr>
-          <w:p>
-            <w:pPr>
-              <w:pStyle w:val="Normal"/>
-              <w:spacing w:line="240" w:lineRule="auto"/>
-              <w:jc w:val="center"/>
-              <w:rPr>
-                <w:sz w:val="20"/>
-                <w:szCs w:val="20"/>
-              </w:rPr>
-            </w:pPr>
-            <w:r>
-              <w:rPr>
-                <w:sz w:val="20"/>
-                <w:szCs w:val="20"/>
-              </w:rPr>
-              <w:t>TP11_&lt;</w:t>
-            </w:r>
-            <w:r>
-              <w:rPr>
-                <w:sz w:val="20"/>
-                <w:szCs w:val="20"/>
-              </w:rPr>
-              <w:t>NombreDescriptivo</w:t>
-            </w:r>
-            <w:r>
-              <w:rPr>
-                <w:sz w:val="20"/>
-                <w:szCs w:val="20"/>
-              </w:rPr>
-              <w:t>&gt;.&lt;</w:t>
-            </w:r>
-            <w:r>
-              <w:rPr>
-                <w:sz w:val="20"/>
-                <w:szCs w:val="20"/>
-              </w:rPr>
-              <w:t>Extension&gt;</w:t>
-            </w:r>
-          </w:p>
-        </w:tc>
-        <w:tc>
-          <w:tcPr>
-            <w:tcW w:w="5497" w:type="dxa"/>
-            <w:tcMar>
-              <w:top w:w="100" w:type="dxa"/>
-              <w:left w:w="100" w:type="dxa"/>
-              <w:bottom w:w="100" w:type="dxa"/>
-              <w:right w:w="100" w:type="dxa"/>
-            </w:tcMar>
-            <w:vAlign w:val="center"/>
-          </w:tcPr>
-          <w:p>
-            <w:pPr>
-              <w:spacing w:before="240" w:beforeAutospacing="off" w:after="240" w:afterAutospacing="off"/>
-              <w:jc w:val="center"/>
-            </w:pPr>
-            <w:hyperlink r:id="R06a8272f3fa14a67">
-              <w:r>
-                <w:rPr>
-                  <w:rStyle w:val="Hipervnculo"/>
-                  <w:rFonts w:ascii="Arial" w:hAnsi="Arial" w:eastAsia="Arial" w:cs="Arial"/>
-                  <w:noProof w:val="0"/>
-                  <w:sz w:val="22"/>
-                  <w:szCs w:val="22"/>
-                  <w:lang w:val="es-AR"/>
-                </w:rPr>
-                <w:t>Entregas\</w:t>
-              </w:r>
-              <w:r>
-                <w:rPr>
-                  <w:rStyle w:val="Hipervnculo"/>
-                  <w:rFonts w:ascii="Arial" w:hAnsi="Arial" w:eastAsia="Arial" w:cs="Arial"/>
-                  <w:noProof w:val="0"/>
-                  <w:sz w:val="22"/>
-                  <w:szCs w:val="22"/>
-                  <w:lang w:val="es-AR"/>
-                </w:rPr>
-                <w:t>Trabajos_Prácticos</w:t>
-              </w:r>
-              <w:r>
-                <w:rPr>
-                  <w:rStyle w:val="Hipervnculo"/>
-                  <w:rFonts w:ascii="Arial" w:hAnsi="Arial" w:eastAsia="Arial" w:cs="Arial"/>
-                  <w:noProof w:val="0"/>
-                  <w:sz w:val="22"/>
-                  <w:szCs w:val="22"/>
-                  <w:lang w:val="es-AR"/>
-                </w:rPr>
-                <w:t>\TP11_Testing</w:t>
-              </w:r>
-            </w:hyperlink>
           </w:p>
         </w:tc>
       </w:tr>
@@ -3015,7 +2890,7 @@
                 <w:szCs w:val="20"/>
               </w:rPr>
             </w:pPr>
-            <w:hyperlink r:id="rId27">
+            <w:hyperlink r:id="rId28">
               <w:r>
                 <w:rPr>
                   <w:color w:val="0000FF"/>
@@ -3156,7 +3031,7 @@
               <w:spacing w:line="240" w:lineRule="auto"/>
               <w:jc w:val="center"/>
             </w:pPr>
-            <w:hyperlink w:history="1" r:id="rId28">
+            <w:hyperlink w:history="1" r:id="rId29">
               <w:r>
                 <w:rPr>
                   <w:rStyle w:val="Hipervnculo"/>
@@ -3285,44 +3160,48 @@
             </w:tcMar>
             <w:vAlign w:val="center"/>
           </w:tcPr>
-          <w:p w14:noSpellErr="1">
+          <w:p>
             <w:pPr>
               <w:widowControl w:val="0"/>
               <w:pBdr>
-                <w:top w:val="nil" w:color="FF000000" w:sz="0" w:space="0"/>
-                <w:left w:val="nil" w:color="FF000000" w:sz="0" w:space="0"/>
-                <w:bottom w:val="nil" w:color="FF000000" w:sz="0" w:space="0"/>
-                <w:right w:val="nil" w:color="FF000000" w:sz="0" w:space="0"/>
-                <w:between w:val="nil" w:color="FF000000" w:sz="0" w:space="0"/>
+                <w:top w:val="nil"/>
+                <w:left w:val="nil"/>
+                <w:bottom w:val="nil"/>
+                <w:right w:val="nil"/>
+                <w:between w:val="nil"/>
               </w:pBdr>
               <w:spacing w:line="240" w:lineRule="auto"/>
               <w:jc w:val="center"/>
             </w:pPr>
-            <w:hyperlink r:id="R01d6e1fc2b4c4fe2">
+            <w:hyperlink r:id="rId30">
               <w:r>
                 <w:rPr>
                   <w:rStyle w:val="Hipervnculo"/>
                 </w:rPr>
                 <w:t>Entregas/</w:t>
               </w:r>
+              <w:proofErr w:type="spellStart"/>
               <w:r>
                 <w:rPr>
                   <w:rStyle w:val="Hipervnculo"/>
                 </w:rPr>
                 <w:t>Trabajos_Prácticos</w:t>
               </w:r>
+              <w:proofErr w:type="spellEnd"/>
               <w:r>
                 <w:rPr>
                   <w:rStyle w:val="Hipervnculo"/>
                 </w:rPr>
                 <w:t>/TP#_&lt;</w:t>
               </w:r>
+              <w:proofErr w:type="spellStart"/>
               <w:r>
                 <w:rPr>
                   <w:rStyle w:val="Hipervnculo"/>
                 </w:rPr>
                 <w:t>NombreTrabajoPractico</w:t>
               </w:r>
+              <w:proofErr w:type="spellEnd"/>
               <w:r>
                 <w:rPr>
                   <w:rStyle w:val="Hipervnculo"/>
@@ -3350,12 +3229,10 @@
           </w:tcPr>
           <w:p>
             <w:pPr>
-              <w:pStyle w:val="Normal"/>
-              <w:spacing w:line="240" w:lineRule="auto"/>
-              <w:jc w:val="center"/>
-            </w:pPr>
-            <w:r>
-              <w:rPr/>
+              <w:spacing w:line="240" w:lineRule="auto"/>
+              <w:jc w:val="center"/>
+            </w:pPr>
+            <w:r>
               <w:t>Poster Cientifico</w:t>
             </w:r>
           </w:p>
@@ -3373,16 +3250,13 @@
           </w:tcPr>
           <w:p>
             <w:pPr>
-              <w:spacing w:before="240" w:beforeAutospacing="off" w:after="240" w:afterAutospacing="off"/>
-              <w:jc w:val="center"/>
-            </w:pPr>
-            <w:r>
-              <w:rPr>
-                <w:rFonts w:ascii="Arial" w:hAnsi="Arial" w:eastAsia="Arial" w:cs="Arial"/>
-                <w:noProof w:val="0"/>
-                <w:sz w:val="20"/>
-                <w:szCs w:val="20"/>
-                <w:lang w:val="es-AR"/>
+              <w:spacing w:before="240" w:after="240"/>
+              <w:jc w:val="center"/>
+            </w:pPr>
+            <w:r>
+              <w:rPr>
+                <w:sz w:val="20"/>
+                <w:szCs w:val="20"/>
               </w:rPr>
               <w:t>ISW_ 4K1_G4 _PÓSTER CIENTÍFICO.pdf</w:t>
             </w:r>
@@ -3401,42 +3275,132 @@
           </w:tcPr>
           <w:p>
             <w:pPr>
-              <w:spacing w:before="240" w:beforeAutospacing="off" w:after="240" w:afterAutospacing="off"/>
-              <w:jc w:val="center"/>
-            </w:pPr>
-            <w:hyperlink r:id="R78740dbb0a9b49a5">
+              <w:spacing w:before="240" w:after="240"/>
+              <w:jc w:val="center"/>
+            </w:pPr>
+            <w:hyperlink r:id="rId31">
               <w:r>
                 <w:rPr>
                   <w:rStyle w:val="Hipervnculo"/>
-                  <w:rFonts w:ascii="Arial" w:hAnsi="Arial" w:eastAsia="Arial" w:cs="Arial"/>
-                  <w:noProof w:val="0"/>
-                  <w:sz w:val="22"/>
-                  <w:szCs w:val="22"/>
-                  <w:lang w:val="es-AR"/>
+                </w:rPr>
+                <w:t>Entregas\Trabajos_De_Investigación\TP01_Poster Científico</w:t>
+              </w:r>
+            </w:hyperlink>
+          </w:p>
+        </w:tc>
+      </w:tr>
+      <w:tr>
+        <w:trPr>
+          <w:trHeight w:val="610"/>
+        </w:trPr>
+        <w:tc>
+          <w:tcPr>
+            <w:tcW w:w="1560" w:type="dxa"/>
+            <w:tcMar>
+              <w:top w:w="100" w:type="dxa"/>
+              <w:left w:w="100" w:type="dxa"/>
+              <w:bottom w:w="100" w:type="dxa"/>
+              <w:right w:w="100" w:type="dxa"/>
+            </w:tcMar>
+            <w:vAlign w:val="center"/>
+          </w:tcPr>
+          <w:p>
+            <w:pPr>
+              <w:spacing w:line="240" w:lineRule="auto"/>
+              <w:jc w:val="center"/>
+            </w:pPr>
+            <w:bookmarkStart w:name="_GoBack" w:id="0"/>
+            <w:bookmarkEnd w:id="0"/>
+            <w:r>
+              <w:t>Charla Ted</w:t>
+            </w:r>
+          </w:p>
+        </w:tc>
+        <w:tc>
+          <w:tcPr>
+            <w:tcW w:w="3402" w:type="dxa"/>
+            <w:tcMar>
+              <w:top w:w="100" w:type="dxa"/>
+              <w:left w:w="100" w:type="dxa"/>
+              <w:bottom w:w="100" w:type="dxa"/>
+              <w:right w:w="100" w:type="dxa"/>
+            </w:tcMar>
+            <w:vAlign w:val="center"/>
+          </w:tcPr>
+          <w:p>
+            <w:pPr>
+              <w:spacing w:before="240" w:after="240"/>
+              <w:jc w:val="center"/>
+              <w:rPr>
+                <w:sz w:val="20"/>
+                <w:szCs w:val="20"/>
+              </w:rPr>
+            </w:pPr>
+            <w:r>
+              <w:rPr>
+                <w:sz w:val="20"/>
+                <w:szCs w:val="20"/>
+              </w:rPr>
+              <w:t>ISW_ 4K1_G4 _</w:t>
+            </w:r>
+            <w:r>
+              <w:rPr>
+                <w:sz w:val="20"/>
+                <w:szCs w:val="20"/>
+              </w:rPr>
+              <w:t>CHARLA TED</w:t>
+            </w:r>
+            <w:r>
+              <w:rPr>
+                <w:sz w:val="20"/>
+                <w:szCs w:val="20"/>
+              </w:rPr>
+              <w:t>.pdf</w:t>
+            </w:r>
+          </w:p>
+        </w:tc>
+        <w:tc>
+          <w:tcPr>
+            <w:tcW w:w="5497" w:type="dxa"/>
+            <w:tcMar>
+              <w:top w:w="100" w:type="dxa"/>
+              <w:left w:w="100" w:type="dxa"/>
+              <w:bottom w:w="100" w:type="dxa"/>
+              <w:right w:w="100" w:type="dxa"/>
+            </w:tcMar>
+            <w:vAlign w:val="center"/>
+          </w:tcPr>
+          <w:p>
+            <w:pPr>
+              <w:spacing w:before="240" w:after="240"/>
+              <w:jc w:val="center"/>
+            </w:pPr>
+            <w:hyperlink r:id="rId32">
+              <w:r>
+                <w:rPr>
+                  <w:rStyle w:val="Hipervnculo"/>
                 </w:rPr>
                 <w:t>Entregas\</w:t>
+              </w:r>
+              <w:proofErr w:type="spellStart"/>
+              <w:r>
+                <w:rPr>
+                  <w:rStyle w:val="Hipervnculo"/>
+                </w:rPr>
+                <w:t>Trabajos_De_Investigación</w:t>
+              </w:r>
+              <w:proofErr w:type="spellEnd"/>
+              <w:r>
+                <w:rPr>
+                  <w:rStyle w:val="Hipervnculo"/>
+                </w:rPr>
+                <w:t>\</w:t>
               </w:r>
               <w:r>
                 <w:rPr>
                   <w:rStyle w:val="Hipervnculo"/>
-                  <w:rFonts w:ascii="Arial" w:hAnsi="Arial" w:eastAsia="Arial" w:cs="Arial"/>
-                  <w:noProof w:val="0"/>
-                  <w:sz w:val="22"/>
-                  <w:szCs w:val="22"/>
-                  <w:lang w:val="es-AR"/>
                 </w:rPr>
-                <w:t>Trabajos_De_Investigación</w:t>
-              </w:r>
-              <w:r>
-                <w:rPr>
-                  <w:rStyle w:val="Hipervnculo"/>
-                  <w:rFonts w:ascii="Arial" w:hAnsi="Arial" w:eastAsia="Arial" w:cs="Arial"/>
-                  <w:noProof w:val="0"/>
-                  <w:sz w:val="22"/>
-                  <w:szCs w:val="22"/>
-                  <w:lang w:val="es-AR"/>
-                </w:rPr>
-                <w:t>\TP01_Poster Científico</w:t>
+                <w:t>TP02_Charla Ted</w:t>
               </w:r>
             </w:hyperlink>
           </w:p>
@@ -3501,6 +3465,10 @@
         </w:sectPr>
       </w:pPr>
       <w:r>
+        <w:rPr>
+          <w:noProof/>
+          <w:lang w:eastAsia="es-AR"/>
+        </w:rPr>
         <w:drawing>
           <wp:inline distT="0" distB="0" distL="0" distR="0" wp14:anchorId="4925544C" wp14:editId="381FBEE7">
             <wp:extent cx="4086795" cy="7240010"/>
@@ -3517,7 +3485,7 @@
                     <pic:cNvPicPr/>
                   </pic:nvPicPr>
                   <pic:blipFill>
-                    <a:blip r:embed="rId30"/>
+                    <a:blip r:embed="rId33"/>
                     <a:stretch>
                       <a:fillRect/>
                     </a:stretch>
@@ -4724,7 +4692,15 @@
         <w:jc w:val="both"/>
       </w:pPr>
       <w:r>
-        <w:t>La línea base será establecida en el momento posterior a una devolución positiva tanto verbal o escrita por parte de los docentes en los trabajos prácticos. El contenido de la misma tendrá los ítems de configuración pertenecientes a cada trabajo practico.</w:t>
+        <w:t xml:space="preserve">La línea base será establecida en el momento posterior a una devolución positiva tanto verbal o escrita por parte de los docentes en los trabajos prácticos. El contenido de la misma tendrá los ítems de configuración pertenecientes a cada trabajo </w:t>
+      </w:r>
+      <w:proofErr w:type="gramStart"/>
+      <w:r>
+        <w:t>practico</w:t>
+      </w:r>
+      <w:proofErr w:type="gramEnd"/>
+      <w:r>
+        <w:t>.</w:t>
       </w:r>
     </w:p>
     <w:p>
@@ -5247,7 +5223,6 @@
   <w:style w:type="character" w:styleId="Fuentedeprrafopredeter" w:default="1">
     <w:name w:val="Default Paragraph Font"/>
     <w:uiPriority w:val="1"/>
-    <w:semiHidden/>
     <w:unhideWhenUsed/>
   </w:style>
   <w:style w:type="table" w:styleId="Tablanormal" w:default="1">
@@ -5332,6 +5307,12 @@
     <w:tblPr>
       <w:tblStyleRowBandSize w:val="1"/>
       <w:tblStyleColBandSize w:val="1"/>
+      <w:tblCellMar>
+        <w:top w:w="100" w:type="dxa"/>
+        <w:left w:w="100" w:type="dxa"/>
+        <w:bottom w:w="100" w:type="dxa"/>
+        <w:right w:w="100" w:type="dxa"/>
+      </w:tblCellMar>
     </w:tblPr>
   </w:style>
   <w:style w:type="table" w:styleId="a1" w:customStyle="1">
@@ -5339,6 +5320,12 @@
     <w:tblPr>
       <w:tblStyleRowBandSize w:val="1"/>
       <w:tblStyleColBandSize w:val="1"/>
+      <w:tblCellMar>
+        <w:top w:w="100" w:type="dxa"/>
+        <w:left w:w="100" w:type="dxa"/>
+        <w:bottom w:w="100" w:type="dxa"/>
+        <w:right w:w="100" w:type="dxa"/>
+      </w:tblCellMar>
     </w:tblPr>
   </w:style>
   <w:style w:type="character" w:styleId="Hipervnculo">

</xml_diff>